<commit_message>
Chiens: retire la note pour collegue technique, ajoute le volet com/presse/reseaux (avec sa section d'audit)
</commit_message>
<xml_diff>
--- a/export/Chien-citoyen-de-Paris-dossier-complet.docx
+++ b/export/Chien-citoyen-de-Paris-dossier-complet.docx
@@ -38,7 +38,7 @@
     </w:p>
     <w:p>
       <w:r>
-        <w:t>Document unique rassemblant le dossier complet : le pitch général, les pitchs ciblés (grand public, élu, cabinet technique, collègue technique) puis les annexes vérifiées et triées (audit des sources, note juridique, coûts et faisabilité, arrêté et règlement, rapport complet).</w:t>
+        <w:t>Document unique rassemblant le dossier complet : le pitch général, les notes ciblées (grand public, élu, cabinet technique, communication et presse) puis les annexes vérifiées et triées (audit des sources, note juridique, coûts et faisabilité, arrêté et règlement, rapport complet).</w:t>
       </w:r>
     </w:p>
     <w:p>
@@ -694,7 +694,7 @@
         <w:rPr>
           <w:b w:val="0"/>
         </w:rPr>
-        <w:t>5. Pitch pour un collègue technique</w:t>
+        <w:t>5. Volet communication, presse et réseaux</w:t>
       </w:r>
       <w:r>
         <w:t xml:space="preserve"> — </w:t>
@@ -704,7 +704,7 @@
           <w:rFonts w:ascii="Consolas" w:hAnsi="Consolas"/>
           <w:sz w:val="20"/>
         </w:rPr>
-        <w:t>PITCH-COLLAB-TECHNIQUE-IT.md</w:t>
+        <w:t>PITCH-COM-PRESSE-RESEAUX.md</w:t>
       </w:r>
     </w:p>
     <w:p>
@@ -715,7 +715,7 @@
         <w:rPr>
           <w:b w:val="0"/>
         </w:rPr>
-        <w:t>Le produit en trois couches</w:t>
+        <w:t>Ce qu'on a, et ce qu'on n'a pas</w:t>
       </w:r>
     </w:p>
     <w:p>
@@ -726,7 +726,7 @@
         <w:rPr>
           <w:b w:val="0"/>
         </w:rPr>
-        <w:t>Volumes, pour dimensionner</w:t>
+        <w:t>Les trois messages, et jamais plus</w:t>
       </w:r>
     </w:p>
     <w:p>
@@ -737,7 +737,7 @@
         <w:rPr>
           <w:b w:val="0"/>
         </w:rPr>
-        <w:t>Ce qu'il faut attaquer en premier, par ordre de risque</w:t>
+        <w:t>Ce qu'on ne dit jamais</w:t>
       </w:r>
     </w:p>
     <w:p>
@@ -748,7 +748,7 @@
         <w:rPr>
           <w:b w:val="0"/>
         </w:rPr>
-        <w:t>Ce qu'on ne sait pas, et qu'il faut dire avant de coder</w:t>
+        <w:t>Les interlocuteurs, par ordre</w:t>
       </w:r>
     </w:p>
     <w:p>
@@ -759,7 +759,7 @@
         <w:rPr>
           <w:b w:val="0"/>
         </w:rPr>
-        <w:t>Le test à trente jours, sans budget</w:t>
+        <w:t>Les réseaux, par nature de contenu</w:t>
       </w:r>
     </w:p>
     <w:p>
@@ -770,7 +770,73 @@
         <w:rPr>
           <w:b w:val="0"/>
         </w:rPr>
-        <w:t>Ce qu'il me faut de toi</w:t>
+        <w:t>La séquence : la preuve d'abord, la presse ensuite</w:t>
+      </w:r>
+    </w:p>
+    <w:p>
+      <w:pPr>
+        <w:pStyle w:val="ListBullet2"/>
+      </w:pPr>
+      <w:r>
+        <w:rPr>
+          <w:b w:val="0"/>
+        </w:rPr>
+        <w:t>Le dossier de presse, pièce par pièce</w:t>
+      </w:r>
+    </w:p>
+    <w:p>
+      <w:pPr>
+        <w:pStyle w:val="ListBullet2"/>
+      </w:pPr>
+      <w:r>
+        <w:rPr>
+          <w:b w:val="0"/>
+        </w:rPr>
+        <w:t>Les quatre attaques, et la réponse écrite</w:t>
+      </w:r>
+    </w:p>
+    <w:p>
+      <w:pPr>
+        <w:pStyle w:val="ListBullet2"/>
+      </w:pPr>
+      <w:r>
+        <w:rPr>
+          <w:b w:val="0"/>
+        </w:rPr>
+        <w:t>Crise : le scénario qu'il faut avoir écrit d'avance</w:t>
+      </w:r>
+    </w:p>
+    <w:p>
+      <w:pPr>
+        <w:pStyle w:val="ListBullet2"/>
+      </w:pPr>
+      <w:r>
+        <w:rPr>
+          <w:b w:val="0"/>
+        </w:rPr>
+        <w:t>Ce que ça coûte</w:t>
+      </w:r>
+    </w:p>
+    <w:p>
+      <w:pPr>
+        <w:pStyle w:val="ListBullet2"/>
+      </w:pPr>
+      <w:r>
+        <w:rPr>
+          <w:b w:val="0"/>
+        </w:rPr>
+        <w:t>Ce qui compte comme réussite</w:t>
+      </w:r>
+    </w:p>
+    <w:p>
+      <w:pPr>
+        <w:pStyle w:val="ListBullet2"/>
+      </w:pPr>
+      <w:r>
+        <w:rPr>
+          <w:b w:val="0"/>
+        </w:rPr>
+        <w:t>Suite</w:t>
       </w:r>
     </w:p>
     <w:p>
@@ -855,6 +921,17 @@
           <w:b w:val="0"/>
         </w:rPr>
         <w:t>5. Corrections appliquées aux fichiers</w:t>
+      </w:r>
+    </w:p>
+    <w:p>
+      <w:pPr>
+        <w:pStyle w:val="ListBullet2"/>
+      </w:pPr>
+      <w:r>
+        <w:rPr>
+          <w:b w:val="0"/>
+        </w:rPr>
+        <w:t>6. Ajouts postérieurs à l'audit</w:t>
       </w:r>
     </w:p>
     <w:p>
@@ -4628,7 +4705,7 @@
         <w:pStyle w:val="Heading2"/>
       </w:pPr>
       <w:r>
-        <w:t>5. Pitch pour un collègue technique</w:t>
+        <w:t>5. Volet communication, presse et réseaux</w:t>
       </w:r>
     </w:p>
     <w:p>
@@ -4636,12 +4713,12 @@
         <w:rPr>
           <w:i/>
         </w:rPr>
-        <w:t>Source : `PITCH-COLLAB-TECHNIQUE-IT.md`.</w:t>
-      </w:r>
-    </w:p>
-    <w:p>
-      <w:r>
-        <w:t>Ce qu'on veut construire, ce qui est dur, et ce qu'on ne sait pas encore.</w:t>
+        <w:t>Source : `PITCH-COM-PRESSE-RESEAUX.md`.</w:t>
+      </w:r>
+    </w:p>
+    <w:p>
+      <w:r>
+        <w:t>Ce qu'on dit, à qui, dans quel ordre, et ce qu'on ne dit pas. Ce volet n'existait pas dans le dossier : c'est la pièce qui transforme un document de travail en campagne, ou qui évite de la rater. Note de travail, 29 septembre 2026. Rien n'a été voté.</w:t>
       </w:r>
     </w:p>
     <w:p>
@@ -4649,77 +4726,48 @@
         <w:pStyle w:val="Heading3"/>
       </w:pPr>
       <w:r>
-        <w:t>Le produit en trois couches</w:t>
-      </w:r>
-    </w:p>
-    <w:p>
-      <w:pPr>
-        <w:pStyle w:val="ListNumber"/>
-      </w:pPr>
+        <w:t>Ce qu'on a, et ce qu'on n'a pas</w:t>
+      </w:r>
+    </w:p>
+    <w:p>
+      <w:r>
+        <w:t>On a : un dossier de quatorze pièces, chaque chiffre adossé à une source ouverte, un audit qui dit ce qui a été corrigé et ce qui reste incertain, trois villes et une jurisprudence à raconter, et une idée qui tient en deux phrases.</w:t>
+      </w:r>
+    </w:p>
+    <w:p>
+      <w:r>
+        <w:t>On n'a pas : d'association, de mandat, de budget, d'élu derrière, de porte-parole légitime. Sauf à en inventer un, et c'est exactement ce qu'il ne faut pas faire.</w:t>
+      </w:r>
+    </w:p>
+    <w:p>
+      <w:r>
+        <w:t xml:space="preserve">La conséquence est le principe de tout ce volet : </w:t>
+      </w:r>
       <w:r>
         <w:rPr>
           <w:b/>
         </w:rPr>
-        <w:t>Un registre des chiens parisiens.</w:t>
-      </w:r>
-      <w:r>
-        <w:t xml:space="preserve"> Une fiche par chien :</w:t>
-      </w:r>
-    </w:p>
-    <w:p>
-      <w:pPr>
-        <w:pStyle w:val="ListBullet"/>
-      </w:pPr>
-      <w:r>
-        <w:t>identifiant I-CAD existant,</w:t>
-      </w:r>
-    </w:p>
-    <w:p>
-      <w:pPr>
-        <w:pStyle w:val="ListBullet"/>
-      </w:pPr>
-      <w:r>
-        <w:t>empreinte génétique,</w:t>
-      </w:r>
-    </w:p>
-    <w:p>
-      <w:pPr>
-        <w:pStyle w:val="ListBullet"/>
-      </w:pPr>
-      <w:r>
-        <w:t>propriétaire,</w:t>
-      </w:r>
-    </w:p>
-    <w:p>
-      <w:pPr>
-        <w:pStyle w:val="ListBullet"/>
-      </w:pPr>
-      <w:r>
-        <w:t>adresse dans Paris,</w:t>
-      </w:r>
-    </w:p>
-    <w:p>
-      <w:pPr>
-        <w:pStyle w:val="ListBullet"/>
-      </w:pPr>
-      <w:r>
-        <w:t>statut vaccinal,</w:t>
-      </w:r>
-    </w:p>
-    <w:p>
-      <w:pPr>
-        <w:pStyle w:val="ListBullet"/>
-      </w:pPr>
-      <w:r>
-        <w:t>date d'enregistrement,</w:t>
-      </w:r>
-    </w:p>
-    <w:p>
-      <w:pPr>
-        <w:pStyle w:val="ListBullet"/>
-      </w:pPr>
-      <w:r>
-        <w:t>statut (à jour / à renouveler / radié).</w:t>
+        <w:t>on ne communique pas sur une idée, on publie une preuve.</w:t>
+      </w:r>
+      <w:r>
+        <w:t xml:space="preserve"> Tant qu'il n'y a pas un comptage, il n'y a rien à annoncer — seulement une opinion de plus. Un dossier de preuve devient un dossier de presse par construction : les chiffres sourcés </w:t>
+      </w:r>
+      <w:r>
+        <w:rPr>
+          <w:i/>
+        </w:rPr>
+        <w:t>sont</w:t>
+      </w:r>
+      <w:r>
+        <w:t xml:space="preserve"> le matériau journalistique.</w:t>
+      </w:r>
+    </w:p>
+    <w:p>
+      <w:pPr>
+        <w:pStyle w:val="Heading3"/>
+      </w:pPr>
+      <w:r>
+        <w:t>Les trois messages, et jamais plus</w:t>
       </w:r>
     </w:p>
     <w:p>
@@ -4730,131 +4778,60 @@
         <w:rPr>
           <w:b/>
         </w:rPr>
-        <w:t>Une chaîne de prélèvement et d'analyse.</w:t>
-      </w:r>
-    </w:p>
-    <w:p>
-      <w:pPr>
-        <w:pStyle w:val="ListBullet"/>
-      </w:pPr>
-      <w:r>
-        <w:t>Un agent ramasse une déjection non ramassée,</w:t>
-      </w:r>
-    </w:p>
-    <w:p>
-      <w:pPr>
-        <w:pStyle w:val="ListBullet"/>
-      </w:pPr>
-      <w:r>
-        <w:t>la met dans un tube avec un numéro d'ordre,</w:t>
-      </w:r>
-    </w:p>
-    <w:p>
-      <w:pPr>
-        <w:pStyle w:val="ListBullet"/>
-      </w:pPr>
-      <w:r>
-        <w:t>la chaîne part au laboratoire,</w:t>
-      </w:r>
-    </w:p>
-    <w:p>
-      <w:pPr>
-        <w:pStyle w:val="ListBullet"/>
-      </w:pPr>
-      <w:r>
-        <w:t>le laboratoire renvoie un identifiant génétique,</w:t>
-      </w:r>
-    </w:p>
-    <w:p>
-      <w:pPr>
-        <w:pStyle w:val="ListBullet"/>
-      </w:pPr>
-      <w:r>
-        <w:t>le système cherche la correspondance dans le registre et sort un nom.</w:t>
-      </w:r>
-    </w:p>
-    <w:p>
-      <w:r>
-        <w:t>Le laboratoire détient la base génétique, la Ville ne détient que la correspondance prélèvement -&gt; propriétaire, pour la durée de l'expérimentation.</w:t>
-      </w:r>
-    </w:p>
-    <w:p>
-      <w:pPr>
-        <w:pStyle w:val="IntenseQuote"/>
-      </w:pPr>
-      <w:r>
-        <w:t>C'est la contrainte d'architecture principale, pas un détail de conformité : elle décide où vivent les données et qui peut interroger quoi.</w:t>
-      </w:r>
-    </w:p>
-    <w:p>
-      <w:pPr>
-        <w:pStyle w:val="ListNumber"/>
-      </w:pPr>
+        <w:t>Paris est la ville la plus dense en chiens et la plus pauvre en espaces.</w:t>
+      </w:r>
+      <w:r>
+        <w:t xml:space="preserve"> Un chien pour vingt et un habitants ; 45 espaces canins, environ 15 000 m² en tout, soit 0,15 m² de liberté par chien. Image utilisable : </w:t>
+      </w:r>
       <w:r>
         <w:rPr>
           <w:b/>
         </w:rPr>
-        <w:t>Une application terrain.</w:t>
-      </w:r>
-    </w:p>
-    <w:p>
-      <w:pPr>
-        <w:pStyle w:val="ListBullet"/>
-      </w:pPr>
-      <w:r>
-        <w:t>Pour l'agent : numéroter un prélèvement, géolocaliser, photographier, horodater, imprimer ou transmettre l'étiquette.</w:t>
-      </w:r>
-    </w:p>
-    <w:p>
-      <w:pPr>
-        <w:pStyle w:val="ListBullet"/>
-      </w:pPr>
-      <w:r>
-        <w:t>Pour le propriétaire : s'enregistrer, prendre rendez-vous, télécharger l'attestation, voir ses droits (transports, espaces).</w:t>
-      </w:r>
-    </w:p>
-    <w:p>
-      <w:pPr>
-        <w:pStyle w:val="ListBullet"/>
-      </w:pPr>
-      <w:r>
-        <w:t>Pour la mairie : compter, suivre les taux d'aboutissement, éditer les chiffres de l'évaluation.</w:t>
-      </w:r>
-    </w:p>
-    <w:p>
-      <w:pPr>
-        <w:pStyle w:val="Heading3"/>
-      </w:pPr>
-      <w:r>
-        <w:t>Volumes, pour dimensionner</w:t>
-      </w:r>
-    </w:p>
-    <w:p>
-      <w:pPr>
-        <w:pStyle w:val="ListBullet"/>
+        <w:t>tous les espaces canins de Paris réunis font un peu moins d'un cinquième du parc Monceau</w:t>
+      </w:r>
+      <w:r>
+        <w:t xml:space="preserve"> (8,25 ha, source ci-dessous).</w:t>
+      </w:r>
+    </w:p>
+    <w:p>
+      <w:pPr>
+        <w:pStyle w:val="ListNumber"/>
       </w:pPr>
       <w:r>
         <w:rPr>
           <w:b/>
         </w:rPr>
-        <w:t>Pilote</w:t>
-      </w:r>
-      <w:r>
-        <w:t xml:space="preserve"> : 2 ou 3 arrondissements, environ 9 700 chiens identifiés, 5 000 enregistrés en année 1.</w:t>
-      </w:r>
-    </w:p>
-    <w:p>
-      <w:pPr>
-        <w:pStyle w:val="ListBullet"/>
+        <w:t>Un contrat, pas une revendication.</w:t>
+      </w:r>
+      <w:r>
+        <w:t xml:space="preserve"> Le maître s'engage sur ce qui se vérifie — ramasser, tenir en laisse, une séance d'éducation, une assurance — et obtient ce que personne n'a : les transports, les espaces où on peut détacher, des jardins d'immeuble. Personne ne fait le lien entre les deux bouts aujourd'hui.</w:t>
+      </w:r>
+    </w:p>
+    <w:p>
+      <w:pPr>
+        <w:pStyle w:val="ListNumber"/>
       </w:pPr>
       <w:r>
         <w:rPr>
           <w:b/>
         </w:rPr>
-        <w:t>Extension</w:t>
-      </w:r>
-      <w:r>
-        <w:t xml:space="preserve"> : 100 000 chiens, soit 100 000 prélèvements buccaux étalés sur deux à quatre ans.</w:t>
+        <w:t>On compte avant de sanctionner.</w:t>
+      </w:r>
+      <w:r>
+        <w:t xml:space="preserve"> Béziers a fait baisser les déjections de 85 % selon la mairie et a perdu devant le tribunal administratif, non pour illégalité mais faute de pièces prouvant l'utilité. C'est la leçon du dossier, et c'est le meilleur angle de presse : un projet d'arrêté qui commence par un comptage de trottoir à la main.</w:t>
+      </w:r>
+    </w:p>
+    <w:p>
+      <w:r>
+        <w:t>Trois messages, parce qu'au-delà de trois, un message de campagne ne se retient pas. Les chiffres détaillés, les coûts, la jurisprudence, les objections : c'est la matière des questions, pas des titres.</w:t>
+      </w:r>
+    </w:p>
+    <w:p>
+      <w:pPr>
+        <w:pStyle w:val="Heading3"/>
+      </w:pPr>
+      <w:r>
+        <w:t>Ce qu'on ne dit jamais</w:t>
       </w:r>
     </w:p>
     <w:p>
@@ -4865,10 +4842,10 @@
         <w:rPr>
           <w:b/>
         </w:rPr>
-        <w:t>Débit vétérinaire</w:t>
-      </w:r>
-      <w:r>
-        <w:t xml:space="preserve"> : à 200 cabinets parisiens, 500 prélèvements par cabinet sur la durée totale. Ce n'est pas un problème de débit, c'est un problème de rendez-vous, de kit et de saisie.</w:t>
+        <w:t>Jamais « amende » ni « verbalisation » dans un message de premier niveau.</w:t>
+      </w:r>
+      <w:r>
+        <w:t xml:space="preserve"> On parle du contrat et des droits ; la sanction arrive à la question, jamais à l'initiative.</w:t>
       </w:r>
     </w:p>
     <w:p>
@@ -4879,10 +4856,10 @@
         <w:rPr>
           <w:b/>
         </w:rPr>
-        <w:t>Analyses de déjections</w:t>
-      </w:r>
-      <w:r>
-        <w:t xml:space="preserve"> : de l'ordre de 500 par an au démarrage, 2 000 à 3 000 en régime établi.</w:t>
+        <w:t>Jamais « ADN » tout seul.</w:t>
+      </w:r>
+      <w:r>
+        <w:t xml:space="preserve"> Le mot convoque le fichage. La formulation complète, dès qu'on l'emploie : « la base génétique reste chez le laboratoire, la Ville ne détient que la correspondance entre un prélèvement et un nom, pour la durée de l'expérience ».</w:t>
       </w:r>
     </w:p>
     <w:p>
@@ -4893,175 +4870,568 @@
         <w:rPr>
           <w:b/>
         </w:rPr>
-        <w:t>Coût unitaire vérifié</w:t>
-      </w:r>
-      <w:r>
-        <w:t xml:space="preserve"> : 34,10 € HT facturés par le laboratoire de Saint-Omer pour une analyse (source : FAQ de la Ville de Saint-Omer), 60,43 € HT tout compris au coût marginal dans notre modèle. À 500 analyses par an, le coût complet monte à 260 € l'unité ; à 2 000, il descend à 70 €.</w:t>
-      </w:r>
-    </w:p>
-    <w:p>
-      <w:pPr>
-        <w:pStyle w:val="Heading3"/>
-      </w:pPr>
-      <w:r>
-        <w:t>Ce qu'il faut attaquer en premier, par ordre de risque</w:t>
-      </w:r>
-    </w:p>
-    <w:p>
-      <w:pPr>
-        <w:pStyle w:val="ListNumber"/>
-      </w:pPr>
-      <w:r>
-        <w:t xml:space="preserve">La </w:t>
-      </w:r>
+        <w:t>Jamais un chiffre sans sa source, ni un chiffre qu'on sait contesté</w:t>
+      </w:r>
+      <w:r>
+        <w:t xml:space="preserve"> — le nombre de chiens est donné comme incertain (100 000 selon la Ville, jusqu'à 300 000 ailleurs) et cette incertitude affichée crédibilise au lieu de fragiliser. Un chiffre présenté comme certain et démenti en commentaire coûte une campagne entière.</w:t>
+      </w:r>
+    </w:p>
+    <w:p>
+      <w:pPr>
+        <w:pStyle w:val="ListBullet"/>
+      </w:pPr>
       <w:r>
         <w:rPr>
           <w:b/>
         </w:rPr>
-        <w:t>robustesse de l'ADN environnemental</w:t>
-      </w:r>
-      <w:r>
-        <w:t xml:space="preserve"> sur un trottoir. Une crotte ramassée reste-t-elle exploitable après une nuit de pluie, deux jours de soleil, un passage de balayeuse ? Personne ne le documente publiquement. C'est le risque numéro un du projet et il se teste en trois semaines, avec un laboratoire et vingt échantillons déposés dans des conditions contrôlées.</w:t>
-      </w:r>
-    </w:p>
-    <w:p>
-      <w:pPr>
-        <w:pStyle w:val="ListNumber"/>
+        <w:t>Jamais « police des trottoirs ».</w:t>
+      </w:r>
+      <w:r>
+        <w:t xml:space="preserve"> On parle d'allègement de la dépense publique (800 millions d'euros de propreté par an) et de contrat.</w:t>
+      </w:r>
+    </w:p>
+    <w:p>
+      <w:pPr>
+        <w:pStyle w:val="ListBullet"/>
       </w:pPr>
       <w:r>
         <w:rPr>
           <w:b/>
         </w:rPr>
-        <w:t>Le mélange et la contamination.</w:t>
-      </w:r>
-      <w:r>
-        <w:t xml:space="preserve"> Deux chiens sur le même trottoir, un prélèvement pris à la pince : quel taux de lecture, quel taux de fausse attribution ? La conséquence juridique d'une fausse attribution est un contentieux, pas une réclamation.</w:t>
-      </w:r>
-    </w:p>
-    <w:p>
-      <w:pPr>
-        <w:pStyle w:val="ListNumber"/>
-      </w:pPr>
+        <w:t>Jamais de faux collectif.</w:t>
+      </w:r>
+      <w:r>
+        <w:t xml:space="preserve"> Pas de page au nom d'une association qui n'existe pas, pas de comptes multiples, pas de pétition gonflée. Le jour où un média vérifie, tout le dossier meurt avec la pose — et ce dossier vaut mieux que ça.</w:t>
+      </w:r>
+    </w:p>
+    <w:p>
+      <w:pPr>
+        <w:pStyle w:val="Heading3"/>
+      </w:pPr>
+      <w:r>
+        <w:t>Les interlocuteurs, par ordre</w:t>
+      </w:r>
+    </w:p>
+    <w:p>
+      <w:r>
+        <w:t>Presse, et dans cet ordre précis : on épuise la presse locale et spécialisée avant de viser le national, parce que le national ne vient qu'avec une baisse mesurée.</w:t>
+      </w:r>
+    </w:p>
+    <w:tbl>
+      <w:tblPr>
+        <w:tblStyle w:val="LightGrid-Accent1"/>
+        <w:tblW w:type="auto" w:w="0"/>
+        <w:tblLook w:firstColumn="1" w:firstRow="1" w:lastColumn="0" w:lastRow="0" w:noHBand="0" w:noVBand="1" w:val="04A0"/>
+      </w:tblPr>
+      <w:tblGrid>
+        <w:gridCol w:w="2160"/>
+        <w:gridCol w:w="2160"/>
+        <w:gridCol w:w="2160"/>
+        <w:gridCol w:w="2160"/>
+      </w:tblGrid>
+      <w:tr>
+        <w:tc>
+          <w:tcPr>
+            <w:tcW w:type="dxa" w:w="2160"/>
+          </w:tcPr>
+          <w:p>
+            <w:r>
+              <w:t>Rang</w:t>
+            </w:r>
+          </w:p>
+        </w:tc>
+        <w:tc>
+          <w:tcPr>
+            <w:tcW w:type="dxa" w:w="2160"/>
+          </w:tcPr>
+          <w:p>
+            <w:r>
+              <w:t>Interlocuteur</w:t>
+            </w:r>
+          </w:p>
+        </w:tc>
+        <w:tc>
+          <w:tcPr>
+            <w:tcW w:type="dxa" w:w="2160"/>
+          </w:tcPr>
+          <w:p>
+            <w:r>
+              <w:t>Pourquoi lui</w:t>
+            </w:r>
+          </w:p>
+        </w:tc>
+        <w:tc>
+          <w:tcPr>
+            <w:tcW w:type="dxa" w:w="2160"/>
+          </w:tcPr>
+          <w:p>
+            <w:r>
+              <w:t>Angle</w:t>
+            </w:r>
+          </w:p>
+        </w:tc>
+      </w:tr>
+      <w:tr>
+        <w:tc>
+          <w:tcPr>
+            <w:tcW w:type="dxa" w:w="2160"/>
+          </w:tcPr>
+          <w:p>
+            <w:r>
+              <w:t>1</w:t>
+            </w:r>
+          </w:p>
+        </w:tc>
+        <w:tc>
+          <w:tcPr>
+            <w:tcW w:type="dxa" w:w="2160"/>
+          </w:tcPr>
+          <w:p>
+            <w:r>
+              <w:t>Le Parisien (édition 75)</w:t>
+            </w:r>
+          </w:p>
+        </w:tc>
+        <w:tc>
+          <w:tcPr>
+            <w:tcW w:type="dxa" w:w="2160"/>
+          </w:tcPr>
+          <w:p>
+            <w:r>
+              <w:t>couvre le sujet chien-parisien depuis Monceau</w:t>
+            </w:r>
+          </w:p>
+        </w:tc>
+        <w:tc>
+          <w:tcPr>
+            <w:tcW w:type="dxa" w:w="2160"/>
+          </w:tcPr>
+          <w:p>
+            <w:r>
+              <w:t>le comptage, la carte, l'arrondissement pilote</w:t>
+            </w:r>
+          </w:p>
+        </w:tc>
+      </w:tr>
+      <w:tr>
+        <w:tc>
+          <w:tcPr>
+            <w:tcW w:type="dxa" w:w="2160"/>
+          </w:tcPr>
+          <w:p>
+            <w:r>
+              <w:t>2</w:t>
+            </w:r>
+          </w:p>
+        </w:tc>
+        <w:tc>
+          <w:tcPr>
+            <w:tcW w:type="dxa" w:w="2160"/>
+          </w:tcPr>
+          <w:p>
+            <w:r>
+              <w:t>20 Minutes Paris</w:t>
+            </w:r>
+          </w:p>
+        </w:tc>
+        <w:tc>
+          <w:tcPr>
+            <w:tcW w:type="dxa" w:w="2160"/>
+          </w:tcPr>
+          <w:p>
+            <w:r>
+              <w:t>formats courts, gros trafic, aime les sujets de trottoir</w:t>
+            </w:r>
+          </w:p>
+        </w:tc>
+        <w:tc>
+          <w:tcPr>
+            <w:tcW w:type="dxa" w:w="2160"/>
+          </w:tcPr>
+          <w:p>
+            <w:r>
+              <w:t>0,15 m² et un chien pour 21 habitants</w:t>
+            </w:r>
+          </w:p>
+        </w:tc>
+      </w:tr>
+      <w:tr>
+        <w:tc>
+          <w:tcPr>
+            <w:tcW w:type="dxa" w:w="2160"/>
+          </w:tcPr>
+          <w:p>
+            <w:r>
+              <w:t>3</w:t>
+            </w:r>
+          </w:p>
+        </w:tc>
+        <w:tc>
+          <w:tcPr>
+            <w:tcW w:type="dxa" w:w="2160"/>
+          </w:tcPr>
+          <w:p>
+            <w:r>
+              <w:t>Actu.fr Paris (par arrondissement)</w:t>
+            </w:r>
+          </w:p>
+        </w:tc>
+        <w:tc>
+          <w:tcPr>
+            <w:tcW w:type="dxa" w:w="2160"/>
+          </w:tcPr>
+          <w:p>
+            <w:r>
+              <w:t>relais local, reprend souvent un dossier</w:t>
+            </w:r>
+          </w:p>
+        </w:tc>
+        <w:tc>
+          <w:tcPr>
+            <w:tcW w:type="dxa" w:w="2160"/>
+          </w:tcPr>
+          <w:p>
+            <w:r>
+              <w:t>la situation rue par rue</w:t>
+            </w:r>
+          </w:p>
+        </w:tc>
+      </w:tr>
+      <w:tr>
+        <w:tc>
+          <w:tcPr>
+            <w:tcW w:type="dxa" w:w="2160"/>
+          </w:tcPr>
+          <w:p>
+            <w:r>
+              <w:t>4</w:t>
+            </w:r>
+          </w:p>
+        </w:tc>
+        <w:tc>
+          <w:tcPr>
+            <w:tcW w:type="dxa" w:w="2160"/>
+          </w:tcPr>
+          <w:p>
+            <w:r>
+              <w:t>France Bleu Paris</w:t>
+            </w:r>
+          </w:p>
+        </w:tc>
+        <w:tc>
+          <w:tcPr>
+            <w:tcW w:type="dxa" w:w="2160"/>
+          </w:tcPr>
+          <w:p>
+            <w:r>
+              <w:t>radio, écoute le terrain, bonne pénétration chez les propriétaires</w:t>
+            </w:r>
+          </w:p>
+        </w:tc>
+        <w:tc>
+          <w:tcPr>
+            <w:tcW w:type="dxa" w:w="2160"/>
+          </w:tcPr>
+          <w:p>
+            <w:r>
+              <w:t>témoignages et Saint-Omer</w:t>
+            </w:r>
+          </w:p>
+        </w:tc>
+      </w:tr>
+      <w:tr>
+        <w:tc>
+          <w:tcPr>
+            <w:tcW w:type="dxa" w:w="2160"/>
+          </w:tcPr>
+          <w:p>
+            <w:r>
+              <w:t>5</w:t>
+            </w:r>
+          </w:p>
+        </w:tc>
+        <w:tc>
+          <w:tcPr>
+            <w:tcW w:type="dxa" w:w="2160"/>
+          </w:tcPr>
+          <w:p>
+            <w:r>
+              <w:t>BFM Paris Île-de-France</w:t>
+            </w:r>
+          </w:p>
+        </w:tc>
+        <w:tc>
+          <w:tcPr>
+            <w:tcW w:type="dxa" w:w="2160"/>
+          </w:tcPr>
+          <w:p>
+            <w:r>
+              <w:t>télévisuel, images de parc et de comptage</w:t>
+            </w:r>
+          </w:p>
+        </w:tc>
+        <w:tc>
+          <w:tcPr>
+            <w:tcW w:type="dxa" w:w="2160"/>
+          </w:tcPr>
+          <w:p>
+            <w:r>
+              <w:t>images fortes, un espace de 15 000 m²</w:t>
+            </w:r>
+          </w:p>
+        </w:tc>
+      </w:tr>
+      <w:tr>
+        <w:tc>
+          <w:tcPr>
+            <w:tcW w:type="dxa" w:w="2160"/>
+          </w:tcPr>
+          <w:p>
+            <w:r>
+              <w:t>6</w:t>
+            </w:r>
+          </w:p>
+        </w:tc>
+        <w:tc>
+          <w:tcPr>
+            <w:tcW w:type="dxa" w:w="2160"/>
+          </w:tcPr>
+          <w:p>
+            <w:r>
+              <w:t>Presse spécialisée : 30 Millions d'Amis, Le Chien, Woopets</w:t>
+            </w:r>
+          </w:p>
+        </w:tc>
+        <w:tc>
+          <w:tcPr>
+            <w:tcW w:type="dxa" w:w="2160"/>
+          </w:tcPr>
+          <w:p>
+            <w:r>
+              <w:t>expertise canine, crédibilité auprès des propriétaires</w:t>
+            </w:r>
+          </w:p>
+        </w:tc>
+        <w:tc>
+          <w:tcPr>
+            <w:tcW w:type="dxa" w:w="2160"/>
+          </w:tcPr>
+          <w:p>
+            <w:r>
+              <w:t>faisabilité, éducation, assurance</w:t>
+            </w:r>
+          </w:p>
+        </w:tc>
+      </w:tr>
+      <w:tr>
+        <w:tc>
+          <w:tcPr>
+            <w:tcW w:type="dxa" w:w="2160"/>
+          </w:tcPr>
+          <w:p>
+            <w:r>
+              <w:t>7</w:t>
+            </w:r>
+          </w:p>
+        </w:tc>
+        <w:tc>
+          <w:tcPr>
+            <w:tcW w:type="dxa" w:w="2160"/>
+          </w:tcPr>
+          <w:p>
+            <w:r>
+              <w:t>Le Journal du Grand Paris</w:t>
+            </w:r>
+          </w:p>
+        </w:tc>
+        <w:tc>
+          <w:tcPr>
+            <w:tcW w:type="dxa" w:w="2160"/>
+          </w:tcPr>
+          <w:p>
+            <w:r>
+              <w:t>institutionnel, lu par les cabinets</w:t>
+            </w:r>
+          </w:p>
+        </w:tc>
+        <w:tc>
+          <w:tcPr>
+            <w:tcW w:type="dxa" w:w="2160"/>
+          </w:tcPr>
+          <w:p>
+            <w:r>
+              <w:t>montage juridique et financement</w:t>
+            </w:r>
+          </w:p>
+        </w:tc>
+      </w:tr>
+      <w:tr>
+        <w:tc>
+          <w:tcPr>
+            <w:tcW w:type="dxa" w:w="2160"/>
+          </w:tcPr>
+          <w:p>
+            <w:r>
+              <w:t>8</w:t>
+            </w:r>
+          </w:p>
+        </w:tc>
+        <w:tc>
+          <w:tcPr>
+            <w:tcW w:type="dxa" w:w="2160"/>
+          </w:tcPr>
+          <w:p>
+            <w:r>
+              <w:t>National après preuve : Le Monde (Paris), Libération</w:t>
+            </w:r>
+          </w:p>
+        </w:tc>
+        <w:tc>
+          <w:tcPr>
+            <w:tcW w:type="dxa" w:w="2160"/>
+          </w:tcPr>
+          <w:p>
+            <w:r>
+              <w:t>seulement avec des chiffres avant/après</w:t>
+            </w:r>
+          </w:p>
+        </w:tc>
+        <w:tc>
+          <w:tcPr>
+            <w:tcW w:type="dxa" w:w="2160"/>
+          </w:tcPr>
+          <w:p>
+            <w:r>
+              <w:t>l'expérimentation qui a marché</w:t>
+            </w:r>
+          </w:p>
+        </w:tc>
+      </w:tr>
+    </w:tbl>
+    <w:p>
+      <w:r>
+        <w:t xml:space="preserve">Relais, à distinguer de la presse : PARC.C (onze associations fédérées, environ 50 000 sympathisants) demandent des droits sans condition, donc </w:t>
+      </w:r>
       <w:r>
         <w:rPr>
           <w:b/>
         </w:rPr>
-        <w:t>La chaîne de preuve.</w:t>
-      </w:r>
-    </w:p>
-    <w:p>
-      <w:pPr>
-        <w:pStyle w:val="IntenseQuote"/>
-      </w:pPr>
-      <w:r>
-        <w:t>Un prélèvement qui n'est pas traçable ne vaut rien devant un juge.</w:t>
-      </w:r>
-    </w:p>
-    <w:p>
-      <w:r>
-        <w:t>Il faut :</w:t>
-      </w:r>
-    </w:p>
-    <w:p>
-      <w:pPr>
-        <w:pStyle w:val="ListBullet"/>
-      </w:pPr>
-      <w:r>
-        <w:t>un numéro unique,</w:t>
-      </w:r>
-    </w:p>
-    <w:p>
-      <w:pPr>
-        <w:pStyle w:val="ListBullet"/>
-      </w:pPr>
-      <w:r>
-        <w:t>un scellé,</w:t>
-      </w:r>
-    </w:p>
-    <w:p>
-      <w:pPr>
-        <w:pStyle w:val="ListBullet"/>
-      </w:pPr>
-      <w:r>
-        <w:t>un horodatage,</w:t>
-      </w:r>
-    </w:p>
-    <w:p>
-      <w:pPr>
-        <w:pStyle w:val="ListBullet"/>
-      </w:pPr>
-      <w:r>
-        <w:t>un accusé de réception du laboratoire et une durée de conservation décidée à l'avance.</w:t>
-      </w:r>
-    </w:p>
-    <w:p>
-      <w:pPr>
-        <w:pStyle w:val="ListNumber"/>
-      </w:pPr>
+        <w:t>elles ne relaieront pas un dispositif conditionnel</w:t>
+      </w:r>
+      <w:r>
+        <w:t xml:space="preserve"> : elles sont à rencontrer et à écouter, pas à instrumentaliser. Même règle avec la SPA, 30 Millions d'Amis, l'Ordre des vétérinaires et les syndicats vétérinaires, les éducateurs canins certifiés : on les informe, on ne leur demande pas d'endosser.</w:t>
+      </w:r>
+    </w:p>
+    <w:p>
+      <w:pPr>
+        <w:pStyle w:val="Heading3"/>
+      </w:pPr>
+      <w:r>
+        <w:t>Les réseaux, par nature de contenu</w:t>
+      </w:r>
+    </w:p>
+    <w:p>
+      <w:r>
+        <w:t xml:space="preserve">Le découpage utile n'est pas plateforme par plateforme, c'est : </w:t>
+      </w:r>
       <w:r>
         <w:rPr>
           <w:b/>
         </w:rPr>
-        <w:t>Le délai de rendu.</w:t>
-      </w:r>
-      <w:r>
-        <w:t xml:space="preserve"> Un propriétaire doit savoir dans quel délai la contravention peut tomber. Si le laboratoire rend en six semaines, l'effet pédagogique disparaît.</w:t>
-      </w:r>
-    </w:p>
-    <w:p>
-      <w:pPr>
-        <w:pStyle w:val="ListNumber"/>
+        <w:t>quelle image ne fonctionne que là.</w:t>
+      </w:r>
+    </w:p>
+    <w:p>
+      <w:pPr>
+        <w:pStyle w:val="ListBullet"/>
       </w:pPr>
       <w:r>
         <w:rPr>
           <w:b/>
         </w:rPr>
-        <w:t>La conformité.</w:t>
-      </w:r>
-    </w:p>
-    <w:p>
-      <w:pPr>
-        <w:pStyle w:val="ListBullet"/>
-      </w:pPr>
-      <w:r>
-        <w:t>Analyse d'impact relative à la protection des données,</w:t>
-      </w:r>
-    </w:p>
-    <w:p>
-      <w:pPr>
-        <w:pStyle w:val="ListBullet"/>
-      </w:pPr>
-      <w:r>
-        <w:t>registre des traitements,</w:t>
-      </w:r>
-    </w:p>
-    <w:p>
-      <w:pPr>
-        <w:pStyle w:val="ListBullet"/>
-      </w:pPr>
-      <w:r>
-        <w:t>durée de conservation,</w:t>
-      </w:r>
-    </w:p>
-    <w:p>
-      <w:pPr>
-        <w:pStyle w:val="ListBullet"/>
-      </w:pPr>
-      <w:r>
-        <w:t>information des personnes,</w:t>
-      </w:r>
-    </w:p>
-    <w:p>
-      <w:pPr>
-        <w:pStyle w:val="ListBullet"/>
-      </w:pPr>
-      <w:r>
-        <w:t>et la question du fichier de personnes morales ou physiques qui n'existe pas encore.</w:t>
-      </w:r>
-    </w:p>
-    <w:p>
-      <w:r>
-        <w:t>Béziers a perdu sur la preuve de nécessité, pas sur la technique, mais la LDH attaque aussi sur les données.</w:t>
+        <w:t>Instagram — les comptes de chiens parisiens.</w:t>
+      </w:r>
+      <w:r>
+        <w:t xml:space="preserve"> Le format qui marche : la carte à l'échelle. Les espaces canins dessinés en clair, la ville en gris, avec un carré de référence (Monceau). Une image, légende courte, les 0,15 m². C'est le visuel que les gens reposteront.</w:t>
+      </w:r>
+    </w:p>
+    <w:p>
+      <w:pPr>
+        <w:pStyle w:val="ListBullet"/>
+      </w:pPr>
+      <w:r>
+        <w:rPr>
+          <w:b/>
+        </w:rPr>
+        <w:t>TikTok — le comptage filmé.</w:t>
+      </w:r>
+      <w:r>
+        <w:t xml:space="preserve"> Une rue, deux compteurs, un chrono, deux semaines, un résultat avant/après. C'est le contenu que personne d'autre ne peut faire, parce qu'il faut accepter de compter à la main, deux fois par jour, pendant quinze jours. Aucun coût de production.</w:t>
+      </w:r>
+    </w:p>
+    <w:p>
+      <w:pPr>
+        <w:pStyle w:val="ListBullet"/>
+      </w:pPr>
+      <w:r>
+        <w:rPr>
+          <w:b/>
+        </w:rPr>
+        <w:t>Facebook et Nextdoor — les groupes de quartier.</w:t>
+      </w:r>
+      <w:r>
+        <w:t xml:space="preserve"> C'est là que la conversation a lieu, et le format n'est pas un post mais une question : la carte des espaces canins </w:t>
+      </w:r>
+      <w:r>
+        <w:rPr>
+          <w:i/>
+        </w:rPr>
+        <w:t>de leur arrondissement</w:t>
+      </w:r>
+      <w:r>
+        <w:t xml:space="preserve"> et les trois questions ouvertes. Le support de terrain (une réunion, un questionnaire) se recrute ici, pas sur Instagram.</w:t>
+      </w:r>
+    </w:p>
+    <w:p>
+      <w:pPr>
+        <w:pStyle w:val="ListBullet"/>
+      </w:pPr>
+      <w:r>
+        <w:rPr>
+          <w:b/>
+        </w:rPr>
+        <w:t>LinkedIn — les élus et les cabinets.</w:t>
+      </w:r>
+      <w:r>
+        <w:t xml:space="preserve"> Pas pour convaincre les propriétaires, pour exister dans le champ où circulent les notes de cabinet. Format : le dossier, pas l'opinion.</w:t>
+      </w:r>
+    </w:p>
+    <w:p>
+      <w:pPr>
+        <w:pStyle w:val="ListBullet"/>
+      </w:pPr>
+      <w:r>
+        <w:rPr>
+          <w:b/>
+        </w:rPr>
+        <w:t>X — en dernier, pour les journalistes parisiens.</w:t>
+      </w:r>
+      <w:r>
+        <w:t xml:space="preserve"> Utile pour diffuser une pièce (le comptage, la réponse écrite à une attaque), pas pour débattre.</w:t>
+      </w:r>
+    </w:p>
+    <w:p>
+      <w:pPr>
+        <w:pStyle w:val="ListBullet"/>
+      </w:pPr>
+      <w:r>
+        <w:rPr>
+          <w:b/>
+        </w:rPr>
+        <w:t>WhatsApp — le canal des copains promeneurs.</w:t>
+      </w:r>
+      <w:r>
+        <w:t xml:space="preserve"> Il ne compte pas comme audience ; il compte comme laboratoire. Ce qui fait réagir là, en bien ou en mal, est ce qui fera réagir ailleurs.</w:t>
       </w:r>
     </w:p>
     <w:p>
@@ -5069,39 +5439,96 @@
         <w:pStyle w:val="Heading3"/>
       </w:pPr>
       <w:r>
-        <w:t>Ce qu'on ne sait pas, et qu'il faut dire avant de coder</w:t>
-      </w:r>
-    </w:p>
-    <w:p>
-      <w:pPr>
-        <w:pStyle w:val="ListBullet"/>
-      </w:pPr>
-      <w:r>
-        <w:t>Combien de chiens vivent réellement à Paris : 100 000 selon la Ville, 300 000 selon le chiffre qui circule. Tout le dimensionnement change d'un facteur trois.</w:t>
-      </w:r>
-    </w:p>
-    <w:p>
-      <w:pPr>
-        <w:pStyle w:val="ListBullet"/>
-      </w:pPr>
-      <w:r>
-        <w:t>Quel taux d'aboutissement est atteignable. Notre seuil d'autofinancement est de 20 % des analyses abouties pour couvrir le coût marginal, 33 % pour le coût complet. Ce sont des calculs.</w:t>
-      </w:r>
-    </w:p>
-    <w:p>
-      <w:pPr>
-        <w:pStyle w:val="ListBullet"/>
-      </w:pPr>
-      <w:r>
-        <w:t>Le temps agent par prélèvement (20 minutes dans notre modèle, 8 € au coût marginal) : à mesurer.</w:t>
-      </w:r>
-    </w:p>
-    <w:p>
-      <w:pPr>
-        <w:pStyle w:val="ListBullet"/>
-      </w:pPr>
-      <w:r>
-        <w:t>Les capacités réelles des laboratoires sur ce volume, et leurs délais.</w:t>
+        <w:t>La séquence : la preuve d'abord, la presse ensuite</w:t>
+      </w:r>
+    </w:p>
+    <w:p>
+      <w:r>
+        <w:t>L'ordre est le fond du sujet, pas une question de tactique médiatique. Béziers est tombé sur l'ordre inverse.</w:t>
+      </w:r>
+    </w:p>
+    <w:p>
+      <w:pPr>
+        <w:pStyle w:val="ListNumber"/>
+      </w:pPr>
+      <w:r>
+        <w:rPr>
+          <w:b/>
+        </w:rPr>
+        <w:t>À froid, sans parole publique</w:t>
+      </w:r>
+      <w:r>
+        <w:t xml:space="preserve"> (zéro euro) : compter. Dix rues, deux semaines, matin et soir, deux compteurs, protocole écrit. Demander les pièces du marché de Saint-Omer et le bilan de Reims. Trois devis de laboratoires. Tant que ça n'est pas fait, on n'a pas de sujet, on a un avis.</w:t>
+      </w:r>
+    </w:p>
+    <w:p>
+      <w:pPr>
+        <w:pStyle w:val="ListNumber"/>
+      </w:pPr>
+      <w:r>
+        <w:rPr>
+          <w:b/>
+        </w:rPr>
+        <w:t>Un seul premier passage</w:t>
+      </w:r>
+      <w:r>
+        <w:t xml:space="preserve"> : la presse parisienne sur le comptage, pas sur l'idée. Un article, pas trois. Le comptage est ce qui a manqué à Béziers ; c'est aussi un angle neuf, ce qui est exactement ce qu'un journal cherche.</w:t>
+      </w:r>
+    </w:p>
+    <w:p>
+      <w:pPr>
+        <w:pStyle w:val="ListNumber"/>
+      </w:pPr>
+      <w:r>
+        <w:rPr>
+          <w:b/>
+        </w:rPr>
+        <w:t>La réunion publique</w:t>
+      </w:r>
+      <w:r>
+        <w:t xml:space="preserve"> dans l'arrondissement pilote (le 20e : 6 133 chiens identifiés, 45 conseillers d'arrondissement) — c'est là qu'un élu se déclare, ou pas.</w:t>
+      </w:r>
+    </w:p>
+    <w:p>
+      <w:pPr>
+        <w:pStyle w:val="ListNumber"/>
+      </w:pPr>
+      <w:r>
+        <w:rPr>
+          <w:b/>
+        </w:rPr>
+        <w:t>Le dépôt du dossier de budget participatif</w:t>
+      </w:r>
+      <w:r>
+        <w:t xml:space="preserve"> : un document public est un canal de communication institutionnel, et il oblige la mairie à répondre par écrit.</w:t>
+      </w:r>
+    </w:p>
+    <w:p>
+      <w:pPr>
+        <w:pStyle w:val="ListNumber"/>
+      </w:pPr>
+      <w:r>
+        <w:rPr>
+          <w:b/>
+        </w:rPr>
+        <w:t>La phase volontaire, non sanctionnante</w:t>
+      </w:r>
+      <w:r>
+        <w:t>, avec publication des chiffres avant/après. Le deuxième article vient de lui-même : « ça a baissé de X % et personne n'a été verbalisé ».</w:t>
+      </w:r>
+    </w:p>
+    <w:p>
+      <w:pPr>
+        <w:pStyle w:val="ListNumber"/>
+      </w:pPr>
+      <w:r>
+        <w:rPr>
+          <w:b/>
+        </w:rPr>
+        <w:t>Le national, et seulement là</w:t>
+      </w:r>
+      <w:r>
+        <w:t xml:space="preserve"> : après une baisse mesurée dans un périmètre, avec les chiffres, le protocole et la réponse aux objections déjà publiés. C'est à ce moment que le dossier devient une référence, et il la reste quand le débat revient.</w:t>
       </w:r>
     </w:p>
     <w:p>
@@ -5109,7 +5536,12 @@
         <w:pStyle w:val="Heading3"/>
       </w:pPr>
       <w:r>
-        <w:t>Le test à trente jours, sans budget</w:t>
+        <w:t>Le dossier de presse, pièce par pièce</w:t>
+      </w:r>
+    </w:p>
+    <w:p>
+      <w:r>
+        <w:t>Un dossier de presse normal empile des affirmations. Un dossier de presse sourcé, personne n'en reçoit : c'est l'argument de vente auprès d'un journaliste qui a cinq minutes.</w:t>
       </w:r>
     </w:p>
     <w:p>
@@ -5117,7 +5549,17 @@
         <w:pStyle w:val="ListNumber"/>
       </w:pPr>
       <w:r>
-        <w:t>Compter les déjections sur un périmètre de dix rues pendant deux semaines, matin et soir, avec un protocole écrit et deux compteurs. C'est ce que le tribunal a reproché à Béziers de ne pas avoir.</w:t>
+        <w:t>Le texte d'une page, sans jargon (</w:t>
+      </w:r>
+      <w:r>
+        <w:rPr>
+          <w:rFonts w:ascii="Consolas" w:hAnsi="Consolas"/>
+          <w:sz w:val="20"/>
+        </w:rPr>
+        <w:t>[PITCH-CITOYEN.md](#2-le-chien-citoyen-de-paris--version-grand-public)</w:t>
+      </w:r>
+      <w:r>
+        <w:t xml:space="preserve"> sert de base).</w:t>
       </w:r>
     </w:p>
     <w:p>
@@ -5125,7 +5567,7 @@
         <w:pStyle w:val="ListNumber"/>
       </w:pPr>
       <w:r>
-        <w:t>Demander des devis à trois laboratoires (Antagene, Genindexe, Animagene) sur 500, 2 000 et 5 000 analyses, avec délai, taux de réussite annoncé et conditions de conservation.</w:t>
+        <w:t>Les quatre chiffres qui portent : 100 000 chiens, 45 espaces, 0,15 m², 800 M€ de propreté — avec la source en note de bas de page.</w:t>
       </w:r>
     </w:p>
     <w:p>
@@ -5133,7 +5575,7 @@
         <w:pStyle w:val="ListNumber"/>
       </w:pPr>
       <w:r>
-        <w:t>Demander les pièces du marché de Saint-Omer et le bilan de Reims : documents administratifs communicables, réponse en un mois.</w:t>
+        <w:t>La carte à l'échelle des espaces canins, par arrondissement.</w:t>
       </w:r>
     </w:p>
     <w:p>
@@ -5141,7 +5583,31 @@
         <w:pStyle w:val="ListNumber"/>
       </w:pPr>
       <w:r>
-        <w:t>Déposer vingt échantillons témoins dans trois conditions (soleil, pluie simulée, deux jours d'attente) et faire analyser.</w:t>
+        <w:t>Saint-Omer et Béziers : ce qui a marché, ce qui a été annulé et pourquoi.</w:t>
+      </w:r>
+    </w:p>
+    <w:p>
+      <w:pPr>
+        <w:pStyle w:val="ListNumber"/>
+      </w:pPr>
+      <w:r>
+        <w:t>Ce qui n'est pas réglé, écrit noir sur blanc : le nombre réel de chiens, Île-de-France Mobilités, le régime des données.</w:t>
+      </w:r>
+    </w:p>
+    <w:p>
+      <w:pPr>
+        <w:pStyle w:val="ListNumber"/>
+      </w:pPr>
+      <w:r>
+        <w:t>Le comptage : protocole, dates, compteurs, résultats.</w:t>
+      </w:r>
+    </w:p>
+    <w:p>
+      <w:pPr>
+        <w:pStyle w:val="ListNumber"/>
+      </w:pPr>
+      <w:r>
+        <w:t>Une page de réponses préparées aux quatre attaques (ci-dessous), pour qu'un journaliste n'ait pas à nous appeler pour ça.</w:t>
       </w:r>
     </w:p>
     <w:p>
@@ -5149,66 +5615,211 @@
         <w:pStyle w:val="Heading3"/>
       </w:pPr>
       <w:r>
-        <w:t>Ce qu'il me faut de toi</w:t>
-      </w:r>
-    </w:p>
-    <w:p>
-      <w:r>
-        <w:t>Deux personnes et un cahier des charges de données :</w:t>
-      </w:r>
-    </w:p>
-    <w:p>
-      <w:pPr>
-        <w:pStyle w:val="ListBullet"/>
-      </w:pPr>
-      <w:r>
-        <w:t>quelqu'un qui sait interroger un laboratoire de génétique et lire un protocole de prélèvement,</w:t>
-      </w:r>
-    </w:p>
-    <w:p>
-      <w:pPr>
-        <w:pStyle w:val="ListBullet"/>
-      </w:pPr>
-      <w:r>
-        <w:t>quelqu'un qui sait faire un registre avec des droits d'accès et une analyse d'impact.</w:t>
-      </w:r>
-    </w:p>
-    <w:p>
-      <w:r>
-        <w:t>Le reste, comptage, dossier, courriers administratifs, je m'en occupe.</w:t>
-      </w:r>
-    </w:p>
-    <w:p>
-      <w:r>
-        <w:t>Le budget d'entrée du test est de zéro euro ; le premier vrai poste de dépense est le laboratoire, et il n'a lieu qu'après le comptage et les devis.</w:t>
-      </w:r>
-    </w:p>
-    <w:p>
-      <w:r>
-        <w:t xml:space="preserve">Détail des coûts : </w:t>
-      </w:r>
+        <w:t>Les quatre attaques, et la réponse écrite</w:t>
+      </w:r>
+    </w:p>
+    <w:p>
+      <w:r>
+        <w:t>À écrire une fois, à réutiliser mot pour mot. Une réponse improvisée sur une plateforme coûte plus cher qu'une réponse lente et écrite.</w:t>
+      </w:r>
+    </w:p>
+    <w:p>
+      <w:pPr>
+        <w:pStyle w:val="ListBullet"/>
+      </w:pPr>
       <w:r>
         <w:rPr>
-          <w:b w:val="0"/>
+          <w:b/>
         </w:rPr>
-        <w:t>ADN-COUTS-FAISABILITE.md</w:t>
-      </w:r>
-      <w:r>
-        <w:t xml:space="preserve"> et section 7 du rapport complet.</w:t>
-      </w:r>
-    </w:p>
-    <w:p>
-      <w:r>
-        <w:t xml:space="preserve">Ce qui est prouvé, ville par ville : </w:t>
-      </w:r>
+        <w:t>« C'est du fichage. »</w:t>
+      </w:r>
+      <w:r>
+        <w:t xml:space="preserve"> La base génétique reste au laboratoire, la Ville ne détient que la correspondance prélèvement → propriétaire, pour la durée bornée de l'expérimentation, sans vidéosurveillance permanente ni croisement de fichiers. Réponse publique, sources à l'appui, et l'avis de la CNIL publié dès qu'il existe.</w:t>
+      </w:r>
+    </w:p>
+    <w:p>
+      <w:pPr>
+        <w:pStyle w:val="ListBullet"/>
+      </w:pPr>
       <w:r>
         <w:rPr>
-          <w:b w:val="0"/>
+          <w:b/>
         </w:rPr>
-        <w:t>AUDIT-SOURCES.md</w:t>
-      </w:r>
-      <w:r>
-        <w:t>.</w:t>
+        <w:t>« C'est un péage pour riches. »</w:t>
+      </w:r>
+      <w:r>
+        <w:t xml:space="preserve"> Sur la cible, c'est faux : 39 % des ouvriers et 42 % des indépendants ont un chien, contre 34 % des cadres. Sur la barrière, c'est vrai : d'où l'identification gratuite, les exonérations, les journées de quartier, l'assurance de groupe.</w:t>
+      </w:r>
+    </w:p>
+    <w:p>
+      <w:pPr>
+        <w:pStyle w:val="ListBullet"/>
+      </w:pPr>
+      <w:r>
+        <w:rPr>
+          <w:b/>
+        </w:rPr>
+        <w:t>« Ça ne sert qu'à verbaliser. »</w:t>
+      </w:r>
+      <w:r>
+        <w:t xml:space="preserve"> Les amendes ne financent rien — à Saint-Omer, trois déjections ont pu être attribuées. Le résultat cherché est la baisse mesurée, pas le rendement.</w:t>
+      </w:r>
+    </w:p>
+    <w:p>
+      <w:pPr>
+        <w:pStyle w:val="ListBullet"/>
+      </w:pPr>
+      <w:r>
+        <w:rPr>
+          <w:b/>
+        </w:rPr>
+        <w:t>« Vous êtes qui, au juste ? »</w:t>
+      </w:r>
+      <w:r>
+        <w:t xml:space="preserve"> La question la plus dangereuse, et elle se répond par la transparence : ni association ni mandat, un dossier de travail documenté, un comptage fait à la main, et les sources publiques pour que n'importe qui refasse le calcul.</w:t>
+      </w:r>
+    </w:p>
+    <w:p>
+      <w:pPr>
+        <w:pStyle w:val="Heading3"/>
+      </w:pPr>
+      <w:r>
+        <w:t>Crise : le scénario qu'il faut avoir écrit d'avance</w:t>
+      </w:r>
+    </w:p>
+    <w:p>
+      <w:r>
+        <w:t>Si un média part sur « on veut ficher l'ADN des chiens de Paris », la réponse est toujours la même, et elle n'est jamais émotionnelle : les données, le laboratoire, la durée bornée, le comptage, et l'offre de transmettre les pièces. Deux règles : on ne répond jamais dans le fil de commentaires d'une plateforme (on publie une réponse écrite et on la lie), et on ne corrige jamais un chiffre sans publier la correction visiblement — la crédibilité du dossier est son seul actif, et une correction publiée coûte moins cher qu'une erreur défendue.</w:t>
+      </w:r>
+    </w:p>
+    <w:p>
+      <w:pPr>
+        <w:pStyle w:val="Heading3"/>
+      </w:pPr>
+      <w:r>
+        <w:t>Ce que ça coûte</w:t>
+      </w:r>
+    </w:p>
+    <w:p>
+      <w:r>
+        <w:t>Zéro euro au départ : du temps, un comptage, trois devis, des courriers administratifs. Ensuite, si quelque chose doit être payé : la carte imprimée pour les réunions, la salle, un site d'une page. Le seul poste qui compte vraiment est le comptage — et il se fait à pied.</w:t>
+      </w:r>
+    </w:p>
+    <w:p>
+      <w:pPr>
+        <w:pStyle w:val="Heading3"/>
+      </w:pPr>
+      <w:r>
+        <w:t>Ce qui compte comme réussite</w:t>
+      </w:r>
+    </w:p>
+    <w:p>
+      <w:r>
+        <w:t>Pas les likes, pas les partages. Trois signaux, dans l'ordre :</w:t>
+      </w:r>
+    </w:p>
+    <w:p>
+      <w:pPr>
+        <w:pStyle w:val="ListNumber"/>
+      </w:pPr>
+      <w:r>
+        <w:rPr>
+          <w:b/>
+        </w:rPr>
+        <w:t>une question posée par un relais</w:t>
+      </w:r>
+      <w:r>
+        <w:t xml:space="preserve"> qui n'est pas un copain : un journaliste, une association, un éducateur ;</w:t>
+      </w:r>
+    </w:p>
+    <w:p>
+      <w:pPr>
+        <w:pStyle w:val="ListNumber"/>
+      </w:pPr>
+      <w:r>
+        <w:rPr>
+          <w:b/>
+        </w:rPr>
+        <w:t>une contribution au comptage</w:t>
+      </w:r>
+      <w:r>
+        <w:t xml:space="preserve"> : quelqu'un qui compte dans sa rue sans qu'on le lui demande ;</w:t>
+      </w:r>
+    </w:p>
+    <w:p>
+      <w:pPr>
+        <w:pStyle w:val="ListNumber"/>
+      </w:pPr>
+      <w:r>
+        <w:rPr>
+          <w:b/>
+        </w:rPr>
+        <w:t>un rendez-vous obtenu</w:t>
+      </w:r>
+      <w:r>
+        <w:t xml:space="preserve"> chez un élu, un cabinet ou une mairie d'arrondissement.</w:t>
+      </w:r>
+    </w:p>
+    <w:p>
+      <w:r>
+        <w:t>Le reste est du bruit agréable. Et le meilleur signe qu'une campagne de ce type fonctionne, c'est qu'on nous reprend nos chiffres — y compris pour nous contredire.</w:t>
+      </w:r>
+    </w:p>
+    <w:p>
+      <w:pPr>
+        <w:pStyle w:val="Heading3"/>
+      </w:pPr>
+      <w:r>
+        <w:t>Suite</w:t>
+      </w:r>
+    </w:p>
+    <w:p>
+      <w:pPr>
+        <w:pStyle w:val="ListBullet"/>
+      </w:pPr>
+      <w:r>
+        <w:t>Écrire le protocole de comptage en une page, exécutable par quelqu'un d'autre que nous.</w:t>
+      </w:r>
+    </w:p>
+    <w:p>
+      <w:pPr>
+        <w:pStyle w:val="ListBullet"/>
+      </w:pPr>
+      <w:r>
+        <w:t>Préparer les quatre réponses et le dossier de presse en pièces séparées.</w:t>
+      </w:r>
+    </w:p>
+    <w:p>
+      <w:pPr>
+        <w:pStyle w:val="ListBullet"/>
+      </w:pPr>
+      <w:r>
+        <w:t>Faire la carte à l'échelle, arrondissement par arrondissement : c'est le seul actif visuel dont on ait besoin.</w:t>
+      </w:r>
+    </w:p>
+    <w:p>
+      <w:r>
+        <w:t xml:space="preserve">Sources et statut de chaque chiffre : </w:t>
+      </w:r>
+      <w:r>
+        <w:rPr>
+          <w:rFonts w:ascii="Consolas" w:hAnsi="Consolas"/>
+          <w:sz w:val="20"/>
+        </w:rPr>
+        <w:t>[AUDIT-SOURCES.md](#6-audit-anti-hallucination-du-dossier-chiens-paris)</w:t>
+      </w:r>
+      <w:r>
+        <w:t xml:space="preserve">. La superficie du parc Monceau (8,25 ha) : https://www.paris.fr/lieux/parc-monceau-1804 Le détail des coûts et des hypothèses : </w:t>
+      </w:r>
+      <w:r>
+        <w:rPr>
+          <w:rFonts w:ascii="Consolas" w:hAnsi="Consolas"/>
+          <w:sz w:val="20"/>
+        </w:rPr>
+        <w:t>[RAPPORT-COMPLET-CHIENS-PARIS.md](#12-rapport--un-projet-politique--chiens-de-paris---statut-du-chien-citoyen-registre-adn-droits-et-chiffrage)</w:t>
+      </w:r>
+      <w:r>
+        <w:t xml:space="preserve"> (annexe E pour les URL).</w:t>
       </w:r>
     </w:p>
     <w:p>
@@ -7771,6 +8382,104 @@
       </w:r>
       <w:r>
         <w:t xml:space="preserve"> : -85 % attribué à la mairie.</w:t>
+      </w:r>
+    </w:p>
+    <w:p>
+      <w:pPr>
+        <w:pStyle w:val="Heading3"/>
+      </w:pPr>
+      <w:r>
+        <w:t>6. Ajouts postérieurs à l'audit</w:t>
+      </w:r>
+    </w:p>
+    <w:p>
+      <w:r>
+        <w:t>Le volet communication, presse et réseaux (</w:t>
+      </w:r>
+      <w:r>
+        <w:rPr>
+          <w:rFonts w:ascii="Consolas" w:hAnsi="Consolas"/>
+          <w:sz w:val="20"/>
+        </w:rPr>
+        <w:t>[PITCH-COM-PRESSE-RESEAUX.md](#5-volet-communication-presse-et-réseaux)</w:t>
+      </w:r>
+      <w:r>
+        <w:t>) a été ajouté après la passe de vérification. Les affirmations qu'il introduit ont été vérifiées à part :</w:t>
+      </w:r>
+    </w:p>
+    <w:p>
+      <w:pPr>
+        <w:pStyle w:val="ListNumber"/>
+      </w:pPr>
+      <w:r>
+        <w:rPr>
+          <w:b/>
+        </w:rPr>
+        <w:t>Les 45 espaces canins réunis font un peu moins d'un cinquième du parc Monceau.</w:t>
+      </w:r>
+      <w:r>
+        <w:t xml:space="preserve"> </w:t>
+      </w:r>
+      <w:r>
+        <w:rPr>
+          <w:rFonts w:ascii="Consolas" w:hAnsi="Consolas"/>
+          <w:sz w:val="20"/>
+        </w:rPr>
+        <w:t>confirmé</w:t>
+      </w:r>
+      <w:r>
+        <w:t xml:space="preserve"> : le dossier retient ~15 000 m² d'espaces canins [E], le parc Monceau mesure 8,25 ha, soit 82 500 m². Le rapport donne 18 %.</w:t>
+      </w:r>
+    </w:p>
+    <w:p>
+      <w:r>
+        <w:t>Sources : https://www.paris.fr/lieux/parc-monceau-1804 https://fr.wikipedia.org/wiki/Parc_Monceau</w:t>
+      </w:r>
+    </w:p>
+    <w:p>
+      <w:pPr>
+        <w:pStyle w:val="ListNumber"/>
+      </w:pPr>
+      <w:r>
+        <w:t xml:space="preserve">Les autres chiffres employés par le volet communication (100 000 chiens, 0,15 m² par chien, 800 M€ de propreté, Saint-Omer, Béziers, la répartition sociale des propriétaires) sont ceux de </w:t>
+      </w:r>
+      <w:r>
+        <w:rPr>
+          <w:rFonts w:ascii="Consolas" w:hAnsi="Consolas"/>
+          <w:sz w:val="20"/>
+        </w:rPr>
+        <w:t>[PITCH-ET-RESUME.md](#1-le-statut-du-chien-citoyen-de-paris)</w:t>
+      </w:r>
+      <w:r>
+        <w:t xml:space="preserve"> et </w:t>
+      </w:r>
+      <w:r>
+        <w:rPr>
+          <w:rFonts w:ascii="Consolas" w:hAnsi="Consolas"/>
+          <w:sz w:val="20"/>
+        </w:rPr>
+        <w:t>[PITCH-CITOYEN.md](#2-le-chien-citoyen-de-paris--version-grand-public)</w:t>
+      </w:r>
+      <w:r>
+        <w:t>, déjà audités en sections 2 et 3.</w:t>
+      </w:r>
+    </w:p>
+    <w:p>
+      <w:pPr>
+        <w:pStyle w:val="ListNumber"/>
+      </w:pPr>
+      <w:r>
+        <w:t xml:space="preserve">Le retrait de </w:t>
+      </w:r>
+      <w:r>
+        <w:rPr>
+          <w:rFonts w:ascii="Consolas" w:hAnsi="Consolas"/>
+          <w:sz w:val="20"/>
+        </w:rPr>
+        <w:t>PITCH-COLLAB-TECHNIQUE-IT.md</w:t>
+      </w:r>
+      <w:r>
+        <w:t xml:space="preserve"> est une décision éditoriale, pas une correction : la pièce technique ne fait pas partie du dossier communiqué.</w:t>
       </w:r>
     </w:p>
     <w:p>
@@ -16178,7 +16887,7 @@
           </w:tcPr>
           <w:p>
             <w:r>
-              <w:t>PITCH-COLLAB-TECHNIQUE-IT.md</w:t>
+              <w:t>PITCH-COM-PRESSE-RESEAUX.md</w:t>
             </w:r>
           </w:p>
         </w:tc>
@@ -16188,7 +16897,7 @@
           </w:tcPr>
           <w:p>
             <w:r>
-              <w:t>Pitch pour un profil technique</w:t>
+              <w:t>Volet communication, presse et réseaux</w:t>
             </w:r>
           </w:p>
         </w:tc>
@@ -16198,7 +16907,7 @@
           </w:tcPr>
           <w:p>
             <w:r>
-              <w:t>137</w:t>
+              <w:t>193</w:t>
             </w:r>
           </w:p>
         </w:tc>
@@ -16230,7 +16939,7 @@
           </w:tcPr>
           <w:p>
             <w:r>
-              <w:t>230</w:t>
+              <w:t>250</w:t>
             </w:r>
           </w:p>
         </w:tc>

</xml_diff>

<commit_message>
Chiens: note juridique du comptage citoyen (preconstitué, contradictoire, horodaté) + annexe C renforcee
</commit_message>
<xml_diff>
--- a/export/Chien-citoyen-de-Paris-dossier-complet.docx
+++ b/export/Chien-citoyen-de-Paris-dossier-complet.docx
@@ -1018,7 +1018,105 @@
         <w:rPr>
           <w:b w:val="0"/>
         </w:rPr>
-        <w:t>8. Tests ADN canins : coûts et faisabilité</w:t>
+        <w:t>8. Note juridique — la valeur juridique du comptage citoyen</w:t>
+      </w:r>
+      <w:r>
+        <w:t xml:space="preserve"> — </w:t>
+      </w:r>
+      <w:r>
+        <w:rPr>
+          <w:rFonts w:ascii="Consolas" w:hAnsi="Consolas"/>
+          <w:sz w:val="20"/>
+        </w:rPr>
+        <w:t>NOTE-JURIDIQUE-COMPTAGE-CITOYEN.md</w:t>
+      </w:r>
+    </w:p>
+    <w:p>
+      <w:pPr>
+        <w:pStyle w:val="ListBullet2"/>
+      </w:pPr>
+      <w:r>
+        <w:rPr>
+          <w:b w:val="0"/>
+        </w:rPr>
+        <w:t>1. Ce que le juge a réellement reproché à Béziers</w:t>
+      </w:r>
+    </w:p>
+    <w:p>
+      <w:pPr>
+        <w:pStyle w:val="ListBullet2"/>
+      </w:pPr>
+      <w:r>
+        <w:rPr>
+          <w:b w:val="0"/>
+        </w:rPr>
+        <w:t>2. Les trois piliers d'un relevé qui tient</w:t>
+      </w:r>
+    </w:p>
+    <w:p>
+      <w:pPr>
+        <w:pStyle w:val="ListBullet2"/>
+      </w:pPr>
+      <w:r>
+        <w:rPr>
+          <w:b w:val="0"/>
+        </w:rPr>
+        <w:t>3. Le piège à ne pas recréer : les données personnelles</w:t>
+      </w:r>
+    </w:p>
+    <w:p>
+      <w:pPr>
+        <w:pStyle w:val="ListBullet2"/>
+      </w:pPr>
+      <w:r>
+        <w:rPr>
+          <w:b w:val="0"/>
+        </w:rPr>
+        <w:t>4. Ce qu'un comptage citoyen ne peut pas faire</w:t>
+      </w:r>
+    </w:p>
+    <w:p>
+      <w:pPr>
+        <w:pStyle w:val="ListBullet2"/>
+      </w:pPr>
+      <w:r>
+        <w:rPr>
+          <w:b w:val="0"/>
+        </w:rPr>
+        <w:t>5. Les trois niveaux d'escalade</w:t>
+      </w:r>
+    </w:p>
+    <w:p>
+      <w:pPr>
+        <w:pStyle w:val="ListBullet2"/>
+      </w:pPr>
+      <w:r>
+        <w:rPr>
+          <w:b w:val="0"/>
+        </w:rPr>
+        <w:t>6. Ce que le comptage ne suffira pas à fermer</w:t>
+      </w:r>
+    </w:p>
+    <w:p>
+      <w:pPr>
+        <w:pStyle w:val="ListBullet2"/>
+      </w:pPr>
+      <w:r>
+        <w:rPr>
+          <w:b w:val="0"/>
+        </w:rPr>
+        <w:t>Sources</w:t>
+      </w:r>
+    </w:p>
+    <w:p>
+      <w:pPr>
+        <w:pStyle w:val="ListBullet"/>
+      </w:pPr>
+      <w:r>
+        <w:rPr>
+          <w:b w:val="0"/>
+        </w:rPr>
+        <w:t>9. Tests ADN canins : coûts et faisabilité</w:t>
       </w:r>
       <w:r>
         <w:t xml:space="preserve"> — </w:t>
@@ -1083,7 +1181,7 @@
         <w:rPr>
           <w:b w:val="0"/>
         </w:rPr>
-        <w:t>9. Statut du chien citoyen — note de conception</w:t>
+        <w:t>10. Statut du chien citoyen — note de conception</w:t>
       </w:r>
       <w:r>
         <w:t xml:space="preserve"> — </w:t>
@@ -1192,7 +1290,7 @@
         <w:rPr>
           <w:b w:val="0"/>
         </w:rPr>
-        <w:t>10. Projet d'arrêté et règlement du statut</w:t>
+        <w:t>11. Projet d'arrêté et règlement du statut</w:t>
       </w:r>
       <w:r>
         <w:t xml:space="preserve"> — </w:t>
@@ -1257,7 +1355,7 @@
         <w:rPr>
           <w:b w:val="0"/>
         </w:rPr>
-        <w:t>11. Projet « chiens de Paris » — creusage</w:t>
+        <w:t>12. Projet « chiens de Paris » — creusage</w:t>
       </w:r>
       <w:r>
         <w:t xml:space="preserve"> — </w:t>
@@ -1366,7 +1464,7 @@
         <w:rPr>
           <w:b w:val="0"/>
         </w:rPr>
-        <w:t>12. Rapport complet et chiffrage</w:t>
+        <w:t>13. Rapport complet et chiffrage</w:t>
       </w:r>
       <w:r>
         <w:t xml:space="preserve"> — </w:t>
@@ -1552,7 +1650,7 @@
         <w:rPr>
           <w:b w:val="0"/>
         </w:rPr>
-        <w:t>Annexe C — Protocole de comptage des déjections (pièce manquante à Béziers)</w:t>
+        <w:t>Annexe C — Protocole de comptage citoyen des déjections (pièce manquante à Béziers)</w:t>
       </w:r>
     </w:p>
     <w:p>
@@ -5816,7 +5914,7 @@
           <w:rFonts w:ascii="Consolas" w:hAnsi="Consolas"/>
           <w:sz w:val="20"/>
         </w:rPr>
-        <w:t>[RAPPORT-COMPLET-CHIENS-PARIS.md](#12-rapport--un-projet-politique--chiens-de-paris---statut-du-chien-citoyen-registre-adn-droits-et-chiffrage)</w:t>
+        <w:t>[RAPPORT-COMPLET-CHIENS-PARIS.md](#13-rapport--un-projet-politique--chiens-de-paris---statut-du-chien-citoyen-registre-adn-droits-et-chiffrage)</w:t>
       </w:r>
       <w:r>
         <w:t xml:space="preserve"> (annexe E pour les URL).</w:t>
@@ -8469,6 +8567,132 @@
         <w:pStyle w:val="ListNumber"/>
       </w:pPr>
       <w:r>
+        <w:rPr>
+          <w:b/>
+        </w:rPr>
+        <w:t>Le comptage national des oiseaux des jardins comme modèle de comptage citoyen.</w:t>
+      </w:r>
+      <w:r>
+        <w:t xml:space="preserve"> </w:t>
+      </w:r>
+      <w:r>
+        <w:rPr>
+          <w:rFonts w:ascii="Consolas" w:hAnsi="Consolas"/>
+          <w:sz w:val="20"/>
+        </w:rPr>
+        <w:t>confirmé</w:t>
+      </w:r>
+      <w:r>
+        <w:t xml:space="preserve"> : organisé par la LPO et l'équipe Vigie-nature (Muséum national d'histoire naturelle, Office français de la biodiversité) depuis 2012 ; près de 100 000 jardins en dix ans, 24 048 contributeurs pour l'édition de janvier 2022 ; deux éditions par an, aux derniers week-ends de janvier et de mai, précisément pour obtenir des périodes comparables ; règle de comptage explicite (« le nombre maximal d'individus vus en même temps », pour éviter les doubles comptes). Sert de référence à l'annexe C du rapport (zone témoin, pré-enregistrement du protocole, créneaux fixes).</w:t>
+      </w:r>
+    </w:p>
+    <w:p>
+      <w:r>
+        <w:t>Sources : https://www.lpo.fr/decouvrir-la-nature/loisirs-nature/grands-rendez-vous/comptage-des-oiseaux-des-jardins https://www.lpo.fr/qui-sommes-nous/espace-presse/communiques/cp-2023/comptage-des-oiseaux-des-jardins-bilan-de-10-ans-de-sciences-citoyennes</w:t>
+      </w:r>
+    </w:p>
+    <w:p>
+      <w:pPr>
+        <w:pStyle w:val="ListNumber"/>
+      </w:pPr>
+      <w:r>
+        <w:rPr>
+          <w:b/>
+        </w:rPr>
+        <w:t>Les motifs du jugement du 6 mai 2025 (TA Montpellier, arrêté ADN de Béziers)</w:t>
+      </w:r>
+      <w:r>
+        <w:t xml:space="preserve"> ont été relus à la source pour la note </w:t>
+      </w:r>
+      <w:r>
+        <w:rPr>
+          <w:rFonts w:ascii="Consolas" w:hAnsi="Consolas"/>
+          <w:sz w:val="20"/>
+        </w:rPr>
+        <w:t>[NOTE-JURIDIQUE-COMPTAGE-CITOYEN.md](#8-note-juridique--ce-qui-donne-une-valeur-juridique-au-comptage-citoyen)</w:t>
+      </w:r>
+      <w:r>
+        <w:t xml:space="preserve">, qui cite l'extrait exact publié par la LDH : aucune pièce du dossier ne corrobore l'atteinte invoquée pour 2020-2022, l'inefficacité des mesures existantes n'est pas établie, et la mesure n'est « ni nécessaire, ni adaptée, ni proportionnée ». </w:t>
+      </w:r>
+      <w:r>
+        <w:rPr>
+          <w:rFonts w:ascii="Consolas" w:hAnsi="Consolas"/>
+          <w:sz w:val="20"/>
+        </w:rPr>
+        <w:t>confirmé</w:t>
+      </w:r>
+      <w:r>
+        <w:t xml:space="preserve"> (citation reproduite telle que publiée par la LDH, reprise par la presse locale).</w:t>
+      </w:r>
+    </w:p>
+    <w:p>
+      <w:r>
+        <w:t>Sources : https://www.ldh-france.org/beziers-lidentification-genetique-des-chiens/ https://www.20minutes.fr/justice/4153524-20250514-beziers-identification-chiens-adn-contre-dejections-annulee-robert-menard-persiste</w:t>
+      </w:r>
+    </w:p>
+    <w:p>
+      <w:pPr>
+        <w:pStyle w:val="ListNumber"/>
+      </w:pPr>
+      <w:r>
+        <w:rPr>
+          <w:b/>
+        </w:rPr>
+        <w:t>Article 537 du code de procédure pénale</w:t>
+      </w:r>
+      <w:r>
+        <w:t xml:space="preserve"> (les procès-verbaux ou rapports font foi jusqu'à preuve contraire en matière contraventionnelle ; la preuve contraire ne peut être rapportée que par écrit ou par témoins). </w:t>
+      </w:r>
+      <w:r>
+        <w:rPr>
+          <w:rFonts w:ascii="Consolas" w:hAnsi="Consolas"/>
+          <w:sz w:val="20"/>
+        </w:rPr>
+        <w:t>confirmé</w:t>
+      </w:r>
+      <w:r>
+        <w:t xml:space="preserve"> : texte reproduit dans la question écrite du Sénat citée en source ; la note renvoie au code sur Légifrance plutôt qu'à un identifiant d'article.</w:t>
+      </w:r>
+    </w:p>
+    <w:p>
+      <w:r>
+        <w:t>Source : https://www.senat.fr/questions/base/2007/qSEQ070801568.html</w:t>
+      </w:r>
+    </w:p>
+    <w:p>
+      <w:pPr>
+        <w:pStyle w:val="ListNumber"/>
+      </w:pPr>
+      <w:r>
+        <w:rPr>
+          <w:b/>
+        </w:rPr>
+        <w:t>Horodatage électronique qualifié</w:t>
+      </w:r>
+      <w:r>
+        <w:t xml:space="preserve"> (présomption d'exactitude de la date et d'intégrité des données, art. 41 § 2 et 42 du règlement eIDAS) : </w:t>
+      </w:r>
+      <w:r>
+        <w:rPr>
+          <w:rFonts w:ascii="Consolas" w:hAnsi="Consolas"/>
+          <w:sz w:val="20"/>
+        </w:rPr>
+        <w:t>confirmé</w:t>
+      </w:r>
+      <w:r>
+        <w:t xml:space="preserve"> auprès de la page de l'ANSSI sur les services de confiance, qui rappelle aussi qu'un horodatage non qualifié ne peut pas être écarté au seul motif qu'il est électronique.</w:t>
+      </w:r>
+    </w:p>
+    <w:p>
+      <w:r>
+        <w:t>Source : https://cyber.gouv.fr/reglementation/reglementation-identite-confiance-numerique/securite-echanges-voie-electronique/reglement-eidas/services-de-confiance/</w:t>
+      </w:r>
+    </w:p>
+    <w:p>
+      <w:pPr>
+        <w:pStyle w:val="ListNumber"/>
+      </w:pPr>
+      <w:r>
         <w:t xml:space="preserve">Le retrait de </w:t>
       </w:r>
       <w:r>
@@ -8788,7 +9012,424 @@
         <w:pStyle w:val="Heading2"/>
       </w:pPr>
       <w:r>
-        <w:t>8. Tests ADN canins : coûts réels, facilité de mise en œuvre, et chiffrage pour Paris (29/09/2026)</w:t>
+        <w:t>8. Note juridique — ce qui donne une valeur juridique au comptage citoyen</w:t>
+      </w:r>
+    </w:p>
+    <w:p>
+      <w:r>
+        <w:rPr>
+          <w:i/>
+        </w:rPr>
+        <w:t>Source : `NOTE-JURIDIQUE-COMPTAGE-CITOYEN.md`.</w:t>
+      </w:r>
+    </w:p>
+    <w:p>
+      <w:r>
+        <w:t>29 septembre 2026. Question posée : suffit-il d'une photo géodatée stockée sur un serveur, ou faut-il un protocole ? Réponse courte : non, une photo sur un serveur ne prouve rien — ce qui prouve, c'est la manière dont le relevé est préconstitué, contradictoire et daté. Détail ci-dessous. Rien n'a été voté.</w:t>
+      </w:r>
+    </w:p>
+    <w:p>
+      <w:pPr>
+        <w:pStyle w:val="Heading3"/>
+      </w:pPr>
+      <w:r>
+        <w:t>1. Ce que le juge a réellement reproché à Béziers</w:t>
+      </w:r>
+    </w:p>
+    <w:p>
+      <w:r>
+        <w:t>C'est le point de départ, et il fixe tout le reste. Le tribunal administratif de Montpellier annule l'arrêté du 12 mai 2023 par jugement du 6 mai 2025, sur trois motifs, dans cet ordre :</w:t>
+      </w:r>
+    </w:p>
+    <w:p>
+      <w:pPr>
+        <w:pStyle w:val="ListNumber"/>
+      </w:pPr>
+      <w:r>
+        <w:rPr>
+          <w:b/>
+        </w:rPr>
+        <w:t>L'atteinte n'est pas démontrée.</w:t>
+      </w:r>
+      <w:r>
+        <w:t xml:space="preserve"> « Aucune pièce du dossier ne permet de corroborer les éléments indiqués dans l'exposé des motifs de l'arrêté, notamment l'atteinte qui serait portée à la sécurité et à la salubrité publique par le nombre de déjections canines ramassées au cours des années 2020, 2021, 2022. »</w:t>
+      </w:r>
+    </w:p>
+    <w:p>
+      <w:pPr>
+        <w:pStyle w:val="ListNumber"/>
+      </w:pPr>
+      <w:r>
+        <w:rPr>
+          <w:b/>
+        </w:rPr>
+        <w:t>L'inefficacité des mesures déjà prises n'est pas démontrée</w:t>
+      </w:r>
+      <w:r>
+        <w:t xml:space="preserve"> — la mairie n'a pas non plus établi que ce qu'elle faisait déjà ne suffisait pas.</w:t>
+      </w:r>
+    </w:p>
+    <w:p>
+      <w:pPr>
+        <w:pStyle w:val="ListNumber"/>
+      </w:pPr>
+      <w:r>
+        <w:rPr>
+          <w:b/>
+        </w:rPr>
+        <w:t>La mesure n'est « ni nécessaire, ni adaptée, ni proportionnée »</w:t>
+      </w:r>
+      <w:r>
+        <w:t>, et l'identification classique (tatouage ou marquage, obligatoire au titre de l'article L. 212-10 du code rural) n'est pas démontrée insuffisante.</w:t>
+      </w:r>
+    </w:p>
+    <w:p>
+      <w:r>
+        <w:t xml:space="preserve">Conséquence pour un comptage : </w:t>
+      </w:r>
+      <w:r>
+        <w:rPr>
+          <w:b/>
+        </w:rPr>
+        <w:t>ce n'est pas un relevé, c'est un dossier de preuve</w:t>
+      </w:r>
+      <w:r>
+        <w:t xml:space="preserve">, et il doit répondre à ces trois points. Le premier exige un </w:t>
+      </w:r>
+      <w:r>
+        <w:rPr>
+          <w:b/>
+        </w:rPr>
+        <w:t>volume daté sur plusieurs périodes</w:t>
+      </w:r>
+      <w:r>
+        <w:t xml:space="preserve"> — le juge compare 2020, 2021, 2022, il ne compare pas une semaine à une autre. Un comptage unique ne ferme aucun de ces trous.</w:t>
+      </w:r>
+    </w:p>
+    <w:p>
+      <w:pPr>
+        <w:pStyle w:val="Heading3"/>
+      </w:pPr>
+      <w:r>
+        <w:t>2. Les trois piliers d'un relevé qui tient</w:t>
+      </w:r>
+    </w:p>
+    <w:p>
+      <w:r>
+        <w:t>Un comptage citoyen est une preuve par témoins et par écrits : le juge administratif apprécie librement les moyens de preuve, mais il apprécie la crédibilité de leur fabrication. Trois mots comptent plus que la photo.</w:t>
+      </w:r>
+    </w:p>
+    <w:p>
+      <w:r>
+        <w:rPr>
+          <w:b/>
+        </w:rPr>
+        <w:t>a. Préconstitué.</w:t>
+      </w:r>
+      <w:r>
+        <w:t xml:space="preserve"> Le protocole — tronçons, créneaux, règle de comptage, dates de début et de fin — est publié avant le premier passage, et ne bouge plus. Un protocole connu après coup est réputé arrangé ; un protocole publié d'avance est opposable. C'est la même logique que le préenregistrement d'un essai clinique, et c'est ce qui distingue un relevé d'un argument.</w:t>
+      </w:r>
+    </w:p>
+    <w:p>
+      <w:r>
+        <w:rPr>
+          <w:b/>
+        </w:rPr>
+        <w:t>b. Contradictoire.</w:t>
+      </w:r>
+      <w:r>
+        <w:t xml:space="preserve"> Deux observateurs distincts par passage, dont un qui n'est pas partie prenante. Et surtout : la partie adverse est </w:t>
+      </w:r>
+      <w:r>
+        <w:rPr>
+          <w:b/>
+        </w:rPr>
+        <w:t>informée par écrit et invitée</w:t>
+      </w:r>
+      <w:r>
+        <w:t xml:space="preserve"> — courrier à la mairie, à la mairie d'arrondissement et au préfet, avec le protocole, les dates et l'invitation à désigner un observateur. Si elle ne vient pas, la preuve de l'invitation reste au dossier : c'est exactement ce qui prive l'autre partie du droit de contester la méthode. Sans cette pièce, tout relevé est « unilatéral ».</w:t>
+      </w:r>
+    </w:p>
+    <w:p>
+      <w:r>
+        <w:rPr>
+          <w:b/>
+        </w:rPr>
+        <w:t>c. Daté et intègre.</w:t>
+      </w:r>
+      <w:r>
+        <w:t xml:space="preserve"> C'est ici que le serveur lambda ne suffit pas. Un fichier photo, une date EXIF et un stockage quelconque ne prouvent ni la date ni la non-modification : les métadonnées se réécrivent en deux clics, et personne ne peut affirmer que le fichier conservé est celui qui a été pris. Ce qu'il faut, et ce qui est vérifiable par un tiers :</w:t>
+      </w:r>
+    </w:p>
+    <w:p>
+      <w:pPr>
+        <w:pStyle w:val="ListBullet"/>
+      </w:pPr>
+      <w:r>
+        <w:t xml:space="preserve">une </w:t>
+      </w:r>
+      <w:r>
+        <w:rPr>
+          <w:b/>
+        </w:rPr>
+        <w:t>fiche de relevé</w:t>
+      </w:r>
+      <w:r>
+        <w:t xml:space="preserve"> identique à chaque passage : tronçon, heure, nombre, position, conditions (météo, balayeuse, marché, vacances, travaux), nom des deux observateurs, photo ;</w:t>
+      </w:r>
+    </w:p>
+    <w:p>
+      <w:pPr>
+        <w:pStyle w:val="ListBullet"/>
+      </w:pPr>
+      <w:r>
+        <w:t xml:space="preserve">une </w:t>
+      </w:r>
+      <w:r>
+        <w:rPr>
+          <w:b/>
+        </w:rPr>
+        <w:t>empreinte SHA-256 de chaque fiche et de chaque photo</w:t>
+      </w:r>
+      <w:r>
+        <w:t>, imprimée dans le tableau publié ;</w:t>
+      </w:r>
+    </w:p>
+    <w:p>
+      <w:pPr>
+        <w:pStyle w:val="ListBullet"/>
+      </w:pPr>
+      <w:r>
+        <w:t xml:space="preserve">un </w:t>
+      </w:r>
+      <w:r>
+        <w:rPr>
+          <w:b/>
+        </w:rPr>
+        <w:t>horodatage électronique</w:t>
+      </w:r>
+      <w:r>
+        <w:t xml:space="preserve"> de ces empreintes, chaque semaine. Un horodatage </w:t>
+      </w:r>
+      <w:r>
+        <w:rPr>
+          <w:b/>
+        </w:rPr>
+        <w:t>qualifié</w:t>
+      </w:r>
+      <w:r>
+        <w:t xml:space="preserve"> (règlement eIDAS n° 910/2014, art. 41 § 2 et 42, prestataire de services de confiance qualifié, protocole RFC 3161) bénéficie d'une </w:t>
+      </w:r>
+      <w:r>
+        <w:rPr>
+          <w:b/>
+        </w:rPr>
+        <w:t>présomption d'exactitude de la date et d'intégrité des données</w:t>
+      </w:r>
+      <w:r>
+        <w:t xml:space="preserve"> : c'est à celui qui conteste de démontrer la fausseté. Un horodatage simple reste recevable mais n'emporte aucune présomption, et l'ancrage en chaîne de blocs, pratique et gratuit, reste apprécié librement par le juge — utile parce que n'importe qui peut le vérifier, mais ce n'est pas un service de confiance qualifié.</w:t>
+      </w:r>
+    </w:p>
+    <w:p>
+      <w:pPr>
+        <w:pStyle w:val="ListBullet"/>
+      </w:pPr>
+      <w:r>
+        <w:t xml:space="preserve">la </w:t>
+      </w:r>
+      <w:r>
+        <w:rPr>
+          <w:b/>
+        </w:rPr>
+        <w:t>publication des données brutes</w:t>
+      </w:r>
+      <w:r>
+        <w:t xml:space="preserve"> (fiches, photos, tableaux) : une preuve que l'adversaire peut refaire est une preuve qu'il ne peut pas écarter.</w:t>
+      </w:r>
+    </w:p>
+    <w:p>
+      <w:pPr>
+        <w:pStyle w:val="Heading3"/>
+      </w:pPr>
+      <w:r>
+        <w:t>3. Le piège à ne pas recréer : les données personnelles</w:t>
+      </w:r>
+    </w:p>
+    <w:p>
+      <w:r>
+        <w:t>Le dispositif est attaqué sur le fichage des propriétaires ; un comptage citoyen qui photographie la rue en grand angle et conserve des plaques d'immatriculation reconstitue l'argument de l'adversaire. Donc : cadrage serré sur la déjection, pas de visage ni de plaque, aucun fichier de personnes, aucune géolocalisation d'individus, une finalité écrite et une durée de conservation annoncée. Le registre du comptage enregistre des tronçons et des nombres, pas des gens.</w:t>
+      </w:r>
+    </w:p>
+    <w:p>
+      <w:pPr>
+        <w:pStyle w:val="Heading3"/>
+      </w:pPr>
+      <w:r>
+        <w:t>4. Ce qu'un comptage citoyen ne peut pas faire</w:t>
+      </w:r>
+    </w:p>
+    <w:p>
+      <w:r>
+        <w:t xml:space="preserve">Il ne permet pas de verbaliser. La contravention est prouvée par procès-verbal ou rapport d'un agent habilité, et, pour les contraventions, l'article 537 du code de procédure pénale prévoit que ces rapports « font foi jusqu'à preuve contraire » et que la preuve contraire ne peut être rapportée que par écrit ou par témoins. Le comptage citoyen sert à </w:t>
+      </w:r>
+      <w:r>
+        <w:rPr>
+          <w:b/>
+        </w:rPr>
+        <w:t>justifier la mesure devant le juge administratif</w:t>
+      </w:r>
+      <w:r>
+        <w:t>, pas à constater l'infraction. Les deux chaînes sont distinctes et ne doivent pas être mélangées dans le discours public — c'est le mélange qui fait dire « ils veulent nous ficher ».</w:t>
+      </w:r>
+    </w:p>
+    <w:p>
+      <w:pPr>
+        <w:pStyle w:val="Heading3"/>
+      </w:pPr>
+      <w:r>
+        <w:t>5. Les trois niveaux d'escalade</w:t>
+      </w:r>
+    </w:p>
+    <w:p>
+      <w:pPr>
+        <w:pStyle w:val="ListNumber"/>
+      </w:pPr>
+      <w:r>
+        <w:rPr>
+          <w:b/>
+        </w:rPr>
+        <w:t>Comptage citoyen avec protocole publié et horodaté</w:t>
+      </w:r>
+      <w:r>
+        <w:t xml:space="preserve"> (coût : du temps). Suffisant pour un conseil d'arrondissement, un budget participatif et un premier article de presse.</w:t>
+      </w:r>
+    </w:p>
+    <w:p>
+      <w:pPr>
+        <w:pStyle w:val="ListNumber"/>
+      </w:pPr>
+      <w:r>
+        <w:rPr>
+          <w:b/>
+        </w:rPr>
+        <w:t>Convention avec la mairie ou la mairie d'arrondissement</w:t>
+      </w:r>
+      <w:r>
+        <w:t>, les agents relayant le comptage : le relevé change de nature et devient un document administratif.</w:t>
+      </w:r>
+    </w:p>
+    <w:p>
+      <w:pPr>
+        <w:pStyle w:val="ListNumber"/>
+      </w:pPr>
+      <w:r>
+        <w:rPr>
+          <w:b/>
+        </w:rPr>
+        <w:t>Constat de commissaire de justice</w:t>
+      </w:r>
+      <w:r>
+        <w:t>, contradictoire, sur un échantillon de passages seulement : c'est l'acte le plus difficile à contester, et il coûte cher — d'où l'intérêt de le réserver à la démonstration finale, une fois le protocole rodé et les chiffres stabilisés.</w:t>
+      </w:r>
+    </w:p>
+    <w:p>
+      <w:r>
+        <w:t xml:space="preserve">À faire en parallèle, et gratuitement : </w:t>
+      </w:r>
+      <w:r>
+        <w:rPr>
+          <w:b/>
+        </w:rPr>
+        <w:t>demander les pièces de l'administration</w:t>
+      </w:r>
+      <w:r>
+        <w:t xml:space="preserve"> (extractions DansMaRue sur le secteur, statistiques de propreté, marché de nettoiement, bilan des campagnes précédentes). Ce sont des documents administratifs communicables ; ils donnent la base officielle que le juge réclamait à Béziers, et ils obligent la Ville à prendre position par écrit.</w:t>
+      </w:r>
+    </w:p>
+    <w:p>
+      <w:pPr>
+        <w:pStyle w:val="Heading3"/>
+      </w:pPr>
+      <w:r>
+        <w:t>6. Ce que le comptage ne suffira pas à fermer</w:t>
+      </w:r>
+    </w:p>
+    <w:p>
+      <w:r>
+        <w:t>Le motif n° 3 de Béziers — l'identification classique est-elle suffisante ? — ne se règle pas en comptant. Il se règle par un raisonnement : un tatouage ou un fichier I-CAD identifie un chien, mais ne relie pas une déjection à son propriétaire, faute de quoi aucune attribution n'est possible. C'est un argument juridique autonome, à écrire séparément, et la proportionnalité (périmètre réduit, durée bornée, gratuité de l'identification, alternatives) reste à démontrer — le juge administratif contrôle les trois, pas seulement l'utilité.</w:t>
+      </w:r>
+    </w:p>
+    <w:p>
+      <w:pPr>
+        <w:pStyle w:val="Heading3"/>
+      </w:pPr>
+      <w:r>
+        <w:t>Sources</w:t>
+      </w:r>
+    </w:p>
+    <w:p>
+      <w:pPr>
+        <w:pStyle w:val="ListBullet"/>
+      </w:pPr>
+      <w:r>
+        <w:t>LDH, « Béziers : l'identification génétique des chiens » (citations du jugement du 6 mai 2025, TA Montpellier) : https://www.ldh-france.org/beziers-lidentification-genetique-des-chiens/</w:t>
+      </w:r>
+    </w:p>
+    <w:p>
+      <w:pPr>
+        <w:pStyle w:val="ListBullet"/>
+      </w:pPr>
+      <w:r>
+        <w:t>Article 537 du code de procédure pénale (force probante des procès-verbaux et rapports en matière contraventionnelle ; texte à lire dans le code, partie législative, livre II, titre III) : https://www.legifrance.gouv.fr/codes/texte_lc/LEGITEXT000006071154/</w:t>
+      </w:r>
+    </w:p>
+    <w:p>
+      <w:pPr>
+        <w:pStyle w:val="ListBullet"/>
+      </w:pPr>
+      <w:r>
+        <w:t>Sénat, question écrite rappelant le régime de l'article 537 (rapports faisant foi jusqu'à preuve contraire, preuve contraire par écrit ou témoins) : https://www.senat.fr/questions/base/2007/qSEQ070801568.html</w:t>
+      </w:r>
+    </w:p>
+    <w:p>
+      <w:pPr>
+        <w:pStyle w:val="ListBullet"/>
+      </w:pPr>
+      <w:r>
+        <w:t>ANSSI, les services de confiance (horodatage électronique qualifié, eIDAS) : https://cyber.gouv.fr/reglementation/reglementation-identite-confiance-numerique/securite-echanges-voie-electronique/reglement-eidas/services-de-confiance/</w:t>
+      </w:r>
+    </w:p>
+    <w:p>
+      <w:pPr>
+        <w:pStyle w:val="ListBullet"/>
+      </w:pPr>
+      <w:r>
+        <w:t>Règlement (UE) n° 910/2014 (eIDAS), art. 41 et 42 ; articles 1366 et 1367 du code civil.</w:t>
+      </w:r>
+    </w:p>
+    <w:p>
+      <w:pPr>
+        <w:pStyle w:val="ListBullet"/>
+      </w:pPr>
+      <w:r>
+        <w:t>Le comptage national des oiseaux des jardins (LPO et Muséum national d'histoire naturelle) comme modèle de comptage citoyen : voir l'annexe C du rapport complet.</w:t>
+      </w:r>
+    </w:p>
+    <w:p>
+      <w:r>
+        <w:rPr>
+          <w:b w:val="0"/>
+        </w:rPr>
+        <w:t>↑ Sommaire</w:t>
+      </w:r>
+    </w:p>
+    <w:p/>
+    <w:p>
+      <w:pPr>
+        <w:pStyle w:val="Heading2"/>
+      </w:pPr>
+      <w:r>
+        <w:t>9. Tests ADN canins : coûts réels, facilité de mise en œuvre, et chiffrage pour Paris (29/09/2026)</w:t>
       </w:r>
     </w:p>
     <w:p>
@@ -9622,7 +10263,7 @@
         <w:pStyle w:val="Heading2"/>
       </w:pPr>
       <w:r>
-        <w:t>9. Statut « chien·ne citoyen·ne de Paris » — note de conception (29/09/2026)</w:t>
+        <w:t>10. Statut « chien·ne citoyen·ne de Paris » — note de conception (29/09/2026)</w:t>
       </w:r>
     </w:p>
     <w:p>
@@ -10498,7 +11139,7 @@
         <w:pStyle w:val="Heading2"/>
       </w:pPr>
       <w:r>
-        <w:t>10. Statut « chien·ne citoyen·ne de Paris » — projet d'arrêté et règlement (version de travail, 29/09/2026)</w:t>
+        <w:t>11. Statut « chien·ne citoyen·ne de Paris » — projet d'arrêté et règlement (version de travail, 29/09/2026)</w:t>
       </w:r>
     </w:p>
     <w:p>
@@ -10937,7 +11578,7 @@
         <w:pStyle w:val="Heading2"/>
       </w:pPr>
       <w:r>
-        <w:t>11. Projet « chiens de Paris » — creusage du 29/09/2026</w:t>
+        <w:t>12. Projet « chiens de Paris » — creusage du 29/09/2026</w:t>
       </w:r>
     </w:p>
     <w:p>
@@ -11873,7 +12514,7 @@
         <w:pStyle w:val="Heading2"/>
       </w:pPr>
       <w:r>
-        <w:t>12. RAPPORT — Un projet politique « chiens de Paris » : statut du chien citoyen, registre ADN, droits et chiffrage</w:t>
+        <w:t>13. RAPPORT — Un projet politique « chiens de Paris » : statut du chien citoyen, registre ADN, droits et chiffrage</w:t>
       </w:r>
     </w:p>
     <w:p>
@@ -16085,47 +16726,201 @@
         <w:pStyle w:val="Heading3"/>
       </w:pPr>
       <w:r>
-        <w:t>Annexe C — Protocole de comptage des déjections (pièce manquante à Béziers)</w:t>
-      </w:r>
-    </w:p>
-    <w:p>
-      <w:pPr>
-        <w:pStyle w:val="ListBullet"/>
-      </w:pPr>
-      <w:r>
-        <w:t>Périmètre : définir des segments homogènes (par exemple 20 tronçons de 300 m dans le 20e), représentatifs des voies les plus fréquentées.</w:t>
-      </w:r>
-    </w:p>
-    <w:p>
-      <w:pPr>
-        <w:pStyle w:val="ListBullet"/>
-      </w:pPr>
-      <w:r>
-        <w:t>Fréquence : deux passages par semaine, sur six semaines minimum, aux mêmes heures, par deux observateurs distincts.</w:t>
-      </w:r>
-    </w:p>
-    <w:p>
-      <w:pPr>
-        <w:pStyle w:val="ListBullet"/>
-      </w:pPr>
-      <w:r>
-        <w:t>Relevé : date, heure, tronçon, nombre de déjections, position (trottoir, chaussée, entrée d'immeuble), photo horodatée, agent identifié.</w:t>
-      </w:r>
-    </w:p>
-    <w:p>
-      <w:pPr>
-        <w:pStyle w:val="ListBullet"/>
-      </w:pPr>
-      <w:r>
-        <w:t>Compléments : extractions DansMaRue sur le secteur, courriers de signalement d'habitants et de commerçants.</w:t>
-      </w:r>
-    </w:p>
-    <w:p>
-      <w:pPr>
-        <w:pStyle w:val="ListBullet"/>
-      </w:pPr>
-      <w:r>
-        <w:t>Livrable : tableau avant/après, méthode publiée, résultat présentable au conseil d'arrondissement et opposable en cas de contentieux. Coût : zéro euro, du temps bénévole.</w:t>
+        <w:t>Annexe C — Protocole de comptage citoyen des déjections (pièce manquante à Béziers)</w:t>
+      </w:r>
+    </w:p>
+    <w:p>
+      <w:r>
+        <w:rPr>
+          <w:b/>
+        </w:rPr>
+        <w:t>Modèle de référence :</w:t>
+      </w:r>
+      <w:r>
+        <w:t xml:space="preserve"> le comptage national des oiseaux des jardins, organisé par la LPO et le Muséum national d'histoire naturelle depuis 2012 — le plus important dispositif français de sciences participatives (près de 100 000 jardins en dix ans, 24 048 contributeurs pour la seule édition de janvier 2022). Trois règles en font un instrument fiable, et non une addition d'opinions :</w:t>
+      </w:r>
+    </w:p>
+    <w:p>
+      <w:pPr>
+        <w:pStyle w:val="ListNumber"/>
+      </w:pPr>
+      <w:r>
+        <w:t>une règle de comptage qui interdit le double compte — « le nombre maximal d'individus vus en même temps », et non la somme des observations successives ;</w:t>
+      </w:r>
+    </w:p>
+    <w:p>
+      <w:pPr>
+        <w:pStyle w:val="ListNumber"/>
+      </w:pPr>
+      <w:r>
+        <w:t>des créneaux fixes et identiques d'une édition à l'autre : c'est la comparabilité qui fait la valeur d'un comptage, pas son volume ;</w:t>
+      </w:r>
+    </w:p>
+    <w:p>
+      <w:pPr>
+        <w:pStyle w:val="ListNumber"/>
+      </w:pPr>
+      <w:r>
+        <w:t>un point de collecte unique, où les données atterrissent et ressortent publiques.</w:t>
+      </w:r>
+    </w:p>
+    <w:p>
+      <w:r>
+        <w:t>Ce que ce modèle change pour un comptage parisien des déjections :</w:t>
+      </w:r>
+    </w:p>
+    <w:p>
+      <w:pPr>
+        <w:pStyle w:val="ListBullet"/>
+      </w:pPr>
+      <w:r>
+        <w:rPr>
+          <w:b/>
+        </w:rPr>
+        <w:t>Périmètre :</w:t>
+      </w:r>
+      <w:r>
+        <w:t xml:space="preserve"> des segments homogènes, par exemple 20 tronçons de 300 m dans le 20e, représentatifs des voies les plus fréquentées.</w:t>
+      </w:r>
+    </w:p>
+    <w:p>
+      <w:pPr>
+        <w:pStyle w:val="ListBullet"/>
+      </w:pPr>
+      <w:r>
+        <w:rPr>
+          <w:b/>
+        </w:rPr>
+        <w:t>Zone témoin :</w:t>
+      </w:r>
+      <w:r>
+        <w:t xml:space="preserve"> 5 tronçons comparables où rien ne change, comptés en parallèle pendant toute la durée. Sans témoin, une baisse ne s'attribue pas au dispositif : c'est exactement l'erreur du « −85 % » de Béziers, revendiqué par la mairie et jamais mesuré indépendamment.</w:t>
+      </w:r>
+    </w:p>
+    <w:p>
+      <w:pPr>
+        <w:pStyle w:val="ListBullet"/>
+      </w:pPr>
+      <w:r>
+        <w:rPr>
+          <w:b/>
+        </w:rPr>
+        <w:t>Pré-enregistrement du protocole :</w:t>
+      </w:r>
+      <w:r>
+        <w:t xml:space="preserve"> tronçons, créneaux, règle de comptage et dates sont publiés </w:t>
+      </w:r>
+      <w:r>
+        <w:rPr>
+          <w:i/>
+        </w:rPr>
+        <w:t>avant</w:t>
+      </w:r>
+      <w:r>
+        <w:t xml:space="preserve"> le premier passage. Un protocole dévoilé après coup est un protocole contestable — c'est la différence entre un relevé et un argument.</w:t>
+      </w:r>
+    </w:p>
+    <w:p>
+      <w:pPr>
+        <w:pStyle w:val="ListBullet"/>
+      </w:pPr>
+      <w:r>
+        <w:rPr>
+          <w:b/>
+        </w:rPr>
+        <w:t>Fréquence et créneaux :</w:t>
+      </w:r>
+      <w:r>
+        <w:t xml:space="preserve"> deux passages par semaine, six semaines minimum, mêmes heures, même jour de la semaine, hors pluie et hors jour de collecte.</w:t>
+      </w:r>
+    </w:p>
+    <w:p>
+      <w:pPr>
+        <w:pStyle w:val="ListBullet"/>
+      </w:pPr>
+      <w:r>
+        <w:rPr>
+          <w:b/>
+        </w:rPr>
+        <w:t>Conditions relevées à chaque passage</w:t>
+      </w:r>
+      <w:r>
+        <w:t xml:space="preserve"> (météo, passage de balayeuse, marché, vacances scolaires, travaux) : ce sont les variables qui expliquent souvent une baisse avant qu'on l'attribue au dispositif.</w:t>
+      </w:r>
+    </w:p>
+    <w:p>
+      <w:pPr>
+        <w:pStyle w:val="ListBullet"/>
+      </w:pPr>
+      <w:r>
+        <w:rPr>
+          <w:b/>
+        </w:rPr>
+        <w:t>Deux observateurs distincts par passage, dont au moins un qui n'est pas partie prenante</w:t>
+      </w:r>
+      <w:r>
+        <w:t xml:space="preserve"> — un sceptique, un commerçant, un élu d'opposition, un membre de PARC.C. Un comptage fait entre convaincus est contesté avant même d'être discuté.</w:t>
+      </w:r>
+    </w:p>
+    <w:p>
+      <w:pPr>
+        <w:pStyle w:val="ListBullet"/>
+      </w:pPr>
+      <w:r>
+        <w:rPr>
+          <w:b/>
+        </w:rPr>
+        <w:t>Relevé :</w:t>
+      </w:r>
+      <w:r>
+        <w:t xml:space="preserve"> date, heure, tronçon, nombre de déjections, position (trottoir, chaussée, entrée d'immeuble), photo horodatée, observateur identifié.</w:t>
+      </w:r>
+    </w:p>
+    <w:p>
+      <w:pPr>
+        <w:pStyle w:val="ListBullet"/>
+      </w:pPr>
+      <w:r>
+        <w:rPr>
+          <w:b/>
+        </w:rPr>
+        <w:t>Compléments :</w:t>
+      </w:r>
+      <w:r>
+        <w:t xml:space="preserve"> extractions DansMaRue sur le secteur, signalements d'habitants et de commerçants.</w:t>
+      </w:r>
+    </w:p>
+    <w:p>
+      <w:pPr>
+        <w:pStyle w:val="ListBullet"/>
+      </w:pPr>
+      <w:r>
+        <w:rPr>
+          <w:b/>
+        </w:rPr>
+        <w:t>Fin bornée et publication :</w:t>
+      </w:r>
+      <w:r>
+        <w:t xml:space="preserve"> la campagne s'arrête à une date annoncée d'avance et produit un tableau daté, la méthode publiée et les données brutes ouvertes à quiconque veut refaire le calcul. Une campagne sans date de fin s'épuise en trois semaines.</w:t>
+      </w:r>
+    </w:p>
+    <w:p>
+      <w:pPr>
+        <w:pStyle w:val="ListBullet"/>
+      </w:pPr>
+      <w:r>
+        <w:rPr>
+          <w:b/>
+        </w:rPr>
+        <w:t>Livrable :</w:t>
+      </w:r>
+      <w:r>
+        <w:t xml:space="preserve"> tableau avant/après avec zone témoin, méthode publiée, résultat présentable au conseil d'arrondissement et opposable en cas de contentieux. Coût : zéro euro, du temps bénévole.</w:t>
+      </w:r>
+    </w:p>
+    <w:p>
+      <w:r>
+        <w:t>Sources du modèle : https://www.lpo.fr/decouvrir-la-nature/loisirs-nature/grands-rendez-vous/comptage-des-oiseaux-des-jardins et https://www.lpo.fr/qui-sommes-nous/espace-presse/communiques/cp-2023/comptage-des-oiseaux-des-jardins-bilan-de-10-ans-de-sciences-citoyennes</w:t>
       </w:r>
     </w:p>
     <w:p>
@@ -16939,7 +17734,7 @@
           </w:tcPr>
           <w:p>
             <w:r>
-              <w:t>250</w:t>
+              <w:t>290</w:t>
             </w:r>
           </w:p>
         </w:tc>
@@ -16983,7 +17778,7 @@
           </w:tcPr>
           <w:p>
             <w:r>
-              <w:t>ADN-COUTS-FAISABILITE.md</w:t>
+              <w:t>NOTE-JURIDIQUE-COMPTAGE-CITOYEN.md</w:t>
             </w:r>
           </w:p>
         </w:tc>
@@ -16993,7 +17788,7 @@
           </w:tcPr>
           <w:p>
             <w:r>
-              <w:t>Coûts réels des tests ADN, faisabilité, chiffrage</w:t>
+              <w:t>Ce qui fait qu'un comptage citoyen tient juridiquement</w:t>
             </w:r>
           </w:p>
         </w:tc>
@@ -17003,7 +17798,7 @@
           </w:tcPr>
           <w:p>
             <w:r>
-              <w:t>118</w:t>
+              <w:t>120</w:t>
             </w:r>
           </w:p>
         </w:tc>
@@ -17015,7 +17810,7 @@
           </w:tcPr>
           <w:p>
             <w:r>
-              <w:t>STATUT-CHIEN-CITOYEN.md</w:t>
+              <w:t>ADN-COUTS-FAISABILITE.md</w:t>
             </w:r>
           </w:p>
         </w:tc>
@@ -17025,7 +17820,7 @@
           </w:tcPr>
           <w:p>
             <w:r>
-              <w:t>Note de conception du statut</w:t>
+              <w:t>Coûts réels des tests ADN, faisabilité, chiffrage</w:t>
             </w:r>
           </w:p>
         </w:tc>
@@ -17035,7 +17830,7 @@
           </w:tcPr>
           <w:p>
             <w:r>
-              <w:t>210</w:t>
+              <w:t>118</w:t>
             </w:r>
           </w:p>
         </w:tc>
@@ -17047,7 +17842,7 @@
           </w:tcPr>
           <w:p>
             <w:r>
-              <w:t>PROJET-ARRETE-STATUT-CHIEN-CITOYEN.md</w:t>
+              <w:t>STATUT-CHIEN-CITOYEN.md</w:t>
             </w:r>
           </w:p>
         </w:tc>
@@ -17057,7 +17852,7 @@
           </w:tcPr>
           <w:p>
             <w:r>
-              <w:t>Projet d'arrêté, règlement, parcours, maquette de données</w:t>
+              <w:t>Note de conception du statut</w:t>
             </w:r>
           </w:p>
         </w:tc>
@@ -17067,7 +17862,7 @@
           </w:tcPr>
           <w:p>
             <w:r>
-              <w:t>193</w:t>
+              <w:t>210</w:t>
             </w:r>
           </w:p>
         </w:tc>
@@ -17079,7 +17874,7 @@
           </w:tcPr>
           <w:p>
             <w:r>
-              <w:t>PROJET-CHIENS-PARIS.md</w:t>
+              <w:t>PROJET-ARRETE-STATUT-CHIEN-CITOYEN.md</w:t>
             </w:r>
           </w:p>
         </w:tc>
@@ -17089,7 +17884,7 @@
           </w:tcPr>
           <w:p>
             <w:r>
-              <w:t>Première note d'exploration politique</w:t>
+              <w:t>Projet d'arrêté, règlement, parcours, maquette de données</w:t>
             </w:r>
           </w:p>
         </w:tc>
@@ -17099,7 +17894,7 @@
           </w:tcPr>
           <w:p>
             <w:r>
-              <w:t>176</w:t>
+              <w:t>193</w:t>
             </w:r>
           </w:p>
         </w:tc>
@@ -17111,6 +17906,38 @@
           </w:tcPr>
           <w:p>
             <w:r>
+              <w:t>PROJET-CHIENS-PARIS.md</w:t>
+            </w:r>
+          </w:p>
+        </w:tc>
+        <w:tc>
+          <w:tcPr>
+            <w:tcW w:type="dxa" w:w="2880"/>
+          </w:tcPr>
+          <w:p>
+            <w:r>
+              <w:t>Première note d'exploration politique</w:t>
+            </w:r>
+          </w:p>
+        </w:tc>
+        <w:tc>
+          <w:tcPr>
+            <w:tcW w:type="dxa" w:w="2880"/>
+          </w:tcPr>
+          <w:p>
+            <w:r>
+              <w:t>176</w:t>
+            </w:r>
+          </w:p>
+        </w:tc>
+      </w:tr>
+      <w:tr>
+        <w:tc>
+          <w:tcPr>
+            <w:tcW w:type="dxa" w:w="2880"/>
+          </w:tcPr>
+          <w:p>
+            <w:r>
               <w:t>RAPPORT-COMPLET-CHIENS-PARIS.md</w:t>
             </w:r>
           </w:p>
@@ -17131,7 +17958,7 @@
           </w:tcPr>
           <w:p>
             <w:r>
-              <w:t>826</w:t>
+              <w:t>856</w:t>
             </w:r>
           </w:p>
         </w:tc>

</xml_diff>

<commit_message>
Chiens: note d'architecture - chaine de preuve outillee (photo en contexte, QR, registre horodate)
</commit_message>
<xml_diff>
--- a/export/Chien-citoyen-de-Paris-dossier-complet.docx
+++ b/export/Chien-citoyen-de-Paris-dossier-complet.docx
@@ -1116,7 +1116,116 @@
         <w:rPr>
           <w:b w:val="0"/>
         </w:rPr>
-        <w:t>9. Tests ADN canins : coûts et faisabilité</w:t>
+        <w:t>9. Architecture — chaîne de preuve outillée (photo en contexte, QR, registre horodaté)</w:t>
+      </w:r>
+      <w:r>
+        <w:t xml:space="preserve"> — </w:t>
+      </w:r>
+      <w:r>
+        <w:rPr>
+          <w:rFonts w:ascii="Consolas" w:hAnsi="Consolas"/>
+          <w:sz w:val="20"/>
+        </w:rPr>
+        <w:t>ARCHI-CHAINE-DE-PREUVE.md</w:t>
+      </w:r>
+    </w:p>
+    <w:p>
+      <w:pPr>
+        <w:pStyle w:val="ListBullet2"/>
+      </w:pPr>
+      <w:r>
+        <w:rPr>
+          <w:b w:val="0"/>
+        </w:rPr>
+        <w:t>1. Le partage à ne pas se tromper</w:t>
+      </w:r>
+    </w:p>
+    <w:p>
+      <w:pPr>
+        <w:pStyle w:val="ListBullet2"/>
+      </w:pPr>
+      <w:r>
+        <w:rPr>
+          <w:b w:val="0"/>
+        </w:rPr>
+        <w:t>2. Le principe : un identifiant, deux chaînes</w:t>
+      </w:r>
+    </w:p>
+    <w:p>
+      <w:pPr>
+        <w:pStyle w:val="ListBullet2"/>
+      </w:pPr>
+      <w:r>
+        <w:rPr>
+          <w:b w:val="0"/>
+        </w:rPr>
+        <w:t>3. La photo en contexte, et à quoi sert vraiment le QR</w:t>
+      </w:r>
+    </w:p>
+    <w:p>
+      <w:pPr>
+        <w:pStyle w:val="ListBullet2"/>
+      </w:pPr>
+      <w:r>
+        <w:rPr>
+          <w:b w:val="0"/>
+        </w:rPr>
+        <w:t>4. Contradictoire outillé, sans le remplacer</w:t>
+      </w:r>
+    </w:p>
+    <w:p>
+      <w:pPr>
+        <w:pStyle w:val="ListBullet2"/>
+      </w:pPr>
+      <w:r>
+        <w:rPr>
+          <w:b w:val="0"/>
+        </w:rPr>
+        <w:t>5. Les chiffres, et comment ils résistent</w:t>
+      </w:r>
+    </w:p>
+    <w:p>
+      <w:pPr>
+        <w:pStyle w:val="ListBullet2"/>
+      </w:pPr>
+      <w:r>
+        <w:rPr>
+          <w:b w:val="0"/>
+        </w:rPr>
+        <w:t>6. Ouvert : ce que « ouvert » doit vouloir dire</w:t>
+      </w:r>
+    </w:p>
+    <w:p>
+      <w:pPr>
+        <w:pStyle w:val="ListBullet2"/>
+      </w:pPr>
+      <w:r>
+        <w:rPr>
+          <w:b w:val="0"/>
+        </w:rPr>
+        <w:t>7. La séquence, et pourquoi il ne faut pas commencer par l'application</w:t>
+      </w:r>
+    </w:p>
+    <w:p>
+      <w:pPr>
+        <w:pStyle w:val="ListBullet2"/>
+      </w:pPr>
+      <w:r>
+        <w:rPr>
+          <w:b w:val="0"/>
+        </w:rPr>
+        <w:t>8. Ce que ça peut devenir</w:t>
+      </w:r>
+    </w:p>
+    <w:p>
+      <w:pPr>
+        <w:pStyle w:val="ListBullet"/>
+      </w:pPr>
+      <w:r>
+        <w:rPr>
+          <w:b w:val="0"/>
+        </w:rPr>
+        <w:t>10. Tests ADN canins : coûts et faisabilité</w:t>
       </w:r>
       <w:r>
         <w:t xml:space="preserve"> — </w:t>
@@ -1181,7 +1290,7 @@
         <w:rPr>
           <w:b w:val="0"/>
         </w:rPr>
-        <w:t>10. Statut du chien citoyen — note de conception</w:t>
+        <w:t>11. Statut du chien citoyen — note de conception</w:t>
       </w:r>
       <w:r>
         <w:t xml:space="preserve"> — </w:t>
@@ -1290,7 +1399,7 @@
         <w:rPr>
           <w:b w:val="0"/>
         </w:rPr>
-        <w:t>11. Projet d'arrêté et règlement du statut</w:t>
+        <w:t>12. Projet d'arrêté et règlement du statut</w:t>
       </w:r>
       <w:r>
         <w:t xml:space="preserve"> — </w:t>
@@ -1355,7 +1464,7 @@
         <w:rPr>
           <w:b w:val="0"/>
         </w:rPr>
-        <w:t>12. Projet « chiens de Paris » — creusage</w:t>
+        <w:t>13. Projet « chiens de Paris » — creusage</w:t>
       </w:r>
       <w:r>
         <w:t xml:space="preserve"> — </w:t>
@@ -1464,7 +1573,7 @@
         <w:rPr>
           <w:b w:val="0"/>
         </w:rPr>
-        <w:t>13. Rapport complet et chiffrage</w:t>
+        <w:t>14. Rapport complet et chiffrage</w:t>
       </w:r>
       <w:r>
         <w:t xml:space="preserve"> — </w:t>
@@ -5914,7 +6023,7 @@
           <w:rFonts w:ascii="Consolas" w:hAnsi="Consolas"/>
           <w:sz w:val="20"/>
         </w:rPr>
-        <w:t>[RAPPORT-COMPLET-CHIENS-PARIS.md](#13-rapport--un-projet-politique--chiens-de-paris---statut-du-chien-citoyen-registre-adn-droits-et-chiffrage)</w:t>
+        <w:t>[RAPPORT-COMPLET-CHIENS-PARIS.md](#14-rapport--un-projet-politique--chiens-de-paris---statut-du-chien-citoyen-registre-adn-droits-et-chiffrage)</w:t>
       </w:r>
       <w:r>
         <w:t xml:space="preserve"> (annexe E pour les URL).</w:t>
@@ -9429,7 +9538,649 @@
         <w:pStyle w:val="Heading2"/>
       </w:pPr>
       <w:r>
-        <w:t>9. Tests ADN canins : coûts réels, facilité de mise en œuvre, et chiffrage pour Paris (29/09/2026)</w:t>
+        <w:t>9. Architecture — une chaîne de preuve outillée (photo en contexte, QR, registre horodaté)</w:t>
+      </w:r>
+    </w:p>
+    <w:p>
+      <w:r>
+        <w:rPr>
+          <w:i/>
+        </w:rPr>
+        <w:t>Source : `ARCHI-CHAINE-DE-PREUVE.md`.</w:t>
+      </w:r>
+    </w:p>
+    <w:p>
+      <w:r>
+        <w:t>29 septembre 2026. Question posée : peut-on faire quelque chose de solide et d'ouvert — photo en contexte, QR code, données et chiffres — en respectant la chaîne de preuve (la « chaîne du froid » du prélèvement) ? Réponse : oui, et c'est même la bonne façon de faire, à condition de comprendre ce que l'outil peut apporter et ce qu'aucun outil ne peut produire. Note de conception. Rien n'a été voté.</w:t>
+      </w:r>
+    </w:p>
+    <w:p>
+      <w:pPr>
+        <w:pStyle w:val="Heading3"/>
+      </w:pPr>
+      <w:r>
+        <w:t>1. Le partage à ne pas se tromper</w:t>
+      </w:r>
+    </w:p>
+    <w:p>
+      <w:r>
+        <w:rPr>
+          <w:b/>
+        </w:rPr>
+        <w:t>Ce que le logiciel peut faire, et qu'aucun humain ne fait proprement :</w:t>
+      </w:r>
+      <w:r>
+        <w:t xml:space="preserve"> l'intégrité, la datation, la traçabilité des transferts, et la publication vérifiable. C'est le pilier « daté et intègre » de la note juridique du comptage, et c'est exactement là qu'un serveur quelconque ne vaut rien.</w:t>
+      </w:r>
+    </w:p>
+    <w:p>
+      <w:r>
+        <w:rPr>
+          <w:b/>
+        </w:rPr>
+        <w:t>Ce qu'aucun logiciel ne peut produire :</w:t>
+      </w:r>
+    </w:p>
+    <w:p>
+      <w:pPr>
+        <w:pStyle w:val="ListBullet"/>
+      </w:pPr>
+      <w:r>
+        <w:rPr>
+          <w:b/>
+        </w:rPr>
+        <w:t>L'autorité de constater.</w:t>
+      </w:r>
+      <w:r>
+        <w:t xml:space="preserve"> Un procès-verbal n'a de force que par un agent habilité (art. 537 du code de procédure pénale). Aucune application ne verbalise.</w:t>
+      </w:r>
+    </w:p>
+    <w:p>
+      <w:pPr>
+        <w:pStyle w:val="ListBullet"/>
+      </w:pPr>
+      <w:r>
+        <w:rPr>
+          <w:b/>
+        </w:rPr>
+        <w:t>Le contradictoire.</w:t>
+      </w:r>
+      <w:r>
+        <w:t xml:space="preserve"> Il tient à une invitation écrite, datée, envoyée avant le premier passage, et à deux observateurs dont un non partie prenante. Un logiciel peut </w:t>
+      </w:r>
+      <w:r>
+        <w:rPr>
+          <w:i/>
+        </w:rPr>
+        <w:t>enregistrer</w:t>
+      </w:r>
+      <w:r>
+        <w:t xml:space="preserve"> cette invitation et </w:t>
+      </w:r>
+      <w:r>
+        <w:rPr>
+          <w:i/>
+        </w:rPr>
+        <w:t>rendre visible</w:t>
+      </w:r>
+      <w:r>
+        <w:t xml:space="preserve"> qui a compté ; il ne peut pas la remplacer.</w:t>
+      </w:r>
+    </w:p>
+    <w:p>
+      <w:pPr>
+        <w:pStyle w:val="ListBullet"/>
+      </w:pPr>
+      <w:r>
+        <w:rPr>
+          <w:b/>
+        </w:rPr>
+        <w:t>La représentativité.</w:t>
+      </w:r>
+      <w:r>
+        <w:t xml:space="preserve"> Si les rues sont choisies parce qu'elles sont sales, aucun outil ne sauvera le chiffre. D'où la zone témoin et le pré-enregistrement du protocole : c'est de la gouvernance, pas du code.</w:t>
+      </w:r>
+    </w:p>
+    <w:p>
+      <w:r>
+        <w:t xml:space="preserve">Corollaire de conception, et c'est la règle qui structure tout le reste : </w:t>
+      </w:r>
+      <w:r>
+        <w:rPr>
+          <w:b/>
+        </w:rPr>
+        <w:t>l'outil ne doit jamais devenir la preuve.</w:t>
+      </w:r>
+      <w:r>
+        <w:t xml:space="preserve"> Si le chiffre ne tient que parce que notre application l'affirme, l'adversaire n'a qu'un mot à dire — « votre serveur, vos chiffres » — et le dossier est mort. La vérification ne doit exiger de faire confiance à personne, nous compris.</w:t>
+      </w:r>
+    </w:p>
+    <w:p>
+      <w:pPr>
+        <w:pStyle w:val="Heading3"/>
+      </w:pPr>
+      <w:r>
+        <w:t>2. Le principe : un identifiant, deux chaînes</w:t>
+      </w:r>
+    </w:p>
+    <w:p>
+      <w:r>
+        <w:t xml:space="preserve">Tout se tient sur une idée simple : </w:t>
+      </w:r>
+      <w:r>
+        <w:rPr>
+          <w:b/>
+        </w:rPr>
+        <w:t>un identifiant unique lie l'objet physique et l'enregistrement numérique</w:t>
+      </w:r>
+      <w:r>
+        <w:t>, et chaque transfert de cet objet est un événement daté et signé.</w:t>
+      </w:r>
+    </w:p>
+    <w:p>
+      <w:r>
+        <w:rPr>
+          <w:b/>
+        </w:rPr>
+        <w:t>Chaîne matérielle</w:t>
+      </w:r>
+      <w:r>
+        <w:t xml:space="preserve"> (le prélèvement, la « chaîne du froid ») :</w:t>
+      </w:r>
+    </w:p>
+    <w:p>
+      <w:pPr>
+        <w:pStyle w:val="ListNumber"/>
+      </w:pPr>
+      <w:r>
+        <w:t xml:space="preserve">L'agent ou l'observateur prélève la déjection, la place dans un tube et </w:t>
+      </w:r>
+      <w:r>
+        <w:rPr>
+          <w:b/>
+        </w:rPr>
+        <w:t>appose un scellé numéroté</w:t>
+      </w:r>
+      <w:r>
+        <w:t>, issu d'un carnet à séquence continue — comme un carnet d'exhibits. Un scellé manquant dans la séquence est visible, donc un prélèvement fabriqué après coup laisse une trace.</w:t>
+      </w:r>
+    </w:p>
+    <w:p>
+      <w:pPr>
+        <w:pStyle w:val="ListNumber"/>
+      </w:pPr>
+      <w:r>
+        <w:t xml:space="preserve">Relevé obligatoire au moment du prélèvement : horodatage, tronçon, position, </w:t>
+      </w:r>
+      <w:r>
+        <w:rPr>
+          <w:b/>
+        </w:rPr>
+        <w:t>photo en contexte</w:t>
+      </w:r>
+      <w:r>
+        <w:t>, conditions (météo, heure, température si la chaîne du froid s'applique au transport).</w:t>
+      </w:r>
+    </w:p>
+    <w:p>
+      <w:pPr>
+        <w:pStyle w:val="ListNumber"/>
+      </w:pPr>
+      <w:r>
+        <w:t xml:space="preserve">Chaque remise (observateur → transporteur → laboratoire) est un </w:t>
+      </w:r>
+      <w:r>
+        <w:rPr>
+          <w:b/>
+        </w:rPr>
+        <w:t>transfert à deux signatures</w:t>
+      </w:r>
+      <w:r>
+        <w:t xml:space="preserve"> : qui remet, qui reçoit, quand, dans quel état. Le laboratoire renvoie un accusé de réception.</w:t>
+      </w:r>
+    </w:p>
+    <w:p>
+      <w:pPr>
+        <w:pStyle w:val="ListNumber"/>
+      </w:pPr>
+      <w:r>
+        <w:t>Conservation et délai : la date limite d'analyse et les conditions de transport sont inscrites dans le protocole, pas improvisées. C'est aussi le point technique numéro un du dossier — la robustesse de l'ADN environnemental sur un trottoir n'est documentée nulle part publiquement.</w:t>
+      </w:r>
+    </w:p>
+    <w:p>
+      <w:r>
+        <w:rPr>
+          <w:b/>
+        </w:rPr>
+        <w:t>Chaîne numérique</w:t>
+      </w:r>
+      <w:r>
+        <w:t xml:space="preserve"> (le même identifiant, côté données) :</w:t>
+      </w:r>
+    </w:p>
+    <w:p>
+      <w:pPr>
+        <w:pStyle w:val="ListNumber"/>
+      </w:pPr>
+      <w:r>
+        <w:t>Chaque fiche de relevé produit un enregistrement immuable : identifiant, tronçon, créneau, comptage, observateurs, empreinte de la photo, version du protocole.</w:t>
+      </w:r>
+    </w:p>
+    <w:p>
+      <w:pPr>
+        <w:pStyle w:val="ListNumber"/>
+      </w:pPr>
+      <w:r>
+        <w:rPr>
+          <w:b/>
+        </w:rPr>
+        <w:t>Empreinte SHA-256</w:t>
+      </w:r>
+      <w:r>
+        <w:t xml:space="preserve"> de chaque fiche et de chaque photo.</w:t>
+      </w:r>
+    </w:p>
+    <w:p>
+      <w:pPr>
+        <w:pStyle w:val="ListNumber"/>
+      </w:pPr>
+      <w:r>
+        <w:rPr>
+          <w:b/>
+        </w:rPr>
+        <w:t>Arbre de Merkle par session</w:t>
+      </w:r>
+      <w:r>
+        <w:t>, dont la racine est horodatée par un service de confiance qualifié (eIDAS, RFC 3161). Résultat : n'importe qui peut vérifier, des années plus tard, qu'une photo donnée existait à cette date et n'a pas bougé — sans nous croire et sans accéder à nos serveurs. Une variante gratuite et indépendamment vérifiable (ancrage en chaîne de blocs) est utile en complément, mais reste appréciée librement par le juge : ce n'est pas un service qualifié.</w:t>
+      </w:r>
+    </w:p>
+    <w:p>
+      <w:pPr>
+        <w:pStyle w:val="ListNumber"/>
+      </w:pPr>
+      <w:r>
+        <w:rPr>
+          <w:b/>
+        </w:rPr>
+        <w:t>Registre en ajout seul</w:t>
+      </w:r>
+      <w:r>
+        <w:t xml:space="preserve"> : aucun enregistrement n'est modifiable. Une correction est un nouvel enregistrement qui référence l'ancien, et les deux restent visibles. C'est ce qui rend un chiffre inattaquable sur le terrain où toutes les administrations se font prendre : « vous avez ajusté après coup ».</w:t>
+      </w:r>
+    </w:p>
+    <w:p>
+      <w:pPr>
+        <w:pStyle w:val="ListNumber"/>
+      </w:pPr>
+      <w:r>
+        <w:rPr>
+          <w:b/>
+        </w:rPr>
+        <w:t>Divergence publiée, jamais lissée</w:t>
+      </w:r>
+      <w:r>
+        <w:t xml:space="preserve"> : quand les deux observateurs d'un même passage ne comptent pas la même chose, l'écart est publié avec sa raison. Un écart affiché crédibilise ; un écart effacé se retrouve un jour en commentaire.</w:t>
+      </w:r>
+    </w:p>
+    <w:p>
+      <w:pPr>
+        <w:pStyle w:val="Heading3"/>
+      </w:pPr>
+      <w:r>
+        <w:t>3. La photo en contexte, et à quoi sert vraiment le QR</w:t>
+      </w:r>
+    </w:p>
+    <w:p>
+      <w:r>
+        <w:t>Une photo seule ne dit pas où, quand, ni par qui — et ses métadonnées se réécrivent. Trois usages du QR, dans cet ordre d'utilité :</w:t>
+      </w:r>
+    </w:p>
+    <w:p>
+      <w:pPr>
+        <w:pStyle w:val="ListNumber"/>
+      </w:pPr>
+      <w:r>
+        <w:rPr>
+          <w:b/>
+        </w:rPr>
+        <w:t>L'étiquette de passage, imprimée à l'avance et numérotée.</w:t>
+      </w:r>
+      <w:r>
+        <w:t xml:space="preserve"> Elle porte un QR contenant : identifiant du tronçon, numéro de session, date prévue, version du protocole, identifiant de l'observateur. La règle photographique est : </w:t>
+      </w:r>
+      <w:r>
+        <w:rPr>
+          <w:b/>
+        </w:rPr>
+        <w:t>l'étiquette et la déjection dans le même cadre</w:t>
+      </w:r>
+      <w:r>
+        <w:t>. L'image porte alors son contexte, lisible par un humain sur la photo et par une machine dans le QR. Les étiquettes sont émises en séquence continue : un manque dans la séquence est un signal.</w:t>
+      </w:r>
+    </w:p>
+    <w:p>
+      <w:pPr>
+        <w:pStyle w:val="ListNumber"/>
+      </w:pPr>
+      <w:r>
+        <w:rPr>
+          <w:b/>
+        </w:rPr>
+        <w:t>Le lien de vérification</w:t>
+      </w:r>
+      <w:r>
+        <w:t xml:space="preserve"> : le QR renvoie à la page publique de l'enregistrement — empreinte, horodatage, statut. C'est ce qui permet à un journaliste, à un élu ou à un contradicteur de vérifier sans rien nous demander.</w:t>
+      </w:r>
+    </w:p>
+    <w:p>
+      <w:pPr>
+        <w:pStyle w:val="ListNumber"/>
+      </w:pPr>
+      <w:r>
+        <w:rPr>
+          <w:b/>
+        </w:rPr>
+        <w:t>La même étiquette pour le prélèvement</w:t>
+      </w:r>
+      <w:r>
+        <w:t xml:space="preserve"> : le QR porte aussi le numéro de scellé du tube, ce qui fait qu'un seul identifiant suit l'objet du trottoir jusqu'au résultat du laboratoire.</w:t>
+      </w:r>
+    </w:p>
+    <w:p>
+      <w:pPr>
+        <w:pStyle w:val="Heading3"/>
+      </w:pPr>
+      <w:r>
+        <w:t>4. Contradictoire outillé, sans le remplacer</w:t>
+      </w:r>
+    </w:p>
+    <w:p>
+      <w:r>
+        <w:t>Ce que le logiciel ajoute au contradictoire, sans jamais s'y substituer :</w:t>
+      </w:r>
+    </w:p>
+    <w:p>
+      <w:pPr>
+        <w:pStyle w:val="ListBullet"/>
+      </w:pPr>
+      <w:r>
+        <w:rPr>
+          <w:b/>
+        </w:rPr>
+        <w:t>l'invitation est un enregistrement du registre</w:t>
+      </w:r>
+      <w:r>
+        <w:t xml:space="preserve"> : courrier à la mairie, à la mairie d'arrondissement, au préfet, daté et horodaté, avec le protocole et les dates ;</w:t>
+      </w:r>
+    </w:p>
+    <w:p>
+      <w:pPr>
+        <w:pStyle w:val="ListBullet"/>
+      </w:pPr>
+      <w:r>
+        <w:rPr>
+          <w:b/>
+        </w:rPr>
+        <w:t>la clé publique des observateurs</w:t>
+      </w:r>
+      <w:r>
+        <w:t xml:space="preserve"> est publiée : chacun peut voir qui a compté, et un opposant peut demander une clé de lecture, voire une clé d'écriture pour son propre observateur ;</w:t>
+      </w:r>
+    </w:p>
+    <w:p>
+      <w:pPr>
+        <w:pStyle w:val="ListBullet"/>
+      </w:pPr>
+      <w:r>
+        <w:rPr>
+          <w:b/>
+        </w:rPr>
+        <w:t>une reconstitution publique</w:t>
+      </w:r>
+      <w:r>
+        <w:t xml:space="preserve"> : n'importe qui peut refaire le comptage sur les mêmes tronçons et les mêmes créneaux, et déposer ses propres enregistrements.</w:t>
+      </w:r>
+    </w:p>
+    <w:p>
+      <w:pPr>
+        <w:pStyle w:val="Heading3"/>
+      </w:pPr>
+      <w:r>
+        <w:t>5. Les chiffres, et comment ils résistent</w:t>
+      </w:r>
+    </w:p>
+    <w:p>
+      <w:pPr>
+        <w:pStyle w:val="ListBullet"/>
+      </w:pPr>
+      <w:r>
+        <w:rPr>
+          <w:b/>
+        </w:rPr>
+        <w:t>Unité</w:t>
+      </w:r>
+      <w:r>
+        <w:t xml:space="preserve"> : déjections pour 100 m de voie et par passage — jamais un total brut, qui ne veut rien dire et se retourne contre celui qui le présente.</w:t>
+      </w:r>
+    </w:p>
+    <w:p>
+      <w:pPr>
+        <w:pStyle w:val="ListBullet"/>
+      </w:pPr>
+      <w:r>
+        <w:rPr>
+          <w:b/>
+        </w:rPr>
+        <w:t>Comparaison</w:t>
+      </w:r>
+      <w:r>
+        <w:t xml:space="preserve"> : tronçons traités contre zone témoin, sur plusieurs périodes. C'est le motif exact du jugement de Béziers : le juge compare des années, pas deux semaines.</w:t>
+      </w:r>
+    </w:p>
+    <w:p>
+      <w:pPr>
+        <w:pStyle w:val="ListBullet"/>
+      </w:pPr>
+      <w:r>
+        <w:rPr>
+          <w:b/>
+        </w:rPr>
+        <w:t>Conditions en covariables</w:t>
+      </w:r>
+      <w:r>
+        <w:t xml:space="preserve"> : météo, jour de collecte, marché, vacances, travaux. Une baisse après un passage de balayeuse n'est pas un effet du dispositif.</w:t>
+      </w:r>
+    </w:p>
+    <w:p>
+      <w:pPr>
+        <w:pStyle w:val="ListBullet"/>
+      </w:pPr>
+      <w:r>
+        <w:rPr>
+          <w:b/>
+        </w:rPr>
+        <w:t>Méthode d'agrégation écrite avant</w:t>
+      </w:r>
+      <w:r>
+        <w:t xml:space="preserve"> : médiane par tronçon, intervalle par rééchantillonnage, seuil de significativité. Écrite avant, elle n'est pas choisie pour le résultat.</w:t>
+      </w:r>
+    </w:p>
+    <w:p>
+      <w:pPr>
+        <w:pStyle w:val="ListBullet"/>
+      </w:pPr>
+      <w:r>
+        <w:rPr>
+          <w:b/>
+        </w:rPr>
+        <w:t>Données brutes publiées</w:t>
+      </w:r>
+      <w:r>
+        <w:t xml:space="preserve"> : JSON, CSV et GeoJSON, plus les empreintes. Une preuve reproductible est une preuve qu'on ne peut pas écarter.</w:t>
+      </w:r>
+    </w:p>
+    <w:p>
+      <w:pPr>
+        <w:pStyle w:val="Heading3"/>
+      </w:pPr>
+      <w:r>
+        <w:t>6. Ouvert : ce que « ouvert » doit vouloir dire</w:t>
+      </w:r>
+    </w:p>
+    <w:p>
+      <w:r>
+        <w:t>Ouvrir le code ne suffit pas. Les quatre pièces qui rendent l'ensemble vérifiable par un tiers :</w:t>
+      </w:r>
+    </w:p>
+    <w:p>
+      <w:pPr>
+        <w:pStyle w:val="ListNumber"/>
+      </w:pPr>
+      <w:r>
+        <w:rPr>
+          <w:b/>
+        </w:rPr>
+        <w:t>protocole versionné</w:t>
+      </w:r>
+      <w:r>
+        <w:t xml:space="preserve"> (les versions successives restent consultables, on ne réécrit pas le passé) ;</w:t>
+      </w:r>
+    </w:p>
+    <w:p>
+      <w:pPr>
+        <w:pStyle w:val="ListNumber"/>
+      </w:pPr>
+      <w:r>
+        <w:rPr>
+          <w:b/>
+        </w:rPr>
+        <w:t>schéma de données publié</w:t>
+      </w:r>
+      <w:r>
+        <w:t xml:space="preserve"> avec le format des enregistrements ;</w:t>
+      </w:r>
+    </w:p>
+    <w:p>
+      <w:pPr>
+        <w:pStyle w:val="ListNumber"/>
+      </w:pPr>
+      <w:r>
+        <w:rPr>
+          <w:b/>
+        </w:rPr>
+        <w:t>code source ouvert</w:t>
+      </w:r>
+      <w:r>
+        <w:t>, exécutable par un tiers, sans dépendance à notre hébergement ;</w:t>
+      </w:r>
+    </w:p>
+    <w:p>
+      <w:pPr>
+        <w:pStyle w:val="ListNumber"/>
+      </w:pPr>
+      <w:r>
+        <w:rPr>
+          <w:b/>
+        </w:rPr>
+        <w:t>jeu de données ouvert</w:t>
+      </w:r>
+      <w:r>
+        <w:t xml:space="preserve"> sous licence claire, avec les empreintes et les jetons d'horodatage.</w:t>
+      </w:r>
+    </w:p>
+    <w:p>
+      <w:pPr>
+        <w:pStyle w:val="Heading3"/>
+      </w:pPr>
+      <w:r>
+        <w:t>7. La séquence, et pourquoi il ne faut pas commencer par l'application</w:t>
+      </w:r>
+    </w:p>
+    <w:p>
+      <w:r>
+        <w:t>Le risque de ce genre de projet est connu : deux mois d'application, zéro comptage.</w:t>
+      </w:r>
+    </w:p>
+    <w:p>
+      <w:pPr>
+        <w:pStyle w:val="ListNumber"/>
+      </w:pPr>
+      <w:r>
+        <w:rPr>
+          <w:b/>
+        </w:rPr>
+        <w:t>Semaine 1-2, à la main.</w:t>
+      </w:r>
+      <w:r>
+        <w:t xml:space="preserve"> Fiche papier standardisée, téléphone, étiquettes imprimées, un tronçon, une zone témoin. Export des photos et des fiches, une empreinte globale par semaine, horodatée. Coût : du temps, quelques euros d'horodatage.</w:t>
+      </w:r>
+    </w:p>
+    <w:p>
+      <w:pPr>
+        <w:pStyle w:val="ListNumber"/>
+      </w:pPr>
+      <w:r>
+        <w:rPr>
+          <w:b/>
+        </w:rPr>
+        <w:t>Semaine 3-6.</w:t>
+      </w:r>
+      <w:r>
+        <w:t xml:space="preserve"> On teste ce qui casse : deux observateurs en désaccord, une pluie, un marché, un tronçon où personne ne passe. C'est là qu'on apprend ce que doit gérer l'outil.</w:t>
+      </w:r>
+    </w:p>
+    <w:p>
+      <w:pPr>
+        <w:pStyle w:val="ListNumber"/>
+      </w:pPr>
+      <w:r>
+        <w:rPr>
+          <w:b/>
+        </w:rPr>
+        <w:t>Après, seulement si l'échelle le justifie</w:t>
+      </w:r>
+      <w:r>
+        <w:t xml:space="preserve"> (plus de dix compteurs, ou une mairie qui veut reprendre l'instrument) : l'application hors ligne d'abord, clé par observateur, QR des étiquettes, registre en ajout seul, publication automatique des agrégats.</w:t>
+      </w:r>
+    </w:p>
+    <w:p>
+      <w:pPr>
+        <w:pStyle w:val="Heading3"/>
+      </w:pPr>
+      <w:r>
+        <w:t>8. Ce que ça peut devenir</w:t>
+      </w:r>
+    </w:p>
+    <w:p>
+      <w:r>
+        <w:t>Le même instrument sert à tout ce qu'une administration ne mesure pas : déjections, dépôts sauvages, bruit, chaleur de rue, bus qui ne passent pas, trottoirs impraticables. Une chaîne de preuve citoyenne réutilisable — protocole, outil, données ouvertes — est un actif qui se prête ou se vend à une association, une mairie, un journal, sans jamais vendre le dossier lui-même. Mais l'ordre compte : c'est le pilote qui donne le droit d'en faire un produit, pas l'inverse.</w:t>
+      </w:r>
+    </w:p>
+    <w:p>
+      <w:r>
+        <w:t>Ce que cette architecture ne règle pas, et qu'il faut répéter : elle ne remplace ni l'invitation écrite à l'adversaire, ni la zone témoin, ni la démonstration que l'identification classique est insuffisante. Elle rend seulement les preuves que nous produisons impossibles à écarter pour de mauvaises raisons.</w:t>
+      </w:r>
+    </w:p>
+    <w:p>
+      <w:r>
+        <w:t>Suite : écrire la fiche de relevé en une page, la règle photographique en une ligne (« l'étiquette et la déjection dans le même cadre »), et le protocole de transfert à deux signatures. Tout le reste est du logiciel, et le logiciel vient après.</w:t>
+      </w:r>
+    </w:p>
+    <w:p>
+      <w:r>
+        <w:rPr>
+          <w:b w:val="0"/>
+        </w:rPr>
+        <w:t>↑ Sommaire</w:t>
+      </w:r>
+    </w:p>
+    <w:p/>
+    <w:p>
+      <w:pPr>
+        <w:pStyle w:val="Heading2"/>
+      </w:pPr>
+      <w:r>
+        <w:t>10. Tests ADN canins : coûts réels, facilité de mise en œuvre, et chiffrage pour Paris (29/09/2026)</w:t>
       </w:r>
     </w:p>
     <w:p>
@@ -10263,7 +11014,7 @@
         <w:pStyle w:val="Heading2"/>
       </w:pPr>
       <w:r>
-        <w:t>10. Statut « chien·ne citoyen·ne de Paris » — note de conception (29/09/2026)</w:t>
+        <w:t>11. Statut « chien·ne citoyen·ne de Paris » — note de conception (29/09/2026)</w:t>
       </w:r>
     </w:p>
     <w:p>
@@ -11139,7 +11890,7 @@
         <w:pStyle w:val="Heading2"/>
       </w:pPr>
       <w:r>
-        <w:t>11. Statut « chien·ne citoyen·ne de Paris » — projet d'arrêté et règlement (version de travail, 29/09/2026)</w:t>
+        <w:t>12. Statut « chien·ne citoyen·ne de Paris » — projet d'arrêté et règlement (version de travail, 29/09/2026)</w:t>
       </w:r>
     </w:p>
     <w:p>
@@ -11578,7 +12329,7 @@
         <w:pStyle w:val="Heading2"/>
       </w:pPr>
       <w:r>
-        <w:t>12. Projet « chiens de Paris » — creusage du 29/09/2026</w:t>
+        <w:t>13. Projet « chiens de Paris » — creusage du 29/09/2026</w:t>
       </w:r>
     </w:p>
     <w:p>
@@ -12514,7 +13265,7 @@
         <w:pStyle w:val="Heading2"/>
       </w:pPr>
       <w:r>
-        <w:t>13. RAPPORT — Un projet politique « chiens de Paris » : statut du chien citoyen, registre ADN, droits et chiffrage</w:t>
+        <w:t>14. RAPPORT — Un projet politique « chiens de Paris » : statut du chien citoyen, registre ADN, droits et chiffrage</w:t>
       </w:r>
     </w:p>
     <w:p>
@@ -17799,6 +18550,38 @@
           <w:p>
             <w:r>
               <w:t>120</w:t>
+            </w:r>
+          </w:p>
+        </w:tc>
+      </w:tr>
+      <w:tr>
+        <w:tc>
+          <w:tcPr>
+            <w:tcW w:type="dxa" w:w="2880"/>
+          </w:tcPr>
+          <w:p>
+            <w:r>
+              <w:t>ARCHI-CHAINE-DE-PREUVE.md</w:t>
+            </w:r>
+          </w:p>
+        </w:tc>
+        <w:tc>
+          <w:tcPr>
+            <w:tcW w:type="dxa" w:w="2880"/>
+          </w:tcPr>
+          <w:p>
+            <w:r>
+              <w:t>Chaîne de preuve outillée : photo en contexte, QR, registre horodaté</w:t>
+            </w:r>
+          </w:p>
+        </w:tc>
+        <w:tc>
+          <w:tcPr>
+            <w:tcW w:type="dxa" w:w="2880"/>
+          </w:tcPr>
+          <w:p>
+            <w:r>
+              <w:t>146</w:t>
             </w:r>
           </w:p>
         </w:tc>

</xml_diff>

<commit_message>
Chiens: note de lancement - le comptage comme vehicule de depart
</commit_message>
<xml_diff>
--- a/export/Chien-citoyen-de-Paris-dossier-complet.docx
+++ b/export/Chien-citoyen-de-Paris-dossier-complet.docx
@@ -840,14 +840,6 @@
       </w:r>
     </w:p>
     <w:p>
-      <w:r>
-        <w:rPr>
-          <w:b/>
-        </w:rPr>
-        <w:t>Partie III — Les annexes vérifiées et triées</w:t>
-      </w:r>
-    </w:p>
-    <w:p>
       <w:pPr>
         <w:pStyle w:val="ListBullet"/>
       </w:pPr>
@@ -855,7 +847,7 @@
         <w:rPr>
           <w:b w:val="0"/>
         </w:rPr>
-        <w:t>6. Audit anti-hallucination des sources</w:t>
+        <w:t>6. Lancer le projet par le comptage</w:t>
       </w:r>
       <w:r>
         <w:t xml:space="preserve"> — </w:t>
@@ -865,7 +857,7 @@
           <w:rFonts w:ascii="Consolas" w:hAnsi="Consolas"/>
           <w:sz w:val="20"/>
         </w:rPr>
-        <w:t>AUDIT-SOURCES.md</w:t>
+        <w:t>LANCEMENT-PAR-LE-COMPTAGE.md</w:t>
       </w:r>
     </w:p>
     <w:p>
@@ -876,7 +868,7 @@
         <w:rPr>
           <w:b w:val="0"/>
         </w:rPr>
-        <w:t>1. Ce qui était faux, et qui a été corrigé dans les documents</w:t>
+        <w:t>1. Pourquoi ce renversement tient</w:t>
       </w:r>
     </w:p>
     <w:p>
@@ -887,7 +879,7 @@
         <w:rPr>
           <w:b w:val="0"/>
         </w:rPr>
-        <w:t>2. Ce que j'avais signalé à tort au premier passage</w:t>
+        <w:t>2. Ce que ça lance vraiment, et ce que ça ne lance pas</w:t>
       </w:r>
     </w:p>
     <w:p>
@@ -898,7 +890,7 @@
         <w:rPr>
           <w:b w:val="0"/>
         </w:rPr>
-        <w:t>3. Affirmations confirmées, avec la source qui les porte</w:t>
+        <w:t>3. Les trois conditions de réussite</w:t>
       </w:r>
     </w:p>
     <w:p>
@@ -909,7 +901,7 @@
         <w:rPr>
           <w:b w:val="0"/>
         </w:rPr>
-        <w:t>4. Ce qui reste incertain, à assumer tel quel</w:t>
+        <w:t>4. Les deux façons dont ça peut rater</w:t>
       </w:r>
     </w:p>
     <w:p>
@@ -920,7 +912,7 @@
         <w:rPr>
           <w:b w:val="0"/>
         </w:rPr>
-        <w:t>5. Corrections appliquées aux fichiers</w:t>
+        <w:t>5. Où ça se branche dans le dossier existant</w:t>
       </w:r>
     </w:p>
     <w:p>
@@ -931,7 +923,15 @@
         <w:rPr>
           <w:b w:val="0"/>
         </w:rPr>
-        <w:t>6. Ajouts postérieurs à l'audit</w:t>
+        <w:t>6. Critères d'arrêt, écrits à l'avance</w:t>
+      </w:r>
+    </w:p>
+    <w:p>
+      <w:r>
+        <w:rPr>
+          <w:b/>
+        </w:rPr>
+        <w:t>Partie III — Les annexes vérifiées et triées</w:t>
       </w:r>
     </w:p>
     <w:p>
@@ -942,7 +942,7 @@
         <w:rPr>
           <w:b w:val="0"/>
         </w:rPr>
-        <w:t>7. Note juridique — l'arrêté ADN canin</w:t>
+        <w:t>7. Audit anti-hallucination des sources</w:t>
       </w:r>
       <w:r>
         <w:t xml:space="preserve"> — </w:t>
@@ -952,7 +952,7 @@
           <w:rFonts w:ascii="Consolas" w:hAnsi="Consolas"/>
           <w:sz w:val="20"/>
         </w:rPr>
-        <w:t>NOTE-JURIDIQUE-ARRETE-ADN.md</w:t>
+        <w:t>AUDIT-SOURCES.md</w:t>
       </w:r>
     </w:p>
     <w:p>
@@ -963,7 +963,7 @@
         <w:rPr>
           <w:b w:val="0"/>
         </w:rPr>
-        <w:t>1. Les faits de Béziers, précisément</w:t>
+        <w:t>1. Ce qui était faux, et qui a été corrigé dans les documents</w:t>
       </w:r>
     </w:p>
     <w:p>
@@ -974,7 +974,7 @@
         <w:rPr>
           <w:b w:val="0"/>
         </w:rPr>
-        <w:t>2. Le point qui change tout pour Paris</w:t>
+        <w:t>2. Ce que j'avais signalé à tort au premier passage</w:t>
       </w:r>
     </w:p>
     <w:p>
@@ -985,7 +985,7 @@
         <w:rPr>
           <w:b w:val="0"/>
         </w:rPr>
-        <w:t>3. La recette pour un arrêté qui survit à un recours (déduite du jugement de Béziers)</w:t>
+        <w:t>3. Affirmations confirmées, avec la source qui les porte</w:t>
       </w:r>
     </w:p>
     <w:p>
@@ -996,7 +996,7 @@
         <w:rPr>
           <w:b w:val="0"/>
         </w:rPr>
-        <w:t>4. Ce que ça implique pour le projet « chien citoyen »</w:t>
+        <w:t>4. Ce qui reste incertain, à assumer tel quel</w:t>
       </w:r>
     </w:p>
     <w:p>
@@ -1007,18 +1007,29 @@
         <w:rPr>
           <w:b w:val="0"/>
         </w:rPr>
-        <w:t>Sources</w:t>
-      </w:r>
-    </w:p>
-    <w:p>
-      <w:pPr>
-        <w:pStyle w:val="ListBullet"/>
+        <w:t>5. Corrections appliquées aux fichiers</w:t>
+      </w:r>
+    </w:p>
+    <w:p>
+      <w:pPr>
+        <w:pStyle w:val="ListBullet2"/>
       </w:pPr>
       <w:r>
         <w:rPr>
           <w:b w:val="0"/>
         </w:rPr>
-        <w:t>8. Note juridique — la valeur juridique du comptage citoyen</w:t>
+        <w:t>6. Ajouts postérieurs à l'audit</w:t>
+      </w:r>
+    </w:p>
+    <w:p>
+      <w:pPr>
+        <w:pStyle w:val="ListBullet"/>
+      </w:pPr>
+      <w:r>
+        <w:rPr>
+          <w:b w:val="0"/>
+        </w:rPr>
+        <w:t>8. Note juridique — l'arrêté ADN canin</w:t>
       </w:r>
       <w:r>
         <w:t xml:space="preserve"> — </w:t>
@@ -1028,7 +1039,7 @@
           <w:rFonts w:ascii="Consolas" w:hAnsi="Consolas"/>
           <w:sz w:val="20"/>
         </w:rPr>
-        <w:t>NOTE-JURIDIQUE-COMPTAGE-CITOYEN.md</w:t>
+        <w:t>NOTE-JURIDIQUE-ARRETE-ADN.md</w:t>
       </w:r>
     </w:p>
     <w:p>
@@ -1039,7 +1050,7 @@
         <w:rPr>
           <w:b w:val="0"/>
         </w:rPr>
-        <w:t>1. Ce que le juge a réellement reproché à Béziers</w:t>
+        <w:t>1. Les faits de Béziers, précisément</w:t>
       </w:r>
     </w:p>
     <w:p>
@@ -1050,7 +1061,7 @@
         <w:rPr>
           <w:b w:val="0"/>
         </w:rPr>
-        <w:t>2. Les trois piliers d'un relevé qui tient</w:t>
+        <w:t>2. Le point qui change tout pour Paris</w:t>
       </w:r>
     </w:p>
     <w:p>
@@ -1061,7 +1072,7 @@
         <w:rPr>
           <w:b w:val="0"/>
         </w:rPr>
-        <w:t>3. Le piège à ne pas recréer : les données personnelles</w:t>
+        <w:t>3. La recette pour un arrêté qui survit à un recours (déduite du jugement de Béziers)</w:t>
       </w:r>
     </w:p>
     <w:p>
@@ -1072,7 +1083,7 @@
         <w:rPr>
           <w:b w:val="0"/>
         </w:rPr>
-        <w:t>4. Ce qu'un comptage citoyen ne peut pas faire</w:t>
+        <w:t>4. Ce que ça implique pour le projet « chien citoyen »</w:t>
       </w:r>
     </w:p>
     <w:p>
@@ -1083,40 +1094,18 @@
         <w:rPr>
           <w:b w:val="0"/>
         </w:rPr>
-        <w:t>5. Les trois niveaux d'escalade</w:t>
-      </w:r>
-    </w:p>
-    <w:p>
-      <w:pPr>
-        <w:pStyle w:val="ListBullet2"/>
+        <w:t>Sources</w:t>
+      </w:r>
+    </w:p>
+    <w:p>
+      <w:pPr>
+        <w:pStyle w:val="ListBullet"/>
       </w:pPr>
       <w:r>
         <w:rPr>
           <w:b w:val="0"/>
         </w:rPr>
-        <w:t>6. Ce que le comptage ne suffira pas à fermer</w:t>
-      </w:r>
-    </w:p>
-    <w:p>
-      <w:pPr>
-        <w:pStyle w:val="ListBullet2"/>
-      </w:pPr>
-      <w:r>
-        <w:rPr>
-          <w:b w:val="0"/>
-        </w:rPr>
-        <w:t>Sources</w:t>
-      </w:r>
-    </w:p>
-    <w:p>
-      <w:pPr>
-        <w:pStyle w:val="ListBullet"/>
-      </w:pPr>
-      <w:r>
-        <w:rPr>
-          <w:b w:val="0"/>
-        </w:rPr>
-        <w:t>9. Architecture — chaîne de preuve outillée (photo en contexte, QR, registre horodaté)</w:t>
+        <w:t>9. Note juridique — la valeur juridique du comptage citoyen</w:t>
       </w:r>
       <w:r>
         <w:t xml:space="preserve"> — </w:t>
@@ -1126,7 +1115,7 @@
           <w:rFonts w:ascii="Consolas" w:hAnsi="Consolas"/>
           <w:sz w:val="20"/>
         </w:rPr>
-        <w:t>ARCHI-CHAINE-DE-PREUVE.md</w:t>
+        <w:t>NOTE-JURIDIQUE-COMPTAGE-CITOYEN.md</w:t>
       </w:r>
     </w:p>
     <w:p>
@@ -1137,7 +1126,7 @@
         <w:rPr>
           <w:b w:val="0"/>
         </w:rPr>
-        <w:t>1. Le partage à ne pas se tromper</w:t>
+        <w:t>1. Ce que le juge a réellement reproché à Béziers</w:t>
       </w:r>
     </w:p>
     <w:p>
@@ -1148,7 +1137,7 @@
         <w:rPr>
           <w:b w:val="0"/>
         </w:rPr>
-        <w:t>2. Le principe : un identifiant, deux chaînes</w:t>
+        <w:t>2. Les trois piliers d'un relevé qui tient</w:t>
       </w:r>
     </w:p>
     <w:p>
@@ -1159,7 +1148,7 @@
         <w:rPr>
           <w:b w:val="0"/>
         </w:rPr>
-        <w:t>3. La photo en contexte, et à quoi sert vraiment le QR</w:t>
+        <w:t>3. Le piège à ne pas recréer : les données personnelles</w:t>
       </w:r>
     </w:p>
     <w:p>
@@ -1170,7 +1159,7 @@
         <w:rPr>
           <w:b w:val="0"/>
         </w:rPr>
-        <w:t>4. Contradictoire outillé, sans le remplacer</w:t>
+        <w:t>4. Ce qu'un comptage citoyen ne peut pas faire</w:t>
       </w:r>
     </w:p>
     <w:p>
@@ -1181,7 +1170,7 @@
         <w:rPr>
           <w:b w:val="0"/>
         </w:rPr>
-        <w:t>5. Les chiffres, et comment ils résistent</w:t>
+        <w:t>5. Les trois niveaux d'escalade</w:t>
       </w:r>
     </w:p>
     <w:p>
@@ -1192,7 +1181,7 @@
         <w:rPr>
           <w:b w:val="0"/>
         </w:rPr>
-        <w:t>6. Ouvert : ce que « ouvert » doit vouloir dire</w:t>
+        <w:t>6. Ce que le comptage ne suffira pas à fermer</w:t>
       </w:r>
     </w:p>
     <w:p>
@@ -1203,29 +1192,18 @@
         <w:rPr>
           <w:b w:val="0"/>
         </w:rPr>
-        <w:t>7. La séquence, et pourquoi il ne faut pas commencer par l'application</w:t>
-      </w:r>
-    </w:p>
-    <w:p>
-      <w:pPr>
-        <w:pStyle w:val="ListBullet2"/>
+        <w:t>Sources</w:t>
+      </w:r>
+    </w:p>
+    <w:p>
+      <w:pPr>
+        <w:pStyle w:val="ListBullet"/>
       </w:pPr>
       <w:r>
         <w:rPr>
           <w:b w:val="0"/>
         </w:rPr>
-        <w:t>8. Ce que ça peut devenir</w:t>
-      </w:r>
-    </w:p>
-    <w:p>
-      <w:pPr>
-        <w:pStyle w:val="ListBullet"/>
-      </w:pPr>
-      <w:r>
-        <w:rPr>
-          <w:b w:val="0"/>
-        </w:rPr>
-        <w:t>10. Tests ADN canins : coûts et faisabilité</w:t>
+        <w:t>10. Architecture — chaîne de preuve outillée (photo en contexte, QR, registre horodaté)</w:t>
       </w:r>
       <w:r>
         <w:t xml:space="preserve"> — </w:t>
@@ -1235,7 +1213,7 @@
           <w:rFonts w:ascii="Consolas" w:hAnsi="Consolas"/>
           <w:sz w:val="20"/>
         </w:rPr>
-        <w:t>ADN-COUTS-FAISABILITE.md</w:t>
+        <w:t>ARCHI-CHAINE-DE-PREUVE.md</w:t>
       </w:r>
     </w:p>
     <w:p>
@@ -1246,7 +1224,7 @@
         <w:rPr>
           <w:b w:val="0"/>
         </w:rPr>
-        <w:t>1. Combien coûte un test, concrètement</w:t>
+        <w:t>1. Le partage à ne pas se tromper</w:t>
       </w:r>
     </w:p>
     <w:p>
@@ -1257,7 +1235,7 @@
         <w:rPr>
           <w:b w:val="0"/>
         </w:rPr>
-        <w:t>2. Est-ce facile à faire ? Oui, techniquement. Les points durs sont ailleurs.</w:t>
+        <w:t>2. Le principe : un identifiant, deux chaînes</w:t>
       </w:r>
     </w:p>
     <w:p>
@@ -1268,7 +1246,7 @@
         <w:rPr>
           <w:b w:val="0"/>
         </w:rPr>
-        <w:t>3. Chiffrage pour Paris</w:t>
+        <w:t>3. La photo en contexte, et à quoi sert vraiment le QR</w:t>
       </w:r>
     </w:p>
     <w:p>
@@ -1279,18 +1257,62 @@
         <w:rPr>
           <w:b w:val="0"/>
         </w:rPr>
-        <w:t>4. Le test le moins cher à faire maintenant (pour aller vite sans argent)</w:t>
-      </w:r>
-    </w:p>
-    <w:p>
-      <w:pPr>
-        <w:pStyle w:val="ListBullet"/>
+        <w:t>4. Contradictoire outillé, sans le remplacer</w:t>
+      </w:r>
+    </w:p>
+    <w:p>
+      <w:pPr>
+        <w:pStyle w:val="ListBullet2"/>
       </w:pPr>
       <w:r>
         <w:rPr>
           <w:b w:val="0"/>
         </w:rPr>
-        <w:t>11. Statut du chien citoyen — note de conception</w:t>
+        <w:t>5. Les chiffres, et comment ils résistent</w:t>
+      </w:r>
+    </w:p>
+    <w:p>
+      <w:pPr>
+        <w:pStyle w:val="ListBullet2"/>
+      </w:pPr>
+      <w:r>
+        <w:rPr>
+          <w:b w:val="0"/>
+        </w:rPr>
+        <w:t>6. Ouvert : ce que « ouvert » doit vouloir dire</w:t>
+      </w:r>
+    </w:p>
+    <w:p>
+      <w:pPr>
+        <w:pStyle w:val="ListBullet2"/>
+      </w:pPr>
+      <w:r>
+        <w:rPr>
+          <w:b w:val="0"/>
+        </w:rPr>
+        <w:t>7. La séquence, et pourquoi il ne faut pas commencer par l'application</w:t>
+      </w:r>
+    </w:p>
+    <w:p>
+      <w:pPr>
+        <w:pStyle w:val="ListBullet2"/>
+      </w:pPr>
+      <w:r>
+        <w:rPr>
+          <w:b w:val="0"/>
+        </w:rPr>
+        <w:t>8. Ce que ça peut devenir</w:t>
+      </w:r>
+    </w:p>
+    <w:p>
+      <w:pPr>
+        <w:pStyle w:val="ListBullet"/>
+      </w:pPr>
+      <w:r>
+        <w:rPr>
+          <w:b w:val="0"/>
+        </w:rPr>
+        <w:t>11. Tests ADN canins : coûts et faisabilité</w:t>
       </w:r>
       <w:r>
         <w:t xml:space="preserve"> — </w:t>
@@ -1300,7 +1322,7 @@
           <w:rFonts w:ascii="Consolas" w:hAnsi="Consolas"/>
           <w:sz w:val="20"/>
         </w:rPr>
-        <w:t>STATUT-CHIEN-CITOYEN.md</w:t>
+        <w:t>ADN-COUTS-FAISABILITE.md</w:t>
       </w:r>
     </w:p>
     <w:p>
@@ -1311,7 +1333,7 @@
         <w:rPr>
           <w:b w:val="0"/>
         </w:rPr>
-        <w:t>0. Le verdict d'abord</w:t>
+        <w:t>1. Combien coûte un test, concrètement</w:t>
       </w:r>
     </w:p>
     <w:p>
@@ -1322,7 +1344,7 @@
         <w:rPr>
           <w:b w:val="0"/>
         </w:rPr>
-        <w:t>1. Le dispositif, brique par brique</w:t>
+        <w:t>2. Est-ce facile à faire ? Oui, techniquement. Les points durs sont ailleurs.</w:t>
       </w:r>
     </w:p>
     <w:p>
@@ -1333,7 +1355,7 @@
         <w:rPr>
           <w:b w:val="0"/>
         </w:rPr>
-        <w:t>2. Qui peut faire quoi (le vrai tableau de contraintes)</w:t>
+        <w:t>3. Chiffrage pour Paris</w:t>
       </w:r>
     </w:p>
     <w:p>
@@ -1344,62 +1366,18 @@
         <w:rPr>
           <w:b w:val="0"/>
         </w:rPr>
-        <w:t>3. Chiffrage</w:t>
-      </w:r>
-    </w:p>
-    <w:p>
-      <w:pPr>
-        <w:pStyle w:val="ListBullet2"/>
+        <w:t>4. Le test le moins cher à faire maintenant (pour aller vite sans argent)</w:t>
+      </w:r>
+    </w:p>
+    <w:p>
+      <w:pPr>
+        <w:pStyle w:val="ListBullet"/>
       </w:pPr>
       <w:r>
         <w:rPr>
           <w:b w:val="0"/>
         </w:rPr>
-        <w:t>4. Les cinq décisions à trancher (ce sont elles, le projet politique)</w:t>
-      </w:r>
-    </w:p>
-    <w:p>
-      <w:pPr>
-        <w:pStyle w:val="ListBullet2"/>
-      </w:pPr>
-      <w:r>
-        <w:rPr>
-          <w:b w:val="0"/>
-        </w:rPr>
-        <w:t>5. Objections à anticiper (sinon elles tueront le projet)</w:t>
-      </w:r>
-    </w:p>
-    <w:p>
-      <w:pPr>
-        <w:pStyle w:val="ListBullet2"/>
-      </w:pPr>
-      <w:r>
-        <w:rPr>
-          <w:b w:val="0"/>
-        </w:rPr>
-        <w:t>6. Positionnement : la formulation qui peut devenir majoritaire</w:t>
-      </w:r>
-    </w:p>
-    <w:p>
-      <w:pPr>
-        <w:pStyle w:val="ListBullet2"/>
-      </w:pPr>
-      <w:r>
-        <w:rPr>
-          <w:b w:val="0"/>
-        </w:rPr>
-        <w:t>7. Prochaines étapes (coût, délai)</w:t>
-      </w:r>
-    </w:p>
-    <w:p>
-      <w:pPr>
-        <w:pStyle w:val="ListBullet"/>
-      </w:pPr>
-      <w:r>
-        <w:rPr>
-          <w:b w:val="0"/>
-        </w:rPr>
-        <w:t>12. Projet d'arrêté et règlement du statut</w:t>
+        <w:t>12. Statut du chien citoyen — note de conception</w:t>
       </w:r>
       <w:r>
         <w:t xml:space="preserve"> — </w:t>
@@ -1409,7 +1387,7 @@
           <w:rFonts w:ascii="Consolas" w:hAnsi="Consolas"/>
           <w:sz w:val="20"/>
         </w:rPr>
-        <w:t>PROJET-ARRETE-STATUT-CHIEN-CITOYEN.md</w:t>
+        <w:t>STATUT-CHIEN-CITOYEN.md</w:t>
       </w:r>
     </w:p>
     <w:p>
@@ -1420,7 +1398,7 @@
         <w:rPr>
           <w:b w:val="0"/>
         </w:rPr>
-        <w:t>A. Projet d'arrêté (expérimentation de 24 mois)</w:t>
+        <w:t>0. Le verdict d'abord</w:t>
       </w:r>
     </w:p>
     <w:p>
@@ -1431,7 +1409,7 @@
         <w:rPr>
           <w:b w:val="0"/>
         </w:rPr>
-        <w:t>B. Règlement du statut</w:t>
+        <w:t>1. Le dispositif, brique par brique</w:t>
       </w:r>
     </w:p>
     <w:p>
@@ -1442,7 +1420,7 @@
         <w:rPr>
           <w:b w:val="0"/>
         </w:rPr>
-        <w:t>C. Le parcours propriétaire, en cinq étapes (le point qui décide du taux d'adhésion)</w:t>
+        <w:t>2. Qui peut faire quoi (le vrai tableau de contraintes)</w:t>
       </w:r>
     </w:p>
     <w:p>
@@ -1453,18 +1431,62 @@
         <w:rPr>
           <w:b w:val="0"/>
         </w:rPr>
-        <w:t>D. Maquette de données (à valider par le DPO de la Ville)</w:t>
-      </w:r>
-    </w:p>
-    <w:p>
-      <w:pPr>
-        <w:pStyle w:val="ListBullet"/>
+        <w:t>3. Chiffrage</w:t>
+      </w:r>
+    </w:p>
+    <w:p>
+      <w:pPr>
+        <w:pStyle w:val="ListBullet2"/>
       </w:pPr>
       <w:r>
         <w:rPr>
           <w:b w:val="0"/>
         </w:rPr>
-        <w:t>13. Projet « chiens de Paris » — creusage</w:t>
+        <w:t>4. Les cinq décisions à trancher (ce sont elles, le projet politique)</w:t>
+      </w:r>
+    </w:p>
+    <w:p>
+      <w:pPr>
+        <w:pStyle w:val="ListBullet2"/>
+      </w:pPr>
+      <w:r>
+        <w:rPr>
+          <w:b w:val="0"/>
+        </w:rPr>
+        <w:t>5. Objections à anticiper (sinon elles tueront le projet)</w:t>
+      </w:r>
+    </w:p>
+    <w:p>
+      <w:pPr>
+        <w:pStyle w:val="ListBullet2"/>
+      </w:pPr>
+      <w:r>
+        <w:rPr>
+          <w:b w:val="0"/>
+        </w:rPr>
+        <w:t>6. Positionnement : la formulation qui peut devenir majoritaire</w:t>
+      </w:r>
+    </w:p>
+    <w:p>
+      <w:pPr>
+        <w:pStyle w:val="ListBullet2"/>
+      </w:pPr>
+      <w:r>
+        <w:rPr>
+          <w:b w:val="0"/>
+        </w:rPr>
+        <w:t>7. Prochaines étapes (coût, délai)</w:t>
+      </w:r>
+    </w:p>
+    <w:p>
+      <w:pPr>
+        <w:pStyle w:val="ListBullet"/>
+      </w:pPr>
+      <w:r>
+        <w:rPr>
+          <w:b w:val="0"/>
+        </w:rPr>
+        <w:t>13. Projet d'arrêté et règlement du statut</w:t>
       </w:r>
       <w:r>
         <w:t xml:space="preserve"> — </w:t>
@@ -1474,6 +1496,71 @@
           <w:rFonts w:ascii="Consolas" w:hAnsi="Consolas"/>
           <w:sz w:val="20"/>
         </w:rPr>
+        <w:t>PROJET-ARRETE-STATUT-CHIEN-CITOYEN.md</w:t>
+      </w:r>
+    </w:p>
+    <w:p>
+      <w:pPr>
+        <w:pStyle w:val="ListBullet2"/>
+      </w:pPr>
+      <w:r>
+        <w:rPr>
+          <w:b w:val="0"/>
+        </w:rPr>
+        <w:t>A. Projet d'arrêté (expérimentation de 24 mois)</w:t>
+      </w:r>
+    </w:p>
+    <w:p>
+      <w:pPr>
+        <w:pStyle w:val="ListBullet2"/>
+      </w:pPr>
+      <w:r>
+        <w:rPr>
+          <w:b w:val="0"/>
+        </w:rPr>
+        <w:t>B. Règlement du statut</w:t>
+      </w:r>
+    </w:p>
+    <w:p>
+      <w:pPr>
+        <w:pStyle w:val="ListBullet2"/>
+      </w:pPr>
+      <w:r>
+        <w:rPr>
+          <w:b w:val="0"/>
+        </w:rPr>
+        <w:t>C. Le parcours propriétaire, en cinq étapes (le point qui décide du taux d'adhésion)</w:t>
+      </w:r>
+    </w:p>
+    <w:p>
+      <w:pPr>
+        <w:pStyle w:val="ListBullet2"/>
+      </w:pPr>
+      <w:r>
+        <w:rPr>
+          <w:b w:val="0"/>
+        </w:rPr>
+        <w:t>D. Maquette de données (à valider par le DPO de la Ville)</w:t>
+      </w:r>
+    </w:p>
+    <w:p>
+      <w:pPr>
+        <w:pStyle w:val="ListBullet"/>
+      </w:pPr>
+      <w:r>
+        <w:rPr>
+          <w:b w:val="0"/>
+        </w:rPr>
+        <w:t>14. Projet « chiens de Paris » — creusage</w:t>
+      </w:r>
+      <w:r>
+        <w:t xml:space="preserve"> — </w:t>
+      </w:r>
+      <w:r>
+        <w:rPr>
+          <w:rFonts w:ascii="Consolas" w:hAnsi="Consolas"/>
+          <w:sz w:val="20"/>
+        </w:rPr>
         <w:t>PROJET-CHIENS-PARIS.md</w:t>
       </w:r>
     </w:p>
@@ -1573,7 +1660,7 @@
         <w:rPr>
           <w:b w:val="0"/>
         </w:rPr>
-        <w:t>14. Rapport complet et chiffrage</w:t>
+        <w:t>15. Rapport complet et chiffrage</w:t>
       </w:r>
       <w:r>
         <w:t xml:space="preserve"> — </w:t>
@@ -6013,7 +6100,7 @@
           <w:rFonts w:ascii="Consolas" w:hAnsi="Consolas"/>
           <w:sz w:val="20"/>
         </w:rPr>
-        <w:t>[AUDIT-SOURCES.md](#6-audit-anti-hallucination-du-dossier-chiens-paris)</w:t>
+        <w:t>[AUDIT-SOURCES.md](#7-audit-anti-hallucination-du-dossier-chiens-paris)</w:t>
       </w:r>
       <w:r>
         <w:t xml:space="preserve">. La superficie du parc Monceau (8,25 ha) : https://www.paris.fr/lieux/parc-monceau-1804 Le détail des coûts et des hypothèses : </w:t>
@@ -6023,7 +6110,7 @@
           <w:rFonts w:ascii="Consolas" w:hAnsi="Consolas"/>
           <w:sz w:val="20"/>
         </w:rPr>
-        <w:t>[RAPPORT-COMPLET-CHIENS-PARIS.md](#14-rapport--un-projet-politique--chiens-de-paris---statut-du-chien-citoyen-registre-adn-droits-et-chiffrage)</w:t>
+        <w:t>[RAPPORT-COMPLET-CHIENS-PARIS.md](#15-rapport--un-projet-politique--chiens-de-paris---statut-du-chien-citoyen-registre-adn-droits-et-chiffrage)</w:t>
       </w:r>
       <w:r>
         <w:t xml:space="preserve"> (annexe E pour les URL).</w:t>
@@ -6039,6 +6126,325 @@
     </w:p>
     <w:p/>
     <w:p>
+      <w:pPr>
+        <w:pStyle w:val="Heading2"/>
+      </w:pPr>
+      <w:r>
+        <w:t>6. Lancer par le comptage</w:t>
+      </w:r>
+    </w:p>
+    <w:p>
+      <w:r>
+        <w:rPr>
+          <w:i/>
+        </w:rPr>
+        <w:t>Source : `LANCEMENT-PAR-LE-COMPTAGE.md`.</w:t>
+      </w:r>
+    </w:p>
+    <w:p>
+      <w:r>
+        <w:t>29 septembre 2026. Hypothèse de travail : le comptage n'est pas seulement la protection juridique exigée avant tout arrêté (la pièce qui a manqué à Béziers) — c'est le bon véhicule de lancement du projet. Le volet communication disait déjà, sans le nommer, que la première prise de parole publique est le comptage et pas l'idée. Cette note va au bout de la conséquence. Rien n'a été voté.</w:t>
+      </w:r>
+    </w:p>
+    <w:p>
+      <w:pPr>
+        <w:pStyle w:val="Heading3"/>
+      </w:pPr>
+      <w:r>
+        <w:t>1. Pourquoi ce renversement tient</w:t>
+      </w:r>
+    </w:p>
+    <w:p>
+      <w:r>
+        <w:t>Lancer par le statut, c'est demander quelque chose : « voulez-vous ce contrat ? » Une demande politique se heurte à une opinion, et une opinion ne produit rien. Tout le monde a un avis sur les chiens de Paris, personne n'a un chiffre.</w:t>
+      </w:r>
+    </w:p>
+    <w:p>
+      <w:r>
+        <w:t>Lancer par le comptage inverse la charge. On n'arrive pas avec une idée à débattre, on arrive avec quelque chose de fait et un chiffre à contester. Quatre effets concrets :</w:t>
+      </w:r>
+    </w:p>
+    <w:p>
+      <w:pPr>
+        <w:pStyle w:val="ListNumber"/>
+      </w:pPr>
+      <w:r>
+        <w:rPr>
+          <w:b/>
+        </w:rPr>
+        <w:t>La contrainte d'hier devient la raison d'agir.</w:t>
+      </w:r>
+      <w:r>
+        <w:t xml:space="preserve"> Le comptage n'est plus une case à cocher imposée par le juge : c'est l'action. Et c'est la seule du dossier qui ne dépende de personne — ni d'un maire, ni d'Île-de-France Mobilités, ni d'une association, ni d'un budget.</w:t>
+      </w:r>
+    </w:p>
+    <w:p>
+      <w:pPr>
+        <w:pStyle w:val="ListNumber"/>
+      </w:pPr>
+      <w:r>
+        <w:rPr>
+          <w:b/>
+        </w:rPr>
+        <w:t>Ça recrute par le geste, pas par la cause.</w:t>
+      </w:r>
+      <w:r>
+        <w:t xml:space="preserve"> Six semaines à compter à deux, deux fois par semaine, ça fabrique un groupe qui s'est engagé sur une tâche. Un collectif se forme bien plus solidement autour d'un travail partagé qu'autour d'une pétition.</w:t>
+      </w:r>
+    </w:p>
+    <w:p>
+      <w:pPr>
+        <w:pStyle w:val="ListNumber"/>
+      </w:pPr>
+      <w:r>
+        <w:rPr>
+          <w:b/>
+        </w:rPr>
+        <w:t>Ça fabrique l'angle de presse.</w:t>
+      </w:r>
+      <w:r>
+        <w:t xml:space="preserve"> Personne n'a de comptage par 100 m dans un arrondissement donné. Le neuf, pour un journal, c'est la mesure, jamais l'idée — et un comptage a la vertu d'être vérifiable : le journaliste peut aller compter lui-même.</w:t>
+      </w:r>
+    </w:p>
+    <w:p>
+      <w:pPr>
+        <w:pStyle w:val="ListNumber"/>
+      </w:pPr>
+      <w:r>
+        <w:rPr>
+          <w:b/>
+        </w:rPr>
+        <w:t>Ça désarme les deux attaques qui tuent ce projet.</w:t>
+      </w:r>
+      <w:r>
+        <w:t xml:space="preserve"> Personne ne crie au fichage ni à la taxe quand on ne demande rien à personne : ni registre, ni obligation, ni identification. On mesure. Politiquement, un comptage est presque inattaquable — c'est un actif rare dans ce dossier.</w:t>
+      </w:r>
+    </w:p>
+    <w:p>
+      <w:pPr>
+        <w:pStyle w:val="Heading3"/>
+      </w:pPr>
+      <w:r>
+        <w:t>2. Ce que ça lance vraiment, et ce que ça ne lance pas</w:t>
+      </w:r>
+    </w:p>
+    <w:p>
+      <w:r>
+        <w:t xml:space="preserve">Ça lance </w:t>
+      </w:r>
+      <w:r>
+        <w:rPr>
+          <w:b/>
+        </w:rPr>
+        <w:t>la position de référence sur le sujet</w:t>
+      </w:r>
+      <w:r>
+        <w:t xml:space="preserve"> : celui qui détient le chiffre devient l'interlocuteur, et se fait appeler par les praticiens — la propreté, un cabinet d'arrondissement, la presse locale. C'est la précondition pour être pris au sérieux plus tard, y compris par des adversaires.</w:t>
+      </w:r>
+    </w:p>
+    <w:p>
+      <w:r>
+        <w:t xml:space="preserve">Ça ne lance </w:t>
+      </w:r>
+      <w:r>
+        <w:rPr>
+          <w:b/>
+        </w:rPr>
+        <w:t>ni le statut, ni des droits, ni un élu</w:t>
+      </w:r>
+      <w:r>
+        <w:t>. Le comptage ouvre des portes techniques et médiatiques, pas la décision politique. L'objectif du lancement doit donc être écrit ainsi : devenir la référence chiffrée du sujet, pas passer le statut. Le statut vient après, porté par le chiffre au lieu d'être porté par nous.</w:t>
+      </w:r>
+    </w:p>
+    <w:p>
+      <w:pPr>
+        <w:pStyle w:val="Heading3"/>
+      </w:pPr>
+      <w:r>
+        <w:t>3. Les trois conditions de réussite</w:t>
+      </w:r>
+    </w:p>
+    <w:p>
+      <w:r>
+        <w:rPr>
+          <w:b/>
+        </w:rPr>
+        <w:t>a. Le comptage doit être construit pour finir sur un point de décision.</w:t>
+      </w:r>
+      <w:r>
+        <w:t xml:space="preserve"> C'est le vrai risque du lancement par le comptage : on obtient un joli observatoire, un tableau, et rien d'autre. Donc dès le protocole : une date de fin annoncée, une publication datée, et le dépôt public du même jour — présentation en conseil d'arrondissement, dossier de budget participatif, courrier aux élus. Le comptage n'est pas une fin, c'est la pièce jointe d'une demande qui arrive le jour où la donnée existe.</w:t>
+      </w:r>
+    </w:p>
+    <w:p>
+      <w:r>
+        <w:rPr>
+          <w:b/>
+        </w:rPr>
+        <w:t>b. Les règles de sélection des tronçons sont publiques et non choisies par nous.</w:t>
+      </w:r>
+      <w:r>
+        <w:t xml:space="preserve"> C'est la faiblesse la plus facile à exploiter : « vous avez compté où vous vouliez ». La parade est simple et imparable : liste des tronçons candidats établie selon une règle explicite (voies bordant écoles, marchés, sorties de métro), puis </w:t>
+      </w:r>
+      <w:r>
+        <w:rPr>
+          <w:b/>
+        </w:rPr>
+        <w:t>tirage au sort publié</w:t>
+      </w:r>
+      <w:r>
+        <w:t xml:space="preserve"> — graine, date, résultat, témoin. Un tirage au sort se vérifie ; une sélection se discute.</w:t>
+      </w:r>
+    </w:p>
+    <w:p>
+      <w:r>
+        <w:rPr>
+          <w:b/>
+        </w:rPr>
+        <w:t>c. Le premier comptage est un état des lieux, pas une évaluation.</w:t>
+      </w:r>
+      <w:r>
+        <w:t xml:space="preserve"> T0 décrit ce qui est. La baisse est une conséquence possible, jamais une promesse : promettre une baisse, c'est Béziers qui annonce 85 % et perd au tribunal. Et la comparaison T0/T1 se fait à saison comparable, sinon elle ne vaut rien.</w:t>
+      </w:r>
+    </w:p>
+    <w:p>
+      <w:pPr>
+        <w:pStyle w:val="Heading3"/>
+      </w:pPr>
+      <w:r>
+        <w:t>4. Les deux façons dont ça peut rater</w:t>
+      </w:r>
+    </w:p>
+    <w:p>
+      <w:r>
+        <w:rPr>
+          <w:b/>
+        </w:rPr>
+        <w:t>L'épuisement.</w:t>
+      </w:r>
+      <w:r>
+        <w:t xml:space="preserve"> Compter sous la pluie, deux fois par semaine, sans résultat visible pendant six semaines : la moitié des volontaires s'arrêtent à la troisième. Parade : périmètre réduit au départ, date de fin annoncée, </w:t>
+      </w:r>
+      <w:r>
+        <w:rPr>
+          <w:b/>
+        </w:rPr>
+        <w:t>bilan de mi-parcours publié à la troisième semaine</w:t>
+      </w:r>
+      <w:r>
+        <w:t xml:space="preserve"> (voir un chiffre intermédiaire, même provisoire, est ce qui tient les gens), deux personnes minimum par tronçon, et passage de relais assumé plutôt que culpabilisé.</w:t>
+      </w:r>
+    </w:p>
+    <w:p>
+      <w:r>
+        <w:rPr>
+          <w:b/>
+        </w:rPr>
+        <w:t>Le folklorique.</w:t>
+      </w:r>
+      <w:r>
+        <w:t xml:space="preserve"> Des crottes, c'est drôle — et le drôle a un plafond : certains interlocuteurs classeront le dossier en sujet anecdotique, et un élu peut s'en servir pour éviter la question. Règle de ton : le gag peut servir de titre ou d'amorce, jamais de substance. Le comptage se présente comme un constat médico-légal, pas comme un happening — protocole, témoins, empreintes, chiffres au centième. C'est précisément ce sérieux qui rend le sujet impossible à balayer.</w:t>
+      </w:r>
+    </w:p>
+    <w:p>
+      <w:pPr>
+        <w:pStyle w:val="Heading3"/>
+      </w:pPr>
+      <w:r>
+        <w:t>5. Où ça se branche dans le dossier existant</w:t>
+      </w:r>
+    </w:p>
+    <w:p>
+      <w:pPr>
+        <w:pStyle w:val="ListBullet"/>
+      </w:pPr>
+      <w:r>
+        <w:t xml:space="preserve">Le comptage est la </w:t>
+      </w:r>
+      <w:r>
+        <w:rPr>
+          <w:b/>
+        </w:rPr>
+        <w:t>première prise de parole</w:t>
+      </w:r>
+      <w:r>
+        <w:t xml:space="preserve"> : un seul article, sur la mesure, jamais trois (volet communication, étape 1).</w:t>
+      </w:r>
+    </w:p>
+    <w:p>
+      <w:pPr>
+        <w:pStyle w:val="ListBullet"/>
+      </w:pPr>
+      <w:r>
+        <w:t>Il rend le protocole de l'annexe C exécutable : zone témoin, pré-enregistrement, observateurs non partisans, fin bornée avec publication.</w:t>
+      </w:r>
+    </w:p>
+    <w:p>
+      <w:pPr>
+        <w:pStyle w:val="ListBullet"/>
+      </w:pPr>
+      <w:r>
+        <w:t>Il donne à la note juridique du comptage sa raison d'être : c'est parce que la donnée doit finir devant un juge et une administration hostile qu'elle est construite comme une preuve.</w:t>
+      </w:r>
+    </w:p>
+    <w:p>
+      <w:pPr>
+        <w:pStyle w:val="ListBullet"/>
+      </w:pPr>
+      <w:r>
+        <w:t>Il ouvre la porte du seul vrai produit possible à ce stade : une chaîne de preuve citoyenne réutilisable, pour tout ce que l'administration ne mesure pas.</w:t>
+      </w:r>
+    </w:p>
+    <w:p>
+      <w:pPr>
+        <w:pStyle w:val="Heading3"/>
+      </w:pPr>
+      <w:r>
+        <w:t>6. Critères d'arrêt, écrits à l'avance</w:t>
+      </w:r>
+    </w:p>
+    <w:p>
+      <w:pPr>
+        <w:pStyle w:val="ListBullet"/>
+      </w:pPr>
+      <w:r>
+        <w:t xml:space="preserve">Si le comptage </w:t>
+      </w:r>
+      <w:r>
+        <w:rPr>
+          <w:b/>
+        </w:rPr>
+        <w:t>ne confirme pas</w:t>
+      </w:r>
+      <w:r>
+        <w:t xml:space="preserve"> le problème (peu de déjections sur les tronçons tirés au sort), on publie le résultat tel quel et le projet change de sujet ou s'arrête : c'est honorable, c'est publiable, et c'est exactement ce que le dossier s'engage à assumer.</w:t>
+      </w:r>
+    </w:p>
+    <w:p>
+      <w:pPr>
+        <w:pStyle w:val="ListBullet"/>
+      </w:pPr>
+      <w:r>
+        <w:t>Si le registre de volontaires ne tient pas la deuxième semaine, on réduit à un tronçon, on garde la méthode et on documente l'échec — un protocole qui n'a pas tenu est une donnée sur la faisabilité.</w:t>
+      </w:r>
+    </w:p>
+    <w:p>
+      <w:pPr>
+        <w:pStyle w:val="ListBullet"/>
+      </w:pPr>
+      <w:r>
+        <w:t>Si un élu veut récupérer l'opération, on le laisse : le comptage doit rester une contribution ouverte, jamais une propriété.</w:t>
+      </w:r>
+    </w:p>
+    <w:p>
+      <w:r>
+        <w:rPr>
+          <w:b w:val="0"/>
+        </w:rPr>
+        <w:t>↑ Sommaire</w:t>
+      </w:r>
+    </w:p>
+    <w:p/>
+    <w:p>
       <w:r>
         <w:br w:type="page"/>
       </w:r>
@@ -6056,7 +6462,7 @@
         <w:pStyle w:val="Heading2"/>
       </w:pPr>
       <w:r>
-        <w:t>6. Audit anti-hallucination du dossier chiens-paris</w:t>
+        <w:t>7. Audit anti-hallucination du dossier chiens-paris</w:t>
       </w:r>
     </w:p>
     <w:p>
@@ -8718,7 +9124,7 @@
           <w:rFonts w:ascii="Consolas" w:hAnsi="Consolas"/>
           <w:sz w:val="20"/>
         </w:rPr>
-        <w:t>[NOTE-JURIDIQUE-COMPTAGE-CITOYEN.md](#8-note-juridique--ce-qui-donne-une-valeur-juridique-au-comptage-citoyen)</w:t>
+        <w:t>[NOTE-JURIDIQUE-COMPTAGE-CITOYEN.md](#9-note-juridique--ce-qui-donne-une-valeur-juridique-au-comptage-citoyen)</w:t>
       </w:r>
       <w:r>
         <w:t xml:space="preserve">, qui cite l'extrait exact publié par la LDH : aucune pièce du dossier ne corrobore l'atteinte invoquée pour 2020-2022, l'inefficacité des mesures existantes n'est pas établie, et la mesure n'est « ni nécessaire, ni adaptée, ni proportionnée ». </w:t>
@@ -8829,7 +9235,7 @@
         <w:pStyle w:val="Heading2"/>
       </w:pPr>
       <w:r>
-        <w:t>7. Note juridique — l'arrêté ADN canin : ce qui a fait annuler Béziers, et la recette pour un arrêté qui tient (29/09/2026)</w:t>
+        <w:t>8. Note juridique — l'arrêté ADN canin : ce qui a fait annuler Béziers, et la recette pour un arrêté qui tient (29/09/2026)</w:t>
       </w:r>
     </w:p>
     <w:p>
@@ -9121,7 +9527,7 @@
         <w:pStyle w:val="Heading2"/>
       </w:pPr>
       <w:r>
-        <w:t>8. Note juridique — ce qui donne une valeur juridique au comptage citoyen</w:t>
+        <w:t>9. Note juridique — ce qui donne une valeur juridique au comptage citoyen</w:t>
       </w:r>
     </w:p>
     <w:p>
@@ -9538,7 +9944,7 @@
         <w:pStyle w:val="Heading2"/>
       </w:pPr>
       <w:r>
-        <w:t>9. Architecture — une chaîne de preuve outillée (photo en contexte, QR, registre horodaté)</w:t>
+        <w:t>10. Architecture — une chaîne de preuve outillée (photo en contexte, QR, registre horodaté)</w:t>
       </w:r>
     </w:p>
     <w:p>
@@ -10180,7 +10586,7 @@
         <w:pStyle w:val="Heading2"/>
       </w:pPr>
       <w:r>
-        <w:t>10. Tests ADN canins : coûts réels, facilité de mise en œuvre, et chiffrage pour Paris (29/09/2026)</w:t>
+        <w:t>11. Tests ADN canins : coûts réels, facilité de mise en œuvre, et chiffrage pour Paris (29/09/2026)</w:t>
       </w:r>
     </w:p>
     <w:p>
@@ -11014,7 +11420,7 @@
         <w:pStyle w:val="Heading2"/>
       </w:pPr>
       <w:r>
-        <w:t>11. Statut « chien·ne citoyen·ne de Paris » — note de conception (29/09/2026)</w:t>
+        <w:t>12. Statut « chien·ne citoyen·ne de Paris » — note de conception (29/09/2026)</w:t>
       </w:r>
     </w:p>
     <w:p>
@@ -11890,7 +12296,7 @@
         <w:pStyle w:val="Heading2"/>
       </w:pPr>
       <w:r>
-        <w:t>12. Statut « chien·ne citoyen·ne de Paris » — projet d'arrêté et règlement (version de travail, 29/09/2026)</w:t>
+        <w:t>13. Statut « chien·ne citoyen·ne de Paris » — projet d'arrêté et règlement (version de travail, 29/09/2026)</w:t>
       </w:r>
     </w:p>
     <w:p>
@@ -12329,7 +12735,7 @@
         <w:pStyle w:val="Heading2"/>
       </w:pPr>
       <w:r>
-        <w:t>13. Projet « chiens de Paris » — creusage du 29/09/2026</w:t>
+        <w:t>14. Projet « chiens de Paris » — creusage du 29/09/2026</w:t>
       </w:r>
     </w:p>
     <w:p>
@@ -13265,7 +13671,7 @@
         <w:pStyle w:val="Heading2"/>
       </w:pPr>
       <w:r>
-        <w:t>14. RAPPORT — Un projet politique « chiens de Paris » : statut du chien citoyen, registre ADN, droits et chiffrage</w:t>
+        <w:t>15. RAPPORT — Un projet politique « chiens de Paris » : statut du chien citoyen, registre ADN, droits et chiffrage</w:t>
       </w:r>
     </w:p>
     <w:p>
@@ -18454,6 +18860,38 @@
           <w:p>
             <w:r>
               <w:t>193</w:t>
+            </w:r>
+          </w:p>
+        </w:tc>
+      </w:tr>
+      <w:tr>
+        <w:tc>
+          <w:tcPr>
+            <w:tcW w:type="dxa" w:w="2880"/>
+          </w:tcPr>
+          <w:p>
+            <w:r>
+              <w:t>LANCEMENT-PAR-LE-COMPTAGE.md</w:t>
+            </w:r>
+          </w:p>
+        </w:tc>
+        <w:tc>
+          <w:tcPr>
+            <w:tcW w:type="dxa" w:w="2880"/>
+          </w:tcPr>
+          <w:p>
+            <w:r>
+              <w:t>Lancer le projet par le comptage citoyen</w:t>
+            </w:r>
+          </w:p>
+        </w:tc>
+        <w:tc>
+          <w:tcPr>
+            <w:tcW w:type="dxa" w:w="2880"/>
+          </w:tcPr>
+          <w:p>
+            <w:r>
+              <w:t>96</w:t>
             </w:r>
           </w:p>
         </w:tc>

</xml_diff>

<commit_message>
Chiens: perimetre pilote arbitre sur le 13e (volontaires, poids politique, espaces verts, petite ceinture) + chiffres 13e sources et audit
</commit_message>
<xml_diff>
--- a/export/Chien-citoyen-de-Paris-dossier-complet.docx
+++ b/export/Chien-citoyen-de-Paris-dossier-complet.docx
@@ -923,7 +923,18 @@
         <w:rPr>
           <w:b w:val="0"/>
         </w:rPr>
-        <w:t>6. Critères d'arrêt, écrits à l'avance</w:t>
+        <w:t>6. Le périmètre : le 13e, et pourquoi ce n'est pas un compromis</w:t>
+      </w:r>
+    </w:p>
+    <w:p>
+      <w:pPr>
+        <w:pStyle w:val="ListBullet2"/>
+      </w:pPr>
+      <w:r>
+        <w:rPr>
+          <w:b w:val="0"/>
+        </w:rPr>
+        <w:t>7. Critères d'arrêt, écrits à l'avance</w:t>
       </w:r>
     </w:p>
     <w:p>
@@ -3001,7 +3012,7 @@
         <w:pStyle w:val="ListBullet"/>
       </w:pPr>
       <w:r>
-        <w:t>Périmètre du pilote : le 20e, 6 133 chiens identifiés et 45 conseillers d'arrondissement, ou le 10e, 3 580 chiens et 19 sièges. Le 8e a l'infrastructure mais peu de chiens.</w:t>
+        <w:t>Périmètre du pilote : le 13e, retenu le 29 septembre 2026 — c'est l'arrondissement des volontaires qui comptent, et il tient le reste (environ 180 000 habitants, 116 196 inscrits, 43 sièges au conseil d'arrondissement, 62 espaces verts ouverts au public). Alternatives : le 20e, 6 133 chiens identifiés et 45 conseillers d'arrondissement, ou le 10e, 3 580 chiens et 19 sièges. Le 8e a l'infrastructure mais peu de chiens. Le nombre de chiens identifiés dans le 13e est à demander à la Ville.</w:t>
       </w:r>
     </w:p>
     <w:p>
@@ -3037,7 +3048,7 @@
         <w:t>Un à deux mois</w:t>
       </w:r>
       <w:r>
-        <w:t xml:space="preserve"> : entretien avec PARC.C, réunion publique dans le 20e, questionnaire à 300 détenteurs pour voir si l'adhésion prend.</w:t>
+        <w:t xml:space="preserve"> : entretien avec PARC.C, réunion publique dans le 13e, questionnaire à 300 détenteurs pour voir si l'adhésion prend.</w:t>
       </w:r>
     </w:p>
     <w:p>
@@ -3934,7 +3945,7 @@
         <w:pStyle w:val="ListBullet"/>
       </w:pPr>
       <w:r>
-        <w:t>périmètre pilote sur le 20e arrondissement (6 133 chiens identifiés) plutôt que sur un arrondissement central,</w:t>
+        <w:t>périmètre pilote sur le 13e arrondissement (des volontaires y comptent déjà, 43 sièges au conseil d'arrondissement, majorité stable depuis mars 2026) plutôt que sur un arrondissement central,</w:t>
       </w:r>
     </w:p>
     <w:p>
@@ -4340,7 +4351,7 @@
         <w:pStyle w:val="ListNumber"/>
       </w:pPr>
       <w:r>
-        <w:t>Vœu ou délibération du conseil d'arrondissement (le 20e est le périmètre recommandé : 6 133 chiens identifiés, 45 conseillers d'arrondissement), qui vaut engagement politique et peut servir de base à l'expérimentation.</w:t>
+        <w:t>Vœu ou délibération du conseil d'arrondissement (le 13e est le périmètre retenu : des volontaires y comptent déjà, 43 sièges au conseil d'arrondissement, majorité stable depuis mars 2026), qui vaut engagement politique et peut servir de base à l'expérimentation.</w:t>
       </w:r>
     </w:p>
     <w:p>
@@ -4829,7 +4840,7 @@
         <w:t>Périmètre</w:t>
       </w:r>
       <w:r>
-        <w:t xml:space="preserve"> : un arrondissement (le 20e, recommandé) ou deux. Réponse recommandée : un seul, avec extension décidée après évaluation.</w:t>
+        <w:t xml:space="preserve"> : un arrondissement (le 13e, retenu : c'est là que vivent les volontaires qui comptent) ou deux. Réponse recommandée : un seul, avec extension décidée après évaluation.</w:t>
       </w:r>
     </w:p>
     <w:p>
@@ -5780,7 +5791,7 @@
         <w:t>La réunion publique</w:t>
       </w:r>
       <w:r>
-        <w:t xml:space="preserve"> dans l'arrondissement pilote (le 20e : 6 133 chiens identifiés, 45 conseillers d'arrondissement) — c'est là qu'un élu se déclare, ou pas.</w:t>
+        <w:t xml:space="preserve"> dans l'arrondissement pilote (le 13e : environ 180 000 habitants, 43 sièges au conseil d'arrondissement, majorité stable depuis mars 2026) — c'est là qu'un élu se déclare, ou pas.</w:t>
       </w:r>
     </w:p>
     <w:p>
@@ -6399,7 +6410,106 @@
         <w:pStyle w:val="Heading3"/>
       </w:pPr>
       <w:r>
-        <w:t>6. Critères d'arrêt, écrits à l'avance</w:t>
+        <w:t>6. Le périmètre : le 13e, et pourquoi ce n'est pas un compromis</w:t>
+      </w:r>
+    </w:p>
+    <w:p>
+      <w:r>
+        <w:t xml:space="preserve">Le critère qui décide n'est pas la densité canine, c'est </w:t>
+      </w:r>
+      <w:r>
+        <w:rPr>
+          <w:b/>
+        </w:rPr>
+        <w:t>qui compte</w:t>
+      </w:r>
+      <w:r>
+        <w:t>. Les volontaires sont tous dans le 13e : c'est là que la balade des chiens a lieu. Un pilote où personne ne compte ne vaut rien, même avec trois fois plus de chiens identifiés — et un pilote avec trois couples de promeneurs motivés vaut mieux que n'importe quel arrondissement théoriquement idéal. Le dossier recommandait le 20e ou le 10e sur deux critères seulement (densité canine, taille du conseil) : il en manquait un troisième, et c'est le premier en pratique.</w:t>
+      </w:r>
+    </w:p>
+    <w:p>
+      <w:r>
+        <w:t>Et le 13e n'est pas une concession. Sur quatre points, c'est probablement un meilleur pilote :</w:t>
+      </w:r>
+    </w:p>
+    <w:p>
+      <w:pPr>
+        <w:pStyle w:val="ListNumber"/>
+      </w:pPr>
+      <w:r>
+        <w:rPr>
+          <w:b/>
+        </w:rPr>
+        <w:t>Poids politique et durée.</w:t>
+      </w:r>
+      <w:r>
+        <w:t xml:space="preserve"> Près de 180 000 habitants, 7,13 km², 116 196 inscrits, un conseil d'arrondissement de 43 sièges (12 conseillers de Paris et 31 conseillers d'arrondissement). Le maire, Jérôme Coumet, a été élu au premier tour en mars 2026 avec 51,52 % des suffrages et 35 des 43 sièges : majorité stable pour six ans, donc le temps d'une expérimentation, et un rapport de force où une délibération d'arrondissement est atteignable.</w:t>
+      </w:r>
+    </w:p>
+    <w:p>
+      <w:pPr>
+        <w:pStyle w:val="ListNumber"/>
+      </w:pPr>
+      <w:r>
+        <w:rPr>
+          <w:b/>
+        </w:rPr>
+        <w:t>Beaucoup d'espaces verts, peu de droits pour les chiens.</w:t>
+      </w:r>
+      <w:r>
+        <w:t xml:space="preserve"> Le 13e compte 62 espaces verts ouverts au public, soit 6 % de sa surface, et il est présenté comme l'un des arrondissements aux plus grands parcs et jardins. Or la liste des jardins accessibles aux chiens, même en laisse, y reste courte, et les espaces canins sont en nombre insuffisant. Le contraste local — tous ces hectares et presque aucun droit — est plus parlant qu'un chiffre parisien global.</w:t>
+      </w:r>
+    </w:p>
+    <w:p>
+      <w:pPr>
+        <w:pStyle w:val="ListNumber"/>
+      </w:pPr>
+      <w:r>
+        <w:rPr>
+          <w:b/>
+        </w:rPr>
+        <w:t>Le tissu social tue l'objection « péage pour riches ».</w:t>
+      </w:r>
+      <w:r>
+        <w:t xml:space="preserve"> Logements sociaux nombreux (Olympiades, Italie 13, parc de Paris Habitat), familles, ouvriers et employés, communauté asiatique importante et commerces de rue très vivants. C'est exactement la population que le statut doit convaincre s'il ne veut pas filtrer par l'argent : le meilleur terrain pour tester la gratuité de l'identification, les exonérations et l'ouverture des jardins d'immeuble.</w:t>
+      </w:r>
+    </w:p>
+    <w:p>
+      <w:pPr>
+        <w:pStyle w:val="ListNumber"/>
+      </w:pPr>
+      <w:r>
+        <w:rPr>
+          <w:b/>
+        </w:rPr>
+        <w:t>Un lieu où la règle ne s'applique déjà plus.</w:t>
+      </w:r>
+      <w:r>
+        <w:t xml:space="preserve"> Le contrat de prévention et de sécurité du 13e signale explicitement la promenade de la petite ceinture à la Poterne des Peupliers comme un point où l'on rencontre des chiens non tenus en laisse. C'est le candidat naturel à un espace de liberté encadré — et, avant/après, une mesure qui parle aux habitants comme aux élus.</w:t>
+      </w:r>
+    </w:p>
+    <w:p>
+      <w:r>
+        <w:rPr>
+          <w:b/>
+        </w:rPr>
+        <w:t>Ce qui manque, et qu'il ne faut pas inventer :</w:t>
+      </w:r>
+      <w:r>
+        <w:t xml:space="preserve"> le nombre de chiens identifiés dans le 13e. Le dossier retient 6 133 chiens pour le 20e et 3 580 pour le 10e, mais aucun chiffre fiable pour le 13e — et le nombre parisien lui-même est incertain (100 000 selon la Ville, jusqu'à 300 000 ailleurs). Trois demandes écrites à faire, gratuites, sur des documents administratifs communicables : le chiffre I-CAD à jour pour l'arrondissement (à la Ville et à la profession vétérinaire), la liste des espaces canins et des jardins accessibles aux chiens du 13e, et les statistiques de propreté du secteur. Tant qu'elles ne sont pas arrivées, le pilote s'écrit « 13e » et le chiffre reste vide.</w:t>
+      </w:r>
+    </w:p>
+    <w:p>
+      <w:r>
+        <w:t>Sources : Ville de Paris, élus d'arrondissements (page mise à jour le 31/03/2026) ; https://www.paris.fr/pages/elus-d-arrondissements-2365 — résultats des municipales 2026 dans le 13e (12 conseillers de Paris, 31 conseillers d'arrondissement, 43 sièges, 51,52 % de suffrages exprimés, 35 sièges, 116 196 inscrits) ; contrat de prévention et de sécurité du 13e arrondissement (62 espaces verts ouverts au public, petite ceinture à la Poterne des Peupliers) : https://cdn.paris.fr/paris/2023/11/14/cpsa-13e_2-juin-2023-Mxbk.pdf</w:t>
+      </w:r>
+    </w:p>
+    <w:p>
+      <w:pPr>
+        <w:pStyle w:val="Heading3"/>
+      </w:pPr>
+      <w:r>
+        <w:t>7. Critères d'arrêt, écrits à l'avance</w:t>
       </w:r>
     </w:p>
     <w:p>
@@ -9208,6 +9318,64 @@
         <w:pStyle w:val="ListNumber"/>
       </w:pPr>
       <w:r>
+        <w:rPr>
+          <w:b/>
+        </w:rPr>
+        <w:t>Le 13e comme périmètre pilote</w:t>
+      </w:r>
+      <w:r>
+        <w:t xml:space="preserve"> (arbitrage du 29/09/2026). Chiffres vérifiés : </w:t>
+      </w:r>
+      <w:r>
+        <w:rPr>
+          <w:rFonts w:ascii="Consolas" w:hAnsi="Consolas"/>
+          <w:sz w:val="20"/>
+        </w:rPr>
+        <w:t>confirmé</w:t>
+      </w:r>
+      <w:r>
+        <w:t xml:space="preserve"> — 43 sièges au conseil d'arrondissement (12 conseillers de Paris + 31 conseillers d'arrondissement) et maire élu au premier tour de mars 2026 avec 51,52 % des suffrages et 35 des 43 sièges, 116 196 inscrits (Ville de Paris, page « élus d'arrondissements » mise à jour le 31/03/2026 ; résultats des municipales 2026 dans le 13e). </w:t>
+      </w:r>
+      <w:r>
+        <w:rPr>
+          <w:rFonts w:ascii="Consolas" w:hAnsi="Consolas"/>
+          <w:sz w:val="20"/>
+        </w:rPr>
+        <w:t>confirmé avec nuance</w:t>
+      </w:r>
+      <w:r>
+        <w:t xml:space="preserve"> — 62 espaces verts ouverts au public, soit 6 % de la surface, et chiens non tenus en laisse signalés sur la promenade de la petite ceinture à la Poterne des Peupliers : source datée de 2023 (contrat de prévention et de sécurité du 13e), donc à rafraîchir. </w:t>
+      </w:r>
+      <w:r>
+        <w:rPr>
+          <w:rFonts w:ascii="Consolas" w:hAnsi="Consolas"/>
+          <w:sz w:val="20"/>
+        </w:rPr>
+        <w:t>incertain</w:t>
+      </w:r>
+      <w:r>
+        <w:t xml:space="preserve"> — population « près de 180 000 habitants » et 105 665 logements : annuaire et presse locale, pas de source statistique officielle ouverte à ce jour. </w:t>
+      </w:r>
+      <w:r>
+        <w:rPr>
+          <w:b/>
+        </w:rPr>
+        <w:t>Non trouvé</w:t>
+      </w:r>
+      <w:r>
+        <w:t xml:space="preserve"> : le nombre de chiens identifiés dans le 13e. Aucun chiffre fiable — à demander (documents administratifs communicables) avant tout usage public, comme pour le total parisien.</w:t>
+      </w:r>
+    </w:p>
+    <w:p>
+      <w:r>
+        <w:t>Sources : https://www.paris.fr/pages/elus-d-arrondissements-2365 https://www.ici.fr/ile-de-france/paris-75/paris-13e/elections https://cdn.paris.fr/paris/2023/11/14/cpsa-13e_2-juin-2023-Mxbk.pdf</w:t>
+      </w:r>
+    </w:p>
+    <w:p>
+      <w:pPr>
+        <w:pStyle w:val="ListNumber"/>
+      </w:pPr>
+      <w:r>
         <w:t xml:space="preserve">Le retrait de </w:t>
       </w:r>
       <w:r>
@@ -11065,7 +11233,16 @@
         <w:pStyle w:val="ListBullet"/>
       </w:pPr>
       <w:r>
-        <w:t>périmètre pilote 20e + 10e = 9 713 chiens identifiés ;</w:t>
+        <w:t xml:space="preserve">périmètre pilote : </w:t>
+      </w:r>
+      <w:r>
+        <w:rPr>
+          <w:b/>
+        </w:rPr>
+        <w:t>le 13e</w:t>
+      </w:r>
+      <w:r>
+        <w:t xml:space="preserve"> (arbitrage du 29/09/2026) ; le chiffre de chiens identifiés du 13e est à obtenir, donc les volumes ci-dessous utilisent le cas de référence déjà chiffré, 20e + 10e = 9 713 chiens identifiés ;</w:t>
       </w:r>
     </w:p>
     <w:p>
@@ -11174,7 +11351,7 @@
           </w:tcPr>
           <w:p>
             <w:r>
-              <w:t>Pilote périmètre 20e + 10e, obligatoire, gratuit</w:t>
+              <w:t>Pilote (cas de référence 20e + 10e), obligatoire, gratuit</w:t>
             </w:r>
           </w:p>
         </w:tc>
@@ -11403,7 +11580,7 @@
         <w:pStyle w:val="ListNumber"/>
       </w:pPr>
       <w:r>
-        <w:t>Comptage des déjections sur un périmètre test (20e), protocole simple, 3 semaines, avec des bénévoles et une fiche de relevé. Coût : 0 €. C'est la pièce qui manquait à Béziers, et c'est aussi l'argument public (le chiffre avant/après).</w:t>
+        <w:t>Comptage des déjections sur un périmètre test (13e), protocole simple, 3 semaines, avec des bénévoles et une fiche de relevé. Coût : 0 €. C'est la pièce qui manquait à Béziers, et c'est aussi l'argument public (le chiffre avant/après).</w:t>
       </w:r>
     </w:p>
     <w:p>
@@ -12120,7 +12297,16 @@
     </w:p>
     <w:p>
       <w:r>
-        <w:t>D5. Le périmètre pilote : le 20e (6 133 chiens identifiés, 45 sièges de conseillers) ou le 10e (3 580 chiens, 19 sièges) ; le 8e a déjà l'infrastructure mais peu de chiens.</w:t>
+        <w:t xml:space="preserve">D5. Le périmètre pilote : </w:t>
+      </w:r>
+      <w:r>
+        <w:rPr>
+          <w:b/>
+        </w:rPr>
+        <w:t>le 13e, arbitré le 29/09/2026</w:t>
+      </w:r>
+      <w:r>
+        <w:t xml:space="preserve"> — c'est là que vivent les volontaires qui comptent, et l'arrondissement tient tout le reste (environ 180 000 habitants, 43 sièges au conseil d'arrondissement, majorité stable, 62 espaces verts ouverts au public, petite ceinture à la Poterne des Peupliers déjà hors laisse). Alternatives : le 20e (6 133 chiens identifiés, 45 sièges) ou le 10e (3 580 chiens, 19 sièges) ; le 8e a l'infrastructure mais peu de chiens. Le nombre de chiens identifiés dans le 13e reste à obtenir par demande écrite.</w:t>
       </w:r>
     </w:p>
     <w:p>
@@ -12271,7 +12457,7 @@
         <w:pStyle w:val="ListNumber"/>
       </w:pPr>
       <w:r>
-        <w:t>Entretien PARC.C + une réunion publique dans le 20e pour tester la formulation et la disposition à adhérer — 0 €.</w:t>
+        <w:t>Entretien PARC.C + une réunion publique dans le 13e pour tester la formulation et la disposition à adhérer — 0 €.</w:t>
       </w:r>
     </w:p>
     <w:p>
@@ -13534,7 +13720,24 @@
     </w:p>
     <w:p>
       <w:r>
-        <w:t>Où tester en premier (densité canine + taille d'arrondissement) :</w:t>
+        <w:t xml:space="preserve">Où tester en premier (densité canine + taille d'arrondissement) — </w:t>
+      </w:r>
+      <w:r>
+        <w:rPr>
+          <w:b/>
+        </w:rPr>
+        <w:t>arbitrage du 29/09/2026 : le 13e</w:t>
+      </w:r>
+      <w:r>
+        <w:t>, parce que c'est là que vivent les volontaires qui comptent (environ 180 000 habitants, 43 sièges au conseil d'arrondissement, majorité stable, 62 espaces verts ouverts au public) :</w:t>
+      </w:r>
+    </w:p>
+    <w:p>
+      <w:pPr>
+        <w:pStyle w:val="ListBullet"/>
+      </w:pPr>
+      <w:r>
+        <w:t>13e (chiffre I-CAD à demander à la Ville),</w:t>
       </w:r>
     </w:p>
     <w:p>
@@ -15310,7 +15513,7 @@
           </w:tcPr>
           <w:p>
             <w:r>
-              <w:t>Périmètre pilote 20e + 10e, obligation gratuite, couverture 50-60 %</w:t>
+              <w:t>Périmètre pilote (cas de référence 20e + 10e ; le pilote retenu est le 13e), obligation gratuite, couverture 50-60 %</w:t>
             </w:r>
           </w:p>
         </w:tc>
@@ -15694,7 +15897,16 @@
         <w:t>D5.</w:t>
       </w:r>
       <w:r>
-        <w:t xml:space="preserve"> Périmètre pilote. Le 20e (6 133 chiens identifiés, 45 conseillers d'arrondissement) ou le 10e (3 580 chiens, 19 sièges) ; le 8e a déjà l'infrastructure (Monceau) mais peu de chiens.</w:t>
+        <w:t xml:space="preserve"> Périmètre pilote. </w:t>
+      </w:r>
+      <w:r>
+        <w:rPr>
+          <w:b/>
+        </w:rPr>
+        <w:t>Arbitrée le 29/09/2026 : le 13e.</w:t>
+      </w:r>
+      <w:r>
+        <w:t xml:space="preserve"> Le critère décisif est le nombre de volontaires qui comptent réellement — ils sont tous dans le 13e — et l'arrondissement tient le reste : environ 180 000 habitants, 116 196 inscrits, 43 sièges au conseil d'arrondissement, majorité stable (maire élu au premier tour en 2026 avec 51,52 %), 62 espaces verts ouverts au public, et la petite ceinture à la Poterne des Peupliers comme lieu où la laisse n'est déjà plus respectée. Les alternatives restent le 20e (6 133 chiens identifiés, 45 sièges) et le 10e (3 580 chiens, 19 sièges) ; le 8e a l'infrastructure (Monceau) mais peu de chiens. Le nombre de chiens identifiés dans le 13e reste à obtenir (demande écrite à la Ville et à la profession vétérinaire).</w:t>
       </w:r>
     </w:p>
     <w:p/>
@@ -15833,7 +16045,7 @@
         <w:t>Étape 1</w:t>
       </w:r>
       <w:r>
-        <w:t xml:space="preserve"> — 1 à 2 mois : test politique. Entretien avec PARC.C, une réunion publique dans le 20e, questionnaire à 300 détenteurs. Question à trancher : le statut intéresse-t-il sa cible ?</w:t>
+        <w:t xml:space="preserve"> — 1 à 2 mois : test politique. Entretien avec PARC.C, une réunion publique dans le 13e, questionnaire à 300 détenteurs. Question à trancher : le statut intéresse-t-il sa cible ?</w:t>
       </w:r>
     </w:p>
     <w:p>
@@ -17043,7 +17255,7 @@
           </w:tcPr>
           <w:p>
             <w:r>
-              <w:t>An 1, pilote 20e + 10e : 5 000 chiens</w:t>
+              <w:t>An 1, pilote (cas de référence 20e + 10e) : 5 000 chiens</w:t>
             </w:r>
           </w:p>
         </w:tc>
@@ -17937,7 +18149,7 @@
         <w:t>Périmètre :</w:t>
       </w:r>
       <w:r>
-        <w:t xml:space="preserve"> des segments homogènes, par exemple 20 tronçons de 300 m dans le 20e, représentatifs des voies les plus fréquentées.</w:t>
+        <w:t xml:space="preserve"> des segments homogènes, par exemple 20 tronçons de 300 m dans le 13e, représentatifs des voies les plus fréquentées.</w:t>
       </w:r>
     </w:p>
     <w:p>
@@ -18731,7 +18943,7 @@
           </w:tcPr>
           <w:p>
             <w:r>
-              <w:t>326</w:t>
+              <w:t>330</w:t>
             </w:r>
           </w:p>
         </w:tc>
@@ -18827,7 +19039,7 @@
           </w:tcPr>
           <w:p>
             <w:r>
-              <w:t>271</w:t>
+              <w:t>272</w:t>
             </w:r>
           </w:p>
         </w:tc>
@@ -18859,7 +19071,7 @@
           </w:tcPr>
           <w:p>
             <w:r>
-              <w:t>193</w:t>
+              <w:t>194</w:t>
             </w:r>
           </w:p>
         </w:tc>
@@ -18891,7 +19103,7 @@
           </w:tcPr>
           <w:p>
             <w:r>
-              <w:t>96</w:t>
+              <w:t>142</w:t>
             </w:r>
           </w:p>
         </w:tc>
@@ -18923,7 +19135,7 @@
           </w:tcPr>
           <w:p>
             <w:r>
-              <w:t>290</w:t>
+              <w:t>308</w:t>
             </w:r>
           </w:p>
         </w:tc>
@@ -19051,7 +19263,7 @@
           </w:tcPr>
           <w:p>
             <w:r>
-              <w:t>118</w:t>
+              <w:t>120</w:t>
             </w:r>
           </w:p>
         </w:tc>
@@ -19083,7 +19295,7 @@
           </w:tcPr>
           <w:p>
             <w:r>
-              <w:t>210</w:t>
+              <w:t>214</w:t>
             </w:r>
           </w:p>
         </w:tc>
@@ -19147,7 +19359,7 @@
           </w:tcPr>
           <w:p>
             <w:r>
-              <w:t>176</w:t>
+              <w:t>179</w:t>
             </w:r>
           </w:p>
         </w:tc>
@@ -19179,7 +19391,7 @@
           </w:tcPr>
           <w:p>
             <w:r>
-              <w:t>856</w:t>
+              <w:t>862</w:t>
             </w:r>
           </w:p>
         </w:tc>

</xml_diff>

<commit_message>
Chiens: note de site PC13 Poterne - admission animaux non, requalifie en site de comptage d'usage + alternative espace canin voisin
</commit_message>
<xml_diff>
--- a/export/Chien-citoyen-de-Paris-dossier-complet.docx
+++ b/export/Chien-citoyen-de-Paris-dossier-complet.docx
@@ -1323,7 +1323,7 @@
         <w:rPr>
           <w:b w:val="0"/>
         </w:rPr>
-        <w:t>11. Tests ADN canins : coûts et faisabilité</w:t>
+        <w:t>11. Site de la Poterne des Peupliers (PC 13) — ce qu'on peut y faire</w:t>
       </w:r>
       <w:r>
         <w:t xml:space="preserve"> — </w:t>
@@ -1333,7 +1333,7 @@
           <w:rFonts w:ascii="Consolas" w:hAnsi="Consolas"/>
           <w:sz w:val="20"/>
         </w:rPr>
-        <w:t>ADN-COUTS-FAISABILITE.md</w:t>
+        <w:t>NOTE-PC13-POTERNE.md</w:t>
       </w:r>
     </w:p>
     <w:p>
@@ -1344,7 +1344,7 @@
         <w:rPr>
           <w:b w:val="0"/>
         </w:rPr>
-        <w:t>1. Combien coûte un test, concrètement</w:t>
+        <w:t>1. Ce qu'est exactement ce lieu</w:t>
       </w:r>
     </w:p>
     <w:p>
@@ -1355,7 +1355,7 @@
         <w:rPr>
           <w:b w:val="0"/>
         </w:rPr>
-        <w:t>2. Est-ce facile à faire ? Oui, techniquement. Les points durs sont ailleurs.</w:t>
+        <w:t>2. Ce que la Ville et la préfecture disent déjà du lieu</w:t>
       </w:r>
     </w:p>
     <w:p>
@@ -1366,7 +1366,7 @@
         <w:rPr>
           <w:b w:val="0"/>
         </w:rPr>
-        <w:t>3. Chiffrage pour Paris</w:t>
+        <w:t>3. Le comptage d'usage : la mesure que personne n'a</w:t>
       </w:r>
     </w:p>
     <w:p>
@@ -1377,18 +1377,40 @@
         <w:rPr>
           <w:b w:val="0"/>
         </w:rPr>
-        <w:t>4. Le test le moins cher à faire maintenant (pour aller vite sans argent)</w:t>
-      </w:r>
-    </w:p>
-    <w:p>
-      <w:pPr>
-        <w:pStyle w:val="ListBullet"/>
+        <w:t>4. Ce qu'il faut demander, dans l'ordre</w:t>
+      </w:r>
+    </w:p>
+    <w:p>
+      <w:pPr>
+        <w:pStyle w:val="ListBullet2"/>
       </w:pPr>
       <w:r>
         <w:rPr>
           <w:b w:val="0"/>
         </w:rPr>
-        <w:t>12. Statut du chien citoyen — note de conception</w:t>
+        <w:t>5. La proposition qui a une chance, et pourquoi elle est différente</w:t>
+      </w:r>
+    </w:p>
+    <w:p>
+      <w:pPr>
+        <w:pStyle w:val="ListBullet2"/>
+      </w:pPr>
+      <w:r>
+        <w:rPr>
+          <w:b w:val="0"/>
+        </w:rPr>
+        <w:t>Sources</w:t>
+      </w:r>
+    </w:p>
+    <w:p>
+      <w:pPr>
+        <w:pStyle w:val="ListBullet"/>
+      </w:pPr>
+      <w:r>
+        <w:rPr>
+          <w:b w:val="0"/>
+        </w:rPr>
+        <w:t>12. Tests ADN canins : coûts et faisabilité</w:t>
       </w:r>
       <w:r>
         <w:t xml:space="preserve"> — </w:t>
@@ -1398,7 +1420,7 @@
           <w:rFonts w:ascii="Consolas" w:hAnsi="Consolas"/>
           <w:sz w:val="20"/>
         </w:rPr>
-        <w:t>STATUT-CHIEN-CITOYEN.md</w:t>
+        <w:t>ADN-COUTS-FAISABILITE.md</w:t>
       </w:r>
     </w:p>
     <w:p>
@@ -1409,7 +1431,7 @@
         <w:rPr>
           <w:b w:val="0"/>
         </w:rPr>
-        <w:t>0. Le verdict d'abord</w:t>
+        <w:t>1. Combien coûte un test, concrètement</w:t>
       </w:r>
     </w:p>
     <w:p>
@@ -1420,7 +1442,7 @@
         <w:rPr>
           <w:b w:val="0"/>
         </w:rPr>
-        <w:t>1. Le dispositif, brique par brique</w:t>
+        <w:t>2. Est-ce facile à faire ? Oui, techniquement. Les points durs sont ailleurs.</w:t>
       </w:r>
     </w:p>
     <w:p>
@@ -1431,7 +1453,7 @@
         <w:rPr>
           <w:b w:val="0"/>
         </w:rPr>
-        <w:t>2. Qui peut faire quoi (le vrai tableau de contraintes)</w:t>
+        <w:t>3. Chiffrage pour Paris</w:t>
       </w:r>
     </w:p>
     <w:p>
@@ -1442,62 +1464,18 @@
         <w:rPr>
           <w:b w:val="0"/>
         </w:rPr>
-        <w:t>3. Chiffrage</w:t>
-      </w:r>
-    </w:p>
-    <w:p>
-      <w:pPr>
-        <w:pStyle w:val="ListBullet2"/>
+        <w:t>4. Le test le moins cher à faire maintenant (pour aller vite sans argent)</w:t>
+      </w:r>
+    </w:p>
+    <w:p>
+      <w:pPr>
+        <w:pStyle w:val="ListBullet"/>
       </w:pPr>
       <w:r>
         <w:rPr>
           <w:b w:val="0"/>
         </w:rPr>
-        <w:t>4. Les cinq décisions à trancher (ce sont elles, le projet politique)</w:t>
-      </w:r>
-    </w:p>
-    <w:p>
-      <w:pPr>
-        <w:pStyle w:val="ListBullet2"/>
-      </w:pPr>
-      <w:r>
-        <w:rPr>
-          <w:b w:val="0"/>
-        </w:rPr>
-        <w:t>5. Objections à anticiper (sinon elles tueront le projet)</w:t>
-      </w:r>
-    </w:p>
-    <w:p>
-      <w:pPr>
-        <w:pStyle w:val="ListBullet2"/>
-      </w:pPr>
-      <w:r>
-        <w:rPr>
-          <w:b w:val="0"/>
-        </w:rPr>
-        <w:t>6. Positionnement : la formulation qui peut devenir majoritaire</w:t>
-      </w:r>
-    </w:p>
-    <w:p>
-      <w:pPr>
-        <w:pStyle w:val="ListBullet2"/>
-      </w:pPr>
-      <w:r>
-        <w:rPr>
-          <w:b w:val="0"/>
-        </w:rPr>
-        <w:t>7. Prochaines étapes (coût, délai)</w:t>
-      </w:r>
-    </w:p>
-    <w:p>
-      <w:pPr>
-        <w:pStyle w:val="ListBullet"/>
-      </w:pPr>
-      <w:r>
-        <w:rPr>
-          <w:b w:val="0"/>
-        </w:rPr>
-        <w:t>13. Projet d'arrêté et règlement du statut</w:t>
+        <w:t>13. Statut du chien citoyen — note de conception</w:t>
       </w:r>
       <w:r>
         <w:t xml:space="preserve"> — </w:t>
@@ -1507,7 +1485,7 @@
           <w:rFonts w:ascii="Consolas" w:hAnsi="Consolas"/>
           <w:sz w:val="20"/>
         </w:rPr>
-        <w:t>PROJET-ARRETE-STATUT-CHIEN-CITOYEN.md</w:t>
+        <w:t>STATUT-CHIEN-CITOYEN.md</w:t>
       </w:r>
     </w:p>
     <w:p>
@@ -1518,7 +1496,7 @@
         <w:rPr>
           <w:b w:val="0"/>
         </w:rPr>
-        <w:t>A. Projet d'arrêté (expérimentation de 24 mois)</w:t>
+        <w:t>0. Le verdict d'abord</w:t>
       </w:r>
     </w:p>
     <w:p>
@@ -1529,7 +1507,7 @@
         <w:rPr>
           <w:b w:val="0"/>
         </w:rPr>
-        <w:t>B. Règlement du statut</w:t>
+        <w:t>1. Le dispositif, brique par brique</w:t>
       </w:r>
     </w:p>
     <w:p>
@@ -1540,7 +1518,7 @@
         <w:rPr>
           <w:b w:val="0"/>
         </w:rPr>
-        <w:t>C. Le parcours propriétaire, en cinq étapes (le point qui décide du taux d'adhésion)</w:t>
+        <w:t>2. Qui peut faire quoi (le vrai tableau de contraintes)</w:t>
       </w:r>
     </w:p>
     <w:p>
@@ -1551,18 +1529,62 @@
         <w:rPr>
           <w:b w:val="0"/>
         </w:rPr>
-        <w:t>D. Maquette de données (à valider par le DPO de la Ville)</w:t>
-      </w:r>
-    </w:p>
-    <w:p>
-      <w:pPr>
-        <w:pStyle w:val="ListBullet"/>
+        <w:t>3. Chiffrage</w:t>
+      </w:r>
+    </w:p>
+    <w:p>
+      <w:pPr>
+        <w:pStyle w:val="ListBullet2"/>
       </w:pPr>
       <w:r>
         <w:rPr>
           <w:b w:val="0"/>
         </w:rPr>
-        <w:t>14. Projet « chiens de Paris » — creusage</w:t>
+        <w:t>4. Les cinq décisions à trancher (ce sont elles, le projet politique)</w:t>
+      </w:r>
+    </w:p>
+    <w:p>
+      <w:pPr>
+        <w:pStyle w:val="ListBullet2"/>
+      </w:pPr>
+      <w:r>
+        <w:rPr>
+          <w:b w:val="0"/>
+        </w:rPr>
+        <w:t>5. Objections à anticiper (sinon elles tueront le projet)</w:t>
+      </w:r>
+    </w:p>
+    <w:p>
+      <w:pPr>
+        <w:pStyle w:val="ListBullet2"/>
+      </w:pPr>
+      <w:r>
+        <w:rPr>
+          <w:b w:val="0"/>
+        </w:rPr>
+        <w:t>6. Positionnement : la formulation qui peut devenir majoritaire</w:t>
+      </w:r>
+    </w:p>
+    <w:p>
+      <w:pPr>
+        <w:pStyle w:val="ListBullet2"/>
+      </w:pPr>
+      <w:r>
+        <w:rPr>
+          <w:b w:val="0"/>
+        </w:rPr>
+        <w:t>7. Prochaines étapes (coût, délai)</w:t>
+      </w:r>
+    </w:p>
+    <w:p>
+      <w:pPr>
+        <w:pStyle w:val="ListBullet"/>
+      </w:pPr>
+      <w:r>
+        <w:rPr>
+          <w:b w:val="0"/>
+        </w:rPr>
+        <w:t>14. Projet d'arrêté et règlement du statut</w:t>
       </w:r>
       <w:r>
         <w:t xml:space="preserve"> — </w:t>
@@ -1572,6 +1594,71 @@
           <w:rFonts w:ascii="Consolas" w:hAnsi="Consolas"/>
           <w:sz w:val="20"/>
         </w:rPr>
+        <w:t>PROJET-ARRETE-STATUT-CHIEN-CITOYEN.md</w:t>
+      </w:r>
+    </w:p>
+    <w:p>
+      <w:pPr>
+        <w:pStyle w:val="ListBullet2"/>
+      </w:pPr>
+      <w:r>
+        <w:rPr>
+          <w:b w:val="0"/>
+        </w:rPr>
+        <w:t>A. Projet d'arrêté (expérimentation de 24 mois)</w:t>
+      </w:r>
+    </w:p>
+    <w:p>
+      <w:pPr>
+        <w:pStyle w:val="ListBullet2"/>
+      </w:pPr>
+      <w:r>
+        <w:rPr>
+          <w:b w:val="0"/>
+        </w:rPr>
+        <w:t>B. Règlement du statut</w:t>
+      </w:r>
+    </w:p>
+    <w:p>
+      <w:pPr>
+        <w:pStyle w:val="ListBullet2"/>
+      </w:pPr>
+      <w:r>
+        <w:rPr>
+          <w:b w:val="0"/>
+        </w:rPr>
+        <w:t>C. Le parcours propriétaire, en cinq étapes (le point qui décide du taux d'adhésion)</w:t>
+      </w:r>
+    </w:p>
+    <w:p>
+      <w:pPr>
+        <w:pStyle w:val="ListBullet2"/>
+      </w:pPr>
+      <w:r>
+        <w:rPr>
+          <w:b w:val="0"/>
+        </w:rPr>
+        <w:t>D. Maquette de données (à valider par le DPO de la Ville)</w:t>
+      </w:r>
+    </w:p>
+    <w:p>
+      <w:pPr>
+        <w:pStyle w:val="ListBullet"/>
+      </w:pPr>
+      <w:r>
+        <w:rPr>
+          <w:b w:val="0"/>
+        </w:rPr>
+        <w:t>15. Projet « chiens de Paris » — creusage</w:t>
+      </w:r>
+      <w:r>
+        <w:t xml:space="preserve"> — </w:t>
+      </w:r>
+      <w:r>
+        <w:rPr>
+          <w:rFonts w:ascii="Consolas" w:hAnsi="Consolas"/>
+          <w:sz w:val="20"/>
+        </w:rPr>
         <w:t>PROJET-CHIENS-PARIS.md</w:t>
       </w:r>
     </w:p>
@@ -1671,7 +1758,7 @@
         <w:rPr>
           <w:b w:val="0"/>
         </w:rPr>
-        <w:t>15. Rapport complet et chiffrage</w:t>
+        <w:t>16. Rapport complet et chiffrage</w:t>
       </w:r>
       <w:r>
         <w:t xml:space="preserve"> — </w:t>
@@ -6121,7 +6208,7 @@
           <w:rFonts w:ascii="Consolas" w:hAnsi="Consolas"/>
           <w:sz w:val="20"/>
         </w:rPr>
-        <w:t>[RAPPORT-COMPLET-CHIENS-PARIS.md](#15-rapport--un-projet-politique--chiens-de-paris---statut-du-chien-citoyen-registre-adn-droits-et-chiffrage)</w:t>
+        <w:t>[RAPPORT-COMPLET-CHIENS-PARIS.md](#16-rapport--un-projet-politique--chiens-de-paris---statut-du-chien-citoyen-registre-adn-droits-et-chiffrage)</w:t>
       </w:r>
       <w:r>
         <w:t xml:space="preserve"> (annexe E pour les URL).</w:t>
@@ -6482,10 +6569,29 @@
         <w:rPr>
           <w:b/>
         </w:rPr>
-        <w:t>Un lieu où la règle ne s'applique déjà plus.</w:t>
-      </w:r>
-      <w:r>
-        <w:t xml:space="preserve"> Le contrat de prévention et de sécurité du 13e signale explicitement la promenade de la petite ceinture à la Poterne des Peupliers comme un point où l'on rencontre des chiens non tenus en laisse. C'est le candidat naturel à un espace de liberté encadré — et, avant/après, une mesure qui parle aux habitants comme aux élus.</w:t>
+        <w:t>Un lieu où l'usage dépasse déjà la règle.</w:t>
+      </w:r>
+      <w:r>
+        <w:t xml:space="preserve"> Le contrat de prévention et de sécurité du 13e signale la promenade de la petite ceinture à la Poterne des Peupliers — « SDF et chiens non tenus en laisse » — parmi ses points sensibles. Attention au contresens : la fiche officielle du lieu indique « admission animaux : non », donc ce n'est pas l'endroit où demander un espace de liberté (voir </w:t>
+      </w:r>
+      <w:r>
+        <w:rPr>
+          <w:rFonts w:ascii="Consolas" w:hAnsi="Consolas"/>
+          <w:sz w:val="20"/>
+        </w:rPr>
+        <w:t>[NOTE-PC13-POTERNE.md](#11-le-site-de-la-poterne-des-peupliers-pc-13--ce-quon-peut-y-faire-et-ce-quon-ne-peut-pas)</w:t>
+      </w:r>
+      <w:r>
+        <w:t xml:space="preserve">). C'est en revanche le meilleur site de </w:t>
+      </w:r>
+      <w:r>
+        <w:rPr>
+          <w:b/>
+        </w:rPr>
+        <w:t>comptage d'usage</w:t>
+      </w:r>
+      <w:r>
+        <w:t xml:space="preserve"> : la mesure qui manque à la mairie pour choisir entre faire respecter l'interdiction, tolérer avec encadrement, ou ouvrir un espace canin dans un jardin voisin.</w:t>
       </w:r>
     </w:p>
     <w:p>
@@ -9376,13 +9482,80 @@
         <w:pStyle w:val="ListNumber"/>
       </w:pPr>
       <w:r>
-        <w:t xml:space="preserve">Le retrait de </w:t>
+        <w:rPr>
+          <w:b/>
+        </w:rPr>
+        <w:t>La petite ceinture du 13e (PC 13)</w:t>
+      </w:r>
+      <w:r>
+        <w:t xml:space="preserve"> — vérification faite sur la fiche officielle du lieu, et elle corrige une hypothèse du dossier : </w:t>
       </w:r>
       <w:r>
         <w:rPr>
           <w:rFonts w:ascii="Consolas" w:hAnsi="Consolas"/>
           <w:sz w:val="20"/>
         </w:rPr>
+        <w:t>confirmé</w:t>
+      </w:r>
+      <w:r>
+        <w:t xml:space="preserve"> la surface de 12 234 m², l'ouverture au public depuis 2016, la liaison avec les jardins Charles-Trenet, Moulin-de-la-Pointe et Poterne-des-Peupliers, le label Ecojardin, les horaires (8 h – 20 h 30 en saison, </w:t>
+      </w:r>
+      <w:r>
+        <w:rPr>
+          <w:b/>
+        </w:rPr>
+        <w:t>H24 du troisième lundi d'avril au troisième dimanche de septembre</w:t>
+      </w:r>
+      <w:r>
+        <w:t xml:space="preserve">), et surtout </w:t>
+      </w:r>
+      <w:r>
+        <w:rPr>
+          <w:b/>
+        </w:rPr>
+        <w:t>« Admission animaux : non »</w:t>
+      </w:r>
+      <w:r>
+        <w:t xml:space="preserve">. La ligne du contrat de prévention et de sécurité du 13e (« Promenade de la petite ceinture à la Poterne des Peupliers (SDF et chiens non tenus en laisse) »), déjà citée, a été relue dans le texte intégral du document : </w:t>
+      </w:r>
+      <w:r>
+        <w:rPr>
+          <w:rFonts w:ascii="Consolas" w:hAnsi="Consolas"/>
+          <w:sz w:val="20"/>
+        </w:rPr>
+        <w:t>confirmé</w:t>
+      </w:r>
+      <w:r>
+        <w:t xml:space="preserve">. Conséquence : le site ne peut pas être proposé comme espace de liberté pour chiens ; il est requalifié en site de comptage d'usage, avec l'alternative d'un espace canin dans un jardin voisin. </w:t>
+      </w:r>
+      <w:r>
+        <w:rPr>
+          <w:rFonts w:ascii="Consolas" w:hAnsi="Consolas"/>
+          <w:sz w:val="20"/>
+        </w:rPr>
+        <w:t>incertain</w:t>
+      </w:r>
+      <w:r>
+        <w:t xml:space="preserve"> les ouvertures de nouveaux tronçons annoncées pour 2026 (presse, pas la Ville).</w:t>
+      </w:r>
+    </w:p>
+    <w:p>
+      <w:r>
+        <w:t>Sources : https://www.paris.fr/lieux/petite-ceinture-du-13e-pc-13-18089 https://cdn.paris.fr/paris/2023/11/14/cpsa-13e_2-juin-2023-Mxbk.pdf</w:t>
+      </w:r>
+    </w:p>
+    <w:p>
+      <w:pPr>
+        <w:pStyle w:val="ListNumber"/>
+      </w:pPr>
+      <w:r>
+        <w:t xml:space="preserve">Le retrait de </w:t>
+      </w:r>
+      <w:r>
+        <w:rPr>
+          <w:rFonts w:ascii="Consolas" w:hAnsi="Consolas"/>
+          <w:sz w:val="20"/>
+        </w:rPr>
         <w:t>PITCH-COLLAB-TECHNIQUE-IT.md</w:t>
       </w:r>
       <w:r>
@@ -10754,7 +10927,418 @@
         <w:pStyle w:val="Heading2"/>
       </w:pPr>
       <w:r>
-        <w:t>11. Tests ADN canins : coûts réels, facilité de mise en œuvre, et chiffrage pour Paris (29/09/2026)</w:t>
+        <w:t>11. Le site de la Poterne des Peupliers (PC 13) — ce qu'on peut y faire, et ce qu'on ne peut pas</w:t>
+      </w:r>
+    </w:p>
+    <w:p>
+      <w:r>
+        <w:rPr>
+          <w:i/>
+        </w:rPr>
+        <w:t>Source : `NOTE-PC13-POTERNE.md`.</w:t>
+      </w:r>
+    </w:p>
+    <w:p>
+      <w:r>
+        <w:t>29 septembre 2026. Note de site, écrite après vérification des sources publiques. Elle change une partie de ce qu'on pouvait imaginer pour ce lieu précis : la promenade de la petite ceinture du 13e n'est pas un espace tolérant qu'il suffirait d'encadrer, c'est un espace où les animaux ne sont officiellement pas admis. À lire avant d'en faire la vitrine du projet. Rien n'a été voté.</w:t>
+      </w:r>
+    </w:p>
+    <w:p>
+      <w:pPr>
+        <w:pStyle w:val="Heading3"/>
+      </w:pPr>
+      <w:r>
+        <w:t>1. Ce qu'est exactement ce lieu</w:t>
+      </w:r>
+    </w:p>
+    <w:p>
+      <w:pPr>
+        <w:pStyle w:val="ListBullet"/>
+      </w:pPr>
+      <w:r>
+        <w:rPr>
+          <w:b/>
+        </w:rPr>
+        <w:t>Petite Ceinture du 13e (PC 13)</w:t>
+      </w:r>
+      <w:r>
+        <w:t xml:space="preserve">, 60 rue Damesme, 13e ; </w:t>
+      </w:r>
+      <w:r>
+        <w:rPr>
+          <w:b/>
+        </w:rPr>
+        <w:t>12 234 m²</w:t>
+      </w:r>
+      <w:r>
+        <w:t>, environ 430 m de long, ouverte au public depuis 2016.</w:t>
+      </w:r>
+    </w:p>
+    <w:p>
+      <w:pPr>
+        <w:pStyle w:val="ListBullet"/>
+      </w:pPr>
+      <w:r>
+        <w:t xml:space="preserve">Elle </w:t>
+      </w:r>
+      <w:r>
+        <w:rPr>
+          <w:b/>
+        </w:rPr>
+        <w:t>relie trois jardins</w:t>
+      </w:r>
+      <w:r>
+        <w:t xml:space="preserve"> : Charles-Trenet, Moulin-de-la-Pointe et Poterne-des-Peupliers, et facilite l'accès au tramway T3. Trois accès : 9 rue Augustin Mouchot, 26 rue de l'Interne Loeb, et par le jardin de la Porte des Peupliers.</w:t>
+      </w:r>
+    </w:p>
+    <w:p>
+      <w:pPr>
+        <w:pStyle w:val="ListBullet"/>
+      </w:pPr>
+      <w:r>
+        <w:t xml:space="preserve">Horaires : 8 h – 20 h 30 en saison haute, </w:t>
+      </w:r>
+      <w:r>
+        <w:rPr>
+          <w:b/>
+        </w:rPr>
+        <w:t>ouverture H24 du troisième lundi d'avril au troisième dimanche de septembre</w:t>
+      </w:r>
+      <w:r>
+        <w:t>, sinon 8 h – 18 h 30 ou 19 h 30 selon la période.</w:t>
+      </w:r>
+    </w:p>
+    <w:p>
+      <w:pPr>
+        <w:pStyle w:val="ListBullet"/>
+      </w:pPr>
+      <w:r>
+        <w:rPr>
+          <w:b/>
+        </w:rPr>
+        <w:t>Label Ecojardin</w:t>
+      </w:r>
+      <w:r>
+        <w:t>, faune et flore de friche industrielle préservées, prairie sèche, couloir écologique.</w:t>
+      </w:r>
+    </w:p>
+    <w:p>
+      <w:pPr>
+        <w:pStyle w:val="ListBullet"/>
+      </w:pPr>
+      <w:r>
+        <w:t xml:space="preserve">Sur la fiche de la Ville : </w:t>
+      </w:r>
+      <w:r>
+        <w:rPr>
+          <w:b/>
+        </w:rPr>
+        <w:t>« Admission animaux : non ».</w:t>
+      </w:r>
+    </w:p>
+    <w:p>
+      <w:pPr>
+        <w:pStyle w:val="Heading3"/>
+      </w:pPr>
+      <w:r>
+        <w:t>2. Ce que la Ville et la préfecture disent déjà du lieu</w:t>
+      </w:r>
+    </w:p>
+    <w:p>
+      <w:r>
+        <w:t xml:space="preserve">Le contrat de prévention et de sécurité du 13e (2023) classe la </w:t>
+      </w:r>
+      <w:r>
+        <w:rPr>
+          <w:b/>
+        </w:rPr>
+        <w:t>« promenade de la petite ceinture à la Poterne des Peupliers (SDF et chiens non tenus en laisse) »</w:t>
+      </w:r>
+      <w:r>
+        <w:t xml:space="preserve"> parmi les équipements municipaux sensibles, au même titre que la mairie du 13e et l'atelier de la propreté rue du Chevaleret. Traduction administrative : ce lieu est aujourd'hui fiché comme un point à surveiller, et la présence de chiens détachés y est traitée comme une nuisance, dans la même phrase que la présence de personnes à la rue.</w:t>
+      </w:r>
+    </w:p>
+    <w:p>
+      <w:r>
+        <w:t>Deux conséquences, et elles sont désagréables mais décisives :</w:t>
+      </w:r>
+    </w:p>
+    <w:p>
+      <w:pPr>
+        <w:pStyle w:val="ListNumber"/>
+      </w:pPr>
+      <w:r>
+        <w:rPr>
+          <w:b/>
+        </w:rPr>
+        <w:t>Ce n'est pas le bon endroit pour demander un espace de liberté.</w:t>
+      </w:r>
+      <w:r>
+        <w:t xml:space="preserve"> Demander l'ouverture aux chiens d'un site labellisé Ecojardin, à biodiversité protégée, et déjà signalé pour chiens détachés, revient à demander à la mairie d'assumer publiquement d'avoir renoncé à faire respecter sa propre règle. Refus quasi certain, et refus qui coûte cher : le premier échec public sur ce dossier installerait l'idée que le projet est irréaliste.</w:t>
+      </w:r>
+    </w:p>
+    <w:p>
+      <w:pPr>
+        <w:pStyle w:val="ListNumber"/>
+      </w:pPr>
+      <w:r>
+        <w:rPr>
+          <w:b/>
+        </w:rPr>
+        <w:t>C'est en revanche un excellent site de comptage.</w:t>
+      </w:r>
+      <w:r>
+        <w:t xml:space="preserve"> Parce qu'il est contesté et officiellement fermé aux chiens, personne n'a le chiffre : combien de chiens y passent, à quelles heures, et combien sont détachés. Ce chiffre n'existe nulle part, et il est exactement ce qui manque à la mairie pour choisir entre faire respecter l'interdiction, tolérer avec un encadrement, ou ouvrir un espace canin à côté.</w:t>
+      </w:r>
+    </w:p>
+    <w:p>
+      <w:pPr>
+        <w:pStyle w:val="Heading3"/>
+      </w:pPr>
+      <w:r>
+        <w:t>3. Le comptage d'usage : la mesure que personne n'a</w:t>
+      </w:r>
+    </w:p>
+    <w:p>
+      <w:r>
+        <w:t>Deux comptages différents, sur le même protocole que le reste du dossier (pré-enregistré, deux observateurs, créneaux fixes, conditions relevées, fin bornée, publication) :</w:t>
+      </w:r>
+    </w:p>
+    <w:p>
+      <w:pPr>
+        <w:pStyle w:val="ListBullet"/>
+      </w:pPr>
+      <w:r>
+        <w:rPr>
+          <w:b/>
+        </w:rPr>
+        <w:t>Comptage d'usage.</w:t>
+      </w:r>
+      <w:r>
+        <w:t xml:space="preserve"> Aux trois entrées, par créneaux d'une heure, en semaine et le week-end : nombre de chiens, nombre de chiens détachés, nombre d'adultes accompagnants, conflits constatés (enfant, vélo, autre chien). Le lieu est un linéaire borné : le comptage y est facile et reproductible.</w:t>
+      </w:r>
+    </w:p>
+    <w:p>
+      <w:pPr>
+        <w:pStyle w:val="ListBullet"/>
+      </w:pPr>
+      <w:r>
+        <w:rPr>
+          <w:b/>
+        </w:rPr>
+        <w:t>Comptage de déjections aux abords.</w:t>
+      </w:r>
+      <w:r>
+        <w:t xml:space="preserve"> Sur les trottoirs des rues qui mènent aux trois entrées (rue Damesme, rue Augustin Mouchot, rue de l'Interne Loeb) — c'est là que se déplace le problème quand le lieu est fermé ou bondé.</w:t>
+      </w:r>
+    </w:p>
+    <w:p>
+      <w:r>
+        <w:t>Ce que ce double comptage permet de dire, sans agresser personne : voilà ce que les gens font réellement, voilà ce que ça produit sur le trottoir, et voici trois façons de traiter ça. C'est un appui pour une mairie, pas une accusation.</w:t>
+      </w:r>
+    </w:p>
+    <w:p>
+      <w:pPr>
+        <w:pStyle w:val="Heading3"/>
+      </w:pPr>
+      <w:r>
+        <w:t>4. Ce qu'il faut demander, dans l'ordre</w:t>
+      </w:r>
+    </w:p>
+    <w:p>
+      <w:pPr>
+        <w:pStyle w:val="ListNumber"/>
+      </w:pPr>
+      <w:r>
+        <w:rPr>
+          <w:b/>
+        </w:rPr>
+        <w:t>Le règlement applicable sur place</w:t>
+      </w:r>
+      <w:r>
+        <w:t>, par écrit : les chiens y sont-ils interdits, tolérés, ou tenus en laisse ? La fiche de la Ville dit « admission animaux : non », mais l'article du règlement des jardins qui s'applique à ce site et son affichage sur place ne sont pas publics. Question simple, réponse opposable.</w:t>
+      </w:r>
+    </w:p>
+    <w:p>
+      <w:pPr>
+        <w:pStyle w:val="ListNumber"/>
+      </w:pPr>
+      <w:r>
+        <w:rPr>
+          <w:b/>
+        </w:rPr>
+        <w:t>Les données de la police municipale et de la Direction des espaces verts</w:t>
+      </w:r>
+      <w:r>
+        <w:t xml:space="preserve"> sur ce point : nombre de passages, nombre de constats, plaintes d'habitants, main courante. Ce sont des éléments qui éclairent le chiffre du comptage et qui obligent à traiter le sujet par des faits.</w:t>
+      </w:r>
+    </w:p>
+    <w:p>
+      <w:pPr>
+        <w:pStyle w:val="ListNumber"/>
+      </w:pPr>
+      <w:r>
+        <w:rPr>
+          <w:b/>
+        </w:rPr>
+        <w:t>La liste des jardins du 13e où les chiens sont admis</w:t>
+      </w:r>
+      <w:r>
+        <w:t>, sur la page de la Ville (des sites tiers en citent cinq, dont le jardin de la Poterne des Peupliers, mais rien ne vaut la liste officielle par arrondissement).</w:t>
+      </w:r>
+    </w:p>
+    <w:p>
+      <w:pPr>
+        <w:pStyle w:val="ListNumber"/>
+      </w:pPr>
+      <w:r>
+        <w:rPr>
+          <w:b/>
+        </w:rPr>
+        <w:t>Le calendrier d'ouverture d'un nouveau tronçon de petite ceinture</w:t>
+      </w:r>
+      <w:r>
+        <w:t xml:space="preserve"> dans le 13e : des sources publiques annoncent de nouvelles ouvertures en 2026. Si un tronçon s'ouvre, c'est le moment exact où demander un espace canin dans l'aménagement, alors que sur un site existant et labellisé, la porte est fermée.</w:t>
+      </w:r>
+    </w:p>
+    <w:p>
+      <w:pPr>
+        <w:pStyle w:val="Heading3"/>
+      </w:pPr>
+      <w:r>
+        <w:t>5. La proposition qui a une chance, et pourquoi elle est différente</w:t>
+      </w:r>
+    </w:p>
+    <w:p>
+      <w:r>
+        <w:t xml:space="preserve">Pas : « ouvrez la petite ceinture aux chiens détachés ». Mais : </w:t>
+      </w:r>
+      <w:r>
+        <w:rPr>
+          <w:b/>
+        </w:rPr>
+        <w:t>comptez l'usage réel, et donnez-lui une alternative à côté</w:t>
+      </w:r>
+      <w:r>
+        <w:t xml:space="preserve"> — un espace canin modèle, sur le modèle de Monceau (2 000 m², ouvert toute la journée, éducateur canin payé par la mairie, réservé aux chiens identifiables et vaccinés), dans un des jardins voisins (Poterne des Peupliers, Charles-Trenet, Moulin-de-la-Pointe) ou sur une parcelle contiguë, la petite ceinture restant ce qu'elle est : un couloir écologique.</w:t>
+      </w:r>
+    </w:p>
+    <w:p>
+      <w:r>
+        <w:t>Trois raisons pour lesquelles celle-ci peut passer là où l'autre échoue :</w:t>
+      </w:r>
+    </w:p>
+    <w:p>
+      <w:pPr>
+        <w:pStyle w:val="ListBullet"/>
+      </w:pPr>
+      <w:r>
+        <w:t xml:space="preserve">elle </w:t>
+      </w:r>
+      <w:r>
+        <w:rPr>
+          <w:b/>
+        </w:rPr>
+        <w:t>ne demande pas de revenir sur une interdiction</w:t>
+      </w:r>
+      <w:r>
+        <w:t>, elle ajoute un équipement ;</w:t>
+      </w:r>
+    </w:p>
+    <w:p>
+      <w:pPr>
+        <w:pStyle w:val="ListBullet"/>
+      </w:pPr>
+      <w:r>
+        <w:t xml:space="preserve">elle </w:t>
+      </w:r>
+      <w:r>
+        <w:rPr>
+          <w:b/>
+        </w:rPr>
+        <w:t>répond au problème que la mairie a déjà écrit noir sur blanc</w:t>
+      </w:r>
+      <w:r>
+        <w:t xml:space="preserve"> (des chiens détachés en nombre, à traiter), et lui apporte la donnée qui lui manque pour agir ;</w:t>
+      </w:r>
+    </w:p>
+    <w:p>
+      <w:pPr>
+        <w:pStyle w:val="ListBullet"/>
+      </w:pPr>
+      <w:r>
+        <w:t xml:space="preserve">elle </w:t>
+      </w:r>
+      <w:r>
+        <w:rPr>
+          <w:b/>
+        </w:rPr>
+        <w:t>réserve la biodiversité</w:t>
+      </w:r>
+      <w:r>
+        <w:t xml:space="preserve"> au lieu de l'opposer aux propriétaires de chiens, ce qui prive l'opposition de son meilleur argument.</w:t>
+      </w:r>
+    </w:p>
+    <w:p>
+      <w:r>
+        <w:t>Et une conséquence personnelle, qu'il faut assumer : se promener là avec son chien détaché, c'est utiliser un espace où les animaux ne sont pas admis. Rien de scandaleux, tout le monde le fait, mais il faut le savoir avant d'en faire un argument public — et avant qu'un adversaire ne fasse remarquer que le porteur du projet compte parmi les usagers hors règle. Le dossier gagne à dire les choses ainsi : « nos chiens y vont, la règle dit non, et si on comptait pour décider ? »</w:t>
+      </w:r>
+    </w:p>
+    <w:p>
+      <w:pPr>
+        <w:pStyle w:val="Heading3"/>
+      </w:pPr>
+      <w:r>
+        <w:t>Sources</w:t>
+      </w:r>
+    </w:p>
+    <w:p>
+      <w:pPr>
+        <w:pStyle w:val="ListBullet"/>
+      </w:pPr>
+      <w:r>
+        <w:t>Ville de Paris, fiche du lieu « Petite Ceinture du 13e (PC 13) » (surface 12 234 m², horaires, ouverture H24 en saison, « admission animaux : non », label Ecojardin, liaison Charles-Trenet / Moulin-de-la-Pointe / Poterne-des-Peupliers) : https://www.paris.fr/lieux/petite-ceinture-du-13e-pc-13-18089</w:t>
+      </w:r>
+    </w:p>
+    <w:p>
+      <w:pPr>
+        <w:pStyle w:val="ListBullet"/>
+      </w:pPr>
+      <w:r>
+        <w:t>Contrat de prévention et de sécurité du 13e arrondissement (2023), « Panorama des principales problématiques identifiées », équipements municipaux sensibles — reprise textuelle de la ligne « Promenade de la petite ceinture à la Poterne des Peupliers (SDF et chiens non tenus en laisse) » : https://cdn.paris.fr/paris/2023/11/14/cpsa-13e_2-juin-2023-Mxbk.pdf</w:t>
+      </w:r>
+    </w:p>
+    <w:p>
+      <w:pPr>
+        <w:pStyle w:val="ListBullet"/>
+      </w:pPr>
+      <w:r>
+        <w:t>Accès et longueur (0,43 km, trois accès, horaires selon la saison) : Paris je t'aime, https://parisjetaime.com/eng/article/the-petite-ceinture-circular-railway-unusual-and-little-known-paris-a1779</w:t>
+      </w:r>
+    </w:p>
+    <w:p>
+      <w:pPr>
+        <w:pStyle w:val="ListBullet"/>
+      </w:pPr>
+      <w:r>
+        <w:t>Ouvertures de nouveaux tronçons annoncées pour 2026 : presse internationale sur la petite ceinture (à confirmer auprès de la Ville avant tout usage public).</w:t>
+      </w:r>
+    </w:p>
+    <w:p>
+      <w:r>
+        <w:rPr>
+          <w:b w:val="0"/>
+        </w:rPr>
+        <w:t>↑ Sommaire</w:t>
+      </w:r>
+    </w:p>
+    <w:p/>
+    <w:p>
+      <w:pPr>
+        <w:pStyle w:val="Heading2"/>
+      </w:pPr>
+      <w:r>
+        <w:t>12. Tests ADN canins : coûts réels, facilité de mise en œuvre, et chiffrage pour Paris (29/09/2026)</w:t>
       </w:r>
     </w:p>
     <w:p>
@@ -11597,7 +12181,7 @@
         <w:pStyle w:val="Heading2"/>
       </w:pPr>
       <w:r>
-        <w:t>12. Statut « chien·ne citoyen·ne de Paris » — note de conception (29/09/2026)</w:t>
+        <w:t>13. Statut « chien·ne citoyen·ne de Paris » — note de conception (29/09/2026)</w:t>
       </w:r>
     </w:p>
     <w:p>
@@ -12482,7 +13066,7 @@
         <w:pStyle w:val="Heading2"/>
       </w:pPr>
       <w:r>
-        <w:t>13. Statut « chien·ne citoyen·ne de Paris » — projet d'arrêté et règlement (version de travail, 29/09/2026)</w:t>
+        <w:t>14. Statut « chien·ne citoyen·ne de Paris » — projet d'arrêté et règlement (version de travail, 29/09/2026)</w:t>
       </w:r>
     </w:p>
     <w:p>
@@ -12921,7 +13505,7 @@
         <w:pStyle w:val="Heading2"/>
       </w:pPr>
       <w:r>
-        <w:t>14. Projet « chiens de Paris » — creusage du 29/09/2026</w:t>
+        <w:t>15. Projet « chiens de Paris » — creusage du 29/09/2026</w:t>
       </w:r>
     </w:p>
     <w:p>
@@ -13874,7 +14458,7 @@
         <w:pStyle w:val="Heading2"/>
       </w:pPr>
       <w:r>
-        <w:t>15. RAPPORT — Un projet politique « chiens de Paris » : statut du chien citoyen, registre ADN, droits et chiffrage</w:t>
+        <w:t>16. RAPPORT — Un projet politique « chiens de Paris » : statut du chien citoyen, registre ADN, droits et chiffrage</w:t>
       </w:r>
     </w:p>
     <w:p>
@@ -19103,7 +19687,7 @@
           </w:tcPr>
           <w:p>
             <w:r>
-              <w:t>142</w:t>
+              <w:t>145</w:t>
             </w:r>
           </w:p>
         </w:tc>
@@ -19135,7 +19719,7 @@
           </w:tcPr>
           <w:p>
             <w:r>
-              <w:t>308</w:t>
+              <w:t>324</w:t>
             </w:r>
           </w:p>
         </w:tc>
@@ -19232,6 +19816,38 @@
           <w:p>
             <w:r>
               <w:t>146</w:t>
+            </w:r>
+          </w:p>
+        </w:tc>
+      </w:tr>
+      <w:tr>
+        <w:tc>
+          <w:tcPr>
+            <w:tcW w:type="dxa" w:w="2880"/>
+          </w:tcPr>
+          <w:p>
+            <w:r>
+              <w:t>NOTE-PC13-POTERNE.md</w:t>
+            </w:r>
+          </w:p>
+        </w:tc>
+        <w:tc>
+          <w:tcPr>
+            <w:tcW w:type="dxa" w:w="2880"/>
+          </w:tcPr>
+          <w:p>
+            <w:r>
+              <w:t>Le site de la Poterne des Peupliers : usage réel et alternative</w:t>
+            </w:r>
+          </w:p>
+        </w:tc>
+        <w:tc>
+          <w:tcPr>
+            <w:tcW w:type="dxa" w:w="2880"/>
+          </w:tcPr>
+          <w:p>
+            <w:r>
+              <w:t>111</w:t>
             </w:r>
           </w:p>
         </w:tc>

</xml_diff>

<commit_message>
Chiens: retire la note de site PC13 (exploration, pas dossier) ; la reserve factuelle reste dans la note de lancement et l'audit
</commit_message>
<xml_diff>
--- a/export/Chien-citoyen-de-Paris-dossier-complet.docx
+++ b/export/Chien-citoyen-de-Paris-dossier-complet.docx
@@ -1323,7 +1323,7 @@
         <w:rPr>
           <w:b w:val="0"/>
         </w:rPr>
-        <w:t>11. Site de la Poterne des Peupliers (PC 13) — ce qu'on peut y faire</w:t>
+        <w:t>11. Tests ADN canins : coûts et faisabilité</w:t>
       </w:r>
       <w:r>
         <w:t xml:space="preserve"> — </w:t>
@@ -1333,7 +1333,7 @@
           <w:rFonts w:ascii="Consolas" w:hAnsi="Consolas"/>
           <w:sz w:val="20"/>
         </w:rPr>
-        <w:t>NOTE-PC13-POTERNE.md</w:t>
+        <w:t>ADN-COUTS-FAISABILITE.md</w:t>
       </w:r>
     </w:p>
     <w:p>
@@ -1344,7 +1344,7 @@
         <w:rPr>
           <w:b w:val="0"/>
         </w:rPr>
-        <w:t>1. Ce qu'est exactement ce lieu</w:t>
+        <w:t>1. Combien coûte un test, concrètement</w:t>
       </w:r>
     </w:p>
     <w:p>
@@ -1355,7 +1355,7 @@
         <w:rPr>
           <w:b w:val="0"/>
         </w:rPr>
-        <w:t>2. Ce que la Ville et la préfecture disent déjà du lieu</w:t>
+        <w:t>2. Est-ce facile à faire ? Oui, techniquement. Les points durs sont ailleurs.</w:t>
       </w:r>
     </w:p>
     <w:p>
@@ -1366,7 +1366,7 @@
         <w:rPr>
           <w:b w:val="0"/>
         </w:rPr>
-        <w:t>3. Le comptage d'usage : la mesure que personne n'a</w:t>
+        <w:t>3. Chiffrage pour Paris</w:t>
       </w:r>
     </w:p>
     <w:p>
@@ -1377,40 +1377,18 @@
         <w:rPr>
           <w:b w:val="0"/>
         </w:rPr>
-        <w:t>4. Ce qu'il faut demander, dans l'ordre</w:t>
-      </w:r>
-    </w:p>
-    <w:p>
-      <w:pPr>
-        <w:pStyle w:val="ListBullet2"/>
+        <w:t>4. Le test le moins cher à faire maintenant (pour aller vite sans argent)</w:t>
+      </w:r>
+    </w:p>
+    <w:p>
+      <w:pPr>
+        <w:pStyle w:val="ListBullet"/>
       </w:pPr>
       <w:r>
         <w:rPr>
           <w:b w:val="0"/>
         </w:rPr>
-        <w:t>5. La proposition qui a une chance, et pourquoi elle est différente</w:t>
-      </w:r>
-    </w:p>
-    <w:p>
-      <w:pPr>
-        <w:pStyle w:val="ListBullet2"/>
-      </w:pPr>
-      <w:r>
-        <w:rPr>
-          <w:b w:val="0"/>
-        </w:rPr>
-        <w:t>Sources</w:t>
-      </w:r>
-    </w:p>
-    <w:p>
-      <w:pPr>
-        <w:pStyle w:val="ListBullet"/>
-      </w:pPr>
-      <w:r>
-        <w:rPr>
-          <w:b w:val="0"/>
-        </w:rPr>
-        <w:t>12. Tests ADN canins : coûts et faisabilité</w:t>
+        <w:t>12. Statut du chien citoyen — note de conception</w:t>
       </w:r>
       <w:r>
         <w:t xml:space="preserve"> — </w:t>
@@ -1420,7 +1398,7 @@
           <w:rFonts w:ascii="Consolas" w:hAnsi="Consolas"/>
           <w:sz w:val="20"/>
         </w:rPr>
-        <w:t>ADN-COUTS-FAISABILITE.md</w:t>
+        <w:t>STATUT-CHIEN-CITOYEN.md</w:t>
       </w:r>
     </w:p>
     <w:p>
@@ -1431,7 +1409,7 @@
         <w:rPr>
           <w:b w:val="0"/>
         </w:rPr>
-        <w:t>1. Combien coûte un test, concrètement</w:t>
+        <w:t>0. Le verdict d'abord</w:t>
       </w:r>
     </w:p>
     <w:p>
@@ -1442,7 +1420,7 @@
         <w:rPr>
           <w:b w:val="0"/>
         </w:rPr>
-        <w:t>2. Est-ce facile à faire ? Oui, techniquement. Les points durs sont ailleurs.</w:t>
+        <w:t>1. Le dispositif, brique par brique</w:t>
       </w:r>
     </w:p>
     <w:p>
@@ -1453,7 +1431,7 @@
         <w:rPr>
           <w:b w:val="0"/>
         </w:rPr>
-        <w:t>3. Chiffrage pour Paris</w:t>
+        <w:t>2. Qui peut faire quoi (le vrai tableau de contraintes)</w:t>
       </w:r>
     </w:p>
     <w:p>
@@ -1464,18 +1442,62 @@
         <w:rPr>
           <w:b w:val="0"/>
         </w:rPr>
-        <w:t>4. Le test le moins cher à faire maintenant (pour aller vite sans argent)</w:t>
-      </w:r>
-    </w:p>
-    <w:p>
-      <w:pPr>
-        <w:pStyle w:val="ListBullet"/>
+        <w:t>3. Chiffrage</w:t>
+      </w:r>
+    </w:p>
+    <w:p>
+      <w:pPr>
+        <w:pStyle w:val="ListBullet2"/>
       </w:pPr>
       <w:r>
         <w:rPr>
           <w:b w:val="0"/>
         </w:rPr>
-        <w:t>13. Statut du chien citoyen — note de conception</w:t>
+        <w:t>4. Les cinq décisions à trancher (ce sont elles, le projet politique)</w:t>
+      </w:r>
+    </w:p>
+    <w:p>
+      <w:pPr>
+        <w:pStyle w:val="ListBullet2"/>
+      </w:pPr>
+      <w:r>
+        <w:rPr>
+          <w:b w:val="0"/>
+        </w:rPr>
+        <w:t>5. Objections à anticiper (sinon elles tueront le projet)</w:t>
+      </w:r>
+    </w:p>
+    <w:p>
+      <w:pPr>
+        <w:pStyle w:val="ListBullet2"/>
+      </w:pPr>
+      <w:r>
+        <w:rPr>
+          <w:b w:val="0"/>
+        </w:rPr>
+        <w:t>6. Positionnement : la formulation qui peut devenir majoritaire</w:t>
+      </w:r>
+    </w:p>
+    <w:p>
+      <w:pPr>
+        <w:pStyle w:val="ListBullet2"/>
+      </w:pPr>
+      <w:r>
+        <w:rPr>
+          <w:b w:val="0"/>
+        </w:rPr>
+        <w:t>7. Prochaines étapes (coût, délai)</w:t>
+      </w:r>
+    </w:p>
+    <w:p>
+      <w:pPr>
+        <w:pStyle w:val="ListBullet"/>
+      </w:pPr>
+      <w:r>
+        <w:rPr>
+          <w:b w:val="0"/>
+        </w:rPr>
+        <w:t>13. Projet d'arrêté et règlement du statut</w:t>
       </w:r>
       <w:r>
         <w:t xml:space="preserve"> — </w:t>
@@ -1485,7 +1507,7 @@
           <w:rFonts w:ascii="Consolas" w:hAnsi="Consolas"/>
           <w:sz w:val="20"/>
         </w:rPr>
-        <w:t>STATUT-CHIEN-CITOYEN.md</w:t>
+        <w:t>PROJET-ARRETE-STATUT-CHIEN-CITOYEN.md</w:t>
       </w:r>
     </w:p>
     <w:p>
@@ -1496,7 +1518,7 @@
         <w:rPr>
           <w:b w:val="0"/>
         </w:rPr>
-        <w:t>0. Le verdict d'abord</w:t>
+        <w:t>A. Projet d'arrêté (expérimentation de 24 mois)</w:t>
       </w:r>
     </w:p>
     <w:p>
@@ -1507,7 +1529,7 @@
         <w:rPr>
           <w:b w:val="0"/>
         </w:rPr>
-        <w:t>1. Le dispositif, brique par brique</w:t>
+        <w:t>B. Règlement du statut</w:t>
       </w:r>
     </w:p>
     <w:p>
@@ -1518,7 +1540,7 @@
         <w:rPr>
           <w:b w:val="0"/>
         </w:rPr>
-        <w:t>2. Qui peut faire quoi (le vrai tableau de contraintes)</w:t>
+        <w:t>C. Le parcours propriétaire, en cinq étapes (le point qui décide du taux d'adhésion)</w:t>
       </w:r>
     </w:p>
     <w:p>
@@ -1529,62 +1551,18 @@
         <w:rPr>
           <w:b w:val="0"/>
         </w:rPr>
-        <w:t>3. Chiffrage</w:t>
-      </w:r>
-    </w:p>
-    <w:p>
-      <w:pPr>
-        <w:pStyle w:val="ListBullet2"/>
+        <w:t>D. Maquette de données (à valider par le DPO de la Ville)</w:t>
+      </w:r>
+    </w:p>
+    <w:p>
+      <w:pPr>
+        <w:pStyle w:val="ListBullet"/>
       </w:pPr>
       <w:r>
         <w:rPr>
           <w:b w:val="0"/>
         </w:rPr>
-        <w:t>4. Les cinq décisions à trancher (ce sont elles, le projet politique)</w:t>
-      </w:r>
-    </w:p>
-    <w:p>
-      <w:pPr>
-        <w:pStyle w:val="ListBullet2"/>
-      </w:pPr>
-      <w:r>
-        <w:rPr>
-          <w:b w:val="0"/>
-        </w:rPr>
-        <w:t>5. Objections à anticiper (sinon elles tueront le projet)</w:t>
-      </w:r>
-    </w:p>
-    <w:p>
-      <w:pPr>
-        <w:pStyle w:val="ListBullet2"/>
-      </w:pPr>
-      <w:r>
-        <w:rPr>
-          <w:b w:val="0"/>
-        </w:rPr>
-        <w:t>6. Positionnement : la formulation qui peut devenir majoritaire</w:t>
-      </w:r>
-    </w:p>
-    <w:p>
-      <w:pPr>
-        <w:pStyle w:val="ListBullet2"/>
-      </w:pPr>
-      <w:r>
-        <w:rPr>
-          <w:b w:val="0"/>
-        </w:rPr>
-        <w:t>7. Prochaines étapes (coût, délai)</w:t>
-      </w:r>
-    </w:p>
-    <w:p>
-      <w:pPr>
-        <w:pStyle w:val="ListBullet"/>
-      </w:pPr>
-      <w:r>
-        <w:rPr>
-          <w:b w:val="0"/>
-        </w:rPr>
-        <w:t>14. Projet d'arrêté et règlement du statut</w:t>
+        <w:t>14. Projet « chiens de Paris » — creusage</w:t>
       </w:r>
       <w:r>
         <w:t xml:space="preserve"> — </w:t>
@@ -1594,7 +1572,7 @@
           <w:rFonts w:ascii="Consolas" w:hAnsi="Consolas"/>
           <w:sz w:val="20"/>
         </w:rPr>
-        <w:t>PROJET-ARRETE-STATUT-CHIEN-CITOYEN.md</w:t>
+        <w:t>PROJET-CHIENS-PARIS.md</w:t>
       </w:r>
     </w:p>
     <w:p>
@@ -1605,7 +1583,7 @@
         <w:rPr>
           <w:b w:val="0"/>
         </w:rPr>
-        <w:t>A. Projet d'arrêté (expérimentation de 24 mois)</w:t>
+        <w:t>1. État des lieux chiffré</w:t>
       </w:r>
     </w:p>
     <w:p>
@@ -1616,7 +1594,7 @@
         <w:rPr>
           <w:b w:val="0"/>
         </w:rPr>
-        <w:t>B. Règlement du statut</w:t>
+        <w:t>2. La cible vaut-elle un électorat ? (le calcul qui décide de tout)</w:t>
       </w:r>
     </w:p>
     <w:p>
@@ -1627,7 +1605,7 @@
         <w:rPr>
           <w:b w:val="0"/>
         </w:rPr>
-        <w:t>C. Le parcours propriétaire, en cinq étapes (le point qui décide du taux d'adhésion)</w:t>
+        <w:t>3. Le problème politique : le sujet est déjà occupé</w:t>
       </w:r>
     </w:p>
     <w:p>
@@ -1638,28 +1616,18 @@
         <w:rPr>
           <w:b w:val="0"/>
         </w:rPr>
-        <w:t>D. Maquette de données (à valider par le DPO de la Ville)</w:t>
-      </w:r>
-    </w:p>
-    <w:p>
-      <w:pPr>
-        <w:pStyle w:val="ListBullet"/>
+        <w:t>4. Trois positionnements (à trancher AVANT tout chiffrage)</w:t>
+      </w:r>
+    </w:p>
+    <w:p>
+      <w:pPr>
+        <w:pStyle w:val="ListBullet2"/>
       </w:pPr>
       <w:r>
         <w:rPr>
           <w:b w:val="0"/>
         </w:rPr>
-        <w:t>15. Projet « chiens de Paris » — creusage</w:t>
-      </w:r>
-      <w:r>
-        <w:t xml:space="preserve"> — </w:t>
-      </w:r>
-      <w:r>
-        <w:rPr>
-          <w:rFonts w:ascii="Consolas" w:hAnsi="Consolas"/>
-          <w:sz w:val="20"/>
-        </w:rPr>
-        <w:t>PROJET-CHIENS-PARIS.md</w:t>
+        <w:t>5. Chiffrage</w:t>
       </w:r>
     </w:p>
     <w:p>
@@ -1670,7 +1638,7 @@
         <w:rPr>
           <w:b w:val="0"/>
         </w:rPr>
-        <w:t>1. État des lieux chiffré</w:t>
+        <w:t>6. Ce qui peut tuer l'idée (hypothèses à tester d'abord)</w:t>
       </w:r>
     </w:p>
     <w:p>
@@ -1681,7 +1649,7 @@
         <w:rPr>
           <w:b w:val="0"/>
         </w:rPr>
-        <w:t>2. La cible vaut-elle un électorat ? (le calcul qui décide de tout)</w:t>
+        <w:t>7. Pas suivants pas chers</w:t>
       </w:r>
     </w:p>
     <w:p>
@@ -1692,73 +1660,18 @@
         <w:rPr>
           <w:b w:val="0"/>
         </w:rPr>
-        <w:t>3. Le problème politique : le sujet est déjà occupé</w:t>
-      </w:r>
-    </w:p>
-    <w:p>
-      <w:pPr>
-        <w:pStyle w:val="ListBullet2"/>
+        <w:t>Sources</w:t>
+      </w:r>
+    </w:p>
+    <w:p>
+      <w:pPr>
+        <w:pStyle w:val="ListBullet"/>
       </w:pPr>
       <w:r>
         <w:rPr>
           <w:b w:val="0"/>
         </w:rPr>
-        <w:t>4. Trois positionnements (à trancher AVANT tout chiffrage)</w:t>
-      </w:r>
-    </w:p>
-    <w:p>
-      <w:pPr>
-        <w:pStyle w:val="ListBullet2"/>
-      </w:pPr>
-      <w:r>
-        <w:rPr>
-          <w:b w:val="0"/>
-        </w:rPr>
-        <w:t>5. Chiffrage</w:t>
-      </w:r>
-    </w:p>
-    <w:p>
-      <w:pPr>
-        <w:pStyle w:val="ListBullet2"/>
-      </w:pPr>
-      <w:r>
-        <w:rPr>
-          <w:b w:val="0"/>
-        </w:rPr>
-        <w:t>6. Ce qui peut tuer l'idée (hypothèses à tester d'abord)</w:t>
-      </w:r>
-    </w:p>
-    <w:p>
-      <w:pPr>
-        <w:pStyle w:val="ListBullet2"/>
-      </w:pPr>
-      <w:r>
-        <w:rPr>
-          <w:b w:val="0"/>
-        </w:rPr>
-        <w:t>7. Pas suivants pas chers</w:t>
-      </w:r>
-    </w:p>
-    <w:p>
-      <w:pPr>
-        <w:pStyle w:val="ListBullet2"/>
-      </w:pPr>
-      <w:r>
-        <w:rPr>
-          <w:b w:val="0"/>
-        </w:rPr>
-        <w:t>Sources</w:t>
-      </w:r>
-    </w:p>
-    <w:p>
-      <w:pPr>
-        <w:pStyle w:val="ListBullet"/>
-      </w:pPr>
-      <w:r>
-        <w:rPr>
-          <w:b w:val="0"/>
-        </w:rPr>
-        <w:t>16. Rapport complet et chiffrage</w:t>
+        <w:t>15. Rapport complet et chiffrage</w:t>
       </w:r>
       <w:r>
         <w:t xml:space="preserve"> — </w:t>
@@ -6208,7 +6121,7 @@
           <w:rFonts w:ascii="Consolas" w:hAnsi="Consolas"/>
           <w:sz w:val="20"/>
         </w:rPr>
-        <w:t>[RAPPORT-COMPLET-CHIENS-PARIS.md](#16-rapport--un-projet-politique--chiens-de-paris---statut-du-chien-citoyen-registre-adn-droits-et-chiffrage)</w:t>
+        <w:t>[RAPPORT-COMPLET-CHIENS-PARIS.md](#15-rapport--un-projet-politique--chiens-de-paris---statut-du-chien-citoyen-registre-adn-droits-et-chiffrage)</w:t>
       </w:r>
       <w:r>
         <w:t xml:space="preserve"> (annexe E pour les URL).</w:t>
@@ -6572,17 +6485,7 @@
         <w:t>Un lieu où l'usage dépasse déjà la règle.</w:t>
       </w:r>
       <w:r>
-        <w:t xml:space="preserve"> Le contrat de prévention et de sécurité du 13e signale la promenade de la petite ceinture à la Poterne des Peupliers — « SDF et chiens non tenus en laisse » — parmi ses points sensibles. Attention au contresens : la fiche officielle du lieu indique « admission animaux : non », donc ce n'est pas l'endroit où demander un espace de liberté (voir </w:t>
-      </w:r>
-      <w:r>
-        <w:rPr>
-          <w:rFonts w:ascii="Consolas" w:hAnsi="Consolas"/>
-          <w:sz w:val="20"/>
-        </w:rPr>
-        <w:t>[NOTE-PC13-POTERNE.md](#11-le-site-de-la-poterne-des-peupliers-pc-13--ce-quon-peut-y-faire-et-ce-quon-ne-peut-pas)</w:t>
-      </w:r>
-      <w:r>
-        <w:t xml:space="preserve">). C'est en revanche le meilleur site de </w:t>
+        <w:t xml:space="preserve"> Le contrat de prévention et de sécurité du 13e signale la promenade de la petite ceinture à la Poterne des Peupliers — « SDF et chiens non tenus en laisse » — parmi ses points sensibles. Attention au contresens : la fiche officielle du lieu indique « admission animaux : non », donc ce n'est pas l'endroit où demander un espace de liberté. C'est en revanche le meilleur site de </w:t>
       </w:r>
       <w:r>
         <w:rPr>
@@ -9488,7 +9391,7 @@
         <w:t>La petite ceinture du 13e (PC 13)</w:t>
       </w:r>
       <w:r>
-        <w:t xml:space="preserve"> — vérification faite sur la fiche officielle du lieu, et elle corrige une hypothèse du dossier : </w:t>
+        <w:t xml:space="preserve"> — vérifié sur la fiche officielle du lieu : </w:t>
       </w:r>
       <w:r>
         <w:rPr>
@@ -9498,25 +9401,16 @@
         <w:t>confirmé</w:t>
       </w:r>
       <w:r>
-        <w:t xml:space="preserve"> la surface de 12 234 m², l'ouverture au public depuis 2016, la liaison avec les jardins Charles-Trenet, Moulin-de-la-Pointe et Poterne-des-Peupliers, le label Ecojardin, les horaires (8 h – 20 h 30 en saison, </w:t>
+        <w:t xml:space="preserve"> 12 234 m², ouverte en 2016, reliant les jardins Charles-Trenet, Moulin-de-la-Pointe et Poterne-des-Peupliers, label Ecojardin, horaires 8 h – 20 h 30 en saison et H24 du troisième lundi d'avril au troisième dimanche de septembre, et </w:t>
       </w:r>
       <w:r>
         <w:rPr>
           <w:b/>
         </w:rPr>
-        <w:t>H24 du troisième lundi d'avril au troisième dimanche de septembre</w:t>
-      </w:r>
-      <w:r>
-        <w:t xml:space="preserve">), et surtout </w:t>
-      </w:r>
-      <w:r>
-        <w:rPr>
-          <w:b/>
-        </w:rPr>
         <w:t>« Admission animaux : non »</w:t>
       </w:r>
       <w:r>
-        <w:t xml:space="preserve">. La ligne du contrat de prévention et de sécurité du 13e (« Promenade de la petite ceinture à la Poterne des Peupliers (SDF et chiens non tenus en laisse) »), déjà citée, a été relue dans le texte intégral du document : </w:t>
+        <w:t xml:space="preserve">. La ligne du contrat de prévention et de sécurité du 13e (« SDF et chiens non tenus en laisse ») a été relue dans le texte intégral : </w:t>
       </w:r>
       <w:r>
         <w:rPr>
@@ -9526,22 +9420,202 @@
         <w:t>confirmé</w:t>
       </w:r>
       <w:r>
-        <w:t xml:space="preserve">. Conséquence : le site ne peut pas être proposé comme espace de liberté pour chiens ; il est requalifié en site de comptage d'usage, avec l'alternative d'un espace canin dans un jardin voisin. </w:t>
+        <w:t>. Conséquence retenue dans le dossier : ce lieu ne peut pas être proposé comme espace de liberté, seulement comme site de comptage d'usage.</w:t>
+      </w:r>
+    </w:p>
+    <w:p>
+      <w:r>
+        <w:t>Sources : https://www.paris.fr/lieux/petite-ceinture-du-13e-pc-13-18089 https://cdn.paris.fr/paris/2023/11/14/cpsa-13e_2-juin-2023-Mxbk.pdf</w:t>
+      </w:r>
+    </w:p>
+    <w:p>
+      <w:pPr>
+        <w:pStyle w:val="ListNumber"/>
+      </w:pPr>
+      <w:r>
+        <w:t xml:space="preserve">Le retrait de </w:t>
       </w:r>
       <w:r>
         <w:rPr>
           <w:rFonts w:ascii="Consolas" w:hAnsi="Consolas"/>
           <w:sz w:val="20"/>
         </w:rPr>
-        <w:t>incertain</w:t>
-      </w:r>
-      <w:r>
-        <w:t xml:space="preserve"> les ouvertures de nouveaux tronçons annoncées pour 2026 (presse, pas la Ville).</w:t>
-      </w:r>
-    </w:p>
-    <w:p>
-      <w:r>
-        <w:t>Sources : https://www.paris.fr/lieux/petite-ceinture-du-13e-pc-13-18089 https://cdn.paris.fr/paris/2023/11/14/cpsa-13e_2-juin-2023-Mxbk.pdf</w:t>
+        <w:t>PITCH-COLLAB-TECHNIQUE-IT.md</w:t>
+      </w:r>
+      <w:r>
+        <w:t xml:space="preserve"> est une décision éditoriale, pas une correction : la pièce technique ne fait pas partie du dossier communiqué.</w:t>
+      </w:r>
+    </w:p>
+    <w:p>
+      <w:r>
+        <w:rPr>
+          <w:b w:val="0"/>
+        </w:rPr>
+        <w:t>↑ Sommaire</w:t>
+      </w:r>
+    </w:p>
+    <w:p/>
+    <w:p>
+      <w:pPr>
+        <w:pStyle w:val="Heading2"/>
+      </w:pPr>
+      <w:r>
+        <w:t>8. Note juridique — l'arrêté ADN canin : ce qui a fait annuler Béziers, et la recette pour un arrêté qui tient (29/09/2026)</w:t>
+      </w:r>
+    </w:p>
+    <w:p>
+      <w:r>
+        <w:rPr>
+          <w:i/>
+        </w:rPr>
+        <w:t>Source : `NOTE-JURIDIQUE-ARRETE-ADN.md`.</w:t>
+      </w:r>
+    </w:p>
+    <w:p>
+      <w:pPr>
+        <w:pStyle w:val="Heading3"/>
+      </w:pPr>
+      <w:r>
+        <w:t>1. Les faits de Béziers, précisément</w:t>
+      </w:r>
+    </w:p>
+    <w:p>
+      <w:pPr>
+        <w:pStyle w:val="ListBullet"/>
+      </w:pPr>
+      <w:r>
+        <w:t>Arrêté du maire de Béziers du 12 mai 2023 : à titre d'expérimentation, du 13 juillet 2023 au 23 juillet 2025, toute personne promenant son chien dans l'hypercentre doit pouvoir justifier de l'identification génétique de son animal.</w:t>
+      </w:r>
+    </w:p>
+    <w:p>
+      <w:pPr>
+        <w:pStyle w:val="ListBullet"/>
+      </w:pPr>
+      <w:r>
+        <w:t>Jugement du tribunal administratif de Montpellier du 6 mai 2025 : ANNULATION. Motifs exacts du jugement (cités par la LDH qui reprend les termes du TA) :</w:t>
+      </w:r>
+    </w:p>
+    <w:p>
+      <w:pPr>
+        <w:pStyle w:val="ListBullet2"/>
+      </w:pPr>
+      <w:r>
+        <w:t>« aucune pièce du dossier ne permet de corroborer les éléments indiqués dans l'exposé des motifs de l'arrêté », notamment l'atteinte à la sécurité et à la salubrité publique par le nombre de déjections ramassées en 2020, 2021 et 2022, ni l'inefficacité des mesures déjà prises par la commune ;</w:t>
+      </w:r>
+    </w:p>
+    <w:p>
+      <w:pPr>
+        <w:pStyle w:val="ListBullet2"/>
+      </w:pPr>
+      <w:r>
+        <w:t>« il ne ressort pas non plus des pièces du dossier que la méthode d'identification classique, telle que l'apposition d'un tatouage ou d'un marquage, obligatoire en vertu de l'article L. 212-10 du code rural et de la pêche maritime, n'est pas suffisante » pour identifier les animaux responsables ;</w:t>
+      </w:r>
+    </w:p>
+    <w:p>
+      <w:pPr>
+        <w:pStyle w:val="ListBullet2"/>
+      </w:pPr>
+      <w:r>
+        <w:t>« eu égard aux sujétions qu'elle impose aux propriétaires ou détenteurs de chiens, la mesure édictée n'est ni nécessaire, ni adaptée, ni proportionnée à sa finalité, et ce, alors même que l'arrêté concerne un territoire réduit. »</w:t>
+      </w:r>
+    </w:p>
+    <w:p>
+      <w:pPr>
+        <w:pStyle w:val="ListBullet"/>
+      </w:pPr>
+      <w:r>
+        <w:t>Le jour même, Robert Ménard a signé un nouvel arrêté identique, jusqu'au 31 décembre 2028 : amende de 35 € en cas de défaut d'identification génétique, redevance de 130 € « au titre des frais de nettoiement » pour une déjection non ramassée identifiée par le fichier. Il invoque une baisse de 85 % des déjections dans l'hypercentre entre septembre 2023 et avril 2025.</w:t>
+      </w:r>
+    </w:p>
+    <w:p>
+      <w:pPr>
+        <w:pStyle w:val="ListBullet"/>
+      </w:pPr>
+      <w:r>
+        <w:t>LDH : référé-suspension rejeté le 27 juin 2025 pour DÉFAUT D'URGENCE — c'est-à-dire que le juge des référés ne s'est PAS prononcé sur la légalité de l'arrêté. Le recours au fond est toujours pendant.</w:t>
+      </w:r>
+    </w:p>
+    <w:p>
+      <w:pPr>
+        <w:pStyle w:val="ListBullet"/>
+      </w:pPr>
+      <w:r>
+        <w:t>Conclusion : en France, la jurisprudence sur l'arrêté ADN canin n'est PAS stabilisée. Un jugement d'annulation existe (motifs ci-dessus), un deuxième contentieux est en cours, et Saint-Omer a un arrêté du même type passé sans remarque par le contrôle de légalité préfectoral (le contrôle de légalité n'est pas un jugement).</w:t>
+      </w:r>
+    </w:p>
+    <w:p>
+      <w:pPr>
+        <w:pStyle w:val="Heading3"/>
+      </w:pPr>
+      <w:r>
+        <w:t>2. Le point qui change tout pour Paris</w:t>
+      </w:r>
+    </w:p>
+    <w:p>
+      <w:r>
+        <w:t>Selon le I de l'article L. 2512-13 du CGCT, à Paris le préfet de police exerce les pouvoirs de police générale, MAIS le II du même article dispose que « le maire de Paris est chargé de la police municipale en matière : 1° De salubrité sur la voie publique ».</w:t>
+      </w:r>
+    </w:p>
+    <w:p>
+      <w:r>
+        <w:t>La salubrité de la voie publique — exactement le fondement de l'arrêté anti-déjections — EST donc bien dans la main du maire de Paris.</w:t>
+      </w:r>
+    </w:p>
+    <w:p>
+      <w:r>
+        <w:t>C'est une base plus claire que celle dont disposaient Béziers ou Saint-Omer, où le maire agit au titre du droit commun (L. 2212-2 CGCT).</w:t>
+      </w:r>
+    </w:p>
+    <w:p>
+      <w:r>
+        <w:t xml:space="preserve">Et </w:t>
+      </w:r>
+      <w:r>
+        <w:rPr>
+          <w:b/>
+        </w:rPr>
+        <w:t>l'exécution existe</w:t>
+      </w:r>
+      <w:r>
+        <w:t xml:space="preserve"> : l'article L. 2512-16-1 du CGCT — rédaction issue de la loi du 15 novembre 2001, qui ne figure plus dans le chapitre en vigueur du code (L. 2512-13 à L. 2512-16), à revérifier sur Légifrance avant citation — permet aux agents de surveillance de Paris (ASP) de verbaliser les contraventions aux arrêtés de police du maire de Paris relatifs au bon ordre, à la tranquillité, à la sécurité et à la salubrité sur la voie publique.</w:t>
+      </w:r>
+    </w:p>
+    <w:p>
+      <w:r>
+        <w:t>La chaîne « arrêté -&gt; verbalisation » a donc un titulaire à Paris.</w:t>
+      </w:r>
+    </w:p>
+    <w:p>
+      <w:pPr>
+        <w:pStyle w:val="IntenseQuote"/>
+      </w:pPr>
+      <w:r>
+        <w:rPr>
+          <w:b/>
+        </w:rPr>
+        <w:t>À vérifier</w:t>
+      </w:r>
+      <w:r>
+        <w:t xml:space="preserve"> auprès de la direction des affaires juridiques de la Ville : le partage exact avec la préfecture de police pour les contrôles sur la voie publique, et la qualification des agents qui feraient les prélèvements sur les déjections.</w:t>
+      </w:r>
+    </w:p>
+    <w:p>
+      <w:pPr>
+        <w:pStyle w:val="Heading3"/>
+      </w:pPr>
+      <w:r>
+        <w:t>3. La recette pour un arrêté qui survit à un recours (déduite du jugement de Béziers)</w:t>
+      </w:r>
+    </w:p>
+    <w:p>
+      <w:r>
+        <w:rPr>
+          <w:b/>
+        </w:rPr>
+        <w:t>Chaque motif d'annulation</w:t>
+      </w:r>
+      <w:r>
+        <w:t xml:space="preserve"> indique ce qu'il faut prouver par pièces :</w:t>
       </w:r>
     </w:p>
     <w:p>
@@ -9549,17 +9623,119 @@
         <w:pStyle w:val="ListNumber"/>
       </w:pPr>
       <w:r>
-        <w:t xml:space="preserve">Le retrait de </w:t>
-      </w:r>
-      <w:r>
-        <w:rPr>
-          <w:rFonts w:ascii="Consolas" w:hAnsi="Consolas"/>
-          <w:sz w:val="20"/>
-        </w:rPr>
-        <w:t>PITCH-COLLAB-TECHNIQUE-IT.md</w:t>
-      </w:r>
-      <w:r>
-        <w:t xml:space="preserve"> est une décision éditoriale, pas une correction : la pièce technique ne fait pas partie du dossier communiqué.</w:t>
+        <w:t>Démontrer l'atteinte à la salubrité AVANT de réglementer. Comptage contradictoire des déjections (agents du service propreté, périmètre défini, plusieurs mois, protocole écrit), données de signalements DansMaRue, plaintes d'habitants et de commerçants. Béziers est tombé là-dessus : l'arrêté affirmait, le dossier ne prouvait pas.</w:t>
+      </w:r>
+    </w:p>
+    <w:p>
+      <w:pPr>
+        <w:pStyle w:val="ListNumber"/>
+      </w:pPr>
+      <w:r>
+        <w:t>Démontrer l'insuffisance de l'identification classique (puce, tatouage). C'est l'argument de fond, et il est solide s'il est documenté : une puce électronique identifie un chien, mais elle ne relie pas une déjection à un chien. Aucun agent ne peut attribuer une crotte à un chien sans analyse génétique, et le flagrant délit est quasi impossible. Cette démonstration doit être écrite noir sur blanc dans l'arrêté, avec les pièces (retours d'expérience des agents, statistiques de verbalisation en flagrant délit : proche de zéro).</w:t>
+      </w:r>
+    </w:p>
+    <w:p>
+      <w:pPr>
+        <w:pStyle w:val="ListNumber"/>
+      </w:pPr>
+      <w:r>
+        <w:t>Documenter la proportionnalité : périmètre restreint et justifié (rues les plus fréquentées), durée bornée, signalétique aux entrées de zone, gratuité totale de l'identification, 72 h pour se mettre en règle, tolérance pour les visiteurs occasionnels, évaluation publique avant toute extension. C'est le modèle Saint-Omer, et c'est l'inverse de la méthode Béziers.</w:t>
+      </w:r>
+    </w:p>
+    <w:p>
+      <w:pPr>
+        <w:pStyle w:val="ListNumber"/>
+      </w:pPr>
+      <w:r>
+        <w:t>Sécuriser les données (moyens soulevés par la LDH, à anticiper) : analyse d'impact (AIPD) et déclaration/registre CNIL, base génétique conservée par le laboratoire seul, la Ville ne détenant que la correspondance prélèvement -&gt; propriétaire, durée de conservation définie, pas de surveillance vidéo permanente (Saint-Omer : vidéoprotection ponctuelle en temps réel uniquement), pas de consultation du fichier national I-CAD au-delà de son objet légal.</w:t>
+      </w:r>
+    </w:p>
+    <w:p>
+      <w:pPr>
+        <w:pStyle w:val="ListNumber"/>
+      </w:pPr>
+      <w:r>
+        <w:t>Ne pas franchir la ligne du « fichage des personnes » : ne jamais conserver l'ADN, ne jamais croiser avec d'autres fichiers, ne pas conditionner l'accès à l'espace public en général.</w:t>
+      </w:r>
+    </w:p>
+    <w:p>
+      <w:pPr>
+        <w:pStyle w:val="Heading3"/>
+      </w:pPr>
+      <w:r>
+        <w:t>4. Ce que ça implique pour le projet « chien citoyen »</w:t>
+      </w:r>
+    </w:p>
+    <w:p>
+      <w:pPr>
+        <w:pStyle w:val="ListBullet"/>
+      </w:pPr>
+      <w:r>
+        <w:t>Le bâton n'est pas interdit en France, mais il est contentieux. La stratégie la moins risquée est en deux temps : (1) phase volontaire non sanctionnante — enregistrement gratuit, badge, contreparties, comptage des déjections en parallèle ; (2) phase d'obligation bornée sur un périmètre, une fois les pièces réunies (baisse constatée, insuffisance de la puce démontrée, AIPD faite) et avec un arrêté écrit comme un dossier de preuve.</w:t>
+      </w:r>
+    </w:p>
+    <w:p>
+      <w:pPr>
+        <w:pStyle w:val="ListBullet"/>
+      </w:pPr>
+      <w:r>
+        <w:t>Ne pas annoncer l'obligation sans les comptages : c'est le motif exact qui a coulé Béziers, et une annulation en pleine campagne est une défaite politique irrécupérable.</w:t>
+      </w:r>
+    </w:p>
+    <w:p>
+      <w:pPr>
+        <w:pStyle w:val="ListBullet"/>
+      </w:pPr>
+      <w:r>
+        <w:t>Saint-Omer a un avantage que Paris aura aussi : la baisse constatée (-60 %) devient la preuve de l'utilité du dispositif pour la période suivante. Il faut donc mesurer dès le premier jour.</w:t>
+      </w:r>
+    </w:p>
+    <w:p>
+      <w:pPr>
+        <w:pStyle w:val="Heading3"/>
+      </w:pPr>
+      <w:r>
+        <w:t>Sources</w:t>
+      </w:r>
+    </w:p>
+    <w:p>
+      <w:pPr>
+        <w:pStyle w:val="ListBullet"/>
+      </w:pPr>
+      <w:r>
+        <w:t>TA Montpellier, jugement du 6 mai 2025 (arrêté du 12 mai 2023 annulé), motifs cités par la LDH ; ordonnance de référé du 27 juin 2025 (n° 2504518, rejet pour défaut d'urgence).</w:t>
+      </w:r>
+    </w:p>
+    <w:p>
+      <w:pPr>
+        <w:pStyle w:val="ListBullet"/>
+      </w:pPr>
+      <w:r>
+        <w:t>Le Parisien, 14/05/2025 (nouvel arrêté du 6 mai 2025, amende 35 €, redevance 130 €, -85 %).</w:t>
+      </w:r>
+    </w:p>
+    <w:p>
+      <w:pPr>
+        <w:pStyle w:val="ListBullet"/>
+      </w:pPr>
+      <w:r>
+        <w:t>LDH France et LDH Béziers (moyens soulevés : incompétence, AIPD et déclaration CNIL au titre des articles 27-28 de la directive (UE) 2016/680, fichage non encadré, consultation du fichier national hors objet de l'article L. 212-10 du code rural, vie privée, liberté d'aller et venir).</w:t>
+      </w:r>
+    </w:p>
+    <w:p>
+      <w:pPr>
+        <w:pStyle w:val="ListBullet"/>
+      </w:pPr>
+      <w:r>
+        <w:t>CGCT, art. L. 2512-13 II 1° (police municipale de la salubrité sur la voie publique confiée au maire de Paris) et L. 2512-16-1 (verbalisation par les agents de surveillance de Paris).</w:t>
+      </w:r>
+    </w:p>
+    <w:p>
+      <w:pPr>
+        <w:pStyle w:val="ListBullet"/>
+      </w:pPr>
+      <w:r>
+        <w:t>FAQ officielle « L'identification génétique des chiens » de la Ville de Saint-Omer.</w:t>
       </w:r>
     </w:p>
     <w:p>
@@ -9576,7 +9752,7 @@
         <w:pStyle w:val="Heading2"/>
       </w:pPr>
       <w:r>
-        <w:t>8. Note juridique — l'arrêté ADN canin : ce qui a fait annuler Béziers, et la recette pour un arrêté qui tient (29/09/2026)</w:t>
+        <w:t>9. Note juridique — ce qui donne une valeur juridique au comptage citoyen</w:t>
       </w:r>
     </w:p>
     <w:p>
@@ -9584,7 +9760,12 @@
         <w:rPr>
           <w:i/>
         </w:rPr>
-        <w:t>Source : `NOTE-JURIDIQUE-ARRETE-ADN.md`.</w:t>
+        <w:t>Source : `NOTE-JURIDIQUE-COMPTAGE-CITOYEN.md`.</w:t>
+      </w:r>
+    </w:p>
+    <w:p>
+      <w:r>
+        <w:t>29 septembre 2026. Question posée : suffit-il d'une photo géodatée stockée sur un serveur, ou faut-il un protocole ? Réponse courte : non, une photo sur un serveur ne prouve rien — ce qui prouve, c'est la manière dont le relevé est préconstitué, contradictoire et daté. Détail ci-dessous. Rien n'a été voté.</w:t>
       </w:r>
     </w:p>
     <w:p>
@@ -9592,71 +9773,77 @@
         <w:pStyle w:val="Heading3"/>
       </w:pPr>
       <w:r>
-        <w:t>1. Les faits de Béziers, précisément</w:t>
-      </w:r>
-    </w:p>
-    <w:p>
-      <w:pPr>
-        <w:pStyle w:val="ListBullet"/>
-      </w:pPr>
-      <w:r>
-        <w:t>Arrêté du maire de Béziers du 12 mai 2023 : à titre d'expérimentation, du 13 juillet 2023 au 23 juillet 2025, toute personne promenant son chien dans l'hypercentre doit pouvoir justifier de l'identification génétique de son animal.</w:t>
-      </w:r>
-    </w:p>
-    <w:p>
-      <w:pPr>
-        <w:pStyle w:val="ListBullet"/>
-      </w:pPr>
-      <w:r>
-        <w:t>Jugement du tribunal administratif de Montpellier du 6 mai 2025 : ANNULATION. Motifs exacts du jugement (cités par la LDH qui reprend les termes du TA) :</w:t>
-      </w:r>
-    </w:p>
-    <w:p>
-      <w:pPr>
-        <w:pStyle w:val="ListBullet2"/>
-      </w:pPr>
-      <w:r>
-        <w:t>« aucune pièce du dossier ne permet de corroborer les éléments indiqués dans l'exposé des motifs de l'arrêté », notamment l'atteinte à la sécurité et à la salubrité publique par le nombre de déjections ramassées en 2020, 2021 et 2022, ni l'inefficacité des mesures déjà prises par la commune ;</w:t>
-      </w:r>
-    </w:p>
-    <w:p>
-      <w:pPr>
-        <w:pStyle w:val="ListBullet2"/>
-      </w:pPr>
-      <w:r>
-        <w:t>« il ne ressort pas non plus des pièces du dossier que la méthode d'identification classique, telle que l'apposition d'un tatouage ou d'un marquage, obligatoire en vertu de l'article L. 212-10 du code rural et de la pêche maritime, n'est pas suffisante » pour identifier les animaux responsables ;</w:t>
-      </w:r>
-    </w:p>
-    <w:p>
-      <w:pPr>
-        <w:pStyle w:val="ListBullet2"/>
-      </w:pPr>
-      <w:r>
-        <w:t>« eu égard aux sujétions qu'elle impose aux propriétaires ou détenteurs de chiens, la mesure édictée n'est ni nécessaire, ni adaptée, ni proportionnée à sa finalité, et ce, alors même que l'arrêté concerne un territoire réduit. »</w:t>
-      </w:r>
-    </w:p>
-    <w:p>
-      <w:pPr>
-        <w:pStyle w:val="ListBullet"/>
-      </w:pPr>
-      <w:r>
-        <w:t>Le jour même, Robert Ménard a signé un nouvel arrêté identique, jusqu'au 31 décembre 2028 : amende de 35 € en cas de défaut d'identification génétique, redevance de 130 € « au titre des frais de nettoiement » pour une déjection non ramassée identifiée par le fichier. Il invoque une baisse de 85 % des déjections dans l'hypercentre entre septembre 2023 et avril 2025.</w:t>
-      </w:r>
-    </w:p>
-    <w:p>
-      <w:pPr>
-        <w:pStyle w:val="ListBullet"/>
-      </w:pPr>
-      <w:r>
-        <w:t>LDH : référé-suspension rejeté le 27 juin 2025 pour DÉFAUT D'URGENCE — c'est-à-dire que le juge des référés ne s'est PAS prononcé sur la légalité de l'arrêté. Le recours au fond est toujours pendant.</w:t>
-      </w:r>
-    </w:p>
-    <w:p>
-      <w:pPr>
-        <w:pStyle w:val="ListBullet"/>
-      </w:pPr>
-      <w:r>
-        <w:t>Conclusion : en France, la jurisprudence sur l'arrêté ADN canin n'est PAS stabilisée. Un jugement d'annulation existe (motifs ci-dessus), un deuxième contentieux est en cours, et Saint-Omer a un arrêté du même type passé sans remarque par le contrôle de légalité préfectoral (le contrôle de légalité n'est pas un jugement).</w:t>
+        <w:t>1. Ce que le juge a réellement reproché à Béziers</w:t>
+      </w:r>
+    </w:p>
+    <w:p>
+      <w:r>
+        <w:t>C'est le point de départ, et il fixe tout le reste. Le tribunal administratif de Montpellier annule l'arrêté du 12 mai 2023 par jugement du 6 mai 2025, sur trois motifs, dans cet ordre :</w:t>
+      </w:r>
+    </w:p>
+    <w:p>
+      <w:pPr>
+        <w:pStyle w:val="ListNumber"/>
+      </w:pPr>
+      <w:r>
+        <w:rPr>
+          <w:b/>
+        </w:rPr>
+        <w:t>L'atteinte n'est pas démontrée.</w:t>
+      </w:r>
+      <w:r>
+        <w:t xml:space="preserve"> « Aucune pièce du dossier ne permet de corroborer les éléments indiqués dans l'exposé des motifs de l'arrêté, notamment l'atteinte qui serait portée à la sécurité et à la salubrité publique par le nombre de déjections canines ramassées au cours des années 2020, 2021, 2022. »</w:t>
+      </w:r>
+    </w:p>
+    <w:p>
+      <w:pPr>
+        <w:pStyle w:val="ListNumber"/>
+      </w:pPr>
+      <w:r>
+        <w:rPr>
+          <w:b/>
+        </w:rPr>
+        <w:t>L'inefficacité des mesures déjà prises n'est pas démontrée</w:t>
+      </w:r>
+      <w:r>
+        <w:t xml:space="preserve"> — la mairie n'a pas non plus établi que ce qu'elle faisait déjà ne suffisait pas.</w:t>
+      </w:r>
+    </w:p>
+    <w:p>
+      <w:pPr>
+        <w:pStyle w:val="ListNumber"/>
+      </w:pPr>
+      <w:r>
+        <w:rPr>
+          <w:b/>
+        </w:rPr>
+        <w:t>La mesure n'est « ni nécessaire, ni adaptée, ni proportionnée »</w:t>
+      </w:r>
+      <w:r>
+        <w:t>, et l'identification classique (tatouage ou marquage, obligatoire au titre de l'article L. 212-10 du code rural) n'est pas démontrée insuffisante.</w:t>
+      </w:r>
+    </w:p>
+    <w:p>
+      <w:r>
+        <w:t xml:space="preserve">Conséquence pour un comptage : </w:t>
+      </w:r>
+      <w:r>
+        <w:rPr>
+          <w:b/>
+        </w:rPr>
+        <w:t>ce n'est pas un relevé, c'est un dossier de preuve</w:t>
+      </w:r>
+      <w:r>
+        <w:t xml:space="preserve">, et il doit répondre à ces trois points. Le premier exige un </w:t>
+      </w:r>
+      <w:r>
+        <w:rPr>
+          <w:b/>
+        </w:rPr>
+        <w:t>volume daté sur plusieurs périodes</w:t>
+      </w:r>
+      <w:r>
+        <w:t xml:space="preserve"> — le juge compare 2020, 2021, 2022, il ne compare pas une semaine à une autre. Un comptage unique ne ferme aucun de ces trous.</w:t>
       </w:r>
     </w:p>
     <w:p>
@@ -9664,55 +9851,140 @@
         <w:pStyle w:val="Heading3"/>
       </w:pPr>
       <w:r>
-        <w:t>2. Le point qui change tout pour Paris</w:t>
-      </w:r>
-    </w:p>
-    <w:p>
-      <w:r>
-        <w:t>Selon le I de l'article L. 2512-13 du CGCT, à Paris le préfet de police exerce les pouvoirs de police générale, MAIS le II du même article dispose que « le maire de Paris est chargé de la police municipale en matière : 1° De salubrité sur la voie publique ».</w:t>
-      </w:r>
-    </w:p>
-    <w:p>
-      <w:r>
-        <w:t>La salubrité de la voie publique — exactement le fondement de l'arrêté anti-déjections — EST donc bien dans la main du maire de Paris.</w:t>
-      </w:r>
-    </w:p>
-    <w:p>
-      <w:r>
-        <w:t>C'est une base plus claire que celle dont disposaient Béziers ou Saint-Omer, où le maire agit au titre du droit commun (L. 2212-2 CGCT).</w:t>
-      </w:r>
-    </w:p>
-    <w:p>
-      <w:r>
-        <w:t xml:space="preserve">Et </w:t>
-      </w:r>
+        <w:t>2. Les trois piliers d'un relevé qui tient</w:t>
+      </w:r>
+    </w:p>
+    <w:p>
+      <w:r>
+        <w:t>Un comptage citoyen est une preuve par témoins et par écrits : le juge administratif apprécie librement les moyens de preuve, mais il apprécie la crédibilité de leur fabrication. Trois mots comptent plus que la photo.</w:t>
+      </w:r>
+    </w:p>
+    <w:p>
       <w:r>
         <w:rPr>
           <w:b/>
         </w:rPr>
-        <w:t>l'exécution existe</w:t>
-      </w:r>
-      <w:r>
-        <w:t xml:space="preserve"> : l'article L. 2512-16-1 du CGCT — rédaction issue de la loi du 15 novembre 2001, qui ne figure plus dans le chapitre en vigueur du code (L. 2512-13 à L. 2512-16), à revérifier sur Légifrance avant citation — permet aux agents de surveillance de Paris (ASP) de verbaliser les contraventions aux arrêtés de police du maire de Paris relatifs au bon ordre, à la tranquillité, à la sécurité et à la salubrité sur la voie publique.</w:t>
-      </w:r>
-    </w:p>
-    <w:p>
-      <w:r>
-        <w:t>La chaîne « arrêté -&gt; verbalisation » a donc un titulaire à Paris.</w:t>
-      </w:r>
-    </w:p>
-    <w:p>
-      <w:pPr>
-        <w:pStyle w:val="IntenseQuote"/>
-      </w:pPr>
+        <w:t>a. Préconstitué.</w:t>
+      </w:r>
+      <w:r>
+        <w:t xml:space="preserve"> Le protocole — tronçons, créneaux, règle de comptage, dates de début et de fin — est publié avant le premier passage, et ne bouge plus. Un protocole connu après coup est réputé arrangé ; un protocole publié d'avance est opposable. C'est la même logique que le préenregistrement d'un essai clinique, et c'est ce qui distingue un relevé d'un argument.</w:t>
+      </w:r>
+    </w:p>
+    <w:p>
       <w:r>
         <w:rPr>
           <w:b/>
         </w:rPr>
-        <w:t>À vérifier</w:t>
-      </w:r>
-      <w:r>
-        <w:t xml:space="preserve"> auprès de la direction des affaires juridiques de la Ville : le partage exact avec la préfecture de police pour les contrôles sur la voie publique, et la qualification des agents qui feraient les prélèvements sur les déjections.</w:t>
+        <w:t>b. Contradictoire.</w:t>
+      </w:r>
+      <w:r>
+        <w:t xml:space="preserve"> Deux observateurs distincts par passage, dont un qui n'est pas partie prenante. Et surtout : la partie adverse est </w:t>
+      </w:r>
+      <w:r>
+        <w:rPr>
+          <w:b/>
+        </w:rPr>
+        <w:t>informée par écrit et invitée</w:t>
+      </w:r>
+      <w:r>
+        <w:t xml:space="preserve"> — courrier à la mairie, à la mairie d'arrondissement et au préfet, avec le protocole, les dates et l'invitation à désigner un observateur. Si elle ne vient pas, la preuve de l'invitation reste au dossier : c'est exactement ce qui prive l'autre partie du droit de contester la méthode. Sans cette pièce, tout relevé est « unilatéral ».</w:t>
+      </w:r>
+    </w:p>
+    <w:p>
+      <w:r>
+        <w:rPr>
+          <w:b/>
+        </w:rPr>
+        <w:t>c. Daté et intègre.</w:t>
+      </w:r>
+      <w:r>
+        <w:t xml:space="preserve"> C'est ici que le serveur lambda ne suffit pas. Un fichier photo, une date EXIF et un stockage quelconque ne prouvent ni la date ni la non-modification : les métadonnées se réécrivent en deux clics, et personne ne peut affirmer que le fichier conservé est celui qui a été pris. Ce qu'il faut, et ce qui est vérifiable par un tiers :</w:t>
+      </w:r>
+    </w:p>
+    <w:p>
+      <w:pPr>
+        <w:pStyle w:val="ListBullet"/>
+      </w:pPr>
+      <w:r>
+        <w:t xml:space="preserve">une </w:t>
+      </w:r>
+      <w:r>
+        <w:rPr>
+          <w:b/>
+        </w:rPr>
+        <w:t>fiche de relevé</w:t>
+      </w:r>
+      <w:r>
+        <w:t xml:space="preserve"> identique à chaque passage : tronçon, heure, nombre, position, conditions (météo, balayeuse, marché, vacances, travaux), nom des deux observateurs, photo ;</w:t>
+      </w:r>
+    </w:p>
+    <w:p>
+      <w:pPr>
+        <w:pStyle w:val="ListBullet"/>
+      </w:pPr>
+      <w:r>
+        <w:t xml:space="preserve">une </w:t>
+      </w:r>
+      <w:r>
+        <w:rPr>
+          <w:b/>
+        </w:rPr>
+        <w:t>empreinte SHA-256 de chaque fiche et de chaque photo</w:t>
+      </w:r>
+      <w:r>
+        <w:t>, imprimée dans le tableau publié ;</w:t>
+      </w:r>
+    </w:p>
+    <w:p>
+      <w:pPr>
+        <w:pStyle w:val="ListBullet"/>
+      </w:pPr>
+      <w:r>
+        <w:t xml:space="preserve">un </w:t>
+      </w:r>
+      <w:r>
+        <w:rPr>
+          <w:b/>
+        </w:rPr>
+        <w:t>horodatage électronique</w:t>
+      </w:r>
+      <w:r>
+        <w:t xml:space="preserve"> de ces empreintes, chaque semaine. Un horodatage </w:t>
+      </w:r>
+      <w:r>
+        <w:rPr>
+          <w:b/>
+        </w:rPr>
+        <w:t>qualifié</w:t>
+      </w:r>
+      <w:r>
+        <w:t xml:space="preserve"> (règlement eIDAS n° 910/2014, art. 41 § 2 et 42, prestataire de services de confiance qualifié, protocole RFC 3161) bénéficie d'une </w:t>
+      </w:r>
+      <w:r>
+        <w:rPr>
+          <w:b/>
+        </w:rPr>
+        <w:t>présomption d'exactitude de la date et d'intégrité des données</w:t>
+      </w:r>
+      <w:r>
+        <w:t xml:space="preserve"> : c'est à celui qui conteste de démontrer la fausseté. Un horodatage simple reste recevable mais n'emporte aucune présomption, et l'ancrage en chaîne de blocs, pratique et gratuit, reste apprécié librement par le juge — utile parce que n'importe qui peut le vérifier, mais ce n'est pas un service de confiance qualifié.</w:t>
+      </w:r>
+    </w:p>
+    <w:p>
+      <w:pPr>
+        <w:pStyle w:val="ListBullet"/>
+      </w:pPr>
+      <w:r>
+        <w:t xml:space="preserve">la </w:t>
+      </w:r>
+      <w:r>
+        <w:rPr>
+          <w:b/>
+        </w:rPr>
+        <w:t>publication des données brutes</w:t>
+      </w:r>
+      <w:r>
+        <w:t xml:space="preserve"> (fiches, photos, tableaux) : une preuve que l'adversaire peut refaire est une preuve qu'il ne peut pas écarter.</w:t>
       </w:r>
     </w:p>
     <w:p>
@@ -9720,18 +9992,42 @@
         <w:pStyle w:val="Heading3"/>
       </w:pPr>
       <w:r>
-        <w:t>3. La recette pour un arrêté qui survit à un recours (déduite du jugement de Béziers)</w:t>
-      </w:r>
-    </w:p>
-    <w:p>
+        <w:t>3. Le piège à ne pas recréer : les données personnelles</w:t>
+      </w:r>
+    </w:p>
+    <w:p>
+      <w:r>
+        <w:t>Le dispositif est attaqué sur le fichage des propriétaires ; un comptage citoyen qui photographie la rue en grand angle et conserve des plaques d'immatriculation reconstitue l'argument de l'adversaire. Donc : cadrage serré sur la déjection, pas de visage ni de plaque, aucun fichier de personnes, aucune géolocalisation d'individus, une finalité écrite et une durée de conservation annoncée. Le registre du comptage enregistre des tronçons et des nombres, pas des gens.</w:t>
+      </w:r>
+    </w:p>
+    <w:p>
+      <w:pPr>
+        <w:pStyle w:val="Heading3"/>
+      </w:pPr>
+      <w:r>
+        <w:t>4. Ce qu'un comptage citoyen ne peut pas faire</w:t>
+      </w:r>
+    </w:p>
+    <w:p>
+      <w:r>
+        <w:t xml:space="preserve">Il ne permet pas de verbaliser. La contravention est prouvée par procès-verbal ou rapport d'un agent habilité, et, pour les contraventions, l'article 537 du code de procédure pénale prévoit que ces rapports « font foi jusqu'à preuve contraire » et que la preuve contraire ne peut être rapportée que par écrit ou par témoins. Le comptage citoyen sert à </w:t>
+      </w:r>
       <w:r>
         <w:rPr>
           <w:b/>
         </w:rPr>
-        <w:t>Chaque motif d'annulation</w:t>
-      </w:r>
-      <w:r>
-        <w:t xml:space="preserve"> indique ce qu'il faut prouver par pièces :</w:t>
+        <w:t>justifier la mesure devant le juge administratif</w:t>
+      </w:r>
+      <w:r>
+        <w:t>, pas à constater l'infraction. Les deux chaînes sont distinctes et ne doivent pas être mélangées dans le discours public — c'est le mélange qui fait dire « ils veulent nous ficher ».</w:t>
+      </w:r>
+    </w:p>
+    <w:p>
+      <w:pPr>
+        <w:pStyle w:val="Heading3"/>
+      </w:pPr>
+      <w:r>
+        <w:t>5. Les trois niveaux d'escalade</w:t>
       </w:r>
     </w:p>
     <w:p>
@@ -9739,7 +10035,13 @@
         <w:pStyle w:val="ListNumber"/>
       </w:pPr>
       <w:r>
-        <w:t>Démontrer l'atteinte à la salubrité AVANT de réglementer. Comptage contradictoire des déjections (agents du service propreté, périmètre défini, plusieurs mois, protocole écrit), données de signalements DansMaRue, plaintes d'habitants et de commerçants. Béziers est tombé là-dessus : l'arrêté affirmait, le dossier ne prouvait pas.</w:t>
+        <w:rPr>
+          <w:b/>
+        </w:rPr>
+        <w:t>Comptage citoyen avec protocole publié et horodaté</w:t>
+      </w:r>
+      <w:r>
+        <w:t xml:space="preserve"> (coût : du temps). Suffisant pour un conseil d'arrondissement, un budget participatif et un premier article de presse.</w:t>
       </w:r>
     </w:p>
     <w:p>
@@ -9747,7 +10049,13 @@
         <w:pStyle w:val="ListNumber"/>
       </w:pPr>
       <w:r>
-        <w:t>Démontrer l'insuffisance de l'identification classique (puce, tatouage). C'est l'argument de fond, et il est solide s'il est documenté : une puce électronique identifie un chien, mais elle ne relie pas une déjection à un chien. Aucun agent ne peut attribuer une crotte à un chien sans analyse génétique, et le flagrant délit est quasi impossible. Cette démonstration doit être écrite noir sur blanc dans l'arrêté, avec les pièces (retours d'expérience des agents, statistiques de verbalisation en flagrant délit : proche de zéro).</w:t>
+        <w:rPr>
+          <w:b/>
+        </w:rPr>
+        <w:t>Convention avec la mairie ou la mairie d'arrondissement</w:t>
+      </w:r>
+      <w:r>
+        <w:t>, les agents relayant le comptage : le relevé change de nature et devient un document administratif.</w:t>
       </w:r>
     </w:p>
     <w:p>
@@ -9755,7 +10063,260 @@
         <w:pStyle w:val="ListNumber"/>
       </w:pPr>
       <w:r>
-        <w:t>Documenter la proportionnalité : périmètre restreint et justifié (rues les plus fréquentées), durée bornée, signalétique aux entrées de zone, gratuité totale de l'identification, 72 h pour se mettre en règle, tolérance pour les visiteurs occasionnels, évaluation publique avant toute extension. C'est le modèle Saint-Omer, et c'est l'inverse de la méthode Béziers.</w:t>
+        <w:rPr>
+          <w:b/>
+        </w:rPr>
+        <w:t>Constat de commissaire de justice</w:t>
+      </w:r>
+      <w:r>
+        <w:t>, contradictoire, sur un échantillon de passages seulement : c'est l'acte le plus difficile à contester, et il coûte cher — d'où l'intérêt de le réserver à la démonstration finale, une fois le protocole rodé et les chiffres stabilisés.</w:t>
+      </w:r>
+    </w:p>
+    <w:p>
+      <w:r>
+        <w:t xml:space="preserve">À faire en parallèle, et gratuitement : </w:t>
+      </w:r>
+      <w:r>
+        <w:rPr>
+          <w:b/>
+        </w:rPr>
+        <w:t>demander les pièces de l'administration</w:t>
+      </w:r>
+      <w:r>
+        <w:t xml:space="preserve"> (extractions DansMaRue sur le secteur, statistiques de propreté, marché de nettoiement, bilan des campagnes précédentes). Ce sont des documents administratifs communicables ; ils donnent la base officielle que le juge réclamait à Béziers, et ils obligent la Ville à prendre position par écrit.</w:t>
+      </w:r>
+    </w:p>
+    <w:p>
+      <w:pPr>
+        <w:pStyle w:val="Heading3"/>
+      </w:pPr>
+      <w:r>
+        <w:t>6. Ce que le comptage ne suffira pas à fermer</w:t>
+      </w:r>
+    </w:p>
+    <w:p>
+      <w:r>
+        <w:t>Le motif n° 3 de Béziers — l'identification classique est-elle suffisante ? — ne se règle pas en comptant. Il se règle par un raisonnement : un tatouage ou un fichier I-CAD identifie un chien, mais ne relie pas une déjection à son propriétaire, faute de quoi aucune attribution n'est possible. C'est un argument juridique autonome, à écrire séparément, et la proportionnalité (périmètre réduit, durée bornée, gratuité de l'identification, alternatives) reste à démontrer — le juge administratif contrôle les trois, pas seulement l'utilité.</w:t>
+      </w:r>
+    </w:p>
+    <w:p>
+      <w:pPr>
+        <w:pStyle w:val="Heading3"/>
+      </w:pPr>
+      <w:r>
+        <w:t>Sources</w:t>
+      </w:r>
+    </w:p>
+    <w:p>
+      <w:pPr>
+        <w:pStyle w:val="ListBullet"/>
+      </w:pPr>
+      <w:r>
+        <w:t>LDH, « Béziers : l'identification génétique des chiens » (citations du jugement du 6 mai 2025, TA Montpellier) : https://www.ldh-france.org/beziers-lidentification-genetique-des-chiens/</w:t>
+      </w:r>
+    </w:p>
+    <w:p>
+      <w:pPr>
+        <w:pStyle w:val="ListBullet"/>
+      </w:pPr>
+      <w:r>
+        <w:t>Article 537 du code de procédure pénale (force probante des procès-verbaux et rapports en matière contraventionnelle ; texte à lire dans le code, partie législative, livre II, titre III) : https://www.legifrance.gouv.fr/codes/texte_lc/LEGITEXT000006071154/</w:t>
+      </w:r>
+    </w:p>
+    <w:p>
+      <w:pPr>
+        <w:pStyle w:val="ListBullet"/>
+      </w:pPr>
+      <w:r>
+        <w:t>Sénat, question écrite rappelant le régime de l'article 537 (rapports faisant foi jusqu'à preuve contraire, preuve contraire par écrit ou témoins) : https://www.senat.fr/questions/base/2007/qSEQ070801568.html</w:t>
+      </w:r>
+    </w:p>
+    <w:p>
+      <w:pPr>
+        <w:pStyle w:val="ListBullet"/>
+      </w:pPr>
+      <w:r>
+        <w:t>ANSSI, les services de confiance (horodatage électronique qualifié, eIDAS) : https://cyber.gouv.fr/reglementation/reglementation-identite-confiance-numerique/securite-echanges-voie-electronique/reglement-eidas/services-de-confiance/</w:t>
+      </w:r>
+    </w:p>
+    <w:p>
+      <w:pPr>
+        <w:pStyle w:val="ListBullet"/>
+      </w:pPr>
+      <w:r>
+        <w:t>Règlement (UE) n° 910/2014 (eIDAS), art. 41 et 42 ; articles 1366 et 1367 du code civil.</w:t>
+      </w:r>
+    </w:p>
+    <w:p>
+      <w:pPr>
+        <w:pStyle w:val="ListBullet"/>
+      </w:pPr>
+      <w:r>
+        <w:t>Le comptage national des oiseaux des jardins (LPO et Muséum national d'histoire naturelle) comme modèle de comptage citoyen : voir l'annexe C du rapport complet.</w:t>
+      </w:r>
+    </w:p>
+    <w:p>
+      <w:r>
+        <w:rPr>
+          <w:b w:val="0"/>
+        </w:rPr>
+        <w:t>↑ Sommaire</w:t>
+      </w:r>
+    </w:p>
+    <w:p/>
+    <w:p>
+      <w:pPr>
+        <w:pStyle w:val="Heading2"/>
+      </w:pPr>
+      <w:r>
+        <w:t>10. Architecture — une chaîne de preuve outillée (photo en contexte, QR, registre horodaté)</w:t>
+      </w:r>
+    </w:p>
+    <w:p>
+      <w:r>
+        <w:rPr>
+          <w:i/>
+        </w:rPr>
+        <w:t>Source : `ARCHI-CHAINE-DE-PREUVE.md`.</w:t>
+      </w:r>
+    </w:p>
+    <w:p>
+      <w:r>
+        <w:t>29 septembre 2026. Question posée : peut-on faire quelque chose de solide et d'ouvert — photo en contexte, QR code, données et chiffres — en respectant la chaîne de preuve (la « chaîne du froid » du prélèvement) ? Réponse : oui, et c'est même la bonne façon de faire, à condition de comprendre ce que l'outil peut apporter et ce qu'aucun outil ne peut produire. Note de conception. Rien n'a été voté.</w:t>
+      </w:r>
+    </w:p>
+    <w:p>
+      <w:pPr>
+        <w:pStyle w:val="Heading3"/>
+      </w:pPr>
+      <w:r>
+        <w:t>1. Le partage à ne pas se tromper</w:t>
+      </w:r>
+    </w:p>
+    <w:p>
+      <w:r>
+        <w:rPr>
+          <w:b/>
+        </w:rPr>
+        <w:t>Ce que le logiciel peut faire, et qu'aucun humain ne fait proprement :</w:t>
+      </w:r>
+      <w:r>
+        <w:t xml:space="preserve"> l'intégrité, la datation, la traçabilité des transferts, et la publication vérifiable. C'est le pilier « daté et intègre » de la note juridique du comptage, et c'est exactement là qu'un serveur quelconque ne vaut rien.</w:t>
+      </w:r>
+    </w:p>
+    <w:p>
+      <w:r>
+        <w:rPr>
+          <w:b/>
+        </w:rPr>
+        <w:t>Ce qu'aucun logiciel ne peut produire :</w:t>
+      </w:r>
+    </w:p>
+    <w:p>
+      <w:pPr>
+        <w:pStyle w:val="ListBullet"/>
+      </w:pPr>
+      <w:r>
+        <w:rPr>
+          <w:b/>
+        </w:rPr>
+        <w:t>L'autorité de constater.</w:t>
+      </w:r>
+      <w:r>
+        <w:t xml:space="preserve"> Un procès-verbal n'a de force que par un agent habilité (art. 537 du code de procédure pénale). Aucune application ne verbalise.</w:t>
+      </w:r>
+    </w:p>
+    <w:p>
+      <w:pPr>
+        <w:pStyle w:val="ListBullet"/>
+      </w:pPr>
+      <w:r>
+        <w:rPr>
+          <w:b/>
+        </w:rPr>
+        <w:t>Le contradictoire.</w:t>
+      </w:r>
+      <w:r>
+        <w:t xml:space="preserve"> Il tient à une invitation écrite, datée, envoyée avant le premier passage, et à deux observateurs dont un non partie prenante. Un logiciel peut </w:t>
+      </w:r>
+      <w:r>
+        <w:rPr>
+          <w:i/>
+        </w:rPr>
+        <w:t>enregistrer</w:t>
+      </w:r>
+      <w:r>
+        <w:t xml:space="preserve"> cette invitation et </w:t>
+      </w:r>
+      <w:r>
+        <w:rPr>
+          <w:i/>
+        </w:rPr>
+        <w:t>rendre visible</w:t>
+      </w:r>
+      <w:r>
+        <w:t xml:space="preserve"> qui a compté ; il ne peut pas la remplacer.</w:t>
+      </w:r>
+    </w:p>
+    <w:p>
+      <w:pPr>
+        <w:pStyle w:val="ListBullet"/>
+      </w:pPr>
+      <w:r>
+        <w:rPr>
+          <w:b/>
+        </w:rPr>
+        <w:t>La représentativité.</w:t>
+      </w:r>
+      <w:r>
+        <w:t xml:space="preserve"> Si les rues sont choisies parce qu'elles sont sales, aucun outil ne sauvera le chiffre. D'où la zone témoin et le pré-enregistrement du protocole : c'est de la gouvernance, pas du code.</w:t>
+      </w:r>
+    </w:p>
+    <w:p>
+      <w:r>
+        <w:t xml:space="preserve">Corollaire de conception, et c'est la règle qui structure tout le reste : </w:t>
+      </w:r>
+      <w:r>
+        <w:rPr>
+          <w:b/>
+        </w:rPr>
+        <w:t>l'outil ne doit jamais devenir la preuve.</w:t>
+      </w:r>
+      <w:r>
+        <w:t xml:space="preserve"> Si le chiffre ne tient que parce que notre application l'affirme, l'adversaire n'a qu'un mot à dire — « votre serveur, vos chiffres » — et le dossier est mort. La vérification ne doit exiger de faire confiance à personne, nous compris.</w:t>
+      </w:r>
+    </w:p>
+    <w:p>
+      <w:pPr>
+        <w:pStyle w:val="Heading3"/>
+      </w:pPr>
+      <w:r>
+        <w:t>2. Le principe : un identifiant, deux chaînes</w:t>
+      </w:r>
+    </w:p>
+    <w:p>
+      <w:r>
+        <w:t xml:space="preserve">Tout se tient sur une idée simple : </w:t>
+      </w:r>
+      <w:r>
+        <w:rPr>
+          <w:b/>
+        </w:rPr>
+        <w:t>un identifiant unique lie l'objet physique et l'enregistrement numérique</w:t>
+      </w:r>
+      <w:r>
+        <w:t>, et chaque transfert de cet objet est un événement daté et signé.</w:t>
+      </w:r>
+    </w:p>
+    <w:p>
+      <w:r>
+        <w:rPr>
+          <w:b/>
+        </w:rPr>
+        <w:t>Chaîne matérielle</w:t>
+      </w:r>
+      <w:r>
+        <w:t xml:space="preserve"> (le prélèvement, la « chaîne du froid ») :</w:t>
       </w:r>
     </w:p>
     <w:p>
@@ -9763,7 +10324,16 @@
         <w:pStyle w:val="ListNumber"/>
       </w:pPr>
       <w:r>
-        <w:t>Sécuriser les données (moyens soulevés par la LDH, à anticiper) : analyse d'impact (AIPD) et déclaration/registre CNIL, base génétique conservée par le laboratoire seul, la Ville ne détenant que la correspondance prélèvement -&gt; propriétaire, durée de conservation définie, pas de surveillance vidéo permanente (Saint-Omer : vidéoprotection ponctuelle en temps réel uniquement), pas de consultation du fichier national I-CAD au-delà de son objet légal.</w:t>
+        <w:t xml:space="preserve">L'agent ou l'observateur prélève la déjection, la place dans un tube et </w:t>
+      </w:r>
+      <w:r>
+        <w:rPr>
+          <w:b/>
+        </w:rPr>
+        <w:t>appose un scellé numéroté</w:t>
+      </w:r>
+      <w:r>
+        <w:t>, issu d'un carnet à séquence continue — comme un carnet d'exhibits. Un scellé manquant dans la séquence est visible, donc un prélèvement fabriqué après coup laisse une trace.</w:t>
       </w:r>
     </w:p>
     <w:p>
@@ -9771,7 +10341,116 @@
         <w:pStyle w:val="ListNumber"/>
       </w:pPr>
       <w:r>
-        <w:t>Ne pas franchir la ligne du « fichage des personnes » : ne jamais conserver l'ADN, ne jamais croiser avec d'autres fichiers, ne pas conditionner l'accès à l'espace public en général.</w:t>
+        <w:t xml:space="preserve">Relevé obligatoire au moment du prélèvement : horodatage, tronçon, position, </w:t>
+      </w:r>
+      <w:r>
+        <w:rPr>
+          <w:b/>
+        </w:rPr>
+        <w:t>photo en contexte</w:t>
+      </w:r>
+      <w:r>
+        <w:t>, conditions (météo, heure, température si la chaîne du froid s'applique au transport).</w:t>
+      </w:r>
+    </w:p>
+    <w:p>
+      <w:pPr>
+        <w:pStyle w:val="ListNumber"/>
+      </w:pPr>
+      <w:r>
+        <w:t xml:space="preserve">Chaque remise (observateur → transporteur → laboratoire) est un </w:t>
+      </w:r>
+      <w:r>
+        <w:rPr>
+          <w:b/>
+        </w:rPr>
+        <w:t>transfert à deux signatures</w:t>
+      </w:r>
+      <w:r>
+        <w:t xml:space="preserve"> : qui remet, qui reçoit, quand, dans quel état. Le laboratoire renvoie un accusé de réception.</w:t>
+      </w:r>
+    </w:p>
+    <w:p>
+      <w:pPr>
+        <w:pStyle w:val="ListNumber"/>
+      </w:pPr>
+      <w:r>
+        <w:t>Conservation et délai : la date limite d'analyse et les conditions de transport sont inscrites dans le protocole, pas improvisées. C'est aussi le point technique numéro un du dossier — la robustesse de l'ADN environnemental sur un trottoir n'est documentée nulle part publiquement.</w:t>
+      </w:r>
+    </w:p>
+    <w:p>
+      <w:r>
+        <w:rPr>
+          <w:b/>
+        </w:rPr>
+        <w:t>Chaîne numérique</w:t>
+      </w:r>
+      <w:r>
+        <w:t xml:space="preserve"> (le même identifiant, côté données) :</w:t>
+      </w:r>
+    </w:p>
+    <w:p>
+      <w:pPr>
+        <w:pStyle w:val="ListNumber"/>
+      </w:pPr>
+      <w:r>
+        <w:t>Chaque fiche de relevé produit un enregistrement immuable : identifiant, tronçon, créneau, comptage, observateurs, empreinte de la photo, version du protocole.</w:t>
+      </w:r>
+    </w:p>
+    <w:p>
+      <w:pPr>
+        <w:pStyle w:val="ListNumber"/>
+      </w:pPr>
+      <w:r>
+        <w:rPr>
+          <w:b/>
+        </w:rPr>
+        <w:t>Empreinte SHA-256</w:t>
+      </w:r>
+      <w:r>
+        <w:t xml:space="preserve"> de chaque fiche et de chaque photo.</w:t>
+      </w:r>
+    </w:p>
+    <w:p>
+      <w:pPr>
+        <w:pStyle w:val="ListNumber"/>
+      </w:pPr>
+      <w:r>
+        <w:rPr>
+          <w:b/>
+        </w:rPr>
+        <w:t>Arbre de Merkle par session</w:t>
+      </w:r>
+      <w:r>
+        <w:t>, dont la racine est horodatée par un service de confiance qualifié (eIDAS, RFC 3161). Résultat : n'importe qui peut vérifier, des années plus tard, qu'une photo donnée existait à cette date et n'a pas bougé — sans nous croire et sans accéder à nos serveurs. Une variante gratuite et indépendamment vérifiable (ancrage en chaîne de blocs) est utile en complément, mais reste appréciée librement par le juge : ce n'est pas un service qualifié.</w:t>
+      </w:r>
+    </w:p>
+    <w:p>
+      <w:pPr>
+        <w:pStyle w:val="ListNumber"/>
+      </w:pPr>
+      <w:r>
+        <w:rPr>
+          <w:b/>
+        </w:rPr>
+        <w:t>Registre en ajout seul</w:t>
+      </w:r>
+      <w:r>
+        <w:t xml:space="preserve"> : aucun enregistrement n'est modifiable. Une correction est un nouvel enregistrement qui référence l'ancien, et les deux restent visibles. C'est ce qui rend un chiffre inattaquable sur le terrain où toutes les administrations se font prendre : « vous avez ajusté après coup ».</w:t>
+      </w:r>
+    </w:p>
+    <w:p>
+      <w:pPr>
+        <w:pStyle w:val="ListNumber"/>
+      </w:pPr>
+      <w:r>
+        <w:rPr>
+          <w:b/>
+        </w:rPr>
+        <w:t>Divergence publiée, jamais lissée</w:t>
+      </w:r>
+      <w:r>
+        <w:t xml:space="preserve"> : quand les deux observateurs d'un même passage ne comptent pas la même chose, l'écart est publié avec sa raison. Un écart affiché crédibilise ; un écart effacé se retrouve un jour en commentaire.</w:t>
       </w:r>
     </w:p>
     <w:p>
@@ -9779,31 +10458,63 @@
         <w:pStyle w:val="Heading3"/>
       </w:pPr>
       <w:r>
-        <w:t>4. Ce que ça implique pour le projet « chien citoyen »</w:t>
-      </w:r>
-    </w:p>
-    <w:p>
-      <w:pPr>
-        <w:pStyle w:val="ListBullet"/>
-      </w:pPr>
-      <w:r>
-        <w:t>Le bâton n'est pas interdit en France, mais il est contentieux. La stratégie la moins risquée est en deux temps : (1) phase volontaire non sanctionnante — enregistrement gratuit, badge, contreparties, comptage des déjections en parallèle ; (2) phase d'obligation bornée sur un périmètre, une fois les pièces réunies (baisse constatée, insuffisance de la puce démontrée, AIPD faite) et avec un arrêté écrit comme un dossier de preuve.</w:t>
-      </w:r>
-    </w:p>
-    <w:p>
-      <w:pPr>
-        <w:pStyle w:val="ListBullet"/>
-      </w:pPr>
-      <w:r>
-        <w:t>Ne pas annoncer l'obligation sans les comptages : c'est le motif exact qui a coulé Béziers, et une annulation en pleine campagne est une défaite politique irrécupérable.</w:t>
-      </w:r>
-    </w:p>
-    <w:p>
-      <w:pPr>
-        <w:pStyle w:val="ListBullet"/>
-      </w:pPr>
-      <w:r>
-        <w:t>Saint-Omer a un avantage que Paris aura aussi : la baisse constatée (-60 %) devient la preuve de l'utilité du dispositif pour la période suivante. Il faut donc mesurer dès le premier jour.</w:t>
+        <w:t>3. La photo en contexte, et à quoi sert vraiment le QR</w:t>
+      </w:r>
+    </w:p>
+    <w:p>
+      <w:r>
+        <w:t>Une photo seule ne dit pas où, quand, ni par qui — et ses métadonnées se réécrivent. Trois usages du QR, dans cet ordre d'utilité :</w:t>
+      </w:r>
+    </w:p>
+    <w:p>
+      <w:pPr>
+        <w:pStyle w:val="ListNumber"/>
+      </w:pPr>
+      <w:r>
+        <w:rPr>
+          <w:b/>
+        </w:rPr>
+        <w:t>L'étiquette de passage, imprimée à l'avance et numérotée.</w:t>
+      </w:r>
+      <w:r>
+        <w:t xml:space="preserve"> Elle porte un QR contenant : identifiant du tronçon, numéro de session, date prévue, version du protocole, identifiant de l'observateur. La règle photographique est : </w:t>
+      </w:r>
+      <w:r>
+        <w:rPr>
+          <w:b/>
+        </w:rPr>
+        <w:t>l'étiquette et la déjection dans le même cadre</w:t>
+      </w:r>
+      <w:r>
+        <w:t>. L'image porte alors son contexte, lisible par un humain sur la photo et par une machine dans le QR. Les étiquettes sont émises en séquence continue : un manque dans la séquence est un signal.</w:t>
+      </w:r>
+    </w:p>
+    <w:p>
+      <w:pPr>
+        <w:pStyle w:val="ListNumber"/>
+      </w:pPr>
+      <w:r>
+        <w:rPr>
+          <w:b/>
+        </w:rPr>
+        <w:t>Le lien de vérification</w:t>
+      </w:r>
+      <w:r>
+        <w:t xml:space="preserve"> : le QR renvoie à la page publique de l'enregistrement — empreinte, horodatage, statut. C'est ce qui permet à un journaliste, à un élu ou à un contradicteur de vérifier sans rien nous demander.</w:t>
+      </w:r>
+    </w:p>
+    <w:p>
+      <w:pPr>
+        <w:pStyle w:val="ListNumber"/>
+      </w:pPr>
+      <w:r>
+        <w:rPr>
+          <w:b/>
+        </w:rPr>
+        <w:t>La même étiquette pour le prélèvement</w:t>
+      </w:r>
+      <w:r>
+        <w:t xml:space="preserve"> : le QR porte aussi le numéro de scellé du tube, ce qui fait qu'un seul identifiant suit l'objet du trottoir jusqu'au résultat du laboratoire.</w:t>
       </w:r>
     </w:p>
     <w:p>
@@ -9811,47 +10522,279 @@
         <w:pStyle w:val="Heading3"/>
       </w:pPr>
       <w:r>
-        <w:t>Sources</w:t>
-      </w:r>
-    </w:p>
-    <w:p>
-      <w:pPr>
-        <w:pStyle w:val="ListBullet"/>
-      </w:pPr>
-      <w:r>
-        <w:t>TA Montpellier, jugement du 6 mai 2025 (arrêté du 12 mai 2023 annulé), motifs cités par la LDH ; ordonnance de référé du 27 juin 2025 (n° 2504518, rejet pour défaut d'urgence).</w:t>
-      </w:r>
-    </w:p>
-    <w:p>
-      <w:pPr>
-        <w:pStyle w:val="ListBullet"/>
-      </w:pPr>
-      <w:r>
-        <w:t>Le Parisien, 14/05/2025 (nouvel arrêté du 6 mai 2025, amende 35 €, redevance 130 €, -85 %).</w:t>
-      </w:r>
-    </w:p>
-    <w:p>
-      <w:pPr>
-        <w:pStyle w:val="ListBullet"/>
-      </w:pPr>
-      <w:r>
-        <w:t>LDH France et LDH Béziers (moyens soulevés : incompétence, AIPD et déclaration CNIL au titre des articles 27-28 de la directive (UE) 2016/680, fichage non encadré, consultation du fichier national hors objet de l'article L. 212-10 du code rural, vie privée, liberté d'aller et venir).</w:t>
-      </w:r>
-    </w:p>
-    <w:p>
-      <w:pPr>
-        <w:pStyle w:val="ListBullet"/>
-      </w:pPr>
-      <w:r>
-        <w:t>CGCT, art. L. 2512-13 II 1° (police municipale de la salubrité sur la voie publique confiée au maire de Paris) et L. 2512-16-1 (verbalisation par les agents de surveillance de Paris).</w:t>
-      </w:r>
-    </w:p>
-    <w:p>
-      <w:pPr>
-        <w:pStyle w:val="ListBullet"/>
-      </w:pPr>
-      <w:r>
-        <w:t>FAQ officielle « L'identification génétique des chiens » de la Ville de Saint-Omer.</w:t>
+        <w:t>4. Contradictoire outillé, sans le remplacer</w:t>
+      </w:r>
+    </w:p>
+    <w:p>
+      <w:r>
+        <w:t>Ce que le logiciel ajoute au contradictoire, sans jamais s'y substituer :</w:t>
+      </w:r>
+    </w:p>
+    <w:p>
+      <w:pPr>
+        <w:pStyle w:val="ListBullet"/>
+      </w:pPr>
+      <w:r>
+        <w:rPr>
+          <w:b/>
+        </w:rPr>
+        <w:t>l'invitation est un enregistrement du registre</w:t>
+      </w:r>
+      <w:r>
+        <w:t xml:space="preserve"> : courrier à la mairie, à la mairie d'arrondissement, au préfet, daté et horodaté, avec le protocole et les dates ;</w:t>
+      </w:r>
+    </w:p>
+    <w:p>
+      <w:pPr>
+        <w:pStyle w:val="ListBullet"/>
+      </w:pPr>
+      <w:r>
+        <w:rPr>
+          <w:b/>
+        </w:rPr>
+        <w:t>la clé publique des observateurs</w:t>
+      </w:r>
+      <w:r>
+        <w:t xml:space="preserve"> est publiée : chacun peut voir qui a compté, et un opposant peut demander une clé de lecture, voire une clé d'écriture pour son propre observateur ;</w:t>
+      </w:r>
+    </w:p>
+    <w:p>
+      <w:pPr>
+        <w:pStyle w:val="ListBullet"/>
+      </w:pPr>
+      <w:r>
+        <w:rPr>
+          <w:b/>
+        </w:rPr>
+        <w:t>une reconstitution publique</w:t>
+      </w:r>
+      <w:r>
+        <w:t xml:space="preserve"> : n'importe qui peut refaire le comptage sur les mêmes tronçons et les mêmes créneaux, et déposer ses propres enregistrements.</w:t>
+      </w:r>
+    </w:p>
+    <w:p>
+      <w:pPr>
+        <w:pStyle w:val="Heading3"/>
+      </w:pPr>
+      <w:r>
+        <w:t>5. Les chiffres, et comment ils résistent</w:t>
+      </w:r>
+    </w:p>
+    <w:p>
+      <w:pPr>
+        <w:pStyle w:val="ListBullet"/>
+      </w:pPr>
+      <w:r>
+        <w:rPr>
+          <w:b/>
+        </w:rPr>
+        <w:t>Unité</w:t>
+      </w:r>
+      <w:r>
+        <w:t xml:space="preserve"> : déjections pour 100 m de voie et par passage — jamais un total brut, qui ne veut rien dire et se retourne contre celui qui le présente.</w:t>
+      </w:r>
+    </w:p>
+    <w:p>
+      <w:pPr>
+        <w:pStyle w:val="ListBullet"/>
+      </w:pPr>
+      <w:r>
+        <w:rPr>
+          <w:b/>
+        </w:rPr>
+        <w:t>Comparaison</w:t>
+      </w:r>
+      <w:r>
+        <w:t xml:space="preserve"> : tronçons traités contre zone témoin, sur plusieurs périodes. C'est le motif exact du jugement de Béziers : le juge compare des années, pas deux semaines.</w:t>
+      </w:r>
+    </w:p>
+    <w:p>
+      <w:pPr>
+        <w:pStyle w:val="ListBullet"/>
+      </w:pPr>
+      <w:r>
+        <w:rPr>
+          <w:b/>
+        </w:rPr>
+        <w:t>Conditions en covariables</w:t>
+      </w:r>
+      <w:r>
+        <w:t xml:space="preserve"> : météo, jour de collecte, marché, vacances, travaux. Une baisse après un passage de balayeuse n'est pas un effet du dispositif.</w:t>
+      </w:r>
+    </w:p>
+    <w:p>
+      <w:pPr>
+        <w:pStyle w:val="ListBullet"/>
+      </w:pPr>
+      <w:r>
+        <w:rPr>
+          <w:b/>
+        </w:rPr>
+        <w:t>Méthode d'agrégation écrite avant</w:t>
+      </w:r>
+      <w:r>
+        <w:t xml:space="preserve"> : médiane par tronçon, intervalle par rééchantillonnage, seuil de significativité. Écrite avant, elle n'est pas choisie pour le résultat.</w:t>
+      </w:r>
+    </w:p>
+    <w:p>
+      <w:pPr>
+        <w:pStyle w:val="ListBullet"/>
+      </w:pPr>
+      <w:r>
+        <w:rPr>
+          <w:b/>
+        </w:rPr>
+        <w:t>Données brutes publiées</w:t>
+      </w:r>
+      <w:r>
+        <w:t xml:space="preserve"> : JSON, CSV et GeoJSON, plus les empreintes. Une preuve reproductible est une preuve qu'on ne peut pas écarter.</w:t>
+      </w:r>
+    </w:p>
+    <w:p>
+      <w:pPr>
+        <w:pStyle w:val="Heading3"/>
+      </w:pPr>
+      <w:r>
+        <w:t>6. Ouvert : ce que « ouvert » doit vouloir dire</w:t>
+      </w:r>
+    </w:p>
+    <w:p>
+      <w:r>
+        <w:t>Ouvrir le code ne suffit pas. Les quatre pièces qui rendent l'ensemble vérifiable par un tiers :</w:t>
+      </w:r>
+    </w:p>
+    <w:p>
+      <w:pPr>
+        <w:pStyle w:val="ListNumber"/>
+      </w:pPr>
+      <w:r>
+        <w:rPr>
+          <w:b/>
+        </w:rPr>
+        <w:t>protocole versionné</w:t>
+      </w:r>
+      <w:r>
+        <w:t xml:space="preserve"> (les versions successives restent consultables, on ne réécrit pas le passé) ;</w:t>
+      </w:r>
+    </w:p>
+    <w:p>
+      <w:pPr>
+        <w:pStyle w:val="ListNumber"/>
+      </w:pPr>
+      <w:r>
+        <w:rPr>
+          <w:b/>
+        </w:rPr>
+        <w:t>schéma de données publié</w:t>
+      </w:r>
+      <w:r>
+        <w:t xml:space="preserve"> avec le format des enregistrements ;</w:t>
+      </w:r>
+    </w:p>
+    <w:p>
+      <w:pPr>
+        <w:pStyle w:val="ListNumber"/>
+      </w:pPr>
+      <w:r>
+        <w:rPr>
+          <w:b/>
+        </w:rPr>
+        <w:t>code source ouvert</w:t>
+      </w:r>
+      <w:r>
+        <w:t>, exécutable par un tiers, sans dépendance à notre hébergement ;</w:t>
+      </w:r>
+    </w:p>
+    <w:p>
+      <w:pPr>
+        <w:pStyle w:val="ListNumber"/>
+      </w:pPr>
+      <w:r>
+        <w:rPr>
+          <w:b/>
+        </w:rPr>
+        <w:t>jeu de données ouvert</w:t>
+      </w:r>
+      <w:r>
+        <w:t xml:space="preserve"> sous licence claire, avec les empreintes et les jetons d'horodatage.</w:t>
+      </w:r>
+    </w:p>
+    <w:p>
+      <w:pPr>
+        <w:pStyle w:val="Heading3"/>
+      </w:pPr>
+      <w:r>
+        <w:t>7. La séquence, et pourquoi il ne faut pas commencer par l'application</w:t>
+      </w:r>
+    </w:p>
+    <w:p>
+      <w:r>
+        <w:t>Le risque de ce genre de projet est connu : deux mois d'application, zéro comptage.</w:t>
+      </w:r>
+    </w:p>
+    <w:p>
+      <w:pPr>
+        <w:pStyle w:val="ListNumber"/>
+      </w:pPr>
+      <w:r>
+        <w:rPr>
+          <w:b/>
+        </w:rPr>
+        <w:t>Semaine 1-2, à la main.</w:t>
+      </w:r>
+      <w:r>
+        <w:t xml:space="preserve"> Fiche papier standardisée, téléphone, étiquettes imprimées, un tronçon, une zone témoin. Export des photos et des fiches, une empreinte globale par semaine, horodatée. Coût : du temps, quelques euros d'horodatage.</w:t>
+      </w:r>
+    </w:p>
+    <w:p>
+      <w:pPr>
+        <w:pStyle w:val="ListNumber"/>
+      </w:pPr>
+      <w:r>
+        <w:rPr>
+          <w:b/>
+        </w:rPr>
+        <w:t>Semaine 3-6.</w:t>
+      </w:r>
+      <w:r>
+        <w:t xml:space="preserve"> On teste ce qui casse : deux observateurs en désaccord, une pluie, un marché, un tronçon où personne ne passe. C'est là qu'on apprend ce que doit gérer l'outil.</w:t>
+      </w:r>
+    </w:p>
+    <w:p>
+      <w:pPr>
+        <w:pStyle w:val="ListNumber"/>
+      </w:pPr>
+      <w:r>
+        <w:rPr>
+          <w:b/>
+        </w:rPr>
+        <w:t>Après, seulement si l'échelle le justifie</w:t>
+      </w:r>
+      <w:r>
+        <w:t xml:space="preserve"> (plus de dix compteurs, ou une mairie qui veut reprendre l'instrument) : l'application hors ligne d'abord, clé par observateur, QR des étiquettes, registre en ajout seul, publication automatique des agrégats.</w:t>
+      </w:r>
+    </w:p>
+    <w:p>
+      <w:pPr>
+        <w:pStyle w:val="Heading3"/>
+      </w:pPr>
+      <w:r>
+        <w:t>8. Ce que ça peut devenir</w:t>
+      </w:r>
+    </w:p>
+    <w:p>
+      <w:r>
+        <w:t>Le même instrument sert à tout ce qu'une administration ne mesure pas : déjections, dépôts sauvages, bruit, chaleur de rue, bus qui ne passent pas, trottoirs impraticables. Une chaîne de preuve citoyenne réutilisable — protocole, outil, données ouvertes — est un actif qui se prête ou se vend à une association, une mairie, un journal, sans jamais vendre le dossier lui-même. Mais l'ordre compte : c'est le pilote qui donne le droit d'en faire un produit, pas l'inverse.</w:t>
+      </w:r>
+    </w:p>
+    <w:p>
+      <w:r>
+        <w:t>Ce que cette architecture ne règle pas, et qu'il faut répéter : elle ne remplace ni l'invitation écrite à l'adversaire, ni la zone témoin, ni la démonstration que l'identification classique est insuffisante. Elle rend seulement les preuves que nous produisons impossibles à écarter pour de mauvaises raisons.</w:t>
+      </w:r>
+    </w:p>
+    <w:p>
+      <w:r>
+        <w:t>Suite : écrire la fiche de relevé en une page, la règle photographique en une ligne (« l'étiquette et la déjection dans le même cadre »), et le protocole de transfert à deux signatures. Tout le reste est du logiciel, et le logiciel vient après.</w:t>
       </w:r>
     </w:p>
     <w:p>
@@ -9868,1477 +10811,7 @@
         <w:pStyle w:val="Heading2"/>
       </w:pPr>
       <w:r>
-        <w:t>9. Note juridique — ce qui donne une valeur juridique au comptage citoyen</w:t>
-      </w:r>
-    </w:p>
-    <w:p>
-      <w:r>
-        <w:rPr>
-          <w:i/>
-        </w:rPr>
-        <w:t>Source : `NOTE-JURIDIQUE-COMPTAGE-CITOYEN.md`.</w:t>
-      </w:r>
-    </w:p>
-    <w:p>
-      <w:r>
-        <w:t>29 septembre 2026. Question posée : suffit-il d'une photo géodatée stockée sur un serveur, ou faut-il un protocole ? Réponse courte : non, une photo sur un serveur ne prouve rien — ce qui prouve, c'est la manière dont le relevé est préconstitué, contradictoire et daté. Détail ci-dessous. Rien n'a été voté.</w:t>
-      </w:r>
-    </w:p>
-    <w:p>
-      <w:pPr>
-        <w:pStyle w:val="Heading3"/>
-      </w:pPr>
-      <w:r>
-        <w:t>1. Ce que le juge a réellement reproché à Béziers</w:t>
-      </w:r>
-    </w:p>
-    <w:p>
-      <w:r>
-        <w:t>C'est le point de départ, et il fixe tout le reste. Le tribunal administratif de Montpellier annule l'arrêté du 12 mai 2023 par jugement du 6 mai 2025, sur trois motifs, dans cet ordre :</w:t>
-      </w:r>
-    </w:p>
-    <w:p>
-      <w:pPr>
-        <w:pStyle w:val="ListNumber"/>
-      </w:pPr>
-      <w:r>
-        <w:rPr>
-          <w:b/>
-        </w:rPr>
-        <w:t>L'atteinte n'est pas démontrée.</w:t>
-      </w:r>
-      <w:r>
-        <w:t xml:space="preserve"> « Aucune pièce du dossier ne permet de corroborer les éléments indiqués dans l'exposé des motifs de l'arrêté, notamment l'atteinte qui serait portée à la sécurité et à la salubrité publique par le nombre de déjections canines ramassées au cours des années 2020, 2021, 2022. »</w:t>
-      </w:r>
-    </w:p>
-    <w:p>
-      <w:pPr>
-        <w:pStyle w:val="ListNumber"/>
-      </w:pPr>
-      <w:r>
-        <w:rPr>
-          <w:b/>
-        </w:rPr>
-        <w:t>L'inefficacité des mesures déjà prises n'est pas démontrée</w:t>
-      </w:r>
-      <w:r>
-        <w:t xml:space="preserve"> — la mairie n'a pas non plus établi que ce qu'elle faisait déjà ne suffisait pas.</w:t>
-      </w:r>
-    </w:p>
-    <w:p>
-      <w:pPr>
-        <w:pStyle w:val="ListNumber"/>
-      </w:pPr>
-      <w:r>
-        <w:rPr>
-          <w:b/>
-        </w:rPr>
-        <w:t>La mesure n'est « ni nécessaire, ni adaptée, ni proportionnée »</w:t>
-      </w:r>
-      <w:r>
-        <w:t>, et l'identification classique (tatouage ou marquage, obligatoire au titre de l'article L. 212-10 du code rural) n'est pas démontrée insuffisante.</w:t>
-      </w:r>
-    </w:p>
-    <w:p>
-      <w:r>
-        <w:t xml:space="preserve">Conséquence pour un comptage : </w:t>
-      </w:r>
-      <w:r>
-        <w:rPr>
-          <w:b/>
-        </w:rPr>
-        <w:t>ce n'est pas un relevé, c'est un dossier de preuve</w:t>
-      </w:r>
-      <w:r>
-        <w:t xml:space="preserve">, et il doit répondre à ces trois points. Le premier exige un </w:t>
-      </w:r>
-      <w:r>
-        <w:rPr>
-          <w:b/>
-        </w:rPr>
-        <w:t>volume daté sur plusieurs périodes</w:t>
-      </w:r>
-      <w:r>
-        <w:t xml:space="preserve"> — le juge compare 2020, 2021, 2022, il ne compare pas une semaine à une autre. Un comptage unique ne ferme aucun de ces trous.</w:t>
-      </w:r>
-    </w:p>
-    <w:p>
-      <w:pPr>
-        <w:pStyle w:val="Heading3"/>
-      </w:pPr>
-      <w:r>
-        <w:t>2. Les trois piliers d'un relevé qui tient</w:t>
-      </w:r>
-    </w:p>
-    <w:p>
-      <w:r>
-        <w:t>Un comptage citoyen est une preuve par témoins et par écrits : le juge administratif apprécie librement les moyens de preuve, mais il apprécie la crédibilité de leur fabrication. Trois mots comptent plus que la photo.</w:t>
-      </w:r>
-    </w:p>
-    <w:p>
-      <w:r>
-        <w:rPr>
-          <w:b/>
-        </w:rPr>
-        <w:t>a. Préconstitué.</w:t>
-      </w:r>
-      <w:r>
-        <w:t xml:space="preserve"> Le protocole — tronçons, créneaux, règle de comptage, dates de début et de fin — est publié avant le premier passage, et ne bouge plus. Un protocole connu après coup est réputé arrangé ; un protocole publié d'avance est opposable. C'est la même logique que le préenregistrement d'un essai clinique, et c'est ce qui distingue un relevé d'un argument.</w:t>
-      </w:r>
-    </w:p>
-    <w:p>
-      <w:r>
-        <w:rPr>
-          <w:b/>
-        </w:rPr>
-        <w:t>b. Contradictoire.</w:t>
-      </w:r>
-      <w:r>
-        <w:t xml:space="preserve"> Deux observateurs distincts par passage, dont un qui n'est pas partie prenante. Et surtout : la partie adverse est </w:t>
-      </w:r>
-      <w:r>
-        <w:rPr>
-          <w:b/>
-        </w:rPr>
-        <w:t>informée par écrit et invitée</w:t>
-      </w:r>
-      <w:r>
-        <w:t xml:space="preserve"> — courrier à la mairie, à la mairie d'arrondissement et au préfet, avec le protocole, les dates et l'invitation à désigner un observateur. Si elle ne vient pas, la preuve de l'invitation reste au dossier : c'est exactement ce qui prive l'autre partie du droit de contester la méthode. Sans cette pièce, tout relevé est « unilatéral ».</w:t>
-      </w:r>
-    </w:p>
-    <w:p>
-      <w:r>
-        <w:rPr>
-          <w:b/>
-        </w:rPr>
-        <w:t>c. Daté et intègre.</w:t>
-      </w:r>
-      <w:r>
-        <w:t xml:space="preserve"> C'est ici que le serveur lambda ne suffit pas. Un fichier photo, une date EXIF et un stockage quelconque ne prouvent ni la date ni la non-modification : les métadonnées se réécrivent en deux clics, et personne ne peut affirmer que le fichier conservé est celui qui a été pris. Ce qu'il faut, et ce qui est vérifiable par un tiers :</w:t>
-      </w:r>
-    </w:p>
-    <w:p>
-      <w:pPr>
-        <w:pStyle w:val="ListBullet"/>
-      </w:pPr>
-      <w:r>
-        <w:t xml:space="preserve">une </w:t>
-      </w:r>
-      <w:r>
-        <w:rPr>
-          <w:b/>
-        </w:rPr>
-        <w:t>fiche de relevé</w:t>
-      </w:r>
-      <w:r>
-        <w:t xml:space="preserve"> identique à chaque passage : tronçon, heure, nombre, position, conditions (météo, balayeuse, marché, vacances, travaux), nom des deux observateurs, photo ;</w:t>
-      </w:r>
-    </w:p>
-    <w:p>
-      <w:pPr>
-        <w:pStyle w:val="ListBullet"/>
-      </w:pPr>
-      <w:r>
-        <w:t xml:space="preserve">une </w:t>
-      </w:r>
-      <w:r>
-        <w:rPr>
-          <w:b/>
-        </w:rPr>
-        <w:t>empreinte SHA-256 de chaque fiche et de chaque photo</w:t>
-      </w:r>
-      <w:r>
-        <w:t>, imprimée dans le tableau publié ;</w:t>
-      </w:r>
-    </w:p>
-    <w:p>
-      <w:pPr>
-        <w:pStyle w:val="ListBullet"/>
-      </w:pPr>
-      <w:r>
-        <w:t xml:space="preserve">un </w:t>
-      </w:r>
-      <w:r>
-        <w:rPr>
-          <w:b/>
-        </w:rPr>
-        <w:t>horodatage électronique</w:t>
-      </w:r>
-      <w:r>
-        <w:t xml:space="preserve"> de ces empreintes, chaque semaine. Un horodatage </w:t>
-      </w:r>
-      <w:r>
-        <w:rPr>
-          <w:b/>
-        </w:rPr>
-        <w:t>qualifié</w:t>
-      </w:r>
-      <w:r>
-        <w:t xml:space="preserve"> (règlement eIDAS n° 910/2014, art. 41 § 2 et 42, prestataire de services de confiance qualifié, protocole RFC 3161) bénéficie d'une </w:t>
-      </w:r>
-      <w:r>
-        <w:rPr>
-          <w:b/>
-        </w:rPr>
-        <w:t>présomption d'exactitude de la date et d'intégrité des données</w:t>
-      </w:r>
-      <w:r>
-        <w:t xml:space="preserve"> : c'est à celui qui conteste de démontrer la fausseté. Un horodatage simple reste recevable mais n'emporte aucune présomption, et l'ancrage en chaîne de blocs, pratique et gratuit, reste apprécié librement par le juge — utile parce que n'importe qui peut le vérifier, mais ce n'est pas un service de confiance qualifié.</w:t>
-      </w:r>
-    </w:p>
-    <w:p>
-      <w:pPr>
-        <w:pStyle w:val="ListBullet"/>
-      </w:pPr>
-      <w:r>
-        <w:t xml:space="preserve">la </w:t>
-      </w:r>
-      <w:r>
-        <w:rPr>
-          <w:b/>
-        </w:rPr>
-        <w:t>publication des données brutes</w:t>
-      </w:r>
-      <w:r>
-        <w:t xml:space="preserve"> (fiches, photos, tableaux) : une preuve que l'adversaire peut refaire est une preuve qu'il ne peut pas écarter.</w:t>
-      </w:r>
-    </w:p>
-    <w:p>
-      <w:pPr>
-        <w:pStyle w:val="Heading3"/>
-      </w:pPr>
-      <w:r>
-        <w:t>3. Le piège à ne pas recréer : les données personnelles</w:t>
-      </w:r>
-    </w:p>
-    <w:p>
-      <w:r>
-        <w:t>Le dispositif est attaqué sur le fichage des propriétaires ; un comptage citoyen qui photographie la rue en grand angle et conserve des plaques d'immatriculation reconstitue l'argument de l'adversaire. Donc : cadrage serré sur la déjection, pas de visage ni de plaque, aucun fichier de personnes, aucune géolocalisation d'individus, une finalité écrite et une durée de conservation annoncée. Le registre du comptage enregistre des tronçons et des nombres, pas des gens.</w:t>
-      </w:r>
-    </w:p>
-    <w:p>
-      <w:pPr>
-        <w:pStyle w:val="Heading3"/>
-      </w:pPr>
-      <w:r>
-        <w:t>4. Ce qu'un comptage citoyen ne peut pas faire</w:t>
-      </w:r>
-    </w:p>
-    <w:p>
-      <w:r>
-        <w:t xml:space="preserve">Il ne permet pas de verbaliser. La contravention est prouvée par procès-verbal ou rapport d'un agent habilité, et, pour les contraventions, l'article 537 du code de procédure pénale prévoit que ces rapports « font foi jusqu'à preuve contraire » et que la preuve contraire ne peut être rapportée que par écrit ou par témoins. Le comptage citoyen sert à </w:t>
-      </w:r>
-      <w:r>
-        <w:rPr>
-          <w:b/>
-        </w:rPr>
-        <w:t>justifier la mesure devant le juge administratif</w:t>
-      </w:r>
-      <w:r>
-        <w:t>, pas à constater l'infraction. Les deux chaînes sont distinctes et ne doivent pas être mélangées dans le discours public — c'est le mélange qui fait dire « ils veulent nous ficher ».</w:t>
-      </w:r>
-    </w:p>
-    <w:p>
-      <w:pPr>
-        <w:pStyle w:val="Heading3"/>
-      </w:pPr>
-      <w:r>
-        <w:t>5. Les trois niveaux d'escalade</w:t>
-      </w:r>
-    </w:p>
-    <w:p>
-      <w:pPr>
-        <w:pStyle w:val="ListNumber"/>
-      </w:pPr>
-      <w:r>
-        <w:rPr>
-          <w:b/>
-        </w:rPr>
-        <w:t>Comptage citoyen avec protocole publié et horodaté</w:t>
-      </w:r>
-      <w:r>
-        <w:t xml:space="preserve"> (coût : du temps). Suffisant pour un conseil d'arrondissement, un budget participatif et un premier article de presse.</w:t>
-      </w:r>
-    </w:p>
-    <w:p>
-      <w:pPr>
-        <w:pStyle w:val="ListNumber"/>
-      </w:pPr>
-      <w:r>
-        <w:rPr>
-          <w:b/>
-        </w:rPr>
-        <w:t>Convention avec la mairie ou la mairie d'arrondissement</w:t>
-      </w:r>
-      <w:r>
-        <w:t>, les agents relayant le comptage : le relevé change de nature et devient un document administratif.</w:t>
-      </w:r>
-    </w:p>
-    <w:p>
-      <w:pPr>
-        <w:pStyle w:val="ListNumber"/>
-      </w:pPr>
-      <w:r>
-        <w:rPr>
-          <w:b/>
-        </w:rPr>
-        <w:t>Constat de commissaire de justice</w:t>
-      </w:r>
-      <w:r>
-        <w:t>, contradictoire, sur un échantillon de passages seulement : c'est l'acte le plus difficile à contester, et il coûte cher — d'où l'intérêt de le réserver à la démonstration finale, une fois le protocole rodé et les chiffres stabilisés.</w:t>
-      </w:r>
-    </w:p>
-    <w:p>
-      <w:r>
-        <w:t xml:space="preserve">À faire en parallèle, et gratuitement : </w:t>
-      </w:r>
-      <w:r>
-        <w:rPr>
-          <w:b/>
-        </w:rPr>
-        <w:t>demander les pièces de l'administration</w:t>
-      </w:r>
-      <w:r>
-        <w:t xml:space="preserve"> (extractions DansMaRue sur le secteur, statistiques de propreté, marché de nettoiement, bilan des campagnes précédentes). Ce sont des documents administratifs communicables ; ils donnent la base officielle que le juge réclamait à Béziers, et ils obligent la Ville à prendre position par écrit.</w:t>
-      </w:r>
-    </w:p>
-    <w:p>
-      <w:pPr>
-        <w:pStyle w:val="Heading3"/>
-      </w:pPr>
-      <w:r>
-        <w:t>6. Ce que le comptage ne suffira pas à fermer</w:t>
-      </w:r>
-    </w:p>
-    <w:p>
-      <w:r>
-        <w:t>Le motif n° 3 de Béziers — l'identification classique est-elle suffisante ? — ne se règle pas en comptant. Il se règle par un raisonnement : un tatouage ou un fichier I-CAD identifie un chien, mais ne relie pas une déjection à son propriétaire, faute de quoi aucune attribution n'est possible. C'est un argument juridique autonome, à écrire séparément, et la proportionnalité (périmètre réduit, durée bornée, gratuité de l'identification, alternatives) reste à démontrer — le juge administratif contrôle les trois, pas seulement l'utilité.</w:t>
-      </w:r>
-    </w:p>
-    <w:p>
-      <w:pPr>
-        <w:pStyle w:val="Heading3"/>
-      </w:pPr>
-      <w:r>
-        <w:t>Sources</w:t>
-      </w:r>
-    </w:p>
-    <w:p>
-      <w:pPr>
-        <w:pStyle w:val="ListBullet"/>
-      </w:pPr>
-      <w:r>
-        <w:t>LDH, « Béziers : l'identification génétique des chiens » (citations du jugement du 6 mai 2025, TA Montpellier) : https://www.ldh-france.org/beziers-lidentification-genetique-des-chiens/</w:t>
-      </w:r>
-    </w:p>
-    <w:p>
-      <w:pPr>
-        <w:pStyle w:val="ListBullet"/>
-      </w:pPr>
-      <w:r>
-        <w:t>Article 537 du code de procédure pénale (force probante des procès-verbaux et rapports en matière contraventionnelle ; texte à lire dans le code, partie législative, livre II, titre III) : https://www.legifrance.gouv.fr/codes/texte_lc/LEGITEXT000006071154/</w:t>
-      </w:r>
-    </w:p>
-    <w:p>
-      <w:pPr>
-        <w:pStyle w:val="ListBullet"/>
-      </w:pPr>
-      <w:r>
-        <w:t>Sénat, question écrite rappelant le régime de l'article 537 (rapports faisant foi jusqu'à preuve contraire, preuve contraire par écrit ou témoins) : https://www.senat.fr/questions/base/2007/qSEQ070801568.html</w:t>
-      </w:r>
-    </w:p>
-    <w:p>
-      <w:pPr>
-        <w:pStyle w:val="ListBullet"/>
-      </w:pPr>
-      <w:r>
-        <w:t>ANSSI, les services de confiance (horodatage électronique qualifié, eIDAS) : https://cyber.gouv.fr/reglementation/reglementation-identite-confiance-numerique/securite-echanges-voie-electronique/reglement-eidas/services-de-confiance/</w:t>
-      </w:r>
-    </w:p>
-    <w:p>
-      <w:pPr>
-        <w:pStyle w:val="ListBullet"/>
-      </w:pPr>
-      <w:r>
-        <w:t>Règlement (UE) n° 910/2014 (eIDAS), art. 41 et 42 ; articles 1366 et 1367 du code civil.</w:t>
-      </w:r>
-    </w:p>
-    <w:p>
-      <w:pPr>
-        <w:pStyle w:val="ListBullet"/>
-      </w:pPr>
-      <w:r>
-        <w:t>Le comptage national des oiseaux des jardins (LPO et Muséum national d'histoire naturelle) comme modèle de comptage citoyen : voir l'annexe C du rapport complet.</w:t>
-      </w:r>
-    </w:p>
-    <w:p>
-      <w:r>
-        <w:rPr>
-          <w:b w:val="0"/>
-        </w:rPr>
-        <w:t>↑ Sommaire</w:t>
-      </w:r>
-    </w:p>
-    <w:p/>
-    <w:p>
-      <w:pPr>
-        <w:pStyle w:val="Heading2"/>
-      </w:pPr>
-      <w:r>
-        <w:t>10. Architecture — une chaîne de preuve outillée (photo en contexte, QR, registre horodaté)</w:t>
-      </w:r>
-    </w:p>
-    <w:p>
-      <w:r>
-        <w:rPr>
-          <w:i/>
-        </w:rPr>
-        <w:t>Source : `ARCHI-CHAINE-DE-PREUVE.md`.</w:t>
-      </w:r>
-    </w:p>
-    <w:p>
-      <w:r>
-        <w:t>29 septembre 2026. Question posée : peut-on faire quelque chose de solide et d'ouvert — photo en contexte, QR code, données et chiffres — en respectant la chaîne de preuve (la « chaîne du froid » du prélèvement) ? Réponse : oui, et c'est même la bonne façon de faire, à condition de comprendre ce que l'outil peut apporter et ce qu'aucun outil ne peut produire. Note de conception. Rien n'a été voté.</w:t>
-      </w:r>
-    </w:p>
-    <w:p>
-      <w:pPr>
-        <w:pStyle w:val="Heading3"/>
-      </w:pPr>
-      <w:r>
-        <w:t>1. Le partage à ne pas se tromper</w:t>
-      </w:r>
-    </w:p>
-    <w:p>
-      <w:r>
-        <w:rPr>
-          <w:b/>
-        </w:rPr>
-        <w:t>Ce que le logiciel peut faire, et qu'aucun humain ne fait proprement :</w:t>
-      </w:r>
-      <w:r>
-        <w:t xml:space="preserve"> l'intégrité, la datation, la traçabilité des transferts, et la publication vérifiable. C'est le pilier « daté et intègre » de la note juridique du comptage, et c'est exactement là qu'un serveur quelconque ne vaut rien.</w:t>
-      </w:r>
-    </w:p>
-    <w:p>
-      <w:r>
-        <w:rPr>
-          <w:b/>
-        </w:rPr>
-        <w:t>Ce qu'aucun logiciel ne peut produire :</w:t>
-      </w:r>
-    </w:p>
-    <w:p>
-      <w:pPr>
-        <w:pStyle w:val="ListBullet"/>
-      </w:pPr>
-      <w:r>
-        <w:rPr>
-          <w:b/>
-        </w:rPr>
-        <w:t>L'autorité de constater.</w:t>
-      </w:r>
-      <w:r>
-        <w:t xml:space="preserve"> Un procès-verbal n'a de force que par un agent habilité (art. 537 du code de procédure pénale). Aucune application ne verbalise.</w:t>
-      </w:r>
-    </w:p>
-    <w:p>
-      <w:pPr>
-        <w:pStyle w:val="ListBullet"/>
-      </w:pPr>
-      <w:r>
-        <w:rPr>
-          <w:b/>
-        </w:rPr>
-        <w:t>Le contradictoire.</w:t>
-      </w:r>
-      <w:r>
-        <w:t xml:space="preserve"> Il tient à une invitation écrite, datée, envoyée avant le premier passage, et à deux observateurs dont un non partie prenante. Un logiciel peut </w:t>
-      </w:r>
-      <w:r>
-        <w:rPr>
-          <w:i/>
-        </w:rPr>
-        <w:t>enregistrer</w:t>
-      </w:r>
-      <w:r>
-        <w:t xml:space="preserve"> cette invitation et </w:t>
-      </w:r>
-      <w:r>
-        <w:rPr>
-          <w:i/>
-        </w:rPr>
-        <w:t>rendre visible</w:t>
-      </w:r>
-      <w:r>
-        <w:t xml:space="preserve"> qui a compté ; il ne peut pas la remplacer.</w:t>
-      </w:r>
-    </w:p>
-    <w:p>
-      <w:pPr>
-        <w:pStyle w:val="ListBullet"/>
-      </w:pPr>
-      <w:r>
-        <w:rPr>
-          <w:b/>
-        </w:rPr>
-        <w:t>La représentativité.</w:t>
-      </w:r>
-      <w:r>
-        <w:t xml:space="preserve"> Si les rues sont choisies parce qu'elles sont sales, aucun outil ne sauvera le chiffre. D'où la zone témoin et le pré-enregistrement du protocole : c'est de la gouvernance, pas du code.</w:t>
-      </w:r>
-    </w:p>
-    <w:p>
-      <w:r>
-        <w:t xml:space="preserve">Corollaire de conception, et c'est la règle qui structure tout le reste : </w:t>
-      </w:r>
-      <w:r>
-        <w:rPr>
-          <w:b/>
-        </w:rPr>
-        <w:t>l'outil ne doit jamais devenir la preuve.</w:t>
-      </w:r>
-      <w:r>
-        <w:t xml:space="preserve"> Si le chiffre ne tient que parce que notre application l'affirme, l'adversaire n'a qu'un mot à dire — « votre serveur, vos chiffres » — et le dossier est mort. La vérification ne doit exiger de faire confiance à personne, nous compris.</w:t>
-      </w:r>
-    </w:p>
-    <w:p>
-      <w:pPr>
-        <w:pStyle w:val="Heading3"/>
-      </w:pPr>
-      <w:r>
-        <w:t>2. Le principe : un identifiant, deux chaînes</w:t>
-      </w:r>
-    </w:p>
-    <w:p>
-      <w:r>
-        <w:t xml:space="preserve">Tout se tient sur une idée simple : </w:t>
-      </w:r>
-      <w:r>
-        <w:rPr>
-          <w:b/>
-        </w:rPr>
-        <w:t>un identifiant unique lie l'objet physique et l'enregistrement numérique</w:t>
-      </w:r>
-      <w:r>
-        <w:t>, et chaque transfert de cet objet est un événement daté et signé.</w:t>
-      </w:r>
-    </w:p>
-    <w:p>
-      <w:r>
-        <w:rPr>
-          <w:b/>
-        </w:rPr>
-        <w:t>Chaîne matérielle</w:t>
-      </w:r>
-      <w:r>
-        <w:t xml:space="preserve"> (le prélèvement, la « chaîne du froid ») :</w:t>
-      </w:r>
-    </w:p>
-    <w:p>
-      <w:pPr>
-        <w:pStyle w:val="ListNumber"/>
-      </w:pPr>
-      <w:r>
-        <w:t xml:space="preserve">L'agent ou l'observateur prélève la déjection, la place dans un tube et </w:t>
-      </w:r>
-      <w:r>
-        <w:rPr>
-          <w:b/>
-        </w:rPr>
-        <w:t>appose un scellé numéroté</w:t>
-      </w:r>
-      <w:r>
-        <w:t>, issu d'un carnet à séquence continue — comme un carnet d'exhibits. Un scellé manquant dans la séquence est visible, donc un prélèvement fabriqué après coup laisse une trace.</w:t>
-      </w:r>
-    </w:p>
-    <w:p>
-      <w:pPr>
-        <w:pStyle w:val="ListNumber"/>
-      </w:pPr>
-      <w:r>
-        <w:t xml:space="preserve">Relevé obligatoire au moment du prélèvement : horodatage, tronçon, position, </w:t>
-      </w:r>
-      <w:r>
-        <w:rPr>
-          <w:b/>
-        </w:rPr>
-        <w:t>photo en contexte</w:t>
-      </w:r>
-      <w:r>
-        <w:t>, conditions (météo, heure, température si la chaîne du froid s'applique au transport).</w:t>
-      </w:r>
-    </w:p>
-    <w:p>
-      <w:pPr>
-        <w:pStyle w:val="ListNumber"/>
-      </w:pPr>
-      <w:r>
-        <w:t xml:space="preserve">Chaque remise (observateur → transporteur → laboratoire) est un </w:t>
-      </w:r>
-      <w:r>
-        <w:rPr>
-          <w:b/>
-        </w:rPr>
-        <w:t>transfert à deux signatures</w:t>
-      </w:r>
-      <w:r>
-        <w:t xml:space="preserve"> : qui remet, qui reçoit, quand, dans quel état. Le laboratoire renvoie un accusé de réception.</w:t>
-      </w:r>
-    </w:p>
-    <w:p>
-      <w:pPr>
-        <w:pStyle w:val="ListNumber"/>
-      </w:pPr>
-      <w:r>
-        <w:t>Conservation et délai : la date limite d'analyse et les conditions de transport sont inscrites dans le protocole, pas improvisées. C'est aussi le point technique numéro un du dossier — la robustesse de l'ADN environnemental sur un trottoir n'est documentée nulle part publiquement.</w:t>
-      </w:r>
-    </w:p>
-    <w:p>
-      <w:r>
-        <w:rPr>
-          <w:b/>
-        </w:rPr>
-        <w:t>Chaîne numérique</w:t>
-      </w:r>
-      <w:r>
-        <w:t xml:space="preserve"> (le même identifiant, côté données) :</w:t>
-      </w:r>
-    </w:p>
-    <w:p>
-      <w:pPr>
-        <w:pStyle w:val="ListNumber"/>
-      </w:pPr>
-      <w:r>
-        <w:t>Chaque fiche de relevé produit un enregistrement immuable : identifiant, tronçon, créneau, comptage, observateurs, empreinte de la photo, version du protocole.</w:t>
-      </w:r>
-    </w:p>
-    <w:p>
-      <w:pPr>
-        <w:pStyle w:val="ListNumber"/>
-      </w:pPr>
-      <w:r>
-        <w:rPr>
-          <w:b/>
-        </w:rPr>
-        <w:t>Empreinte SHA-256</w:t>
-      </w:r>
-      <w:r>
-        <w:t xml:space="preserve"> de chaque fiche et de chaque photo.</w:t>
-      </w:r>
-    </w:p>
-    <w:p>
-      <w:pPr>
-        <w:pStyle w:val="ListNumber"/>
-      </w:pPr>
-      <w:r>
-        <w:rPr>
-          <w:b/>
-        </w:rPr>
-        <w:t>Arbre de Merkle par session</w:t>
-      </w:r>
-      <w:r>
-        <w:t>, dont la racine est horodatée par un service de confiance qualifié (eIDAS, RFC 3161). Résultat : n'importe qui peut vérifier, des années plus tard, qu'une photo donnée existait à cette date et n'a pas bougé — sans nous croire et sans accéder à nos serveurs. Une variante gratuite et indépendamment vérifiable (ancrage en chaîne de blocs) est utile en complément, mais reste appréciée librement par le juge : ce n'est pas un service qualifié.</w:t>
-      </w:r>
-    </w:p>
-    <w:p>
-      <w:pPr>
-        <w:pStyle w:val="ListNumber"/>
-      </w:pPr>
-      <w:r>
-        <w:rPr>
-          <w:b/>
-        </w:rPr>
-        <w:t>Registre en ajout seul</w:t>
-      </w:r>
-      <w:r>
-        <w:t xml:space="preserve"> : aucun enregistrement n'est modifiable. Une correction est un nouvel enregistrement qui référence l'ancien, et les deux restent visibles. C'est ce qui rend un chiffre inattaquable sur le terrain où toutes les administrations se font prendre : « vous avez ajusté après coup ».</w:t>
-      </w:r>
-    </w:p>
-    <w:p>
-      <w:pPr>
-        <w:pStyle w:val="ListNumber"/>
-      </w:pPr>
-      <w:r>
-        <w:rPr>
-          <w:b/>
-        </w:rPr>
-        <w:t>Divergence publiée, jamais lissée</w:t>
-      </w:r>
-      <w:r>
-        <w:t xml:space="preserve"> : quand les deux observateurs d'un même passage ne comptent pas la même chose, l'écart est publié avec sa raison. Un écart affiché crédibilise ; un écart effacé se retrouve un jour en commentaire.</w:t>
-      </w:r>
-    </w:p>
-    <w:p>
-      <w:pPr>
-        <w:pStyle w:val="Heading3"/>
-      </w:pPr>
-      <w:r>
-        <w:t>3. La photo en contexte, et à quoi sert vraiment le QR</w:t>
-      </w:r>
-    </w:p>
-    <w:p>
-      <w:r>
-        <w:t>Une photo seule ne dit pas où, quand, ni par qui — et ses métadonnées se réécrivent. Trois usages du QR, dans cet ordre d'utilité :</w:t>
-      </w:r>
-    </w:p>
-    <w:p>
-      <w:pPr>
-        <w:pStyle w:val="ListNumber"/>
-      </w:pPr>
-      <w:r>
-        <w:rPr>
-          <w:b/>
-        </w:rPr>
-        <w:t>L'étiquette de passage, imprimée à l'avance et numérotée.</w:t>
-      </w:r>
-      <w:r>
-        <w:t xml:space="preserve"> Elle porte un QR contenant : identifiant du tronçon, numéro de session, date prévue, version du protocole, identifiant de l'observateur. La règle photographique est : </w:t>
-      </w:r>
-      <w:r>
-        <w:rPr>
-          <w:b/>
-        </w:rPr>
-        <w:t>l'étiquette et la déjection dans le même cadre</w:t>
-      </w:r>
-      <w:r>
-        <w:t>. L'image porte alors son contexte, lisible par un humain sur la photo et par une machine dans le QR. Les étiquettes sont émises en séquence continue : un manque dans la séquence est un signal.</w:t>
-      </w:r>
-    </w:p>
-    <w:p>
-      <w:pPr>
-        <w:pStyle w:val="ListNumber"/>
-      </w:pPr>
-      <w:r>
-        <w:rPr>
-          <w:b/>
-        </w:rPr>
-        <w:t>Le lien de vérification</w:t>
-      </w:r>
-      <w:r>
-        <w:t xml:space="preserve"> : le QR renvoie à la page publique de l'enregistrement — empreinte, horodatage, statut. C'est ce qui permet à un journaliste, à un élu ou à un contradicteur de vérifier sans rien nous demander.</w:t>
-      </w:r>
-    </w:p>
-    <w:p>
-      <w:pPr>
-        <w:pStyle w:val="ListNumber"/>
-      </w:pPr>
-      <w:r>
-        <w:rPr>
-          <w:b/>
-        </w:rPr>
-        <w:t>La même étiquette pour le prélèvement</w:t>
-      </w:r>
-      <w:r>
-        <w:t xml:space="preserve"> : le QR porte aussi le numéro de scellé du tube, ce qui fait qu'un seul identifiant suit l'objet du trottoir jusqu'au résultat du laboratoire.</w:t>
-      </w:r>
-    </w:p>
-    <w:p>
-      <w:pPr>
-        <w:pStyle w:val="Heading3"/>
-      </w:pPr>
-      <w:r>
-        <w:t>4. Contradictoire outillé, sans le remplacer</w:t>
-      </w:r>
-    </w:p>
-    <w:p>
-      <w:r>
-        <w:t>Ce que le logiciel ajoute au contradictoire, sans jamais s'y substituer :</w:t>
-      </w:r>
-    </w:p>
-    <w:p>
-      <w:pPr>
-        <w:pStyle w:val="ListBullet"/>
-      </w:pPr>
-      <w:r>
-        <w:rPr>
-          <w:b/>
-        </w:rPr>
-        <w:t>l'invitation est un enregistrement du registre</w:t>
-      </w:r>
-      <w:r>
-        <w:t xml:space="preserve"> : courrier à la mairie, à la mairie d'arrondissement, au préfet, daté et horodaté, avec le protocole et les dates ;</w:t>
-      </w:r>
-    </w:p>
-    <w:p>
-      <w:pPr>
-        <w:pStyle w:val="ListBullet"/>
-      </w:pPr>
-      <w:r>
-        <w:rPr>
-          <w:b/>
-        </w:rPr>
-        <w:t>la clé publique des observateurs</w:t>
-      </w:r>
-      <w:r>
-        <w:t xml:space="preserve"> est publiée : chacun peut voir qui a compté, et un opposant peut demander une clé de lecture, voire une clé d'écriture pour son propre observateur ;</w:t>
-      </w:r>
-    </w:p>
-    <w:p>
-      <w:pPr>
-        <w:pStyle w:val="ListBullet"/>
-      </w:pPr>
-      <w:r>
-        <w:rPr>
-          <w:b/>
-        </w:rPr>
-        <w:t>une reconstitution publique</w:t>
-      </w:r>
-      <w:r>
-        <w:t xml:space="preserve"> : n'importe qui peut refaire le comptage sur les mêmes tronçons et les mêmes créneaux, et déposer ses propres enregistrements.</w:t>
-      </w:r>
-    </w:p>
-    <w:p>
-      <w:pPr>
-        <w:pStyle w:val="Heading3"/>
-      </w:pPr>
-      <w:r>
-        <w:t>5. Les chiffres, et comment ils résistent</w:t>
-      </w:r>
-    </w:p>
-    <w:p>
-      <w:pPr>
-        <w:pStyle w:val="ListBullet"/>
-      </w:pPr>
-      <w:r>
-        <w:rPr>
-          <w:b/>
-        </w:rPr>
-        <w:t>Unité</w:t>
-      </w:r>
-      <w:r>
-        <w:t xml:space="preserve"> : déjections pour 100 m de voie et par passage — jamais un total brut, qui ne veut rien dire et se retourne contre celui qui le présente.</w:t>
-      </w:r>
-    </w:p>
-    <w:p>
-      <w:pPr>
-        <w:pStyle w:val="ListBullet"/>
-      </w:pPr>
-      <w:r>
-        <w:rPr>
-          <w:b/>
-        </w:rPr>
-        <w:t>Comparaison</w:t>
-      </w:r>
-      <w:r>
-        <w:t xml:space="preserve"> : tronçons traités contre zone témoin, sur plusieurs périodes. C'est le motif exact du jugement de Béziers : le juge compare des années, pas deux semaines.</w:t>
-      </w:r>
-    </w:p>
-    <w:p>
-      <w:pPr>
-        <w:pStyle w:val="ListBullet"/>
-      </w:pPr>
-      <w:r>
-        <w:rPr>
-          <w:b/>
-        </w:rPr>
-        <w:t>Conditions en covariables</w:t>
-      </w:r>
-      <w:r>
-        <w:t xml:space="preserve"> : météo, jour de collecte, marché, vacances, travaux. Une baisse après un passage de balayeuse n'est pas un effet du dispositif.</w:t>
-      </w:r>
-    </w:p>
-    <w:p>
-      <w:pPr>
-        <w:pStyle w:val="ListBullet"/>
-      </w:pPr>
-      <w:r>
-        <w:rPr>
-          <w:b/>
-        </w:rPr>
-        <w:t>Méthode d'agrégation écrite avant</w:t>
-      </w:r>
-      <w:r>
-        <w:t xml:space="preserve"> : médiane par tronçon, intervalle par rééchantillonnage, seuil de significativité. Écrite avant, elle n'est pas choisie pour le résultat.</w:t>
-      </w:r>
-    </w:p>
-    <w:p>
-      <w:pPr>
-        <w:pStyle w:val="ListBullet"/>
-      </w:pPr>
-      <w:r>
-        <w:rPr>
-          <w:b/>
-        </w:rPr>
-        <w:t>Données brutes publiées</w:t>
-      </w:r>
-      <w:r>
-        <w:t xml:space="preserve"> : JSON, CSV et GeoJSON, plus les empreintes. Une preuve reproductible est une preuve qu'on ne peut pas écarter.</w:t>
-      </w:r>
-    </w:p>
-    <w:p>
-      <w:pPr>
-        <w:pStyle w:val="Heading3"/>
-      </w:pPr>
-      <w:r>
-        <w:t>6. Ouvert : ce que « ouvert » doit vouloir dire</w:t>
-      </w:r>
-    </w:p>
-    <w:p>
-      <w:r>
-        <w:t>Ouvrir le code ne suffit pas. Les quatre pièces qui rendent l'ensemble vérifiable par un tiers :</w:t>
-      </w:r>
-    </w:p>
-    <w:p>
-      <w:pPr>
-        <w:pStyle w:val="ListNumber"/>
-      </w:pPr>
-      <w:r>
-        <w:rPr>
-          <w:b/>
-        </w:rPr>
-        <w:t>protocole versionné</w:t>
-      </w:r>
-      <w:r>
-        <w:t xml:space="preserve"> (les versions successives restent consultables, on ne réécrit pas le passé) ;</w:t>
-      </w:r>
-    </w:p>
-    <w:p>
-      <w:pPr>
-        <w:pStyle w:val="ListNumber"/>
-      </w:pPr>
-      <w:r>
-        <w:rPr>
-          <w:b/>
-        </w:rPr>
-        <w:t>schéma de données publié</w:t>
-      </w:r>
-      <w:r>
-        <w:t xml:space="preserve"> avec le format des enregistrements ;</w:t>
-      </w:r>
-    </w:p>
-    <w:p>
-      <w:pPr>
-        <w:pStyle w:val="ListNumber"/>
-      </w:pPr>
-      <w:r>
-        <w:rPr>
-          <w:b/>
-        </w:rPr>
-        <w:t>code source ouvert</w:t>
-      </w:r>
-      <w:r>
-        <w:t>, exécutable par un tiers, sans dépendance à notre hébergement ;</w:t>
-      </w:r>
-    </w:p>
-    <w:p>
-      <w:pPr>
-        <w:pStyle w:val="ListNumber"/>
-      </w:pPr>
-      <w:r>
-        <w:rPr>
-          <w:b/>
-        </w:rPr>
-        <w:t>jeu de données ouvert</w:t>
-      </w:r>
-      <w:r>
-        <w:t xml:space="preserve"> sous licence claire, avec les empreintes et les jetons d'horodatage.</w:t>
-      </w:r>
-    </w:p>
-    <w:p>
-      <w:pPr>
-        <w:pStyle w:val="Heading3"/>
-      </w:pPr>
-      <w:r>
-        <w:t>7. La séquence, et pourquoi il ne faut pas commencer par l'application</w:t>
-      </w:r>
-    </w:p>
-    <w:p>
-      <w:r>
-        <w:t>Le risque de ce genre de projet est connu : deux mois d'application, zéro comptage.</w:t>
-      </w:r>
-    </w:p>
-    <w:p>
-      <w:pPr>
-        <w:pStyle w:val="ListNumber"/>
-      </w:pPr>
-      <w:r>
-        <w:rPr>
-          <w:b/>
-        </w:rPr>
-        <w:t>Semaine 1-2, à la main.</w:t>
-      </w:r>
-      <w:r>
-        <w:t xml:space="preserve"> Fiche papier standardisée, téléphone, étiquettes imprimées, un tronçon, une zone témoin. Export des photos et des fiches, une empreinte globale par semaine, horodatée. Coût : du temps, quelques euros d'horodatage.</w:t>
-      </w:r>
-    </w:p>
-    <w:p>
-      <w:pPr>
-        <w:pStyle w:val="ListNumber"/>
-      </w:pPr>
-      <w:r>
-        <w:rPr>
-          <w:b/>
-        </w:rPr>
-        <w:t>Semaine 3-6.</w:t>
-      </w:r>
-      <w:r>
-        <w:t xml:space="preserve"> On teste ce qui casse : deux observateurs en désaccord, une pluie, un marché, un tronçon où personne ne passe. C'est là qu'on apprend ce que doit gérer l'outil.</w:t>
-      </w:r>
-    </w:p>
-    <w:p>
-      <w:pPr>
-        <w:pStyle w:val="ListNumber"/>
-      </w:pPr>
-      <w:r>
-        <w:rPr>
-          <w:b/>
-        </w:rPr>
-        <w:t>Après, seulement si l'échelle le justifie</w:t>
-      </w:r>
-      <w:r>
-        <w:t xml:space="preserve"> (plus de dix compteurs, ou une mairie qui veut reprendre l'instrument) : l'application hors ligne d'abord, clé par observateur, QR des étiquettes, registre en ajout seul, publication automatique des agrégats.</w:t>
-      </w:r>
-    </w:p>
-    <w:p>
-      <w:pPr>
-        <w:pStyle w:val="Heading3"/>
-      </w:pPr>
-      <w:r>
-        <w:t>8. Ce que ça peut devenir</w:t>
-      </w:r>
-    </w:p>
-    <w:p>
-      <w:r>
-        <w:t>Le même instrument sert à tout ce qu'une administration ne mesure pas : déjections, dépôts sauvages, bruit, chaleur de rue, bus qui ne passent pas, trottoirs impraticables. Une chaîne de preuve citoyenne réutilisable — protocole, outil, données ouvertes — est un actif qui se prête ou se vend à une association, une mairie, un journal, sans jamais vendre le dossier lui-même. Mais l'ordre compte : c'est le pilote qui donne le droit d'en faire un produit, pas l'inverse.</w:t>
-      </w:r>
-    </w:p>
-    <w:p>
-      <w:r>
-        <w:t>Ce que cette architecture ne règle pas, et qu'il faut répéter : elle ne remplace ni l'invitation écrite à l'adversaire, ni la zone témoin, ni la démonstration que l'identification classique est insuffisante. Elle rend seulement les preuves que nous produisons impossibles à écarter pour de mauvaises raisons.</w:t>
-      </w:r>
-    </w:p>
-    <w:p>
-      <w:r>
-        <w:t>Suite : écrire la fiche de relevé en une page, la règle photographique en une ligne (« l'étiquette et la déjection dans le même cadre »), et le protocole de transfert à deux signatures. Tout le reste est du logiciel, et le logiciel vient après.</w:t>
-      </w:r>
-    </w:p>
-    <w:p>
-      <w:r>
-        <w:rPr>
-          <w:b w:val="0"/>
-        </w:rPr>
-        <w:t>↑ Sommaire</w:t>
-      </w:r>
-    </w:p>
-    <w:p/>
-    <w:p>
-      <w:pPr>
-        <w:pStyle w:val="Heading2"/>
-      </w:pPr>
-      <w:r>
-        <w:t>11. Le site de la Poterne des Peupliers (PC 13) — ce qu'on peut y faire, et ce qu'on ne peut pas</w:t>
-      </w:r>
-    </w:p>
-    <w:p>
-      <w:r>
-        <w:rPr>
-          <w:i/>
-        </w:rPr>
-        <w:t>Source : `NOTE-PC13-POTERNE.md`.</w:t>
-      </w:r>
-    </w:p>
-    <w:p>
-      <w:r>
-        <w:t>29 septembre 2026. Note de site, écrite après vérification des sources publiques. Elle change une partie de ce qu'on pouvait imaginer pour ce lieu précis : la promenade de la petite ceinture du 13e n'est pas un espace tolérant qu'il suffirait d'encadrer, c'est un espace où les animaux ne sont officiellement pas admis. À lire avant d'en faire la vitrine du projet. Rien n'a été voté.</w:t>
-      </w:r>
-    </w:p>
-    <w:p>
-      <w:pPr>
-        <w:pStyle w:val="Heading3"/>
-      </w:pPr>
-      <w:r>
-        <w:t>1. Ce qu'est exactement ce lieu</w:t>
-      </w:r>
-    </w:p>
-    <w:p>
-      <w:pPr>
-        <w:pStyle w:val="ListBullet"/>
-      </w:pPr>
-      <w:r>
-        <w:rPr>
-          <w:b/>
-        </w:rPr>
-        <w:t>Petite Ceinture du 13e (PC 13)</w:t>
-      </w:r>
-      <w:r>
-        <w:t xml:space="preserve">, 60 rue Damesme, 13e ; </w:t>
-      </w:r>
-      <w:r>
-        <w:rPr>
-          <w:b/>
-        </w:rPr>
-        <w:t>12 234 m²</w:t>
-      </w:r>
-      <w:r>
-        <w:t>, environ 430 m de long, ouverte au public depuis 2016.</w:t>
-      </w:r>
-    </w:p>
-    <w:p>
-      <w:pPr>
-        <w:pStyle w:val="ListBullet"/>
-      </w:pPr>
-      <w:r>
-        <w:t xml:space="preserve">Elle </w:t>
-      </w:r>
-      <w:r>
-        <w:rPr>
-          <w:b/>
-        </w:rPr>
-        <w:t>relie trois jardins</w:t>
-      </w:r>
-      <w:r>
-        <w:t xml:space="preserve"> : Charles-Trenet, Moulin-de-la-Pointe et Poterne-des-Peupliers, et facilite l'accès au tramway T3. Trois accès : 9 rue Augustin Mouchot, 26 rue de l'Interne Loeb, et par le jardin de la Porte des Peupliers.</w:t>
-      </w:r>
-    </w:p>
-    <w:p>
-      <w:pPr>
-        <w:pStyle w:val="ListBullet"/>
-      </w:pPr>
-      <w:r>
-        <w:t xml:space="preserve">Horaires : 8 h – 20 h 30 en saison haute, </w:t>
-      </w:r>
-      <w:r>
-        <w:rPr>
-          <w:b/>
-        </w:rPr>
-        <w:t>ouverture H24 du troisième lundi d'avril au troisième dimanche de septembre</w:t>
-      </w:r>
-      <w:r>
-        <w:t>, sinon 8 h – 18 h 30 ou 19 h 30 selon la période.</w:t>
-      </w:r>
-    </w:p>
-    <w:p>
-      <w:pPr>
-        <w:pStyle w:val="ListBullet"/>
-      </w:pPr>
-      <w:r>
-        <w:rPr>
-          <w:b/>
-        </w:rPr>
-        <w:t>Label Ecojardin</w:t>
-      </w:r>
-      <w:r>
-        <w:t>, faune et flore de friche industrielle préservées, prairie sèche, couloir écologique.</w:t>
-      </w:r>
-    </w:p>
-    <w:p>
-      <w:pPr>
-        <w:pStyle w:val="ListBullet"/>
-      </w:pPr>
-      <w:r>
-        <w:t xml:space="preserve">Sur la fiche de la Ville : </w:t>
-      </w:r>
-      <w:r>
-        <w:rPr>
-          <w:b/>
-        </w:rPr>
-        <w:t>« Admission animaux : non ».</w:t>
-      </w:r>
-    </w:p>
-    <w:p>
-      <w:pPr>
-        <w:pStyle w:val="Heading3"/>
-      </w:pPr>
-      <w:r>
-        <w:t>2. Ce que la Ville et la préfecture disent déjà du lieu</w:t>
-      </w:r>
-    </w:p>
-    <w:p>
-      <w:r>
-        <w:t xml:space="preserve">Le contrat de prévention et de sécurité du 13e (2023) classe la </w:t>
-      </w:r>
-      <w:r>
-        <w:rPr>
-          <w:b/>
-        </w:rPr>
-        <w:t>« promenade de la petite ceinture à la Poterne des Peupliers (SDF et chiens non tenus en laisse) »</w:t>
-      </w:r>
-      <w:r>
-        <w:t xml:space="preserve"> parmi les équipements municipaux sensibles, au même titre que la mairie du 13e et l'atelier de la propreté rue du Chevaleret. Traduction administrative : ce lieu est aujourd'hui fiché comme un point à surveiller, et la présence de chiens détachés y est traitée comme une nuisance, dans la même phrase que la présence de personnes à la rue.</w:t>
-      </w:r>
-    </w:p>
-    <w:p>
-      <w:r>
-        <w:t>Deux conséquences, et elles sont désagréables mais décisives :</w:t>
-      </w:r>
-    </w:p>
-    <w:p>
-      <w:pPr>
-        <w:pStyle w:val="ListNumber"/>
-      </w:pPr>
-      <w:r>
-        <w:rPr>
-          <w:b/>
-        </w:rPr>
-        <w:t>Ce n'est pas le bon endroit pour demander un espace de liberté.</w:t>
-      </w:r>
-      <w:r>
-        <w:t xml:space="preserve"> Demander l'ouverture aux chiens d'un site labellisé Ecojardin, à biodiversité protégée, et déjà signalé pour chiens détachés, revient à demander à la mairie d'assumer publiquement d'avoir renoncé à faire respecter sa propre règle. Refus quasi certain, et refus qui coûte cher : le premier échec public sur ce dossier installerait l'idée que le projet est irréaliste.</w:t>
-      </w:r>
-    </w:p>
-    <w:p>
-      <w:pPr>
-        <w:pStyle w:val="ListNumber"/>
-      </w:pPr>
-      <w:r>
-        <w:rPr>
-          <w:b/>
-        </w:rPr>
-        <w:t>C'est en revanche un excellent site de comptage.</w:t>
-      </w:r>
-      <w:r>
-        <w:t xml:space="preserve"> Parce qu'il est contesté et officiellement fermé aux chiens, personne n'a le chiffre : combien de chiens y passent, à quelles heures, et combien sont détachés. Ce chiffre n'existe nulle part, et il est exactement ce qui manque à la mairie pour choisir entre faire respecter l'interdiction, tolérer avec un encadrement, ou ouvrir un espace canin à côté.</w:t>
-      </w:r>
-    </w:p>
-    <w:p>
-      <w:pPr>
-        <w:pStyle w:val="Heading3"/>
-      </w:pPr>
-      <w:r>
-        <w:t>3. Le comptage d'usage : la mesure que personne n'a</w:t>
-      </w:r>
-    </w:p>
-    <w:p>
-      <w:r>
-        <w:t>Deux comptages différents, sur le même protocole que le reste du dossier (pré-enregistré, deux observateurs, créneaux fixes, conditions relevées, fin bornée, publication) :</w:t>
-      </w:r>
-    </w:p>
-    <w:p>
-      <w:pPr>
-        <w:pStyle w:val="ListBullet"/>
-      </w:pPr>
-      <w:r>
-        <w:rPr>
-          <w:b/>
-        </w:rPr>
-        <w:t>Comptage d'usage.</w:t>
-      </w:r>
-      <w:r>
-        <w:t xml:space="preserve"> Aux trois entrées, par créneaux d'une heure, en semaine et le week-end : nombre de chiens, nombre de chiens détachés, nombre d'adultes accompagnants, conflits constatés (enfant, vélo, autre chien). Le lieu est un linéaire borné : le comptage y est facile et reproductible.</w:t>
-      </w:r>
-    </w:p>
-    <w:p>
-      <w:pPr>
-        <w:pStyle w:val="ListBullet"/>
-      </w:pPr>
-      <w:r>
-        <w:rPr>
-          <w:b/>
-        </w:rPr>
-        <w:t>Comptage de déjections aux abords.</w:t>
-      </w:r>
-      <w:r>
-        <w:t xml:space="preserve"> Sur les trottoirs des rues qui mènent aux trois entrées (rue Damesme, rue Augustin Mouchot, rue de l'Interne Loeb) — c'est là que se déplace le problème quand le lieu est fermé ou bondé.</w:t>
-      </w:r>
-    </w:p>
-    <w:p>
-      <w:r>
-        <w:t>Ce que ce double comptage permet de dire, sans agresser personne : voilà ce que les gens font réellement, voilà ce que ça produit sur le trottoir, et voici trois façons de traiter ça. C'est un appui pour une mairie, pas une accusation.</w:t>
-      </w:r>
-    </w:p>
-    <w:p>
-      <w:pPr>
-        <w:pStyle w:val="Heading3"/>
-      </w:pPr>
-      <w:r>
-        <w:t>4. Ce qu'il faut demander, dans l'ordre</w:t>
-      </w:r>
-    </w:p>
-    <w:p>
-      <w:pPr>
-        <w:pStyle w:val="ListNumber"/>
-      </w:pPr>
-      <w:r>
-        <w:rPr>
-          <w:b/>
-        </w:rPr>
-        <w:t>Le règlement applicable sur place</w:t>
-      </w:r>
-      <w:r>
-        <w:t>, par écrit : les chiens y sont-ils interdits, tolérés, ou tenus en laisse ? La fiche de la Ville dit « admission animaux : non », mais l'article du règlement des jardins qui s'applique à ce site et son affichage sur place ne sont pas publics. Question simple, réponse opposable.</w:t>
-      </w:r>
-    </w:p>
-    <w:p>
-      <w:pPr>
-        <w:pStyle w:val="ListNumber"/>
-      </w:pPr>
-      <w:r>
-        <w:rPr>
-          <w:b/>
-        </w:rPr>
-        <w:t>Les données de la police municipale et de la Direction des espaces verts</w:t>
-      </w:r>
-      <w:r>
-        <w:t xml:space="preserve"> sur ce point : nombre de passages, nombre de constats, plaintes d'habitants, main courante. Ce sont des éléments qui éclairent le chiffre du comptage et qui obligent à traiter le sujet par des faits.</w:t>
-      </w:r>
-    </w:p>
-    <w:p>
-      <w:pPr>
-        <w:pStyle w:val="ListNumber"/>
-      </w:pPr>
-      <w:r>
-        <w:rPr>
-          <w:b/>
-        </w:rPr>
-        <w:t>La liste des jardins du 13e où les chiens sont admis</w:t>
-      </w:r>
-      <w:r>
-        <w:t>, sur la page de la Ville (des sites tiers en citent cinq, dont le jardin de la Poterne des Peupliers, mais rien ne vaut la liste officielle par arrondissement).</w:t>
-      </w:r>
-    </w:p>
-    <w:p>
-      <w:pPr>
-        <w:pStyle w:val="ListNumber"/>
-      </w:pPr>
-      <w:r>
-        <w:rPr>
-          <w:b/>
-        </w:rPr>
-        <w:t>Le calendrier d'ouverture d'un nouveau tronçon de petite ceinture</w:t>
-      </w:r>
-      <w:r>
-        <w:t xml:space="preserve"> dans le 13e : des sources publiques annoncent de nouvelles ouvertures en 2026. Si un tronçon s'ouvre, c'est le moment exact où demander un espace canin dans l'aménagement, alors que sur un site existant et labellisé, la porte est fermée.</w:t>
-      </w:r>
-    </w:p>
-    <w:p>
-      <w:pPr>
-        <w:pStyle w:val="Heading3"/>
-      </w:pPr>
-      <w:r>
-        <w:t>5. La proposition qui a une chance, et pourquoi elle est différente</w:t>
-      </w:r>
-    </w:p>
-    <w:p>
-      <w:r>
-        <w:t xml:space="preserve">Pas : « ouvrez la petite ceinture aux chiens détachés ». Mais : </w:t>
-      </w:r>
-      <w:r>
-        <w:rPr>
-          <w:b/>
-        </w:rPr>
-        <w:t>comptez l'usage réel, et donnez-lui une alternative à côté</w:t>
-      </w:r>
-      <w:r>
-        <w:t xml:space="preserve"> — un espace canin modèle, sur le modèle de Monceau (2 000 m², ouvert toute la journée, éducateur canin payé par la mairie, réservé aux chiens identifiables et vaccinés), dans un des jardins voisins (Poterne des Peupliers, Charles-Trenet, Moulin-de-la-Pointe) ou sur une parcelle contiguë, la petite ceinture restant ce qu'elle est : un couloir écologique.</w:t>
-      </w:r>
-    </w:p>
-    <w:p>
-      <w:r>
-        <w:t>Trois raisons pour lesquelles celle-ci peut passer là où l'autre échoue :</w:t>
-      </w:r>
-    </w:p>
-    <w:p>
-      <w:pPr>
-        <w:pStyle w:val="ListBullet"/>
-      </w:pPr>
-      <w:r>
-        <w:t xml:space="preserve">elle </w:t>
-      </w:r>
-      <w:r>
-        <w:rPr>
-          <w:b/>
-        </w:rPr>
-        <w:t>ne demande pas de revenir sur une interdiction</w:t>
-      </w:r>
-      <w:r>
-        <w:t>, elle ajoute un équipement ;</w:t>
-      </w:r>
-    </w:p>
-    <w:p>
-      <w:pPr>
-        <w:pStyle w:val="ListBullet"/>
-      </w:pPr>
-      <w:r>
-        <w:t xml:space="preserve">elle </w:t>
-      </w:r>
-      <w:r>
-        <w:rPr>
-          <w:b/>
-        </w:rPr>
-        <w:t>répond au problème que la mairie a déjà écrit noir sur blanc</w:t>
-      </w:r>
-      <w:r>
-        <w:t xml:space="preserve"> (des chiens détachés en nombre, à traiter), et lui apporte la donnée qui lui manque pour agir ;</w:t>
-      </w:r>
-    </w:p>
-    <w:p>
-      <w:pPr>
-        <w:pStyle w:val="ListBullet"/>
-      </w:pPr>
-      <w:r>
-        <w:t xml:space="preserve">elle </w:t>
-      </w:r>
-      <w:r>
-        <w:rPr>
-          <w:b/>
-        </w:rPr>
-        <w:t>réserve la biodiversité</w:t>
-      </w:r>
-      <w:r>
-        <w:t xml:space="preserve"> au lieu de l'opposer aux propriétaires de chiens, ce qui prive l'opposition de son meilleur argument.</w:t>
-      </w:r>
-    </w:p>
-    <w:p>
-      <w:r>
-        <w:t>Et une conséquence personnelle, qu'il faut assumer : se promener là avec son chien détaché, c'est utiliser un espace où les animaux ne sont pas admis. Rien de scandaleux, tout le monde le fait, mais il faut le savoir avant d'en faire un argument public — et avant qu'un adversaire ne fasse remarquer que le porteur du projet compte parmi les usagers hors règle. Le dossier gagne à dire les choses ainsi : « nos chiens y vont, la règle dit non, et si on comptait pour décider ? »</w:t>
-      </w:r>
-    </w:p>
-    <w:p>
-      <w:pPr>
-        <w:pStyle w:val="Heading3"/>
-      </w:pPr>
-      <w:r>
-        <w:t>Sources</w:t>
-      </w:r>
-    </w:p>
-    <w:p>
-      <w:pPr>
-        <w:pStyle w:val="ListBullet"/>
-      </w:pPr>
-      <w:r>
-        <w:t>Ville de Paris, fiche du lieu « Petite Ceinture du 13e (PC 13) » (surface 12 234 m², horaires, ouverture H24 en saison, « admission animaux : non », label Ecojardin, liaison Charles-Trenet / Moulin-de-la-Pointe / Poterne-des-Peupliers) : https://www.paris.fr/lieux/petite-ceinture-du-13e-pc-13-18089</w:t>
-      </w:r>
-    </w:p>
-    <w:p>
-      <w:pPr>
-        <w:pStyle w:val="ListBullet"/>
-      </w:pPr>
-      <w:r>
-        <w:t>Contrat de prévention et de sécurité du 13e arrondissement (2023), « Panorama des principales problématiques identifiées », équipements municipaux sensibles — reprise textuelle de la ligne « Promenade de la petite ceinture à la Poterne des Peupliers (SDF et chiens non tenus en laisse) » : https://cdn.paris.fr/paris/2023/11/14/cpsa-13e_2-juin-2023-Mxbk.pdf</w:t>
-      </w:r>
-    </w:p>
-    <w:p>
-      <w:pPr>
-        <w:pStyle w:val="ListBullet"/>
-      </w:pPr>
-      <w:r>
-        <w:t>Accès et longueur (0,43 km, trois accès, horaires selon la saison) : Paris je t'aime, https://parisjetaime.com/eng/article/the-petite-ceinture-circular-railway-unusual-and-little-known-paris-a1779</w:t>
-      </w:r>
-    </w:p>
-    <w:p>
-      <w:pPr>
-        <w:pStyle w:val="ListBullet"/>
-      </w:pPr>
-      <w:r>
-        <w:t>Ouvertures de nouveaux tronçons annoncées pour 2026 : presse internationale sur la petite ceinture (à confirmer auprès de la Ville avant tout usage public).</w:t>
-      </w:r>
-    </w:p>
-    <w:p>
-      <w:r>
-        <w:rPr>
-          <w:b w:val="0"/>
-        </w:rPr>
-        <w:t>↑ Sommaire</w:t>
-      </w:r>
-    </w:p>
-    <w:p/>
-    <w:p>
-      <w:pPr>
-        <w:pStyle w:val="Heading2"/>
-      </w:pPr>
-      <w:r>
-        <w:t>12. Tests ADN canins : coûts réels, facilité de mise en œuvre, et chiffrage pour Paris (29/09/2026)</w:t>
+        <w:t>11. Tests ADN canins : coûts réels, facilité de mise en œuvre, et chiffrage pour Paris (29/09/2026)</w:t>
       </w:r>
     </w:p>
     <w:p>
@@ -12181,7 +11654,7 @@
         <w:pStyle w:val="Heading2"/>
       </w:pPr>
       <w:r>
-        <w:t>13. Statut « chien·ne citoyen·ne de Paris » — note de conception (29/09/2026)</w:t>
+        <w:t>12. Statut « chien·ne citoyen·ne de Paris » — note de conception (29/09/2026)</w:t>
       </w:r>
     </w:p>
     <w:p>
@@ -13066,7 +12539,7 @@
         <w:pStyle w:val="Heading2"/>
       </w:pPr>
       <w:r>
-        <w:t>14. Statut « chien·ne citoyen·ne de Paris » — projet d'arrêté et règlement (version de travail, 29/09/2026)</w:t>
+        <w:t>13. Statut « chien·ne citoyen·ne de Paris » — projet d'arrêté et règlement (version de travail, 29/09/2026)</w:t>
       </w:r>
     </w:p>
     <w:p>
@@ -13505,7 +12978,7 @@
         <w:pStyle w:val="Heading2"/>
       </w:pPr>
       <w:r>
-        <w:t>15. Projet « chiens de Paris » — creusage du 29/09/2026</w:t>
+        <w:t>14. Projet « chiens de Paris » — creusage du 29/09/2026</w:t>
       </w:r>
     </w:p>
     <w:p>
@@ -14458,7 +13931,7 @@
         <w:pStyle w:val="Heading2"/>
       </w:pPr>
       <w:r>
-        <w:t>16. RAPPORT — Un projet politique « chiens de Paris » : statut du chien citoyen, registre ADN, droits et chiffrage</w:t>
+        <w:t>15. RAPPORT — Un projet politique « chiens de Paris » : statut du chien citoyen, registre ADN, droits et chiffrage</w:t>
       </w:r>
     </w:p>
     <w:p>
@@ -19719,7 +19192,7 @@
           </w:tcPr>
           <w:p>
             <w:r>
-              <w:t>324</w:t>
+              <w:t>320</w:t>
             </w:r>
           </w:p>
         </w:tc>
@@ -19816,38 +19289,6 @@
           <w:p>
             <w:r>
               <w:t>146</w:t>
-            </w:r>
-          </w:p>
-        </w:tc>
-      </w:tr>
-      <w:tr>
-        <w:tc>
-          <w:tcPr>
-            <w:tcW w:type="dxa" w:w="2880"/>
-          </w:tcPr>
-          <w:p>
-            <w:r>
-              <w:t>NOTE-PC13-POTERNE.md</w:t>
-            </w:r>
-          </w:p>
-        </w:tc>
-        <w:tc>
-          <w:tcPr>
-            <w:tcW w:type="dxa" w:w="2880"/>
-          </w:tcPr>
-          <w:p>
-            <w:r>
-              <w:t>Le site de la Poterne des Peupliers : usage réel et alternative</w:t>
-            </w:r>
-          </w:p>
-        </w:tc>
-        <w:tc>
-          <w:tcPr>
-            <w:tcW w:type="dxa" w:w="2880"/>
-          </w:tcPr>
-          <w:p>
-            <w:r>
-              <w:t>111</w:t>
             </w:r>
           </w:p>
         </w:tc>

</xml_diff>

<commit_message>
Chiens: note de terrain sur le 13e (chiffres, politique locale, sites, demandes ecrites)
</commit_message>
<xml_diff>
--- a/export/Chien-citoyen-de-Paris-dossier-complet.docx
+++ b/export/Chien-citoyen-de-Paris-dossier-complet.docx
@@ -938,14 +938,6 @@
       </w:r>
     </w:p>
     <w:p>
-      <w:r>
-        <w:rPr>
-          <w:b/>
-        </w:rPr>
-        <w:t>Partie III — Les annexes vérifiées et triées</w:t>
-      </w:r>
-    </w:p>
-    <w:p>
       <w:pPr>
         <w:pStyle w:val="ListBullet"/>
       </w:pPr>
@@ -953,7 +945,7 @@
         <w:rPr>
           <w:b w:val="0"/>
         </w:rPr>
-        <w:t>7. Audit anti-hallucination des sources</w:t>
+        <w:t>7. Note de terrain — le 13e arrondissement</w:t>
       </w:r>
       <w:r>
         <w:t xml:space="preserve"> — </w:t>
@@ -963,7 +955,7 @@
           <w:rFonts w:ascii="Consolas" w:hAnsi="Consolas"/>
           <w:sz w:val="20"/>
         </w:rPr>
-        <w:t>AUDIT-SOURCES.md</w:t>
+        <w:t>NOTE-TERRAIN-13E.md</w:t>
       </w:r>
     </w:p>
     <w:p>
@@ -974,7 +966,7 @@
         <w:rPr>
           <w:b w:val="0"/>
         </w:rPr>
-        <w:t>1. Ce qui était faux, et qui a été corrigé dans les documents</w:t>
+        <w:t>1. Pourquoi cet arrondissement</w:t>
       </w:r>
     </w:p>
     <w:p>
@@ -985,7 +977,7 @@
         <w:rPr>
           <w:b w:val="0"/>
         </w:rPr>
-        <w:t>2. Ce que j'avais signalé à tort au premier passage</w:t>
+        <w:t>2. Ce qu'il est, en chiffres</w:t>
       </w:r>
     </w:p>
     <w:p>
@@ -996,7 +988,7 @@
         <w:rPr>
           <w:b w:val="0"/>
         </w:rPr>
-        <w:t>3. Affirmations confirmées, avec la source qui les porte</w:t>
+        <w:t>3. Le paysage politique et institutionnel</w:t>
       </w:r>
     </w:p>
     <w:p>
@@ -1007,7 +999,7 @@
         <w:rPr>
           <w:b w:val="0"/>
         </w:rPr>
-        <w:t>4. Ce qui reste incertain, à assumer tel quel</w:t>
+        <w:t>4. La question canine locale : ce qu'on sait, ce qu'on ne sait pas</w:t>
       </w:r>
     </w:p>
     <w:p>
@@ -1018,7 +1010,7 @@
         <w:rPr>
           <w:b w:val="0"/>
         </w:rPr>
-        <w:t>5. Corrections appliquées aux fichiers</w:t>
+        <w:t>5. Où compter : la règle de sélection, puis le tirage au sort</w:t>
       </w:r>
     </w:p>
     <w:p>
@@ -1029,18 +1021,70 @@
         <w:rPr>
           <w:b w:val="0"/>
         </w:rPr>
-        <w:t>6. Ajouts postérieurs à l'audit</w:t>
-      </w:r>
-    </w:p>
-    <w:p>
-      <w:pPr>
-        <w:pStyle w:val="ListBullet"/>
+        <w:t>6. Les deux sites particuliers de l'arrondissement</w:t>
+      </w:r>
+    </w:p>
+    <w:p>
+      <w:pPr>
+        <w:pStyle w:val="ListBullet2"/>
       </w:pPr>
       <w:r>
         <w:rPr>
           <w:b w:val="0"/>
         </w:rPr>
-        <w:t>8. Note juridique — l'arrêté ADN canin</w:t>
+        <w:t>7. La communication locale, ce qu'elle doit avoir de particulier</w:t>
+      </w:r>
+    </w:p>
+    <w:p>
+      <w:pPr>
+        <w:pStyle w:val="ListBullet2"/>
+      </w:pPr>
+      <w:r>
+        <w:rPr>
+          <w:b w:val="0"/>
+        </w:rPr>
+        <w:t>8. Les demandes écrites, à envoyer avant toute parole publique</w:t>
+      </w:r>
+    </w:p>
+    <w:p>
+      <w:pPr>
+        <w:pStyle w:val="ListBullet2"/>
+      </w:pPr>
+      <w:r>
+        <w:rPr>
+          <w:b w:val="0"/>
+        </w:rPr>
+        <w:t>9. Le calendrier de lancement</w:t>
+      </w:r>
+    </w:p>
+    <w:p>
+      <w:pPr>
+        <w:pStyle w:val="ListBullet2"/>
+      </w:pPr>
+      <w:r>
+        <w:rPr>
+          <w:b w:val="0"/>
+        </w:rPr>
+        <w:t>Sources</w:t>
+      </w:r>
+    </w:p>
+    <w:p>
+      <w:r>
+        <w:rPr>
+          <w:b/>
+        </w:rPr>
+        <w:t>Partie III — Les annexes vérifiées et triées</w:t>
+      </w:r>
+    </w:p>
+    <w:p>
+      <w:pPr>
+        <w:pStyle w:val="ListBullet"/>
+      </w:pPr>
+      <w:r>
+        <w:rPr>
+          <w:b w:val="0"/>
+        </w:rPr>
+        <w:t>8. Audit anti-hallucination des sources</w:t>
       </w:r>
       <w:r>
         <w:t xml:space="preserve"> — </w:t>
@@ -1050,7 +1094,7 @@
           <w:rFonts w:ascii="Consolas" w:hAnsi="Consolas"/>
           <w:sz w:val="20"/>
         </w:rPr>
-        <w:t>NOTE-JURIDIQUE-ARRETE-ADN.md</w:t>
+        <w:t>AUDIT-SOURCES.md</w:t>
       </w:r>
     </w:p>
     <w:p>
@@ -1061,7 +1105,7 @@
         <w:rPr>
           <w:b w:val="0"/>
         </w:rPr>
-        <w:t>1. Les faits de Béziers, précisément</w:t>
+        <w:t>1. Ce qui était faux, et qui a été corrigé dans les documents</w:t>
       </w:r>
     </w:p>
     <w:p>
@@ -1072,7 +1116,7 @@
         <w:rPr>
           <w:b w:val="0"/>
         </w:rPr>
-        <w:t>2. Le point qui change tout pour Paris</w:t>
+        <w:t>2. Ce que j'avais signalé à tort au premier passage</w:t>
       </w:r>
     </w:p>
     <w:p>
@@ -1083,7 +1127,7 @@
         <w:rPr>
           <w:b w:val="0"/>
         </w:rPr>
-        <w:t>3. La recette pour un arrêté qui survit à un recours (déduite du jugement de Béziers)</w:t>
+        <w:t>3. Affirmations confirmées, avec la source qui les porte</w:t>
       </w:r>
     </w:p>
     <w:p>
@@ -1094,7 +1138,7 @@
         <w:rPr>
           <w:b w:val="0"/>
         </w:rPr>
-        <w:t>4. Ce que ça implique pour le projet « chien citoyen »</w:t>
+        <w:t>4. Ce qui reste incertain, à assumer tel quel</w:t>
       </w:r>
     </w:p>
     <w:p>
@@ -1105,18 +1149,29 @@
         <w:rPr>
           <w:b w:val="0"/>
         </w:rPr>
-        <w:t>Sources</w:t>
-      </w:r>
-    </w:p>
-    <w:p>
-      <w:pPr>
-        <w:pStyle w:val="ListBullet"/>
+        <w:t>5. Corrections appliquées aux fichiers</w:t>
+      </w:r>
+    </w:p>
+    <w:p>
+      <w:pPr>
+        <w:pStyle w:val="ListBullet2"/>
       </w:pPr>
       <w:r>
         <w:rPr>
           <w:b w:val="0"/>
         </w:rPr>
-        <w:t>9. Note juridique — la valeur juridique du comptage citoyen</w:t>
+        <w:t>6. Ajouts postérieurs à l'audit</w:t>
+      </w:r>
+    </w:p>
+    <w:p>
+      <w:pPr>
+        <w:pStyle w:val="ListBullet"/>
+      </w:pPr>
+      <w:r>
+        <w:rPr>
+          <w:b w:val="0"/>
+        </w:rPr>
+        <w:t>9. Note juridique — l'arrêté ADN canin</w:t>
       </w:r>
       <w:r>
         <w:t xml:space="preserve"> — </w:t>
@@ -1126,7 +1181,7 @@
           <w:rFonts w:ascii="Consolas" w:hAnsi="Consolas"/>
           <w:sz w:val="20"/>
         </w:rPr>
-        <w:t>NOTE-JURIDIQUE-COMPTAGE-CITOYEN.md</w:t>
+        <w:t>NOTE-JURIDIQUE-ARRETE-ADN.md</w:t>
       </w:r>
     </w:p>
     <w:p>
@@ -1137,7 +1192,7 @@
         <w:rPr>
           <w:b w:val="0"/>
         </w:rPr>
-        <w:t>1. Ce que le juge a réellement reproché à Béziers</w:t>
+        <w:t>1. Les faits de Béziers, précisément</w:t>
       </w:r>
     </w:p>
     <w:p>
@@ -1148,7 +1203,7 @@
         <w:rPr>
           <w:b w:val="0"/>
         </w:rPr>
-        <w:t>2. Les trois piliers d'un relevé qui tient</w:t>
+        <w:t>2. Le point qui change tout pour Paris</w:t>
       </w:r>
     </w:p>
     <w:p>
@@ -1159,7 +1214,7 @@
         <w:rPr>
           <w:b w:val="0"/>
         </w:rPr>
-        <w:t>3. Le piège à ne pas recréer : les données personnelles</w:t>
+        <w:t>3. La recette pour un arrêté qui survit à un recours (déduite du jugement de Béziers)</w:t>
       </w:r>
     </w:p>
     <w:p>
@@ -1170,7 +1225,7 @@
         <w:rPr>
           <w:b w:val="0"/>
         </w:rPr>
-        <w:t>4. Ce qu'un comptage citoyen ne peut pas faire</w:t>
+        <w:t>4. Ce que ça implique pour le projet « chien citoyen »</w:t>
       </w:r>
     </w:p>
     <w:p>
@@ -1181,40 +1236,18 @@
         <w:rPr>
           <w:b w:val="0"/>
         </w:rPr>
-        <w:t>5. Les trois niveaux d'escalade</w:t>
-      </w:r>
-    </w:p>
-    <w:p>
-      <w:pPr>
-        <w:pStyle w:val="ListBullet2"/>
+        <w:t>Sources</w:t>
+      </w:r>
+    </w:p>
+    <w:p>
+      <w:pPr>
+        <w:pStyle w:val="ListBullet"/>
       </w:pPr>
       <w:r>
         <w:rPr>
           <w:b w:val="0"/>
         </w:rPr>
-        <w:t>6. Ce que le comptage ne suffira pas à fermer</w:t>
-      </w:r>
-    </w:p>
-    <w:p>
-      <w:pPr>
-        <w:pStyle w:val="ListBullet2"/>
-      </w:pPr>
-      <w:r>
-        <w:rPr>
-          <w:b w:val="0"/>
-        </w:rPr>
-        <w:t>Sources</w:t>
-      </w:r>
-    </w:p>
-    <w:p>
-      <w:pPr>
-        <w:pStyle w:val="ListBullet"/>
-      </w:pPr>
-      <w:r>
-        <w:rPr>
-          <w:b w:val="0"/>
-        </w:rPr>
-        <w:t>10. Architecture — chaîne de preuve outillée (photo en contexte, QR, registre horodaté)</w:t>
+        <w:t>10. Note juridique — la valeur juridique du comptage citoyen</w:t>
       </w:r>
       <w:r>
         <w:t xml:space="preserve"> — </w:t>
@@ -1224,7 +1257,7 @@
           <w:rFonts w:ascii="Consolas" w:hAnsi="Consolas"/>
           <w:sz w:val="20"/>
         </w:rPr>
-        <w:t>ARCHI-CHAINE-DE-PREUVE.md</w:t>
+        <w:t>NOTE-JURIDIQUE-COMPTAGE-CITOYEN.md</w:t>
       </w:r>
     </w:p>
     <w:p>
@@ -1235,7 +1268,7 @@
         <w:rPr>
           <w:b w:val="0"/>
         </w:rPr>
-        <w:t>1. Le partage à ne pas se tromper</w:t>
+        <w:t>1. Ce que le juge a réellement reproché à Béziers</w:t>
       </w:r>
     </w:p>
     <w:p>
@@ -1246,7 +1279,7 @@
         <w:rPr>
           <w:b w:val="0"/>
         </w:rPr>
-        <w:t>2. Le principe : un identifiant, deux chaînes</w:t>
+        <w:t>2. Les trois piliers d'un relevé qui tient</w:t>
       </w:r>
     </w:p>
     <w:p>
@@ -1257,7 +1290,7 @@
         <w:rPr>
           <w:b w:val="0"/>
         </w:rPr>
-        <w:t>3. La photo en contexte, et à quoi sert vraiment le QR</w:t>
+        <w:t>3. Le piège à ne pas recréer : les données personnelles</w:t>
       </w:r>
     </w:p>
     <w:p>
@@ -1268,7 +1301,7 @@
         <w:rPr>
           <w:b w:val="0"/>
         </w:rPr>
-        <w:t>4. Contradictoire outillé, sans le remplacer</w:t>
+        <w:t>4. Ce qu'un comptage citoyen ne peut pas faire</w:t>
       </w:r>
     </w:p>
     <w:p>
@@ -1279,7 +1312,7 @@
         <w:rPr>
           <w:b w:val="0"/>
         </w:rPr>
-        <w:t>5. Les chiffres, et comment ils résistent</w:t>
+        <w:t>5. Les trois niveaux d'escalade</w:t>
       </w:r>
     </w:p>
     <w:p>
@@ -1290,7 +1323,7 @@
         <w:rPr>
           <w:b w:val="0"/>
         </w:rPr>
-        <w:t>6. Ouvert : ce que « ouvert » doit vouloir dire</w:t>
+        <w:t>6. Ce que le comptage ne suffira pas à fermer</w:t>
       </w:r>
     </w:p>
     <w:p>
@@ -1301,29 +1334,18 @@
         <w:rPr>
           <w:b w:val="0"/>
         </w:rPr>
-        <w:t>7. La séquence, et pourquoi il ne faut pas commencer par l'application</w:t>
-      </w:r>
-    </w:p>
-    <w:p>
-      <w:pPr>
-        <w:pStyle w:val="ListBullet2"/>
+        <w:t>Sources</w:t>
+      </w:r>
+    </w:p>
+    <w:p>
+      <w:pPr>
+        <w:pStyle w:val="ListBullet"/>
       </w:pPr>
       <w:r>
         <w:rPr>
           <w:b w:val="0"/>
         </w:rPr>
-        <w:t>8. Ce que ça peut devenir</w:t>
-      </w:r>
-    </w:p>
-    <w:p>
-      <w:pPr>
-        <w:pStyle w:val="ListBullet"/>
-      </w:pPr>
-      <w:r>
-        <w:rPr>
-          <w:b w:val="0"/>
-        </w:rPr>
-        <w:t>11. Tests ADN canins : coûts et faisabilité</w:t>
+        <w:t>11. Architecture — chaîne de preuve outillée (photo en contexte, QR, registre horodaté)</w:t>
       </w:r>
       <w:r>
         <w:t xml:space="preserve"> — </w:t>
@@ -1333,7 +1355,7 @@
           <w:rFonts w:ascii="Consolas" w:hAnsi="Consolas"/>
           <w:sz w:val="20"/>
         </w:rPr>
-        <w:t>ADN-COUTS-FAISABILITE.md</w:t>
+        <w:t>ARCHI-CHAINE-DE-PREUVE.md</w:t>
       </w:r>
     </w:p>
     <w:p>
@@ -1344,7 +1366,7 @@
         <w:rPr>
           <w:b w:val="0"/>
         </w:rPr>
-        <w:t>1. Combien coûte un test, concrètement</w:t>
+        <w:t>1. Le partage à ne pas se tromper</w:t>
       </w:r>
     </w:p>
     <w:p>
@@ -1355,7 +1377,7 @@
         <w:rPr>
           <w:b w:val="0"/>
         </w:rPr>
-        <w:t>2. Est-ce facile à faire ? Oui, techniquement. Les points durs sont ailleurs.</w:t>
+        <w:t>2. Le principe : un identifiant, deux chaînes</w:t>
       </w:r>
     </w:p>
     <w:p>
@@ -1366,7 +1388,7 @@
         <w:rPr>
           <w:b w:val="0"/>
         </w:rPr>
-        <w:t>3. Chiffrage pour Paris</w:t>
+        <w:t>3. La photo en contexte, et à quoi sert vraiment le QR</w:t>
       </w:r>
     </w:p>
     <w:p>
@@ -1377,18 +1399,62 @@
         <w:rPr>
           <w:b w:val="0"/>
         </w:rPr>
-        <w:t>4. Le test le moins cher à faire maintenant (pour aller vite sans argent)</w:t>
-      </w:r>
-    </w:p>
-    <w:p>
-      <w:pPr>
-        <w:pStyle w:val="ListBullet"/>
+        <w:t>4. Contradictoire outillé, sans le remplacer</w:t>
+      </w:r>
+    </w:p>
+    <w:p>
+      <w:pPr>
+        <w:pStyle w:val="ListBullet2"/>
       </w:pPr>
       <w:r>
         <w:rPr>
           <w:b w:val="0"/>
         </w:rPr>
-        <w:t>12. Statut du chien citoyen — note de conception</w:t>
+        <w:t>5. Les chiffres, et comment ils résistent</w:t>
+      </w:r>
+    </w:p>
+    <w:p>
+      <w:pPr>
+        <w:pStyle w:val="ListBullet2"/>
+      </w:pPr>
+      <w:r>
+        <w:rPr>
+          <w:b w:val="0"/>
+        </w:rPr>
+        <w:t>6. Ouvert : ce que « ouvert » doit vouloir dire</w:t>
+      </w:r>
+    </w:p>
+    <w:p>
+      <w:pPr>
+        <w:pStyle w:val="ListBullet2"/>
+      </w:pPr>
+      <w:r>
+        <w:rPr>
+          <w:b w:val="0"/>
+        </w:rPr>
+        <w:t>7. La séquence, et pourquoi il ne faut pas commencer par l'application</w:t>
+      </w:r>
+    </w:p>
+    <w:p>
+      <w:pPr>
+        <w:pStyle w:val="ListBullet2"/>
+      </w:pPr>
+      <w:r>
+        <w:rPr>
+          <w:b w:val="0"/>
+        </w:rPr>
+        <w:t>8. Ce que ça peut devenir</w:t>
+      </w:r>
+    </w:p>
+    <w:p>
+      <w:pPr>
+        <w:pStyle w:val="ListBullet"/>
+      </w:pPr>
+      <w:r>
+        <w:rPr>
+          <w:b w:val="0"/>
+        </w:rPr>
+        <w:t>12. Tests ADN canins : coûts et faisabilité</w:t>
       </w:r>
       <w:r>
         <w:t xml:space="preserve"> — </w:t>
@@ -1398,7 +1464,7 @@
           <w:rFonts w:ascii="Consolas" w:hAnsi="Consolas"/>
           <w:sz w:val="20"/>
         </w:rPr>
-        <w:t>STATUT-CHIEN-CITOYEN.md</w:t>
+        <w:t>ADN-COUTS-FAISABILITE.md</w:t>
       </w:r>
     </w:p>
     <w:p>
@@ -1409,7 +1475,7 @@
         <w:rPr>
           <w:b w:val="0"/>
         </w:rPr>
-        <w:t>0. Le verdict d'abord</w:t>
+        <w:t>1. Combien coûte un test, concrètement</w:t>
       </w:r>
     </w:p>
     <w:p>
@@ -1420,7 +1486,7 @@
         <w:rPr>
           <w:b w:val="0"/>
         </w:rPr>
-        <w:t>1. Le dispositif, brique par brique</w:t>
+        <w:t>2. Est-ce facile à faire ? Oui, techniquement. Les points durs sont ailleurs.</w:t>
       </w:r>
     </w:p>
     <w:p>
@@ -1431,7 +1497,7 @@
         <w:rPr>
           <w:b w:val="0"/>
         </w:rPr>
-        <w:t>2. Qui peut faire quoi (le vrai tableau de contraintes)</w:t>
+        <w:t>3. Chiffrage pour Paris</w:t>
       </w:r>
     </w:p>
     <w:p>
@@ -1442,62 +1508,18 @@
         <w:rPr>
           <w:b w:val="0"/>
         </w:rPr>
-        <w:t>3. Chiffrage</w:t>
-      </w:r>
-    </w:p>
-    <w:p>
-      <w:pPr>
-        <w:pStyle w:val="ListBullet2"/>
+        <w:t>4. Le test le moins cher à faire maintenant (pour aller vite sans argent)</w:t>
+      </w:r>
+    </w:p>
+    <w:p>
+      <w:pPr>
+        <w:pStyle w:val="ListBullet"/>
       </w:pPr>
       <w:r>
         <w:rPr>
           <w:b w:val="0"/>
         </w:rPr>
-        <w:t>4. Les cinq décisions à trancher (ce sont elles, le projet politique)</w:t>
-      </w:r>
-    </w:p>
-    <w:p>
-      <w:pPr>
-        <w:pStyle w:val="ListBullet2"/>
-      </w:pPr>
-      <w:r>
-        <w:rPr>
-          <w:b w:val="0"/>
-        </w:rPr>
-        <w:t>5. Objections à anticiper (sinon elles tueront le projet)</w:t>
-      </w:r>
-    </w:p>
-    <w:p>
-      <w:pPr>
-        <w:pStyle w:val="ListBullet2"/>
-      </w:pPr>
-      <w:r>
-        <w:rPr>
-          <w:b w:val="0"/>
-        </w:rPr>
-        <w:t>6. Positionnement : la formulation qui peut devenir majoritaire</w:t>
-      </w:r>
-    </w:p>
-    <w:p>
-      <w:pPr>
-        <w:pStyle w:val="ListBullet2"/>
-      </w:pPr>
-      <w:r>
-        <w:rPr>
-          <w:b w:val="0"/>
-        </w:rPr>
-        <w:t>7. Prochaines étapes (coût, délai)</w:t>
-      </w:r>
-    </w:p>
-    <w:p>
-      <w:pPr>
-        <w:pStyle w:val="ListBullet"/>
-      </w:pPr>
-      <w:r>
-        <w:rPr>
-          <w:b w:val="0"/>
-        </w:rPr>
-        <w:t>13. Projet d'arrêté et règlement du statut</w:t>
+        <w:t>13. Statut du chien citoyen — note de conception</w:t>
       </w:r>
       <w:r>
         <w:t xml:space="preserve"> — </w:t>
@@ -1507,7 +1529,7 @@
           <w:rFonts w:ascii="Consolas" w:hAnsi="Consolas"/>
           <w:sz w:val="20"/>
         </w:rPr>
-        <w:t>PROJET-ARRETE-STATUT-CHIEN-CITOYEN.md</w:t>
+        <w:t>STATUT-CHIEN-CITOYEN.md</w:t>
       </w:r>
     </w:p>
     <w:p>
@@ -1518,7 +1540,7 @@
         <w:rPr>
           <w:b w:val="0"/>
         </w:rPr>
-        <w:t>A. Projet d'arrêté (expérimentation de 24 mois)</w:t>
+        <w:t>0. Le verdict d'abord</w:t>
       </w:r>
     </w:p>
     <w:p>
@@ -1529,7 +1551,7 @@
         <w:rPr>
           <w:b w:val="0"/>
         </w:rPr>
-        <w:t>B. Règlement du statut</w:t>
+        <w:t>1. Le dispositif, brique par brique</w:t>
       </w:r>
     </w:p>
     <w:p>
@@ -1540,7 +1562,7 @@
         <w:rPr>
           <w:b w:val="0"/>
         </w:rPr>
-        <w:t>C. Le parcours propriétaire, en cinq étapes (le point qui décide du taux d'adhésion)</w:t>
+        <w:t>2. Qui peut faire quoi (le vrai tableau de contraintes)</w:t>
       </w:r>
     </w:p>
     <w:p>
@@ -1551,18 +1573,62 @@
         <w:rPr>
           <w:b w:val="0"/>
         </w:rPr>
-        <w:t>D. Maquette de données (à valider par le DPO de la Ville)</w:t>
-      </w:r>
-    </w:p>
-    <w:p>
-      <w:pPr>
-        <w:pStyle w:val="ListBullet"/>
+        <w:t>3. Chiffrage</w:t>
+      </w:r>
+    </w:p>
+    <w:p>
+      <w:pPr>
+        <w:pStyle w:val="ListBullet2"/>
       </w:pPr>
       <w:r>
         <w:rPr>
           <w:b w:val="0"/>
         </w:rPr>
-        <w:t>14. Projet « chiens de Paris » — creusage</w:t>
+        <w:t>4. Les cinq décisions à trancher (ce sont elles, le projet politique)</w:t>
+      </w:r>
+    </w:p>
+    <w:p>
+      <w:pPr>
+        <w:pStyle w:val="ListBullet2"/>
+      </w:pPr>
+      <w:r>
+        <w:rPr>
+          <w:b w:val="0"/>
+        </w:rPr>
+        <w:t>5. Objections à anticiper (sinon elles tueront le projet)</w:t>
+      </w:r>
+    </w:p>
+    <w:p>
+      <w:pPr>
+        <w:pStyle w:val="ListBullet2"/>
+      </w:pPr>
+      <w:r>
+        <w:rPr>
+          <w:b w:val="0"/>
+        </w:rPr>
+        <w:t>6. Positionnement : la formulation qui peut devenir majoritaire</w:t>
+      </w:r>
+    </w:p>
+    <w:p>
+      <w:pPr>
+        <w:pStyle w:val="ListBullet2"/>
+      </w:pPr>
+      <w:r>
+        <w:rPr>
+          <w:b w:val="0"/>
+        </w:rPr>
+        <w:t>7. Prochaines étapes (coût, délai)</w:t>
+      </w:r>
+    </w:p>
+    <w:p>
+      <w:pPr>
+        <w:pStyle w:val="ListBullet"/>
+      </w:pPr>
+      <w:r>
+        <w:rPr>
+          <w:b w:val="0"/>
+        </w:rPr>
+        <w:t>14. Projet d'arrêté et règlement du statut</w:t>
       </w:r>
       <w:r>
         <w:t xml:space="preserve"> — </w:t>
@@ -1572,6 +1638,71 @@
           <w:rFonts w:ascii="Consolas" w:hAnsi="Consolas"/>
           <w:sz w:val="20"/>
         </w:rPr>
+        <w:t>PROJET-ARRETE-STATUT-CHIEN-CITOYEN.md</w:t>
+      </w:r>
+    </w:p>
+    <w:p>
+      <w:pPr>
+        <w:pStyle w:val="ListBullet2"/>
+      </w:pPr>
+      <w:r>
+        <w:rPr>
+          <w:b w:val="0"/>
+        </w:rPr>
+        <w:t>A. Projet d'arrêté (expérimentation de 24 mois)</w:t>
+      </w:r>
+    </w:p>
+    <w:p>
+      <w:pPr>
+        <w:pStyle w:val="ListBullet2"/>
+      </w:pPr>
+      <w:r>
+        <w:rPr>
+          <w:b w:val="0"/>
+        </w:rPr>
+        <w:t>B. Règlement du statut</w:t>
+      </w:r>
+    </w:p>
+    <w:p>
+      <w:pPr>
+        <w:pStyle w:val="ListBullet2"/>
+      </w:pPr>
+      <w:r>
+        <w:rPr>
+          <w:b w:val="0"/>
+        </w:rPr>
+        <w:t>C. Le parcours propriétaire, en cinq étapes (le point qui décide du taux d'adhésion)</w:t>
+      </w:r>
+    </w:p>
+    <w:p>
+      <w:pPr>
+        <w:pStyle w:val="ListBullet2"/>
+      </w:pPr>
+      <w:r>
+        <w:rPr>
+          <w:b w:val="0"/>
+        </w:rPr>
+        <w:t>D. Maquette de données (à valider par le DPO de la Ville)</w:t>
+      </w:r>
+    </w:p>
+    <w:p>
+      <w:pPr>
+        <w:pStyle w:val="ListBullet"/>
+      </w:pPr>
+      <w:r>
+        <w:rPr>
+          <w:b w:val="0"/>
+        </w:rPr>
+        <w:t>15. Projet « chiens de Paris » — creusage</w:t>
+      </w:r>
+      <w:r>
+        <w:t xml:space="preserve"> — </w:t>
+      </w:r>
+      <w:r>
+        <w:rPr>
+          <w:rFonts w:ascii="Consolas" w:hAnsi="Consolas"/>
+          <w:sz w:val="20"/>
+        </w:rPr>
         <w:t>PROJET-CHIENS-PARIS.md</w:t>
       </w:r>
     </w:p>
@@ -1671,7 +1802,7 @@
         <w:rPr>
           <w:b w:val="0"/>
         </w:rPr>
-        <w:t>15. Rapport complet et chiffrage</w:t>
+        <w:t>16. Rapport complet et chiffrage</w:t>
       </w:r>
       <w:r>
         <w:t xml:space="preserve"> — </w:t>
@@ -6111,7 +6242,7 @@
           <w:rFonts w:ascii="Consolas" w:hAnsi="Consolas"/>
           <w:sz w:val="20"/>
         </w:rPr>
-        <w:t>[AUDIT-SOURCES.md](#7-audit-anti-hallucination-du-dossier-chiens-paris)</w:t>
+        <w:t>[AUDIT-SOURCES.md](#8-audit-anti-hallucination-du-dossier-chiens-paris)</w:t>
       </w:r>
       <w:r>
         <w:t xml:space="preserve">. La superficie du parc Monceau (8,25 ha) : https://www.paris.fr/lieux/parc-monceau-1804 Le détail des coûts et des hypothèses : </w:t>
@@ -6121,7 +6252,7 @@
           <w:rFonts w:ascii="Consolas" w:hAnsi="Consolas"/>
           <w:sz w:val="20"/>
         </w:rPr>
-        <w:t>[RAPPORT-COMPLET-CHIENS-PARIS.md](#15-rapport--un-projet-politique--chiens-de-paris---statut-du-chien-citoyen-registre-adn-droits-et-chiffrage)</w:t>
+        <w:t>[RAPPORT-COMPLET-CHIENS-PARIS.md](#16-rapport--un-projet-politique--chiens-de-paris---statut-du-chien-citoyen-registre-adn-droits-et-chiffrage)</w:t>
       </w:r>
       <w:r>
         <w:t xml:space="preserve"> (annexe E pour les URL).</w:t>
@@ -6564,6 +6695,742 @@
     </w:p>
     <w:p/>
     <w:p>
+      <w:pPr>
+        <w:pStyle w:val="Heading2"/>
+      </w:pPr>
+      <w:r>
+        <w:t>7. Note de terrain — le 13e arrondissement</w:t>
+      </w:r>
+    </w:p>
+    <w:p>
+      <w:r>
+        <w:rPr>
+          <w:i/>
+        </w:rPr>
+        <w:t>Source : `NOTE-TERRAIN-13E.md`.</w:t>
+      </w:r>
+    </w:p>
+    <w:p>
+      <w:r>
+        <w:t>29 septembre 2026. Tout ce qui concerne l'arrondissement pilote en un seul endroit : pourquoi lui, ce qu'il est en chiffres, qui compte politiquement, où compter, et ce qu'il faut demander par écrit avant de dire quoi que ce soit en public. Les chiffres sourcés viennent de l'INSEE via le contrat de prévention et de sécurité du 13e (2023) et de la page des élus d'arrondissements de la Ville (2026) ; ce qui est marqué [E] est une estimation de notre part. Rien n'a été voté.</w:t>
+      </w:r>
+    </w:p>
+    <w:p>
+      <w:pPr>
+        <w:pStyle w:val="Heading3"/>
+      </w:pPr>
+      <w:r>
+        <w:t>1. Pourquoi cet arrondissement</w:t>
+      </w:r>
+    </w:p>
+    <w:p>
+      <w:r>
+        <w:t xml:space="preserve">Le critère qui a décidé n'est ni la densité canine ni la taille du conseil, mais </w:t>
+      </w:r>
+      <w:r>
+        <w:rPr>
+          <w:b/>
+        </w:rPr>
+        <w:t>qui compte</w:t>
+      </w:r>
+      <w:r>
+        <w:t xml:space="preserve"> : les volontaires qui feront le comptage vivent tous dans le 13e. Un pilote où personne ne compte ne vaut rien. Et le 13e tient le reste sur ses propres mérites — poids politique et durée, beaucoup d'espaces verts pour peu de droits des chiens, un tissu social qui neutralise l'objection « péage pour riches », et un lieu où l'usage dépasse déjà la règle. Le détail du raisonnement est dans </w:t>
+      </w:r>
+      <w:r>
+        <w:rPr>
+          <w:rFonts w:ascii="Consolas" w:hAnsi="Consolas"/>
+          <w:sz w:val="20"/>
+        </w:rPr>
+        <w:t>[LANCEMENT-PAR-LE-COMPTAGE.md](#6-lancer-par-le-comptage)</w:t>
+      </w:r>
+      <w:r>
+        <w:t>, section 6.</w:t>
+      </w:r>
+    </w:p>
+    <w:p>
+      <w:pPr>
+        <w:pStyle w:val="Heading3"/>
+      </w:pPr>
+      <w:r>
+        <w:t>2. Ce qu'il est, en chiffres</w:t>
+      </w:r>
+    </w:p>
+    <w:p>
+      <w:pPr>
+        <w:pStyle w:val="ListBullet"/>
+      </w:pPr>
+      <w:r>
+        <w:rPr>
+          <w:b/>
+        </w:rPr>
+        <w:t>180 005 habitants</w:t>
+      </w:r>
+      <w:r>
+        <w:t xml:space="preserve"> (INSEE, 2019), 8,3 % de la population parisienne pour 8,2 % de la surface ; population stable, contrairement à la plupart des arrondissements.</w:t>
+      </w:r>
+    </w:p>
+    <w:p>
+      <w:pPr>
+        <w:pStyle w:val="ListBullet"/>
+      </w:pPr>
+      <w:r>
+        <w:rPr>
+          <w:b/>
+        </w:rPr>
+        <w:t>714,6 hectares</w:t>
+      </w:r>
+      <w:r>
+        <w:t xml:space="preserve"> : troisième arrondissement le plus vaste de Paris.</w:t>
+      </w:r>
+    </w:p>
+    <w:p>
+      <w:pPr>
+        <w:pStyle w:val="ListBullet"/>
+      </w:pPr>
+      <w:r>
+        <w:rPr>
+          <w:b/>
+        </w:rPr>
+        <w:t>25 100 € de revenu médian</w:t>
+      </w:r>
+      <w:r>
+        <w:t xml:space="preserve">, contre 28 790 € à Paris ; </w:t>
+      </w:r>
+      <w:r>
+        <w:rPr>
+          <w:b/>
+        </w:rPr>
+        <w:t>31 % d'employés et d'ouvriers</w:t>
+      </w:r>
+      <w:r>
+        <w:t xml:space="preserve"> parmi les actifs, contre 26 % à Paris ; 25,6 % de cadres, contre 29,8 %.</w:t>
+      </w:r>
+    </w:p>
+    <w:p>
+      <w:pPr>
+        <w:pStyle w:val="ListBullet"/>
+      </w:pPr>
+      <w:r>
+        <w:rPr>
+          <w:b/>
+        </w:rPr>
+        <w:t>17 % des habitants sous le seuil de pauvreté</w:t>
+      </w:r>
+      <w:r>
+        <w:t xml:space="preserve"> (15,4 % à Paris) ; 9,6 % de chômage, troisième arrondissement le plus touché après le 19e et le 20e.</w:t>
+      </w:r>
+    </w:p>
+    <w:p>
+      <w:pPr>
+        <w:pStyle w:val="ListBullet"/>
+      </w:pPr>
+      <w:r>
+        <w:rPr>
+          <w:b/>
+        </w:rPr>
+        <w:t>39,5 % de logements sociaux SRU</w:t>
+      </w:r>
+      <w:r>
+        <w:t xml:space="preserve"> (35 583 logements), contre 21,4 % à Paris. Un habitant sur cinq vit dans un quartier prioritaire de la politique de la ville, et l'arrondissement accueille le plus grand nombre de places d'hébergement d'urgence de Paris.</w:t>
+      </w:r>
+    </w:p>
+    <w:p>
+      <w:pPr>
+        <w:pStyle w:val="ListBullet"/>
+      </w:pPr>
+      <w:r>
+        <w:rPr>
+          <w:b/>
+        </w:rPr>
+        <w:t>21 700 familles</w:t>
+      </w:r>
+      <w:r>
+        <w:t xml:space="preserve"> (24 % des ménages, contre 22 % à Paris), ménages plus grands qu'ailleurs.</w:t>
+      </w:r>
+    </w:p>
+    <w:p>
+      <w:pPr>
+        <w:pStyle w:val="ListBullet"/>
+      </w:pPr>
+      <w:r>
+        <w:rPr>
+          <w:b/>
+        </w:rPr>
+        <w:t>62 espaces verts ouverts au public</w:t>
+      </w:r>
+      <w:r>
+        <w:t>, 61 parcs et jardins municipaux, soit 6 % de la surface de l'arrondissement : un des arrondissements aux plus grands parcs et jardins.</w:t>
+      </w:r>
+    </w:p>
+    <w:p>
+      <w:pPr>
+        <w:pStyle w:val="ListBullet"/>
+      </w:pPr>
+      <w:r>
+        <w:rPr>
+          <w:b/>
+        </w:rPr>
+        <w:t>8 conseils de quartier</w:t>
+      </w:r>
+      <w:r>
+        <w:t xml:space="preserve"> : Croulebarbe, Butte-aux-Cailles – Daviel – Boussingault, Italie – Peupliers – Rungis, Salpêtrière – Austerlitz, Cœur du 13e, Olympiades – Choisy, Masséna – Jeanne d'Arc, Biblioseine.</w:t>
+      </w:r>
+    </w:p>
+    <w:p>
+      <w:pPr>
+        <w:pStyle w:val="Heading3"/>
+      </w:pPr>
+      <w:r>
+        <w:t>3. Le paysage politique et institutionnel</w:t>
+      </w:r>
+    </w:p>
+    <w:p>
+      <w:pPr>
+        <w:pStyle w:val="ListBullet"/>
+      </w:pPr>
+      <w:r>
+        <w:rPr>
+          <w:b/>
+        </w:rPr>
+        <w:t>116 196 inscrits</w:t>
+      </w:r>
+      <w:r>
+        <w:t>, 57,49 % de participation au premier tour de mars 2026.</w:t>
+      </w:r>
+    </w:p>
+    <w:p>
+      <w:pPr>
+        <w:pStyle w:val="ListBullet"/>
+      </w:pPr>
+      <w:r>
+        <w:rPr>
+          <w:b/>
+        </w:rPr>
+        <w:t>43 sièges</w:t>
+      </w:r>
+      <w:r>
+        <w:t xml:space="preserve"> au conseil d'arrondissement : 12 conseillers de Paris et 31 conseillers d'arrondissement.</w:t>
+      </w:r>
+    </w:p>
+    <w:p>
+      <w:pPr>
+        <w:pStyle w:val="ListBullet"/>
+      </w:pPr>
+      <w:r>
+        <w:rPr>
+          <w:b/>
+        </w:rPr>
+        <w:t>Maire : Jérôme Coumet</w:t>
+      </w:r>
+      <w:r>
+        <w:t>, élu au premier tour avec 51,52 % des suffrages exprimés et 35 des 43 sièges. Majorité stable pour six ans — donc le temps d'une expérimentation, et un rapport de force où une délibération d'arrondissement est atteignable.</w:t>
+      </w:r>
+    </w:p>
+    <w:p>
+      <w:pPr>
+        <w:pStyle w:val="ListBullet"/>
+      </w:pPr>
+      <w:r>
+        <w:t xml:space="preserve">Conséquence pratique : la mairie d'arrondissement est le bon interlocuteur, pas la Ville, pour un vœu, une expérimentation ou un comptage présenté en séance. Les </w:t>
+      </w:r>
+      <w:r>
+        <w:rPr>
+          <w:b/>
+        </w:rPr>
+        <w:t>conseils de quartier</w:t>
+      </w:r>
+      <w:r>
+        <w:t xml:space="preserve"> sont le premier lieu où faire exister le sujet auprès des habitants, et le premier réservoir de volontaires.</w:t>
+      </w:r>
+    </w:p>
+    <w:p>
+      <w:pPr>
+        <w:pStyle w:val="Heading3"/>
+      </w:pPr>
+      <w:r>
+        <w:t>4. La question canine locale : ce qu'on sait, ce qu'on ne sait pas</w:t>
+      </w:r>
+    </w:p>
+    <w:p>
+      <w:pPr>
+        <w:pStyle w:val="ListBullet"/>
+      </w:pPr>
+      <w:r>
+        <w:rPr>
+          <w:b/>
+        </w:rPr>
+        <w:t>On ne sait pas</w:t>
+      </w:r>
+      <w:r>
+        <w:t xml:space="preserve"> combien de chiens sont identifiés dans le 13e. Le dossier a 6 133 chiens pour le 20e et 3 580 pour le 10e, rien de fiable ici.</w:t>
+      </w:r>
+    </w:p>
+    <w:p>
+      <w:pPr>
+        <w:pStyle w:val="ListBullet"/>
+      </w:pPr>
+      <w:r>
+        <w:rPr>
+          <w:b/>
+        </w:rPr>
+        <w:t>Ordre de grandeur [E]</w:t>
+      </w:r>
+      <w:r>
+        <w:t xml:space="preserve"> : au ratio parisien d'un chien pour 21 habitants, le 13e compterait de l'ordre de </w:t>
+      </w:r>
+      <w:r>
+        <w:rPr>
+          <w:b/>
+        </w:rPr>
+        <w:t>8 500 chiens</w:t>
+      </w:r>
+      <w:r>
+        <w:t xml:space="preserve"> — estimation à remplacer par le chiffre I-CAD dès qu'il est obtenu, jamais à publier telle quelle.</w:t>
+      </w:r>
+    </w:p>
+    <w:p>
+      <w:pPr>
+        <w:pStyle w:val="ListBullet"/>
+      </w:pPr>
+      <w:r>
+        <w:rPr>
+          <w:b/>
+        </w:rPr>
+        <w:t>On ne connaît pas</w:t>
+      </w:r>
+      <w:r>
+        <w:t xml:space="preserve"> la liste exacte des espaces canins du 13e ni celle des jardins où les chiens sont admis, même en laisse. Des sites tiers citent cinq jardins accessibles dans l'arrondissement ; seule la liste officielle par arrondissement vaut.</w:t>
+      </w:r>
+    </w:p>
+    <w:p>
+      <w:pPr>
+        <w:pStyle w:val="ListBullet"/>
+      </w:pPr>
+      <w:r>
+        <w:rPr>
+          <w:b/>
+        </w:rPr>
+        <w:t>On sait</w:t>
+      </w:r>
+      <w:r>
+        <w:t xml:space="preserve"> que l'usage dépasse la règle à la Poterne des Peupliers : le contrat de prévention et de sécurité du 13e signale la promenade de la petite ceinture — « SDF et chiens non tenus en laisse » — parmi ses points sensibles. Or la fiche officielle du lieu indique « admission animaux : non » : </w:t>
+      </w:r>
+      <w:r>
+        <w:rPr>
+          <w:b/>
+        </w:rPr>
+        <w:t>ce n'est pas là qu'il faut demander un espace de liberté</w:t>
+      </w:r>
+      <w:r>
+        <w:t>, seulement là qu'il faut compter l'usage réel (voir section 6).</w:t>
+      </w:r>
+    </w:p>
+    <w:p>
+      <w:pPr>
+        <w:pStyle w:val="Heading3"/>
+      </w:pPr>
+      <w:r>
+        <w:t>5. Où compter : la règle de sélection, puis le tirage au sort</w:t>
+      </w:r>
+    </w:p>
+    <w:p>
+      <w:r>
+        <w:t>La faiblesse la plus facile à exploiter est « vous avez compté où vous vouliez ». La parade est écrite d'avance :</w:t>
+      </w:r>
+    </w:p>
+    <w:p>
+      <w:pPr>
+        <w:pStyle w:val="ListNumber"/>
+      </w:pPr>
+      <w:r>
+        <w:rPr>
+          <w:b/>
+        </w:rPr>
+        <w:t>Liste des tronçons candidats établie selon une règle explicite</w:t>
+      </w:r>
+      <w:r>
+        <w:t>, avant tout comptage : une voie bordant un marché de l'arrondissement, une voie bordant deux écoles, une sortie de métro, les abords d'un jardin, un axe de promenade des chiens. La liste est construite à partir des données publiques (carte scolaire, recensement des marchés, stations de métro), pas à la main.</w:t>
+      </w:r>
+    </w:p>
+    <w:p>
+      <w:pPr>
+        <w:pStyle w:val="ListNumber"/>
+      </w:pPr>
+      <w:r>
+        <w:rPr>
+          <w:b/>
+        </w:rPr>
+        <w:t>Tirage au sort publié</w:t>
+      </w:r>
+      <w:r>
+        <w:t xml:space="preserve"> parmi ces candidats : graine, date, témoin, résultat. Un tirage se vérifie, une sélection se discute.</w:t>
+      </w:r>
+    </w:p>
+    <w:p>
+      <w:pPr>
+        <w:pStyle w:val="ListNumber"/>
+      </w:pPr>
+      <w:r>
+        <w:rPr>
+          <w:b/>
+        </w:rPr>
+        <w:t>Zone témoin</w:t>
+      </w:r>
+      <w:r>
+        <w:t xml:space="preserve"> de cinq tronçons comparables où rien ne change, comptés en parallèle pendant toute la durée.</w:t>
+      </w:r>
+    </w:p>
+    <w:p>
+      <w:pPr>
+        <w:pStyle w:val="ListNumber"/>
+      </w:pPr>
+      <w:r>
+        <w:t>Longueur de référence : tronçons de 300 m, comptage en déjections pour 100 m et par passage.</w:t>
+      </w:r>
+    </w:p>
+    <w:p>
+      <w:pPr>
+        <w:pStyle w:val="Heading3"/>
+      </w:pPr>
+      <w:r>
+        <w:t>6. Les deux sites particuliers de l'arrondissement</w:t>
+      </w:r>
+    </w:p>
+    <w:p>
+      <w:pPr>
+        <w:pStyle w:val="ListBullet"/>
+      </w:pPr>
+      <w:r>
+        <w:rPr>
+          <w:b/>
+        </w:rPr>
+        <w:t>Petite ceinture du 13e (PC 13), Poterne des Peupliers</w:t>
+      </w:r>
+      <w:r>
+        <w:t xml:space="preserve"> — 12 234 m², ouverte depuis 2016, reliant les jardins Charles-Trenet, Moulin-de-la-Pointe et Poterne-des-Peupliers, label Ecojardin, horaires 8 h – 20 h 30 en saison et ouverture H24 du troisième lundi d'avril au troisième dimanche de septembre. « Admission animaux : non ». À traiter comme </w:t>
+      </w:r>
+      <w:r>
+        <w:rPr>
+          <w:b/>
+        </w:rPr>
+        <w:t>site de comptage d'usage</w:t>
+      </w:r>
+      <w:r>
+        <w:t xml:space="preserve"> : nombre de chiens aux trois entrées, par créneaux d'une heure, en semaine et le week-end, part des chiens détachés, conflits constatés. C'est la donnée qui manque à la mairie pour choisir entre faire respecter l'interdiction, tolérer avec encadrement, ou ouvrir un espace canin à côté.</w:t>
+      </w:r>
+    </w:p>
+    <w:p>
+      <w:pPr>
+        <w:pStyle w:val="ListBullet"/>
+      </w:pPr>
+      <w:r>
+        <w:rPr>
+          <w:b/>
+        </w:rPr>
+        <w:t>Les jardins voisins</w:t>
+      </w:r>
+      <w:r>
+        <w:t xml:space="preserve"> (Poterne des Peupliers, Charles-Trenet, Moulin-de-la-Pointe) — candidats naturels à un </w:t>
+      </w:r>
+      <w:r>
+        <w:rPr>
+          <w:b/>
+        </w:rPr>
+        <w:t>espace canin modèle</w:t>
+      </w:r>
+      <w:r>
+        <w:t>, sur le modèle de Monceau : 2 000 m², ouvert toute la journée, éducateur canin payé par la mairie, accès réservé aux chiens identifiables et vaccinés. Cette demande-là peut passer, parce qu'elle ajoute un équipement au lieu de revenir sur une interdiction.</w:t>
+      </w:r>
+    </w:p>
+    <w:p>
+      <w:pPr>
+        <w:pStyle w:val="ListBullet"/>
+      </w:pPr>
+      <w:r>
+        <w:rPr>
+          <w:b/>
+        </w:rPr>
+        <w:t>Rue Damesme, rue Augustin Mouchot, rue de l'Interne Loeb</w:t>
+      </w:r>
+      <w:r>
+        <w:t xml:space="preserve"> — les trois rues d'accès portent le comptage de déjections : c'est là que le problème se déplace quand le lieu est fermé ou plein.</w:t>
+      </w:r>
+    </w:p>
+    <w:p>
+      <w:pPr>
+        <w:pStyle w:val="Heading3"/>
+      </w:pPr>
+      <w:r>
+        <w:t>7. La communication locale, ce qu'elle doit avoir de particulier</w:t>
+      </w:r>
+    </w:p>
+    <w:p>
+      <w:pPr>
+        <w:pStyle w:val="ListBullet"/>
+      </w:pPr>
+      <w:r>
+        <w:rPr>
+          <w:b/>
+        </w:rPr>
+        <w:t>Trois langues au moins.</w:t>
+      </w:r>
+      <w:r>
+        <w:t xml:space="preserve"> Dans le secteur Choisy / Ivry / Olympiades, les supports en chinois, vietnamien et khmer comptent autant que le français. Un volet réseaux monolingue ratera une partie de l'arrondissement, et précisément la population que le statut doit convaincre.</w:t>
+      </w:r>
+    </w:p>
+    <w:p>
+      <w:pPr>
+        <w:pStyle w:val="ListBullet"/>
+      </w:pPr>
+      <w:r>
+        <w:rPr>
+          <w:b/>
+        </w:rPr>
+        <w:t>Les conseils de quartier avant les réseaux sociaux</w:t>
+      </w:r>
+      <w:r>
+        <w:t xml:space="preserve"> : c'est là que la parole publique locale se construit dans cet arrondissement, et c'est là qu'on recrute les compteurs.</w:t>
+      </w:r>
+    </w:p>
+    <w:p>
+      <w:pPr>
+        <w:pStyle w:val="ListBullet"/>
+      </w:pPr>
+      <w:r>
+        <w:rPr>
+          <w:b/>
+        </w:rPr>
+        <w:t>Presse locale : Actu.fr Paris 13e, avant Le Parisien.</w:t>
+      </w:r>
+      <w:r>
+        <w:t xml:space="preserve"> Le sujet de quartier d'abord, le sujet parisien ensuite.</w:t>
+      </w:r>
+    </w:p>
+    <w:p>
+      <w:pPr>
+        <w:pStyle w:val="ListBullet"/>
+      </w:pPr>
+      <w:r>
+        <w:rPr>
+          <w:b/>
+        </w:rPr>
+        <w:t>Ton : constat, pas propreté-sanction.</w:t>
+      </w:r>
+      <w:r>
+        <w:t xml:space="preserve"> Dans un arrondissement qui accueille le plus de places d'hébergement d'urgence de Paris et où un habitant sur cinq vit en quartier prioritaire, un discours de verbalisation se lit immédiatement comme un discours sur les personnes. Le comptage d'usage plutôt que la dénonciation.</w:t>
+      </w:r>
+    </w:p>
+    <w:p>
+      <w:pPr>
+        <w:pStyle w:val="Heading3"/>
+      </w:pPr>
+      <w:r>
+        <w:t>8. Les demandes écrites, à envoyer avant toute parole publique</w:t>
+      </w:r>
+    </w:p>
+    <w:p>
+      <w:r>
+        <w:t>Toutes gratuites, toutes sur des documents administratifs communicables :</w:t>
+      </w:r>
+    </w:p>
+    <w:p>
+      <w:pPr>
+        <w:pStyle w:val="ListNumber"/>
+      </w:pPr>
+      <w:r>
+        <w:rPr>
+          <w:b/>
+        </w:rPr>
+        <w:t>Le nombre de chiens identifiés (I-CAD) dans le 13e</w:t>
+      </w:r>
+      <w:r>
+        <w:t>, à la Ville et à la profession vétérinaire.</w:t>
+      </w:r>
+    </w:p>
+    <w:p>
+      <w:pPr>
+        <w:pStyle w:val="ListNumber"/>
+      </w:pPr>
+      <w:r>
+        <w:rPr>
+          <w:b/>
+        </w:rPr>
+        <w:t>La liste officielle des espaces canins et des jardins du 13e où les chiens sont admis</w:t>
+      </w:r>
+      <w:r>
+        <w:t>, avec le règlement applicable.</w:t>
+      </w:r>
+    </w:p>
+    <w:p>
+      <w:pPr>
+        <w:pStyle w:val="ListNumber"/>
+      </w:pPr>
+      <w:r>
+        <w:rPr>
+          <w:b/>
+        </w:rPr>
+        <w:t>Les statistiques de propreté du secteur</w:t>
+      </w:r>
+      <w:r>
+        <w:t xml:space="preserve"> : passages, tonnages, signalements DansMaRue, nombre de distributeurs de sachets et de canisites.</w:t>
+      </w:r>
+    </w:p>
+    <w:p>
+      <w:pPr>
+        <w:pStyle w:val="ListNumber"/>
+      </w:pPr>
+      <w:r>
+        <w:rPr>
+          <w:b/>
+        </w:rPr>
+        <w:t>Les données de la police municipale et de la Direction des espaces verts</w:t>
+      </w:r>
+      <w:r>
+        <w:t xml:space="preserve"> sur la Poterne des Peupliers : passages, constats, plaintes d'habitants.</w:t>
+      </w:r>
+    </w:p>
+    <w:p>
+      <w:pPr>
+        <w:pStyle w:val="ListNumber"/>
+      </w:pPr>
+      <w:r>
+        <w:rPr>
+          <w:b/>
+        </w:rPr>
+        <w:t>Le calendrier d'ouverture de nouveaux tronçons de petite ceinture dans le 13e</w:t>
+      </w:r>
+      <w:r>
+        <w:t xml:space="preserve"> (des sources de presse annoncent des ouvertures en 2026 ; à faire confirmer par la Ville). Si un tronçon s'ouvre, c'est le moment exact où demander un espace canin dans l'aménagement.</w:t>
+      </w:r>
+    </w:p>
+    <w:p>
+      <w:pPr>
+        <w:pStyle w:val="Heading3"/>
+      </w:pPr>
+      <w:r>
+        <w:t>9. Le calendrier de lancement</w:t>
+      </w:r>
+    </w:p>
+    <w:p>
+      <w:pPr>
+        <w:pStyle w:val="ListBullet"/>
+      </w:pPr>
+      <w:r>
+        <w:rPr>
+          <w:b/>
+        </w:rPr>
+        <w:t>Semaine 1</w:t>
+      </w:r>
+      <w:r>
+        <w:t xml:space="preserve"> : les cinq demandes écrites partent. La règle de sélection des tronçons est publiée, le tirage au sort a lieu et son résultat est publié.</w:t>
+      </w:r>
+    </w:p>
+    <w:p>
+      <w:pPr>
+        <w:pStyle w:val="ListBullet"/>
+      </w:pPr>
+      <w:r>
+        <w:rPr>
+          <w:b/>
+        </w:rPr>
+        <w:t>Semaines 2-3</w:t>
+      </w:r>
+      <w:r>
+        <w:t xml:space="preserve"> : premier comptage sur un tronçon et la zone témoin, à la main, fiche papier, photos et empreintes horodatées.</w:t>
+      </w:r>
+    </w:p>
+    <w:p>
+      <w:pPr>
+        <w:pStyle w:val="ListBullet"/>
+      </w:pPr>
+      <w:r>
+        <w:rPr>
+          <w:b/>
+        </w:rPr>
+        <w:t>Semaine 4</w:t>
+      </w:r>
+      <w:r>
+        <w:t xml:space="preserve"> : bilan de mi-parcours publié, même provisoire — c'est ce qui tient les volontaires.</w:t>
+      </w:r>
+    </w:p>
+    <w:p>
+      <w:pPr>
+        <w:pStyle w:val="ListBullet"/>
+      </w:pPr>
+      <w:r>
+        <w:rPr>
+          <w:b/>
+        </w:rPr>
+        <w:t>Semaines 5-7</w:t>
+      </w:r>
+      <w:r>
+        <w:t xml:space="preserve"> : suite du comptage, puis tableau avant/après avec la méthode.</w:t>
+      </w:r>
+    </w:p>
+    <w:p>
+      <w:pPr>
+        <w:pStyle w:val="ListBullet"/>
+      </w:pPr>
+      <w:r>
+        <w:rPr>
+          <w:b/>
+        </w:rPr>
+        <w:t>Semaine 8</w:t>
+      </w:r>
+      <w:r>
+        <w:t xml:space="preserve"> : présentation en conseil d'arrondissement, dépôt du dossier de budget participatif, et le premier article de presse locale, sur la mesure et pas sur l'idée.</w:t>
+      </w:r>
+    </w:p>
+    <w:p>
+      <w:pPr>
+        <w:pStyle w:val="Heading3"/>
+      </w:pPr>
+      <w:r>
+        <w:t>Sources</w:t>
+      </w:r>
+    </w:p>
+    <w:p>
+      <w:pPr>
+        <w:pStyle w:val="ListBullet"/>
+      </w:pPr>
+      <w:r>
+        <w:t>Contrat de prévention et de sécurité du 13e arrondissement (2023) : population, superficie, revenus, logements sociaux, quartiers prioritaires, conseils de quartier, équipements, espaces verts, et la ligne sur la petite ceinture à la Poterne des Peupliers. https://cdn.paris.fr/paris/2023/11/14/cpsa-13e_2-juin-2023-Mxbk.pdf</w:t>
+      </w:r>
+    </w:p>
+    <w:p>
+      <w:pPr>
+        <w:pStyle w:val="ListBullet"/>
+      </w:pPr>
+      <w:r>
+        <w:t>Ville de Paris, élus d'arrondissements (page mise à jour le 31/03/2026) : 503 conseillers d'arrondissement à Paris, répartition du 13e, maire. https://www.paris.fr/pages/elus-d-arrondissements-2365</w:t>
+      </w:r>
+    </w:p>
+    <w:p>
+      <w:pPr>
+        <w:pStyle w:val="ListBullet"/>
+      </w:pPr>
+      <w:r>
+        <w:t>Résultats des élections municipales de mars 2026 dans le 13e : 43 sièges, 51,52 %, 35 sièges, 116 196 inscrits, participation. https://www.ici.fr/ile-de-france/paris-75/paris-13e/elections</w:t>
+      </w:r>
+    </w:p>
+    <w:p>
+      <w:pPr>
+        <w:pStyle w:val="ListBullet"/>
+      </w:pPr>
+      <w:r>
+        <w:t>Ville de Paris, fiche du lieu « Petite Ceinture du 13e (PC 13) » : surface, horaires, label Ecojardin, « admission animaux : non ». https://www.paris.fr/lieux/petite-ceinture-du-13e-pc-13-18089</w:t>
+      </w:r>
+    </w:p>
+    <w:p>
+      <w:r>
+        <w:rPr>
+          <w:b w:val="0"/>
+        </w:rPr>
+        <w:t>↑ Sommaire</w:t>
+      </w:r>
+    </w:p>
+    <w:p/>
+    <w:p>
       <w:r>
         <w:br w:type="page"/>
       </w:r>
@@ -6581,7 +7448,7 @@
         <w:pStyle w:val="Heading2"/>
       </w:pPr>
       <w:r>
-        <w:t>7. Audit anti-hallucination du dossier chiens-paris</w:t>
+        <w:t>8. Audit anti-hallucination du dossier chiens-paris</w:t>
       </w:r>
     </w:p>
     <w:p>
@@ -9243,7 +10110,7 @@
           <w:rFonts w:ascii="Consolas" w:hAnsi="Consolas"/>
           <w:sz w:val="20"/>
         </w:rPr>
-        <w:t>[NOTE-JURIDIQUE-COMPTAGE-CITOYEN.md](#9-note-juridique--ce-qui-donne-une-valeur-juridique-au-comptage-citoyen)</w:t>
+        <w:t>[NOTE-JURIDIQUE-COMPTAGE-CITOYEN.md](#10-note-juridique--ce-qui-donne-une-valeur-juridique-au-comptage-citoyen)</w:t>
       </w:r>
       <w:r>
         <w:t xml:space="preserve">, qui cite l'extrait exact publié par la LDH : aucune pièce du dossier ne corrobore l'atteinte invoquée pour 2020-2022, l'inefficacité des mesures existantes n'est pas établie, et la mesure n'est « ni nécessaire, ni adaptée, ni proportionnée ». </w:t>
@@ -9460,7 +10327,7 @@
         <w:pStyle w:val="Heading2"/>
       </w:pPr>
       <w:r>
-        <w:t>8. Note juridique — l'arrêté ADN canin : ce qui a fait annuler Béziers, et la recette pour un arrêté qui tient (29/09/2026)</w:t>
+        <w:t>9. Note juridique — l'arrêté ADN canin : ce qui a fait annuler Béziers, et la recette pour un arrêté qui tient (29/09/2026)</w:t>
       </w:r>
     </w:p>
     <w:p>
@@ -9752,7 +10619,7 @@
         <w:pStyle w:val="Heading2"/>
       </w:pPr>
       <w:r>
-        <w:t>9. Note juridique — ce qui donne une valeur juridique au comptage citoyen</w:t>
+        <w:t>10. Note juridique — ce qui donne une valeur juridique au comptage citoyen</w:t>
       </w:r>
     </w:p>
     <w:p>
@@ -10169,7 +11036,7 @@
         <w:pStyle w:val="Heading2"/>
       </w:pPr>
       <w:r>
-        <w:t>10. Architecture — une chaîne de preuve outillée (photo en contexte, QR, registre horodaté)</w:t>
+        <w:t>11. Architecture — une chaîne de preuve outillée (photo en contexte, QR, registre horodaté)</w:t>
       </w:r>
     </w:p>
     <w:p>
@@ -10811,7 +11678,7 @@
         <w:pStyle w:val="Heading2"/>
       </w:pPr>
       <w:r>
-        <w:t>11. Tests ADN canins : coûts réels, facilité de mise en œuvre, et chiffrage pour Paris (29/09/2026)</w:t>
+        <w:t>12. Tests ADN canins : coûts réels, facilité de mise en œuvre, et chiffrage pour Paris (29/09/2026)</w:t>
       </w:r>
     </w:p>
     <w:p>
@@ -11654,7 +12521,7 @@
         <w:pStyle w:val="Heading2"/>
       </w:pPr>
       <w:r>
-        <w:t>12. Statut « chien·ne citoyen·ne de Paris » — note de conception (29/09/2026)</w:t>
+        <w:t>13. Statut « chien·ne citoyen·ne de Paris » — note de conception (29/09/2026)</w:t>
       </w:r>
     </w:p>
     <w:p>
@@ -12539,7 +13406,7 @@
         <w:pStyle w:val="Heading2"/>
       </w:pPr>
       <w:r>
-        <w:t>13. Statut « chien·ne citoyen·ne de Paris » — projet d'arrêté et règlement (version de travail, 29/09/2026)</w:t>
+        <w:t>14. Statut « chien·ne citoyen·ne de Paris » — projet d'arrêté et règlement (version de travail, 29/09/2026)</w:t>
       </w:r>
     </w:p>
     <w:p>
@@ -12978,7 +13845,7 @@
         <w:pStyle w:val="Heading2"/>
       </w:pPr>
       <w:r>
-        <w:t>14. Projet « chiens de Paris » — creusage du 29/09/2026</w:t>
+        <w:t>15. Projet « chiens de Paris » — creusage du 29/09/2026</w:t>
       </w:r>
     </w:p>
     <w:p>
@@ -13931,7 +14798,7 @@
         <w:pStyle w:val="Heading2"/>
       </w:pPr>
       <w:r>
-        <w:t>15. RAPPORT — Un projet politique « chiens de Paris » : statut du chien citoyen, registre ADN, droits et chiffrage</w:t>
+        <w:t>16. RAPPORT — Un projet politique « chiens de Paris » : statut du chien citoyen, registre ADN, droits et chiffrage</w:t>
       </w:r>
     </w:p>
     <w:p>
@@ -19161,6 +20028,38 @@
           <w:p>
             <w:r>
               <w:t>145</w:t>
+            </w:r>
+          </w:p>
+        </w:tc>
+      </w:tr>
+      <w:tr>
+        <w:tc>
+          <w:tcPr>
+            <w:tcW w:type="dxa" w:w="2880"/>
+          </w:tcPr>
+          <w:p>
+            <w:r>
+              <w:t>NOTE-TERRAIN-13E.md</w:t>
+            </w:r>
+          </w:p>
+        </w:tc>
+        <w:tc>
+          <w:tcPr>
+            <w:tcW w:type="dxa" w:w="2880"/>
+          </w:tcPr>
+          <w:p>
+            <w:r>
+              <w:t>Le 13e : chiffres, politique locale, sites et démarches</w:t>
+            </w:r>
+          </w:p>
+        </w:tc>
+        <w:tc>
+          <w:tcPr>
+            <w:tcW w:type="dxa" w:w="2880"/>
+          </w:tcPr>
+          <w:p>
+            <w:r>
+              <w:t>151</w:t>
             </w:r>
           </w:p>
         </w:tc>

</xml_diff>